<commit_message>
Rimozione classi test superflue e aggiornamento documentazione test
</commit_message>
<xml_diff>
--- a/Documentazione/Elaborazione/Iterazione 5/Iterazione 5.docx
+++ b/Documentazione/Elaborazione/Iterazione 5/Iterazione 5.docx
@@ -170,6 +170,7 @@
               <w:dataBinding w:prefixMappings="xmlns:ns0='http://purl.org/dc/elements/1.1/' xmlns:ns1='http://schemas.openxmlformats.org/package/2006/metadata/core-properties' " w:xpath="/ns1:coreProperties[1]/ns0:subject[1]" w:storeItemID="{6C3C8BC8-F283-45AE-878A-BAB7291924A1}"/>
               <w:text/>
             </w:sdtPr>
+            <w:sdtEndPr/>
             <w:sdtContent>
               <w:r>
                 <w:rPr>
@@ -291,6 +292,7 @@
                                     <w:dataBinding w:prefixMappings="xmlns:ns0='http://schemas.openxmlformats.org/officeDocument/2006/extended-properties' " w:xpath="/ns0:Properties[1]/ns0:Company[1]" w:storeItemID="{6668398D-A668-4E3E-A5EB-62B293D839F1}"/>
                                     <w:text/>
                                   </w:sdtPr>
+                                  <w:sdtEndPr/>
                                   <w:sdtContent>
                                     <w:r>
                                       <w:rPr>
@@ -321,6 +323,7 @@
                                     <w:dataBinding w:prefixMappings="xmlns:ns0='http://schemas.microsoft.com/office/2006/coverPageProps' " w:xpath="/ns0:CoverPageProperties[1]/ns0:CompanyAddress[1]" w:storeItemID="{55AF091B-3C7A-41E3-B477-F2FDAA23CFDA}"/>
                                     <w:text/>
                                   </w:sdtPr>
+                                  <w:sdtEndPr/>
                                   <w:sdtContent>
                                     <w:r>
                                       <w:rPr>
@@ -393,6 +396,7 @@
                               <w:dataBinding w:prefixMappings="xmlns:ns0='http://schemas.openxmlformats.org/officeDocument/2006/extended-properties' " w:xpath="/ns0:Properties[1]/ns0:Company[1]" w:storeItemID="{6668398D-A668-4E3E-A5EB-62B293D839F1}"/>
                               <w:text/>
                             </w:sdtPr>
+                            <w:sdtEndPr/>
                             <w:sdtContent>
                               <w:r>
                                 <w:rPr>
@@ -423,6 +427,7 @@
                               <w:dataBinding w:prefixMappings="xmlns:ns0='http://schemas.microsoft.com/office/2006/coverPageProps' " w:xpath="/ns0:CoverPageProperties[1]/ns0:CompanyAddress[1]" w:storeItemID="{55AF091B-3C7A-41E3-B477-F2FDAA23CFDA}"/>
                               <w:text/>
                             </w:sdtPr>
+                            <w:sdtEndPr/>
                             <w:sdtContent>
                               <w:r>
                                 <w:rPr>
@@ -669,7 +674,7 @@
                 <w:noProof/>
                 <w:webHidden/>
               </w:rPr>
-              <w:t>2</w:t>
+              <w:t>1</w:t>
             </w:r>
             <w:r>
               <w:rPr>
@@ -743,7 +748,7 @@
                 <w:noProof/>
                 <w:webHidden/>
               </w:rPr>
-              <w:t>3</w:t>
+              <w:t>1</w:t>
             </w:r>
             <w:r>
               <w:rPr>
@@ -817,7 +822,7 @@
                 <w:noProof/>
                 <w:webHidden/>
               </w:rPr>
-              <w:t>4</w:t>
+              <w:t>1</w:t>
             </w:r>
             <w:r>
               <w:rPr>
@@ -891,7 +896,7 @@
                 <w:noProof/>
                 <w:webHidden/>
               </w:rPr>
-              <w:t>6</w:t>
+              <w:t>1</w:t>
             </w:r>
             <w:r>
               <w:rPr>
@@ -966,7 +971,7 @@
                 <w:noProof/>
                 <w:webHidden/>
               </w:rPr>
-              <w:t>6</w:t>
+              <w:t>1</w:t>
             </w:r>
             <w:r>
               <w:rPr>
@@ -1041,7 +1046,7 @@
                 <w:noProof/>
                 <w:webHidden/>
               </w:rPr>
-              <w:t>8</w:t>
+              <w:t>1</w:t>
             </w:r>
             <w:r>
               <w:rPr>
@@ -1115,7 +1120,7 @@
                 <w:noProof/>
                 <w:webHidden/>
               </w:rPr>
-              <w:t>11</w:t>
+              <w:t>1</w:t>
             </w:r>
             <w:r>
               <w:rPr>
@@ -1189,7 +1194,7 @@
                 <w:noProof/>
                 <w:webHidden/>
               </w:rPr>
-              <w:t>12</w:t>
+              <w:t>1</w:t>
             </w:r>
             <w:r>
               <w:rPr>
@@ -1264,7 +1269,7 @@
                 <w:noProof/>
                 <w:webHidden/>
               </w:rPr>
-              <w:t>12</w:t>
+              <w:t>1</w:t>
             </w:r>
             <w:r>
               <w:rPr>
@@ -1339,7 +1344,7 @@
                 <w:noProof/>
                 <w:webHidden/>
               </w:rPr>
-              <w:t>14</w:t>
+              <w:t>1</w:t>
             </w:r>
             <w:r>
               <w:rPr>
@@ -1414,7 +1419,7 @@
                 <w:noProof/>
                 <w:webHidden/>
               </w:rPr>
-              <w:t>14</w:t>
+              <w:t>1</w:t>
             </w:r>
             <w:r>
               <w:rPr>
@@ -1447,23 +1452,7 @@
                 <w:rFonts w:ascii="Calibri" w:hAnsi="Calibri" w:cs="Calibri"/>
                 <w:noProof/>
               </w:rPr>
-              <w:t>5.0 Implementazi</w:t>
-            </w:r>
-            <w:r>
-              <w:rPr>
-                <w:rStyle w:val="Collegamentoipertestuale"/>
-                <w:rFonts w:ascii="Calibri" w:hAnsi="Calibri" w:cs="Calibri"/>
-                <w:noProof/>
-              </w:rPr>
-              <w:t>o</w:t>
-            </w:r>
-            <w:r>
-              <w:rPr>
-                <w:rStyle w:val="Collegamentoipertestuale"/>
-                <w:rFonts w:ascii="Calibri" w:hAnsi="Calibri" w:cs="Calibri"/>
-                <w:noProof/>
-              </w:rPr>
-              <w:t>ne</w:t>
+              <w:t>5.0 Implementazione</w:t>
             </w:r>
             <w:r>
               <w:rPr>
@@ -1504,7 +1493,7 @@
                 <w:noProof/>
                 <w:webHidden/>
               </w:rPr>
-              <w:t>14</w:t>
+              <w:t>1</w:t>
             </w:r>
             <w:r>
               <w:rPr>
@@ -1578,7 +1567,7 @@
                 <w:noProof/>
                 <w:webHidden/>
               </w:rPr>
-              <w:t>15</w:t>
+              <w:t>1</w:t>
             </w:r>
             <w:r>
               <w:rPr>
@@ -1850,31 +1839,7 @@
           <w:i/>
           <w:color w:val="000000"/>
         </w:rPr>
-        <w:t>C</w:t>
-      </w:r>
-      <w:r>
-        <w:rPr>
-          <w:rFonts w:ascii="Calibri" w:eastAsia="Calibri" w:hAnsi="Calibri" w:cs="Calibri"/>
-          <w:i/>
-          <w:color w:val="000000"/>
-        </w:rPr>
-        <w:t>8</w:t>
-      </w:r>
-      <w:r>
-        <w:rPr>
-          <w:rFonts w:ascii="Calibri" w:eastAsia="Calibri" w:hAnsi="Calibri" w:cs="Calibri"/>
-          <w:i/>
-          <w:color w:val="000000"/>
-        </w:rPr>
-        <w:t xml:space="preserve">: Gestione </w:t>
-      </w:r>
-      <w:r>
-        <w:rPr>
-          <w:rFonts w:ascii="Calibri" w:eastAsia="Calibri" w:hAnsi="Calibri" w:cs="Calibri"/>
-          <w:i/>
-          <w:color w:val="000000"/>
-        </w:rPr>
-        <w:t>scenari di gioco</w:t>
+        <w:t>C8: Gestione scenari di gioco</w:t>
       </w:r>
       <w:r>
         <w:rPr>
@@ -1947,31 +1912,7 @@
           <w:i/>
           <w:color w:val="000000"/>
         </w:rPr>
-        <w:t>C</w:t>
-      </w:r>
-      <w:r>
-        <w:rPr>
-          <w:rFonts w:ascii="Calibri" w:eastAsia="Calibri" w:hAnsi="Calibri" w:cs="Calibri"/>
-          <w:i/>
-          <w:color w:val="000000"/>
-        </w:rPr>
-        <w:t>9</w:t>
-      </w:r>
-      <w:r>
-        <w:rPr>
-          <w:rFonts w:ascii="Calibri" w:eastAsia="Calibri" w:hAnsi="Calibri" w:cs="Calibri"/>
-          <w:i/>
-          <w:color w:val="000000"/>
-        </w:rPr>
-        <w:t xml:space="preserve">: Gestione </w:t>
-      </w:r>
-      <w:r>
-        <w:rPr>
-          <w:rFonts w:ascii="Calibri" w:eastAsia="Calibri" w:hAnsi="Calibri" w:cs="Calibri"/>
-          <w:i/>
-          <w:color w:val="000000"/>
-        </w:rPr>
-        <w:t>elementi di gioco personalizzabili</w:t>
+        <w:t>C9: Gestione elementi di gioco personalizzabili</w:t>
       </w:r>
       <w:r>
         <w:rPr>
@@ -3276,7 +3217,6 @@
               <w:rPr>
                 <w:rFonts w:ascii="Calibri" w:hAnsi="Calibri" w:cs="Calibri"/>
               </w:rPr>
-              <w:lastRenderedPageBreak/>
               <w:t>4</w:t>
             </w:r>
             <w:r>
@@ -3394,7 +3334,6 @@
                 <w:szCs w:val="24"/>
                 <w:shd w:val="clear" w:color="auto" w:fill="FFFFFF"/>
               </w:rPr>
-              <w:lastRenderedPageBreak/>
               <w:t>Requisiti speciali</w:t>
             </w:r>
           </w:p>
@@ -3617,13 +3556,7 @@
         <w:rPr>
           <w:rFonts w:ascii="Calibri" w:hAnsi="Calibri" w:cs="Calibri"/>
         </w:rPr>
-        <w:t xml:space="preserve">Gestione </w:t>
-      </w:r>
-      <w:r>
-        <w:rPr>
-          <w:rFonts w:ascii="Calibri" w:hAnsi="Calibri" w:cs="Calibri"/>
-        </w:rPr>
-        <w:t>scenari di gioco</w:t>
+        <w:t>Gestione scenari di gioco</w:t>
       </w:r>
       <w:bookmarkEnd w:id="2"/>
     </w:p>
@@ -3682,25 +3615,7 @@
           <w:iCs/>
           <w:highlight w:val="white"/>
         </w:rPr>
-        <w:t xml:space="preserve">Gestione </w:t>
-      </w:r>
-      <w:r>
-        <w:rPr>
-          <w:rFonts w:ascii="Calibri" w:hAnsi="Calibri" w:cs="Calibri"/>
-          <w:i/>
-          <w:iCs/>
-          <w:highlight w:val="white"/>
-        </w:rPr>
-        <w:t>scenari di gioco</w:t>
-      </w:r>
-      <w:r>
-        <w:rPr>
-          <w:rFonts w:ascii="Calibri" w:hAnsi="Calibri" w:cs="Calibri"/>
-          <w:i/>
-          <w:iCs/>
-          <w:highlight w:val="white"/>
-        </w:rPr>
-        <w:t>.</w:t>
+        <w:t>Gestione scenari di gioco.</w:t>
       </w:r>
       <w:r>
         <w:rPr>
@@ -3714,21 +3629,7 @@
           <w:rFonts w:ascii="Calibri" w:hAnsi="Calibri" w:cs="Calibri"/>
           <w:highlight w:val="white"/>
         </w:rPr>
-        <w:t xml:space="preserve">l’amministratore di creare, modificare o eliminare </w:t>
-      </w:r>
-      <w:r>
-        <w:rPr>
-          <w:rFonts w:ascii="Calibri" w:hAnsi="Calibri" w:cs="Calibri"/>
-          <w:highlight w:val="white"/>
-        </w:rPr>
-        <w:t>gli scenari di gioco</w:t>
-      </w:r>
-      <w:r>
-        <w:rPr>
-          <w:rFonts w:ascii="Calibri" w:hAnsi="Calibri" w:cs="Calibri"/>
-          <w:highlight w:val="white"/>
-        </w:rPr>
-        <w:t>, in modo da renderli disponibili ai giocatori in fase di configurazione della partita.</w:t>
+        <w:t>l’amministratore di creare, modificare o eliminare gli scenari di gioco, in modo da renderli disponibili ai giocatori in fase di configurazione della partita.</w:t>
       </w:r>
     </w:p>
     <w:p>
@@ -3799,15 +3700,7 @@
                 <w:color w:val="0D0D0D"/>
                 <w:shd w:val="clear" w:color="auto" w:fill="FFFFFF"/>
               </w:rPr>
-              <w:t xml:space="preserve">Gestione </w:t>
-            </w:r>
-            <w:r>
-              <w:rPr>
-                <w:rFonts w:ascii="Calibri" w:hAnsi="Calibri" w:cs="Calibri"/>
-                <w:color w:val="0D0D0D"/>
-                <w:shd w:val="clear" w:color="auto" w:fill="FFFFFF"/>
-              </w:rPr>
-              <w:t>scenari di gioco</w:t>
+              <w:t>Gestione scenari di gioco</w:t>
             </w:r>
           </w:p>
         </w:tc>
@@ -3896,16 +3789,7 @@
                 <w:sz w:val="24"/>
                 <w:szCs w:val="24"/>
               </w:rPr>
-              <w:t xml:space="preserve">Gestione </w:t>
-            </w:r>
-            <w:r>
-              <w:rPr>
-                <w:rFonts w:ascii="Calibri" w:eastAsiaTheme="minorEastAsia" w:hAnsi="Calibri" w:cs="Calibri"/>
-                <w:color w:val="auto"/>
-                <w:sz w:val="24"/>
-                <w:szCs w:val="24"/>
-              </w:rPr>
-              <w:t>scenari di gioco</w:t>
+              <w:t>Gestione scenari di gioco</w:t>
             </w:r>
           </w:p>
         </w:tc>
@@ -4164,15 +4048,7 @@
                 <w:sz w:val="24"/>
                 <w:szCs w:val="24"/>
               </w:rPr>
-              <w:t xml:space="preserve">gestire </w:t>
-            </w:r>
-            <w:r>
-              <w:rPr>
-                <w:rFonts w:ascii="Calibri" w:eastAsiaTheme="minorEastAsia" w:hAnsi="Calibri" w:cs="Calibri"/>
-                <w:sz w:val="24"/>
-                <w:szCs w:val="24"/>
-              </w:rPr>
-              <w:t>gli scenari</w:t>
+              <w:t>gestire gli scenari</w:t>
             </w:r>
           </w:p>
         </w:tc>
@@ -4291,23 +4167,7 @@
                 <w:sz w:val="24"/>
                 <w:szCs w:val="24"/>
               </w:rPr>
-              <w:t xml:space="preserve">salva </w:t>
-            </w:r>
-            <w:r>
-              <w:rPr>
-                <w:rFonts w:ascii="Calibri" w:eastAsiaTheme="minorEastAsia" w:hAnsi="Calibri" w:cs="Calibri"/>
-                <w:sz w:val="24"/>
-                <w:szCs w:val="24"/>
-              </w:rPr>
-              <w:t>gli scenari</w:t>
-            </w:r>
-            <w:r>
-              <w:rPr>
-                <w:rFonts w:ascii="Calibri" w:eastAsiaTheme="minorEastAsia" w:hAnsi="Calibri" w:cs="Calibri"/>
-                <w:sz w:val="24"/>
-                <w:szCs w:val="24"/>
-              </w:rPr>
-              <w:t xml:space="preserve"> impostati dall’amministratore</w:t>
+              <w:t>salva gli scenari impostati dall’amministratore</w:t>
             </w:r>
           </w:p>
         </w:tc>
@@ -4483,7 +4343,6 @@
                 <w:rFonts w:ascii="Calibri" w:eastAsia="Calibri" w:hAnsi="Calibri" w:cs="Calibri"/>
                 <w:highlight w:val="white"/>
               </w:rPr>
-              <w:lastRenderedPageBreak/>
               <w:t>Il sistema apre il pannello admin.</w:t>
             </w:r>
           </w:p>
@@ -4505,35 +4364,7 @@
                 <w:rFonts w:ascii="Calibri" w:eastAsia="Calibri" w:hAnsi="Calibri" w:cs="Calibri"/>
                 <w:highlight w:val="white"/>
               </w:rPr>
-              <w:t xml:space="preserve">L’amministratore accede alla pagina di gestione </w:t>
-            </w:r>
-            <w:r>
-              <w:rPr>
-                <w:rFonts w:ascii="Calibri" w:eastAsia="Calibri" w:hAnsi="Calibri" w:cs="Calibri"/>
-                <w:highlight w:val="white"/>
-              </w:rPr>
-              <w:t>degli scenari cliccando</w:t>
-            </w:r>
-            <w:r>
-              <w:rPr>
-                <w:rFonts w:ascii="Calibri" w:eastAsia="Calibri" w:hAnsi="Calibri" w:cs="Calibri"/>
-                <w:highlight w:val="white"/>
-              </w:rPr>
-              <w:t xml:space="preserve"> il pulsante “</w:t>
-            </w:r>
-            <w:r>
-              <w:rPr>
-                <w:rFonts w:ascii="Calibri" w:eastAsia="Calibri" w:hAnsi="Calibri" w:cs="Calibri"/>
-                <w:highlight w:val="white"/>
-              </w:rPr>
-              <w:t>Gestione scenari</w:t>
-            </w:r>
-            <w:r>
-              <w:rPr>
-                <w:rFonts w:ascii="Calibri" w:eastAsia="Calibri" w:hAnsi="Calibri" w:cs="Calibri"/>
-                <w:highlight w:val="white"/>
-              </w:rPr>
-              <w:t>”.</w:t>
+              <w:t>L’amministratore accede alla pagina di gestione degli scenari cliccando il pulsante “Gestione scenari”.</w:t>
             </w:r>
           </w:p>
           <w:p>
@@ -4554,21 +4385,7 @@
                 <w:rFonts w:ascii="Calibri" w:eastAsia="Calibri" w:hAnsi="Calibri" w:cs="Calibri"/>
                 <w:highlight w:val="white"/>
               </w:rPr>
-              <w:t xml:space="preserve">Il sistema apre la pagina di gestione </w:t>
-            </w:r>
-            <w:r>
-              <w:rPr>
-                <w:rFonts w:ascii="Calibri" w:eastAsia="Calibri" w:hAnsi="Calibri" w:cs="Calibri"/>
-                <w:highlight w:val="white"/>
-              </w:rPr>
-              <w:t>degli scenari</w:t>
-            </w:r>
-            <w:r>
-              <w:rPr>
-                <w:rFonts w:ascii="Calibri" w:eastAsia="Calibri" w:hAnsi="Calibri" w:cs="Calibri"/>
-                <w:highlight w:val="white"/>
-              </w:rPr>
-              <w:t>.</w:t>
+              <w:t>Il sistema apre la pagina di gestione degli scenari.</w:t>
             </w:r>
           </w:p>
           <w:p>
@@ -4589,14 +4406,7 @@
                 <w:rFonts w:ascii="Calibri" w:eastAsia="Calibri" w:hAnsi="Calibri" w:cs="Calibri"/>
                 <w:highlight w:val="white"/>
               </w:rPr>
-              <w:t>L’amministratore può aggiunger</w:t>
-            </w:r>
-            <w:r>
-              <w:rPr>
-                <w:rFonts w:ascii="Calibri" w:eastAsia="Calibri" w:hAnsi="Calibri" w:cs="Calibri"/>
-                <w:highlight w:val="white"/>
-              </w:rPr>
-              <w:t>e, modificare ed eliminare gli scenari, impostandone anche le varie descrizioni da mostrare per ogni tipologia di casella</w:t>
+              <w:t>L’amministratore può aggiungere, modificare ed eliminare gli scenari, impostandone anche le varie descrizioni da mostrare per ogni tipologia di casella</w:t>
             </w:r>
             <w:r>
               <w:rPr>
@@ -4673,7 +4483,6 @@
                 <w:szCs w:val="24"/>
                 <w:shd w:val="clear" w:color="auto" w:fill="FFFFFF"/>
               </w:rPr>
-              <w:lastRenderedPageBreak/>
               <w:t>Estensioni</w:t>
             </w:r>
           </w:p>
@@ -5326,7 +5135,6 @@
                 <w:szCs w:val="24"/>
                 <w:shd w:val="clear" w:color="auto" w:fill="FFFFFF"/>
               </w:rPr>
-              <w:lastRenderedPageBreak/>
               <w:t>Nome del caso d’uso</w:t>
             </w:r>
           </w:p>
@@ -6447,7 +6255,6 @@
                 <w:szCs w:val="24"/>
                 <w:shd w:val="clear" w:color="auto" w:fill="FFFFFF"/>
               </w:rPr>
-              <w:lastRenderedPageBreak/>
               <w:t>Elenco delle varianti tecnologiche e dei dati</w:t>
             </w:r>
           </w:p>
@@ -7255,7 +7062,6 @@
           <w:bCs/>
           <w:highlight w:val="white"/>
         </w:rPr>
-        <w:lastRenderedPageBreak/>
         <w:t xml:space="preserve">Pedina: </w:t>
       </w:r>
       <w:r>
@@ -7689,9 +7495,8 @@
           <w:rFonts w:ascii="Calibri" w:hAnsi="Calibri" w:cs="Calibri"/>
           <w:noProof/>
         </w:rPr>
-        <w:lastRenderedPageBreak/>
         <w:drawing>
-          <wp:inline distT="0" distB="0" distL="0" distR="0" wp14:anchorId="27232228" wp14:editId="64B8137E">
+          <wp:inline distT="0" distB="0" distL="0" distR="0" wp14:anchorId="27232228" wp14:editId="256EF577">
             <wp:extent cx="6120130" cy="5064760"/>
             <wp:effectExtent l="0" t="0" r="0" b="2540"/>
             <wp:docPr id="313862309" name="Immagine 2" descr="Immagine che contiene testo, diagramma, schermata, Piano"/>
@@ -7961,7 +7766,6 @@
           <w:rFonts w:ascii="Calibri" w:hAnsi="Calibri" w:cs="Calibri"/>
           <w:noProof/>
         </w:rPr>
-        <w:lastRenderedPageBreak/>
         <w:drawing>
           <wp:inline distT="0" distB="0" distL="0" distR="0" wp14:anchorId="50D9ABB4" wp14:editId="551C5245">
             <wp:extent cx="6120130" cy="3726180"/>
@@ -8149,16 +7953,7 @@
           <w:iCs/>
           <w:highlight w:val="white"/>
         </w:rPr>
-        <w:t xml:space="preserve">Gestione </w:t>
-      </w:r>
-      <w:r>
-        <w:rPr>
-          <w:rFonts w:ascii="Calibri" w:hAnsi="Calibri" w:cs="Calibri"/>
-          <w:i/>
-          <w:iCs/>
-          <w:highlight w:val="white"/>
-        </w:rPr>
-        <w:t>scenari di gioco</w:t>
+        <w:t>Gestione scenari di gioco</w:t>
       </w:r>
       <w:r>
         <w:rPr>
@@ -8180,7 +7975,6 @@
           <w:rFonts w:ascii="Calibri" w:hAnsi="Calibri" w:cs="Calibri"/>
           <w:noProof/>
         </w:rPr>
-        <w:lastRenderedPageBreak/>
         <w:drawing>
           <wp:inline distT="0" distB="0" distL="0" distR="0" wp14:anchorId="44EF7B6B" wp14:editId="58719840">
             <wp:extent cx="6189345" cy="3319462"/>
@@ -8280,16 +8074,7 @@
           <w:iCs/>
           <w:highlight w:val="white"/>
         </w:rPr>
-        <w:t xml:space="preserve">Gestione </w:t>
-      </w:r>
-      <w:r>
-        <w:rPr>
-          <w:rFonts w:ascii="Calibri" w:hAnsi="Calibri" w:cs="Calibri"/>
-          <w:i/>
-          <w:iCs/>
-          <w:highlight w:val="white"/>
-        </w:rPr>
-        <w:t>elementi di gioco personalizzabili</w:t>
+        <w:t>Gestione elementi di gioco personalizzabili</w:t>
       </w:r>
       <w:r>
         <w:rPr>
@@ -8383,7 +8168,6 @@
         <w:rPr>
           <w:rFonts w:ascii="Calibri" w:hAnsi="Calibri" w:cs="Calibri"/>
         </w:rPr>
-        <w:lastRenderedPageBreak/>
         <w:t>3.3</w:t>
       </w:r>
       <w:r>
@@ -8957,19 +8741,7 @@
               <w:rPr>
                 <w:rFonts w:ascii="Calibri" w:eastAsia="Aptos" w:hAnsi="Calibri" w:cs="Calibri"/>
               </w:rPr>
-              <w:t>L’amministra</w:t>
-            </w:r>
-            <w:r>
-              <w:rPr>
-                <w:rFonts w:ascii="Calibri" w:eastAsia="Aptos" w:hAnsi="Calibri" w:cs="Calibri"/>
-              </w:rPr>
-              <w:t xml:space="preserve">tore </w:t>
-            </w:r>
-            <w:r>
-              <w:rPr>
-                <w:rFonts w:ascii="Calibri" w:eastAsia="Aptos" w:hAnsi="Calibri" w:cs="Calibri"/>
-              </w:rPr>
-              <w:t>è stato autenticato con successo</w:t>
+              <w:t>L’amministratore è stato autenticato con successo</w:t>
             </w:r>
           </w:p>
         </w:tc>
@@ -9116,18 +8888,7 @@
                 <w:sz w:val="22"/>
                 <w:szCs w:val="22"/>
               </w:rPr>
-              <w:t>replaceAllS</w:t>
-            </w:r>
-            <w:r>
-              <w:rPr>
-                <w:rFonts w:ascii="Calibri" w:eastAsia="Aptos" w:hAnsi="Calibri" w:cs="Calibri"/>
-                <w:b/>
-                <w:i/>
-                <w:color w:val="215E99"/>
-                <w:sz w:val="22"/>
-                <w:szCs w:val="22"/>
-              </w:rPr>
-              <w:t>cenari</w:t>
+              <w:t>replaceAllScenari</w:t>
             </w:r>
             <w:proofErr w:type="spellEnd"/>
           </w:p>
@@ -9243,25 +9004,7 @@
               <w:rPr>
                 <w:rFonts w:ascii="Calibri" w:hAnsi="Calibri" w:cs="Calibri"/>
               </w:rPr>
-              <w:t>Caso d’uso UC</w:t>
-            </w:r>
-            <w:r>
-              <w:rPr>
-                <w:rFonts w:ascii="Calibri" w:hAnsi="Calibri" w:cs="Calibri"/>
-              </w:rPr>
-              <w:t>8</w:t>
-            </w:r>
-            <w:r>
-              <w:rPr>
-                <w:rFonts w:ascii="Calibri" w:hAnsi="Calibri" w:cs="Calibri"/>
-              </w:rPr>
-              <w:t xml:space="preserve">: Gestione </w:t>
-            </w:r>
-            <w:r>
-              <w:rPr>
-                <w:rFonts w:ascii="Calibri" w:hAnsi="Calibri" w:cs="Calibri"/>
-              </w:rPr>
-              <w:t>scenari di gioco</w:t>
+              <w:t>Caso d’uso UC8: Gestione scenari di gioco</w:t>
             </w:r>
           </w:p>
         </w:tc>
@@ -9308,25 +9051,7 @@
               <w:rPr>
                 <w:rFonts w:ascii="Calibri" w:eastAsia="Aptos" w:hAnsi="Calibri" w:cs="Calibri"/>
               </w:rPr>
-              <w:t>L’amministra</w:t>
-            </w:r>
-            <w:r>
-              <w:rPr>
-                <w:rFonts w:ascii="Calibri" w:eastAsia="Aptos" w:hAnsi="Calibri" w:cs="Calibri"/>
-              </w:rPr>
-              <w:t>tore</w:t>
-            </w:r>
-            <w:r>
-              <w:rPr>
-                <w:rFonts w:ascii="Calibri" w:eastAsia="Aptos" w:hAnsi="Calibri" w:cs="Calibri"/>
-              </w:rPr>
-              <w:t xml:space="preserve"> </w:t>
-            </w:r>
-            <w:r>
-              <w:rPr>
-                <w:rFonts w:ascii="Calibri" w:eastAsia="Aptos" w:hAnsi="Calibri" w:cs="Calibri"/>
-              </w:rPr>
-              <w:t>è stato autenticato con successo</w:t>
+              <w:t>L’amministratore è stato autenticato con successo</w:t>
             </w:r>
           </w:p>
         </w:tc>
@@ -9372,19 +9097,7 @@
               <w:rPr>
                 <w:rFonts w:ascii="Calibri" w:hAnsi="Calibri" w:cs="Calibri"/>
               </w:rPr>
-              <w:t xml:space="preserve">Sono stati salvati nel sistema i nuovi </w:t>
-            </w:r>
-            <w:r>
-              <w:rPr>
-                <w:rFonts w:ascii="Calibri" w:hAnsi="Calibri" w:cs="Calibri"/>
-              </w:rPr>
-              <w:t>scenari</w:t>
-            </w:r>
-            <w:r>
-              <w:rPr>
-                <w:rFonts w:ascii="Calibri" w:hAnsi="Calibri" w:cs="Calibri"/>
-              </w:rPr>
-              <w:t xml:space="preserve"> precedentemente impostati</w:t>
+              <w:t>Sono stati salvati nel sistema i nuovi scenari precedentemente impostati</w:t>
             </w:r>
           </w:p>
         </w:tc>
@@ -9485,18 +9198,7 @@
                 <w:sz w:val="22"/>
                 <w:szCs w:val="22"/>
               </w:rPr>
-              <w:t>replaceAll</w:t>
-            </w:r>
-            <w:r>
-              <w:rPr>
-                <w:rFonts w:ascii="Calibri" w:eastAsia="Aptos" w:hAnsi="Calibri" w:cs="Calibri"/>
-                <w:b/>
-                <w:i/>
-                <w:color w:val="215E99"/>
-                <w:sz w:val="22"/>
-                <w:szCs w:val="22"/>
-              </w:rPr>
-              <w:t>Personalizzazioni</w:t>
+              <w:t>replaceAllPersonalizzazioni</w:t>
             </w:r>
             <w:proofErr w:type="spellEnd"/>
           </w:p>
@@ -9545,13 +9247,7 @@
               <w:rPr>
                 <w:rFonts w:ascii="Calibri" w:eastAsia="Aptos" w:hAnsi="Calibri" w:cs="Calibri"/>
               </w:rPr>
-              <w:t>replaceAll</w:t>
-            </w:r>
-            <w:r>
-              <w:rPr>
-                <w:rFonts w:ascii="Calibri" w:eastAsia="Aptos" w:hAnsi="Calibri" w:cs="Calibri"/>
-              </w:rPr>
-              <w:t>Personalizzazioni</w:t>
+              <w:t>replaceAllPersonalizzazioni</w:t>
             </w:r>
             <w:proofErr w:type="spellEnd"/>
             <w:r>
@@ -9618,25 +9314,7 @@
               <w:rPr>
                 <w:rFonts w:ascii="Calibri" w:hAnsi="Calibri" w:cs="Calibri"/>
               </w:rPr>
-              <w:t>Caso d’uso UC</w:t>
-            </w:r>
-            <w:r>
-              <w:rPr>
-                <w:rFonts w:ascii="Calibri" w:hAnsi="Calibri" w:cs="Calibri"/>
-              </w:rPr>
-              <w:t>9</w:t>
-            </w:r>
-            <w:r>
-              <w:rPr>
-                <w:rFonts w:ascii="Calibri" w:hAnsi="Calibri" w:cs="Calibri"/>
-              </w:rPr>
-              <w:t xml:space="preserve">: Gestione </w:t>
-            </w:r>
-            <w:r>
-              <w:rPr>
-                <w:rFonts w:ascii="Calibri" w:hAnsi="Calibri" w:cs="Calibri"/>
-              </w:rPr>
-              <w:t>elementi di gioco personalizzabili</w:t>
+              <w:t>Caso d’uso UC9: Gestione elementi di gioco personalizzabili</w:t>
             </w:r>
           </w:p>
         </w:tc>
@@ -9683,19 +9361,7 @@
               <w:rPr>
                 <w:rFonts w:ascii="Calibri" w:eastAsia="Aptos" w:hAnsi="Calibri" w:cs="Calibri"/>
               </w:rPr>
-              <w:t>L’amministra</w:t>
-            </w:r>
-            <w:r>
-              <w:rPr>
-                <w:rFonts w:ascii="Calibri" w:eastAsia="Aptos" w:hAnsi="Calibri" w:cs="Calibri"/>
-              </w:rPr>
-              <w:t>tore</w:t>
-            </w:r>
-            <w:r>
-              <w:rPr>
-                <w:rFonts w:ascii="Calibri" w:eastAsia="Aptos" w:hAnsi="Calibri" w:cs="Calibri"/>
-              </w:rPr>
-              <w:t xml:space="preserve"> è stato autenticato con successo</w:t>
+              <w:t>L’amministratore è stato autenticato con successo</w:t>
             </w:r>
           </w:p>
         </w:tc>
@@ -9741,25 +9407,7 @@
               <w:rPr>
                 <w:rFonts w:ascii="Calibri" w:hAnsi="Calibri" w:cs="Calibri"/>
               </w:rPr>
-              <w:t xml:space="preserve">Sono stati salvati nel sistema </w:t>
-            </w:r>
-            <w:r>
-              <w:rPr>
-                <w:rFonts w:ascii="Calibri" w:hAnsi="Calibri" w:cs="Calibri"/>
-              </w:rPr>
-              <w:t>le nuove personalizzazioni (dadi e pedine)</w:t>
-            </w:r>
-            <w:r>
-              <w:rPr>
-                <w:rFonts w:ascii="Calibri" w:hAnsi="Calibri" w:cs="Calibri"/>
-              </w:rPr>
-              <w:t xml:space="preserve"> precedentemente impostat</w:t>
-            </w:r>
-            <w:r>
-              <w:rPr>
-                <w:rFonts w:ascii="Calibri" w:hAnsi="Calibri" w:cs="Calibri"/>
-              </w:rPr>
-              <w:t>e</w:t>
+              <w:t>Sono stati salvati nel sistema le nuove personalizzazioni (dadi e pedine) precedentemente impostate</w:t>
             </w:r>
           </w:p>
         </w:tc>
@@ -9814,7 +9462,6 @@
         <w:rPr>
           <w:rFonts w:ascii="Calibri" w:hAnsi="Calibri" w:cs="Calibri"/>
         </w:rPr>
-        <w:lastRenderedPageBreak/>
         <w:t>4</w:t>
       </w:r>
       <w:r>
@@ -9944,7 +9591,13 @@
           <w:i/>
           <w:iCs/>
         </w:rPr>
-        <w:t>UC8: Gestione scenari di gioco</w:t>
+        <w:t xml:space="preserve">UC8: Gestione scenari di gioco </w:t>
+      </w:r>
+      <w:r>
+        <w:rPr>
+          <w:rFonts w:ascii="Calibri" w:hAnsi="Calibri" w:cs="Calibri"/>
+        </w:rPr>
+        <w:t>e</w:t>
       </w:r>
       <w:r>
         <w:rPr>
@@ -9952,29 +9605,7 @@
           <w:i/>
           <w:iCs/>
         </w:rPr>
-        <w:t xml:space="preserve"> </w:t>
-      </w:r>
-      <w:r>
-        <w:rPr>
-          <w:rFonts w:ascii="Calibri" w:hAnsi="Calibri" w:cs="Calibri"/>
-        </w:rPr>
-        <w:t>e</w:t>
-      </w:r>
-      <w:r>
-        <w:rPr>
-          <w:rFonts w:ascii="Calibri" w:hAnsi="Calibri" w:cs="Calibri"/>
-          <w:i/>
-          <w:iCs/>
-        </w:rPr>
-        <w:t xml:space="preserve"> </w:t>
-      </w:r>
-      <w:r>
-        <w:rPr>
-          <w:rFonts w:ascii="Calibri" w:hAnsi="Calibri" w:cs="Calibri"/>
-          <w:i/>
-          <w:iCs/>
-        </w:rPr>
-        <w:t>UC9: Gestione elementi di gioco personalizzabili</w:t>
+        <w:t xml:space="preserve"> UC9: Gestione elementi di gioco personalizzabili</w:t>
       </w:r>
       <w:r>
         <w:rPr>
@@ -10076,7 +9707,7 @@
           <w:noProof/>
         </w:rPr>
         <w:drawing>
-          <wp:inline distT="0" distB="0" distL="0" distR="0" wp14:anchorId="055F0B55" wp14:editId="1D727D92">
+          <wp:inline distT="0" distB="0" distL="0" distR="0" wp14:anchorId="055F0B55" wp14:editId="69A2CBBD">
             <wp:extent cx="6120130" cy="2813685"/>
             <wp:effectExtent l="0" t="0" r="0" b="5715"/>
             <wp:docPr id="205790204" name="Immagine 6" descr="Immagine che contiene testo, schermata, diagramma, linea"/>
@@ -10193,7 +9824,6 @@
         </w:numPr>
       </w:pPr>
       <w:r>
-        <w:lastRenderedPageBreak/>
         <w:t xml:space="preserve">SD </w:t>
       </w:r>
       <w:proofErr w:type="spellStart"/>
@@ -10208,7 +9838,7 @@
           <w:noProof/>
         </w:rPr>
         <w:drawing>
-          <wp:inline distT="0" distB="0" distL="0" distR="0" wp14:anchorId="74F48C47" wp14:editId="0720AF92">
+          <wp:inline distT="0" distB="0" distL="0" distR="0" wp14:anchorId="74F48C47" wp14:editId="121FD108">
             <wp:extent cx="6120130" cy="2813685"/>
             <wp:effectExtent l="0" t="0" r="0" b="5715"/>
             <wp:docPr id="147181640" name="Immagine 8" descr="Immagine che contiene testo, schermata, diagramma, linea&#10;&#10;Il contenuto generato dall'IA potrebbe non essere corretto."/>
@@ -10274,7 +9904,7 @@
           <w:noProof/>
         </w:rPr>
         <w:drawing>
-          <wp:inline distT="0" distB="0" distL="0" distR="0" wp14:anchorId="296E85D7" wp14:editId="256AA3F5">
+          <wp:inline distT="0" distB="0" distL="0" distR="0" wp14:anchorId="296E85D7" wp14:editId="78B6A689">
             <wp:extent cx="6120130" cy="2813685"/>
             <wp:effectExtent l="0" t="0" r="0" b="5715"/>
             <wp:docPr id="1732354731" name="Immagine 9" descr="Immagine che contiene testo, diagramma, linea, schermata&#10;&#10;Il contenuto generato dall'IA potrebbe non essere corretto."/>
@@ -10337,7 +9967,6 @@
           <w:rFonts w:ascii="Calibri" w:hAnsi="Calibri" w:cs="Calibri"/>
           <w:highlight w:val="white"/>
         </w:rPr>
-        <w:lastRenderedPageBreak/>
         <w:t>4</w:t>
       </w:r>
       <w:r>
@@ -10734,7 +10363,6 @@
         <w:rPr>
           <w:rFonts w:ascii="Calibri" w:hAnsi="Calibri" w:cs="Calibri"/>
         </w:rPr>
-        <w:lastRenderedPageBreak/>
         <w:t>6.</w:t>
       </w:r>
       <w:r>
@@ -10753,11 +10381,1960 @@
       <w:bookmarkEnd w:id="17"/>
     </w:p>
     <w:p>
-      <w:pPr>
-        <w:rPr>
-          <w:highlight w:val="white"/>
-        </w:rPr>
-      </w:pPr>
+      <w:r>
+        <w:t>I test sono stati eseguiti sull</w:t>
+      </w:r>
+      <w:r>
+        <w:t>a</w:t>
+      </w:r>
+      <w:r>
+        <w:t xml:space="preserve"> seguent</w:t>
+      </w:r>
+      <w:r>
+        <w:t>e</w:t>
+      </w:r>
+      <w:r>
+        <w:t xml:space="preserve"> class</w:t>
+      </w:r>
+      <w:r>
+        <w:t>e</w:t>
+      </w:r>
+      <w:r>
+        <w:t>:</w:t>
+      </w:r>
+    </w:p>
+    <w:p>
+      <w:r>
+        <w:t>•</w:t>
+      </w:r>
+      <w:r>
+        <w:tab/>
+      </w:r>
+      <w:proofErr w:type="spellStart"/>
+      <w:r>
+        <w:t>GiocoDellOca</w:t>
+      </w:r>
+      <w:r>
+        <w:t>Test</w:t>
+      </w:r>
+      <w:proofErr w:type="spellEnd"/>
+    </w:p>
+    <w:p/>
+    <w:p>
+      <w:r>
+        <w:t xml:space="preserve">I metodi testati sono i seguenti metodi provenienti dalla classe </w:t>
+      </w:r>
+      <w:proofErr w:type="spellStart"/>
+      <w:r>
+        <w:t>GiocoDellOca</w:t>
+      </w:r>
+      <w:proofErr w:type="spellEnd"/>
+      <w:r>
+        <w:t>:</w:t>
+      </w:r>
+    </w:p>
+    <w:p>
+      <w:pPr>
+        <w:pStyle w:val="Paragrafoelenco"/>
+        <w:numPr>
+          <w:ilvl w:val="0"/>
+          <w:numId w:val="44"/>
+        </w:numPr>
+        <w:rPr>
+          <w:b/>
+          <w:bCs/>
+          <w:color w:val="153D63" w:themeColor="text2" w:themeTint="E6"/>
+        </w:rPr>
+      </w:pPr>
+      <w:proofErr w:type="spellStart"/>
+      <w:r>
+        <w:rPr>
+          <w:b/>
+          <w:bCs/>
+          <w:color w:val="153D63" w:themeColor="text2" w:themeTint="E6"/>
+        </w:rPr>
+        <w:t>void</w:t>
+      </w:r>
+      <w:proofErr w:type="spellEnd"/>
+      <w:r>
+        <w:rPr>
+          <w:b/>
+          <w:bCs/>
+          <w:color w:val="153D63" w:themeColor="text2" w:themeTint="E6"/>
+        </w:rPr>
+        <w:t xml:space="preserve"> </w:t>
+      </w:r>
+      <w:proofErr w:type="spellStart"/>
+      <w:proofErr w:type="gramStart"/>
+      <w:r>
+        <w:rPr>
+          <w:b/>
+          <w:bCs/>
+          <w:color w:val="153D63" w:themeColor="text2" w:themeTint="E6"/>
+        </w:rPr>
+        <w:t>impostazioniTest</w:t>
+      </w:r>
+      <w:proofErr w:type="spellEnd"/>
+      <w:r>
+        <w:rPr>
+          <w:b/>
+          <w:bCs/>
+          <w:color w:val="153D63" w:themeColor="text2" w:themeTint="E6"/>
+        </w:rPr>
+        <w:t>(</w:t>
+      </w:r>
+      <w:proofErr w:type="gramEnd"/>
+      <w:r>
+        <w:rPr>
+          <w:b/>
+          <w:bCs/>
+          <w:color w:val="153D63" w:themeColor="text2" w:themeTint="E6"/>
+        </w:rPr>
+        <w:t>)</w:t>
+      </w:r>
+    </w:p>
+    <w:p>
+      <w:pPr>
+        <w:pStyle w:val="Paragrafoelenco"/>
+        <w:numPr>
+          <w:ilvl w:val="0"/>
+          <w:numId w:val="44"/>
+        </w:numPr>
+        <w:rPr>
+          <w:b/>
+          <w:bCs/>
+          <w:color w:val="153D63" w:themeColor="text2" w:themeTint="E6"/>
+        </w:rPr>
+      </w:pPr>
+      <w:proofErr w:type="spellStart"/>
+      <w:r>
+        <w:rPr>
+          <w:b/>
+          <w:bCs/>
+          <w:color w:val="153D63" w:themeColor="text2" w:themeTint="E6"/>
+        </w:rPr>
+        <w:t>void</w:t>
+      </w:r>
+      <w:proofErr w:type="spellEnd"/>
+      <w:r>
+        <w:rPr>
+          <w:b/>
+          <w:bCs/>
+          <w:color w:val="153D63" w:themeColor="text2" w:themeTint="E6"/>
+        </w:rPr>
+        <w:t xml:space="preserve"> </w:t>
+      </w:r>
+      <w:proofErr w:type="spellStart"/>
+      <w:proofErr w:type="gramStart"/>
+      <w:r>
+        <w:rPr>
+          <w:b/>
+          <w:bCs/>
+          <w:color w:val="153D63" w:themeColor="text2" w:themeTint="E6"/>
+        </w:rPr>
+        <w:t>impostaRegoleSingoleTest</w:t>
+      </w:r>
+      <w:proofErr w:type="spellEnd"/>
+      <w:r>
+        <w:rPr>
+          <w:b/>
+          <w:bCs/>
+          <w:color w:val="153D63" w:themeColor="text2" w:themeTint="E6"/>
+        </w:rPr>
+        <w:t>(</w:t>
+      </w:r>
+      <w:proofErr w:type="gramEnd"/>
+      <w:r>
+        <w:rPr>
+          <w:b/>
+          <w:bCs/>
+          <w:color w:val="153D63" w:themeColor="text2" w:themeTint="E6"/>
+        </w:rPr>
+        <w:t>)</w:t>
+      </w:r>
+    </w:p>
+    <w:p>
+      <w:pPr>
+        <w:pStyle w:val="Paragrafoelenco"/>
+        <w:numPr>
+          <w:ilvl w:val="0"/>
+          <w:numId w:val="44"/>
+        </w:numPr>
+        <w:rPr>
+          <w:b/>
+          <w:bCs/>
+          <w:color w:val="153D63" w:themeColor="text2" w:themeTint="E6"/>
+        </w:rPr>
+      </w:pPr>
+      <w:proofErr w:type="spellStart"/>
+      <w:r>
+        <w:rPr>
+          <w:b/>
+          <w:bCs/>
+          <w:color w:val="153D63" w:themeColor="text2" w:themeTint="E6"/>
+        </w:rPr>
+        <w:t>void</w:t>
+      </w:r>
+      <w:proofErr w:type="spellEnd"/>
+      <w:r>
+        <w:rPr>
+          <w:b/>
+          <w:bCs/>
+          <w:color w:val="153D63" w:themeColor="text2" w:themeTint="E6"/>
+        </w:rPr>
+        <w:t xml:space="preserve"> </w:t>
+      </w:r>
+      <w:proofErr w:type="spellStart"/>
+      <w:proofErr w:type="gramStart"/>
+      <w:r>
+        <w:rPr>
+          <w:b/>
+          <w:bCs/>
+          <w:color w:val="153D63" w:themeColor="text2" w:themeTint="E6"/>
+        </w:rPr>
+        <w:t>impostaRegoleDaSetTest</w:t>
+      </w:r>
+      <w:proofErr w:type="spellEnd"/>
+      <w:r>
+        <w:rPr>
+          <w:b/>
+          <w:bCs/>
+          <w:color w:val="153D63" w:themeColor="text2" w:themeTint="E6"/>
+        </w:rPr>
+        <w:t>(</w:t>
+      </w:r>
+      <w:proofErr w:type="gramEnd"/>
+      <w:r>
+        <w:rPr>
+          <w:b/>
+          <w:bCs/>
+          <w:color w:val="153D63" w:themeColor="text2" w:themeTint="E6"/>
+        </w:rPr>
+        <w:t>)</w:t>
+      </w:r>
+    </w:p>
+    <w:p>
+      <w:pPr>
+        <w:pStyle w:val="Paragrafoelenco"/>
+        <w:numPr>
+          <w:ilvl w:val="0"/>
+          <w:numId w:val="44"/>
+        </w:numPr>
+        <w:rPr>
+          <w:b/>
+          <w:bCs/>
+          <w:color w:val="153D63" w:themeColor="text2" w:themeTint="E6"/>
+        </w:rPr>
+      </w:pPr>
+      <w:proofErr w:type="spellStart"/>
+      <w:r>
+        <w:rPr>
+          <w:b/>
+          <w:bCs/>
+          <w:color w:val="153D63" w:themeColor="text2" w:themeTint="E6"/>
+        </w:rPr>
+        <w:t>void</w:t>
+      </w:r>
+      <w:proofErr w:type="spellEnd"/>
+      <w:r>
+        <w:rPr>
+          <w:b/>
+          <w:bCs/>
+          <w:color w:val="153D63" w:themeColor="text2" w:themeTint="E6"/>
+        </w:rPr>
+        <w:t xml:space="preserve"> </w:t>
+      </w:r>
+      <w:proofErr w:type="spellStart"/>
+      <w:proofErr w:type="gramStart"/>
+      <w:r>
+        <w:rPr>
+          <w:b/>
+          <w:bCs/>
+          <w:color w:val="153D63" w:themeColor="text2" w:themeTint="E6"/>
+        </w:rPr>
+        <w:t>impostaScenarioTest</w:t>
+      </w:r>
+      <w:proofErr w:type="spellEnd"/>
+      <w:r>
+        <w:rPr>
+          <w:b/>
+          <w:bCs/>
+          <w:color w:val="153D63" w:themeColor="text2" w:themeTint="E6"/>
+        </w:rPr>
+        <w:t>(</w:t>
+      </w:r>
+      <w:proofErr w:type="gramEnd"/>
+      <w:r>
+        <w:rPr>
+          <w:b/>
+          <w:bCs/>
+          <w:color w:val="153D63" w:themeColor="text2" w:themeTint="E6"/>
+        </w:rPr>
+        <w:t>)</w:t>
+      </w:r>
+    </w:p>
+    <w:p>
+      <w:pPr>
+        <w:pStyle w:val="Paragrafoelenco"/>
+        <w:numPr>
+          <w:ilvl w:val="0"/>
+          <w:numId w:val="44"/>
+        </w:numPr>
+        <w:rPr>
+          <w:b/>
+          <w:bCs/>
+          <w:color w:val="153D63" w:themeColor="text2" w:themeTint="E6"/>
+        </w:rPr>
+      </w:pPr>
+      <w:proofErr w:type="spellStart"/>
+      <w:r>
+        <w:rPr>
+          <w:b/>
+          <w:bCs/>
+          <w:color w:val="153D63" w:themeColor="text2" w:themeTint="E6"/>
+        </w:rPr>
+        <w:t>void</w:t>
+      </w:r>
+      <w:proofErr w:type="spellEnd"/>
+      <w:r>
+        <w:rPr>
+          <w:b/>
+          <w:bCs/>
+          <w:color w:val="153D63" w:themeColor="text2" w:themeTint="E6"/>
+        </w:rPr>
+        <w:t xml:space="preserve"> </w:t>
+      </w:r>
+      <w:proofErr w:type="spellStart"/>
+      <w:proofErr w:type="gramStart"/>
+      <w:r>
+        <w:rPr>
+          <w:b/>
+          <w:bCs/>
+          <w:color w:val="153D63" w:themeColor="text2" w:themeTint="E6"/>
+        </w:rPr>
+        <w:t>impostaPedinaTest</w:t>
+      </w:r>
+      <w:proofErr w:type="spellEnd"/>
+      <w:r>
+        <w:rPr>
+          <w:b/>
+          <w:bCs/>
+          <w:color w:val="153D63" w:themeColor="text2" w:themeTint="E6"/>
+        </w:rPr>
+        <w:t>(</w:t>
+      </w:r>
+      <w:proofErr w:type="gramEnd"/>
+      <w:r>
+        <w:rPr>
+          <w:b/>
+          <w:bCs/>
+          <w:color w:val="153D63" w:themeColor="text2" w:themeTint="E6"/>
+        </w:rPr>
+        <w:t>)</w:t>
+      </w:r>
+    </w:p>
+    <w:p>
+      <w:pPr>
+        <w:pStyle w:val="Paragrafoelenco"/>
+        <w:numPr>
+          <w:ilvl w:val="0"/>
+          <w:numId w:val="44"/>
+        </w:numPr>
+        <w:rPr>
+          <w:b/>
+          <w:bCs/>
+          <w:color w:val="153D63" w:themeColor="text2" w:themeTint="E6"/>
+        </w:rPr>
+      </w:pPr>
+      <w:proofErr w:type="spellStart"/>
+      <w:r>
+        <w:rPr>
+          <w:b/>
+          <w:bCs/>
+          <w:color w:val="153D63" w:themeColor="text2" w:themeTint="E6"/>
+        </w:rPr>
+        <w:t>void</w:t>
+      </w:r>
+      <w:proofErr w:type="spellEnd"/>
+      <w:r>
+        <w:rPr>
+          <w:b/>
+          <w:bCs/>
+          <w:color w:val="153D63" w:themeColor="text2" w:themeTint="E6"/>
+        </w:rPr>
+        <w:t xml:space="preserve"> </w:t>
+      </w:r>
+      <w:proofErr w:type="spellStart"/>
+      <w:proofErr w:type="gramStart"/>
+      <w:r>
+        <w:rPr>
+          <w:b/>
+          <w:bCs/>
+          <w:color w:val="153D63" w:themeColor="text2" w:themeTint="E6"/>
+        </w:rPr>
+        <w:t>impostaDadoTest</w:t>
+      </w:r>
+      <w:proofErr w:type="spellEnd"/>
+      <w:r>
+        <w:rPr>
+          <w:b/>
+          <w:bCs/>
+          <w:color w:val="153D63" w:themeColor="text2" w:themeTint="E6"/>
+        </w:rPr>
+        <w:t>(</w:t>
+      </w:r>
+      <w:proofErr w:type="gramEnd"/>
+      <w:r>
+        <w:rPr>
+          <w:b/>
+          <w:bCs/>
+          <w:color w:val="153D63" w:themeColor="text2" w:themeTint="E6"/>
+        </w:rPr>
+        <w:t>)</w:t>
+      </w:r>
+    </w:p>
+    <w:p>
+      <w:pPr>
+        <w:pStyle w:val="Paragrafoelenco"/>
+        <w:numPr>
+          <w:ilvl w:val="0"/>
+          <w:numId w:val="44"/>
+        </w:numPr>
+        <w:rPr>
+          <w:b/>
+          <w:bCs/>
+          <w:color w:val="153D63" w:themeColor="text2" w:themeTint="E6"/>
+        </w:rPr>
+      </w:pPr>
+      <w:proofErr w:type="spellStart"/>
+      <w:r>
+        <w:rPr>
+          <w:b/>
+          <w:bCs/>
+          <w:color w:val="153D63" w:themeColor="text2" w:themeTint="E6"/>
+        </w:rPr>
+        <w:t>void</w:t>
+      </w:r>
+      <w:proofErr w:type="spellEnd"/>
+      <w:r>
+        <w:rPr>
+          <w:b/>
+          <w:bCs/>
+          <w:color w:val="153D63" w:themeColor="text2" w:themeTint="E6"/>
+        </w:rPr>
+        <w:t xml:space="preserve"> </w:t>
+      </w:r>
+      <w:proofErr w:type="spellStart"/>
+      <w:proofErr w:type="gramStart"/>
+      <w:r>
+        <w:rPr>
+          <w:b/>
+          <w:bCs/>
+          <w:color w:val="153D63" w:themeColor="text2" w:themeTint="E6"/>
+        </w:rPr>
+        <w:t>eseguiTurnoTest</w:t>
+      </w:r>
+      <w:proofErr w:type="spellEnd"/>
+      <w:r>
+        <w:rPr>
+          <w:b/>
+          <w:bCs/>
+          <w:color w:val="153D63" w:themeColor="text2" w:themeTint="E6"/>
+        </w:rPr>
+        <w:t>(</w:t>
+      </w:r>
+      <w:proofErr w:type="gramEnd"/>
+      <w:r>
+        <w:rPr>
+          <w:b/>
+          <w:bCs/>
+          <w:color w:val="153D63" w:themeColor="text2" w:themeTint="E6"/>
+        </w:rPr>
+        <w:t>)</w:t>
+      </w:r>
+    </w:p>
+    <w:p>
+      <w:pPr>
+        <w:pStyle w:val="Paragrafoelenco"/>
+        <w:numPr>
+          <w:ilvl w:val="0"/>
+          <w:numId w:val="44"/>
+        </w:numPr>
+        <w:rPr>
+          <w:b/>
+          <w:bCs/>
+          <w:color w:val="153D63" w:themeColor="text2" w:themeTint="E6"/>
+        </w:rPr>
+      </w:pPr>
+      <w:proofErr w:type="spellStart"/>
+      <w:r>
+        <w:rPr>
+          <w:b/>
+          <w:bCs/>
+          <w:color w:val="153D63" w:themeColor="text2" w:themeTint="E6"/>
+        </w:rPr>
+        <w:t>void</w:t>
+      </w:r>
+      <w:proofErr w:type="spellEnd"/>
+      <w:r>
+        <w:rPr>
+          <w:b/>
+          <w:bCs/>
+          <w:color w:val="153D63" w:themeColor="text2" w:themeTint="E6"/>
+        </w:rPr>
+        <w:t xml:space="preserve"> </w:t>
+      </w:r>
+      <w:proofErr w:type="spellStart"/>
+      <w:proofErr w:type="gramStart"/>
+      <w:r>
+        <w:rPr>
+          <w:b/>
+          <w:bCs/>
+          <w:color w:val="153D63" w:themeColor="text2" w:themeTint="E6"/>
+        </w:rPr>
+        <w:t>aggiungiGiocatoriOspitiTest</w:t>
+      </w:r>
+      <w:proofErr w:type="spellEnd"/>
+      <w:r>
+        <w:rPr>
+          <w:b/>
+          <w:bCs/>
+          <w:color w:val="153D63" w:themeColor="text2" w:themeTint="E6"/>
+        </w:rPr>
+        <w:t>(</w:t>
+      </w:r>
+      <w:proofErr w:type="gramEnd"/>
+      <w:r>
+        <w:rPr>
+          <w:b/>
+          <w:bCs/>
+          <w:color w:val="153D63" w:themeColor="text2" w:themeTint="E6"/>
+        </w:rPr>
+        <w:t>)</w:t>
+      </w:r>
+    </w:p>
+    <w:p>
+      <w:pPr>
+        <w:pStyle w:val="Paragrafoelenco"/>
+        <w:numPr>
+          <w:ilvl w:val="0"/>
+          <w:numId w:val="44"/>
+        </w:numPr>
+        <w:rPr>
+          <w:b/>
+          <w:bCs/>
+          <w:color w:val="153D63" w:themeColor="text2" w:themeTint="E6"/>
+        </w:rPr>
+      </w:pPr>
+      <w:proofErr w:type="spellStart"/>
+      <w:r>
+        <w:rPr>
+          <w:b/>
+          <w:bCs/>
+          <w:color w:val="153D63" w:themeColor="text2" w:themeTint="E6"/>
+        </w:rPr>
+        <w:t>void</w:t>
+      </w:r>
+      <w:proofErr w:type="spellEnd"/>
+      <w:r>
+        <w:rPr>
+          <w:b/>
+          <w:bCs/>
+          <w:color w:val="153D63" w:themeColor="text2" w:themeTint="E6"/>
+        </w:rPr>
+        <w:t xml:space="preserve"> </w:t>
+      </w:r>
+      <w:proofErr w:type="spellStart"/>
+      <w:proofErr w:type="gramStart"/>
+      <w:r>
+        <w:rPr>
+          <w:b/>
+          <w:bCs/>
+          <w:color w:val="153D63" w:themeColor="text2" w:themeTint="E6"/>
+        </w:rPr>
+        <w:t>configuraGiocatoreCorrenteTest</w:t>
+      </w:r>
+      <w:proofErr w:type="spellEnd"/>
+      <w:r>
+        <w:rPr>
+          <w:b/>
+          <w:bCs/>
+          <w:color w:val="153D63" w:themeColor="text2" w:themeTint="E6"/>
+        </w:rPr>
+        <w:t>(</w:t>
+      </w:r>
+      <w:proofErr w:type="gramEnd"/>
+      <w:r>
+        <w:rPr>
+          <w:b/>
+          <w:bCs/>
+          <w:color w:val="153D63" w:themeColor="text2" w:themeTint="E6"/>
+        </w:rPr>
+        <w:t>)</w:t>
+      </w:r>
+    </w:p>
+    <w:p>
+      <w:pPr>
+        <w:pStyle w:val="Paragrafoelenco"/>
+        <w:numPr>
+          <w:ilvl w:val="0"/>
+          <w:numId w:val="44"/>
+        </w:numPr>
+        <w:rPr>
+          <w:b/>
+          <w:bCs/>
+          <w:color w:val="153D63" w:themeColor="text2" w:themeTint="E6"/>
+        </w:rPr>
+      </w:pPr>
+      <w:proofErr w:type="spellStart"/>
+      <w:r>
+        <w:rPr>
+          <w:b/>
+          <w:bCs/>
+          <w:color w:val="153D63" w:themeColor="text2" w:themeTint="E6"/>
+        </w:rPr>
+        <w:t>void</w:t>
+      </w:r>
+      <w:proofErr w:type="spellEnd"/>
+      <w:r>
+        <w:rPr>
+          <w:b/>
+          <w:bCs/>
+          <w:color w:val="153D63" w:themeColor="text2" w:themeTint="E6"/>
+        </w:rPr>
+        <w:t xml:space="preserve"> </w:t>
+      </w:r>
+      <w:proofErr w:type="spellStart"/>
+      <w:proofErr w:type="gramStart"/>
+      <w:r>
+        <w:rPr>
+          <w:b/>
+          <w:bCs/>
+          <w:color w:val="153D63" w:themeColor="text2" w:themeTint="E6"/>
+        </w:rPr>
+        <w:t>autenticazioneAdminTest</w:t>
+      </w:r>
+      <w:proofErr w:type="spellEnd"/>
+      <w:r>
+        <w:rPr>
+          <w:b/>
+          <w:bCs/>
+          <w:color w:val="153D63" w:themeColor="text2" w:themeTint="E6"/>
+        </w:rPr>
+        <w:t>(</w:t>
+      </w:r>
+      <w:proofErr w:type="gramEnd"/>
+      <w:r>
+        <w:rPr>
+          <w:b/>
+          <w:bCs/>
+          <w:color w:val="153D63" w:themeColor="text2" w:themeTint="E6"/>
+        </w:rPr>
+        <w:t>)</w:t>
+      </w:r>
+    </w:p>
+    <w:p>
+      <w:pPr>
+        <w:pStyle w:val="Paragrafoelenco"/>
+        <w:numPr>
+          <w:ilvl w:val="0"/>
+          <w:numId w:val="44"/>
+        </w:numPr>
+        <w:rPr>
+          <w:b/>
+          <w:bCs/>
+          <w:color w:val="153D63" w:themeColor="text2" w:themeTint="E6"/>
+          <w:lang w:val="en-US"/>
+        </w:rPr>
+      </w:pPr>
+      <w:r>
+        <w:rPr>
+          <w:b/>
+          <w:bCs/>
+          <w:color w:val="153D63" w:themeColor="text2" w:themeTint="E6"/>
+          <w:lang w:val="en-US"/>
+        </w:rPr>
+        <w:t xml:space="preserve">void </w:t>
+      </w:r>
+      <w:proofErr w:type="spellStart"/>
+      <w:proofErr w:type="gramStart"/>
+      <w:r>
+        <w:rPr>
+          <w:b/>
+          <w:bCs/>
+          <w:color w:val="153D63" w:themeColor="text2" w:themeTint="E6"/>
+          <w:lang w:val="en-US"/>
+        </w:rPr>
+        <w:t>replaceAllScenariTest</w:t>
+      </w:r>
+      <w:proofErr w:type="spellEnd"/>
+      <w:r>
+        <w:rPr>
+          <w:b/>
+          <w:bCs/>
+          <w:color w:val="153D63" w:themeColor="text2" w:themeTint="E6"/>
+          <w:lang w:val="en-US"/>
+        </w:rPr>
+        <w:t>(</w:t>
+      </w:r>
+      <w:proofErr w:type="gramEnd"/>
+      <w:r>
+        <w:rPr>
+          <w:b/>
+          <w:bCs/>
+          <w:color w:val="153D63" w:themeColor="text2" w:themeTint="E6"/>
+          <w:lang w:val="en-US"/>
+        </w:rPr>
+        <w:t>)</w:t>
+      </w:r>
+    </w:p>
+    <w:p>
+      <w:pPr>
+        <w:pStyle w:val="Paragrafoelenco"/>
+        <w:numPr>
+          <w:ilvl w:val="0"/>
+          <w:numId w:val="44"/>
+        </w:numPr>
+        <w:rPr>
+          <w:b/>
+          <w:bCs/>
+          <w:color w:val="153D63" w:themeColor="text2" w:themeTint="E6"/>
+          <w:lang w:val="en-US"/>
+        </w:rPr>
+      </w:pPr>
+      <w:r>
+        <w:rPr>
+          <w:b/>
+          <w:bCs/>
+          <w:color w:val="153D63" w:themeColor="text2" w:themeTint="E6"/>
+          <w:lang w:val="en-US"/>
+        </w:rPr>
+        <w:t xml:space="preserve">void </w:t>
+      </w:r>
+      <w:proofErr w:type="spellStart"/>
+      <w:proofErr w:type="gramStart"/>
+      <w:r>
+        <w:rPr>
+          <w:b/>
+          <w:bCs/>
+          <w:color w:val="153D63" w:themeColor="text2" w:themeTint="E6"/>
+          <w:lang w:val="en-US"/>
+        </w:rPr>
+        <w:t>replaceAllRegoleTest</w:t>
+      </w:r>
+      <w:proofErr w:type="spellEnd"/>
+      <w:r>
+        <w:rPr>
+          <w:b/>
+          <w:bCs/>
+          <w:color w:val="153D63" w:themeColor="text2" w:themeTint="E6"/>
+          <w:lang w:val="en-US"/>
+        </w:rPr>
+        <w:t>(</w:t>
+      </w:r>
+      <w:proofErr w:type="gramEnd"/>
+      <w:r>
+        <w:rPr>
+          <w:b/>
+          <w:bCs/>
+          <w:color w:val="153D63" w:themeColor="text2" w:themeTint="E6"/>
+          <w:lang w:val="en-US"/>
+        </w:rPr>
+        <w:t>)</w:t>
+      </w:r>
+    </w:p>
+    <w:p>
+      <w:pPr>
+        <w:pStyle w:val="Paragrafoelenco"/>
+        <w:numPr>
+          <w:ilvl w:val="0"/>
+          <w:numId w:val="44"/>
+        </w:numPr>
+        <w:rPr>
+          <w:b/>
+          <w:bCs/>
+          <w:color w:val="153D63" w:themeColor="text2" w:themeTint="E6"/>
+          <w:lang w:val="en-US"/>
+        </w:rPr>
+      </w:pPr>
+      <w:r>
+        <w:rPr>
+          <w:b/>
+          <w:bCs/>
+          <w:color w:val="153D63" w:themeColor="text2" w:themeTint="E6"/>
+          <w:lang w:val="en-US"/>
+        </w:rPr>
+        <w:t xml:space="preserve">void </w:t>
+      </w:r>
+      <w:proofErr w:type="spellStart"/>
+      <w:proofErr w:type="gramStart"/>
+      <w:r>
+        <w:rPr>
+          <w:b/>
+          <w:bCs/>
+          <w:color w:val="153D63" w:themeColor="text2" w:themeTint="E6"/>
+          <w:lang w:val="en-US"/>
+        </w:rPr>
+        <w:t>replaceAllPersonalizzazioniTest</w:t>
+      </w:r>
+      <w:proofErr w:type="spellEnd"/>
+      <w:r>
+        <w:rPr>
+          <w:b/>
+          <w:bCs/>
+          <w:color w:val="153D63" w:themeColor="text2" w:themeTint="E6"/>
+          <w:lang w:val="en-US"/>
+        </w:rPr>
+        <w:t>(</w:t>
+      </w:r>
+      <w:proofErr w:type="gramEnd"/>
+      <w:r>
+        <w:rPr>
+          <w:b/>
+          <w:bCs/>
+          <w:color w:val="153D63" w:themeColor="text2" w:themeTint="E6"/>
+          <w:lang w:val="en-US"/>
+        </w:rPr>
+        <w:t>)</w:t>
+      </w:r>
+    </w:p>
+    <w:p>
+      <w:pPr>
+        <w:rPr>
+          <w:lang w:val="en-US"/>
+        </w:rPr>
+      </w:pPr>
+    </w:p>
+    <w:p>
+      <w:pPr>
+        <w:rPr>
+          <w:b/>
+          <w:bCs/>
+          <w:color w:val="153D63" w:themeColor="text2" w:themeTint="E6"/>
+        </w:rPr>
+      </w:pPr>
+      <w:proofErr w:type="spellStart"/>
+      <w:r>
+        <w:rPr>
+          <w:b/>
+          <w:bCs/>
+          <w:color w:val="153D63" w:themeColor="text2" w:themeTint="E6"/>
+        </w:rPr>
+        <w:t>void</w:t>
+      </w:r>
+      <w:proofErr w:type="spellEnd"/>
+      <w:r>
+        <w:rPr>
+          <w:b/>
+          <w:bCs/>
+          <w:color w:val="153D63" w:themeColor="text2" w:themeTint="E6"/>
+        </w:rPr>
+        <w:t xml:space="preserve"> </w:t>
+      </w:r>
+      <w:proofErr w:type="spellStart"/>
+      <w:proofErr w:type="gramStart"/>
+      <w:r>
+        <w:rPr>
+          <w:b/>
+          <w:bCs/>
+          <w:color w:val="153D63" w:themeColor="text2" w:themeTint="E6"/>
+        </w:rPr>
+        <w:t>impostazioniTest</w:t>
+      </w:r>
+      <w:proofErr w:type="spellEnd"/>
+      <w:r>
+        <w:rPr>
+          <w:b/>
+          <w:bCs/>
+          <w:color w:val="153D63" w:themeColor="text2" w:themeTint="E6"/>
+        </w:rPr>
+        <w:t>(</w:t>
+      </w:r>
+      <w:proofErr w:type="gramEnd"/>
+      <w:r>
+        <w:rPr>
+          <w:b/>
+          <w:bCs/>
+          <w:color w:val="153D63" w:themeColor="text2" w:themeTint="E6"/>
+        </w:rPr>
+        <w:t>)</w:t>
+      </w:r>
+    </w:p>
+    <w:p>
+      <w:r>
+        <w:t xml:space="preserve">Test del salvataggio delle impostazioni per avviare il gioco. </w:t>
+      </w:r>
+    </w:p>
+    <w:p>
+      <w:r>
+        <w:t xml:space="preserve">Condizione iniziale: che esista la variabile </w:t>
+      </w:r>
+      <w:proofErr w:type="spellStart"/>
+      <w:r>
+        <w:t>giocoDellOca</w:t>
+      </w:r>
+      <w:proofErr w:type="spellEnd"/>
+      <w:r>
+        <w:t>.</w:t>
+      </w:r>
+    </w:p>
+    <w:p>
+      <w:r>
+        <w:t>Condizione da testare: che esistano i giocatori, personalizzazioni, scenario e regole impostate.</w:t>
+      </w:r>
+    </w:p>
+    <w:p/>
+    <w:p>
+      <w:pPr>
+        <w:rPr>
+          <w:b/>
+          <w:bCs/>
+          <w:color w:val="153D63" w:themeColor="text2" w:themeTint="E6"/>
+        </w:rPr>
+      </w:pPr>
+      <w:proofErr w:type="spellStart"/>
+      <w:r>
+        <w:rPr>
+          <w:b/>
+          <w:bCs/>
+          <w:color w:val="153D63" w:themeColor="text2" w:themeTint="E6"/>
+        </w:rPr>
+        <w:t>void</w:t>
+      </w:r>
+      <w:proofErr w:type="spellEnd"/>
+      <w:r>
+        <w:rPr>
+          <w:b/>
+          <w:bCs/>
+          <w:color w:val="153D63" w:themeColor="text2" w:themeTint="E6"/>
+        </w:rPr>
+        <w:t xml:space="preserve"> </w:t>
+      </w:r>
+      <w:proofErr w:type="spellStart"/>
+      <w:proofErr w:type="gramStart"/>
+      <w:r>
+        <w:rPr>
+          <w:b/>
+          <w:bCs/>
+          <w:color w:val="153D63" w:themeColor="text2" w:themeTint="E6"/>
+        </w:rPr>
+        <w:t>impostaRegoleSingoleTest</w:t>
+      </w:r>
+      <w:proofErr w:type="spellEnd"/>
+      <w:r>
+        <w:rPr>
+          <w:b/>
+          <w:bCs/>
+          <w:color w:val="153D63" w:themeColor="text2" w:themeTint="E6"/>
+        </w:rPr>
+        <w:t>(</w:t>
+      </w:r>
+      <w:proofErr w:type="gramEnd"/>
+      <w:r>
+        <w:rPr>
+          <w:b/>
+          <w:bCs/>
+          <w:color w:val="153D63" w:themeColor="text2" w:themeTint="E6"/>
+        </w:rPr>
+        <w:t>)</w:t>
+      </w:r>
+    </w:p>
+    <w:p>
+      <w:r>
+        <w:t>Test dell'impostazione di una Regola Singola.</w:t>
+      </w:r>
+    </w:p>
+    <w:p>
+      <w:r>
+        <w:t xml:space="preserve">Condizione iniziale: che esista una variabile </w:t>
+      </w:r>
+      <w:proofErr w:type="spellStart"/>
+      <w:r>
+        <w:t>giocoDellOca</w:t>
+      </w:r>
+      <w:proofErr w:type="spellEnd"/>
+      <w:r>
+        <w:t xml:space="preserve"> e che stia configurando una nuova Partita</w:t>
+      </w:r>
+    </w:p>
+    <w:p>
+      <w:r>
+        <w:t xml:space="preserve">Condizione da testare: perché il metodo funzioni si deve verificare che il numero di regole Attese sia uguale a quello di default se la tabella è vuota (non sono state aggiunte manualmente via </w:t>
+      </w:r>
+      <w:proofErr w:type="spellStart"/>
+      <w:r>
+        <w:t>ui</w:t>
+      </w:r>
+      <w:proofErr w:type="spellEnd"/>
+      <w:r>
+        <w:t>) oppure uguale al numero di record passato dalla tabella se piena.</w:t>
+      </w:r>
+    </w:p>
+    <w:p/>
+    <w:p>
+      <w:pPr>
+        <w:rPr>
+          <w:b/>
+          <w:bCs/>
+          <w:color w:val="153D63" w:themeColor="text2" w:themeTint="E6"/>
+        </w:rPr>
+      </w:pPr>
+      <w:proofErr w:type="spellStart"/>
+      <w:r>
+        <w:rPr>
+          <w:b/>
+          <w:bCs/>
+          <w:color w:val="153D63" w:themeColor="text2" w:themeTint="E6"/>
+        </w:rPr>
+        <w:t>void</w:t>
+      </w:r>
+      <w:proofErr w:type="spellEnd"/>
+      <w:r>
+        <w:rPr>
+          <w:b/>
+          <w:bCs/>
+          <w:color w:val="153D63" w:themeColor="text2" w:themeTint="E6"/>
+        </w:rPr>
+        <w:t xml:space="preserve"> </w:t>
+      </w:r>
+      <w:proofErr w:type="spellStart"/>
+      <w:proofErr w:type="gramStart"/>
+      <w:r>
+        <w:rPr>
+          <w:b/>
+          <w:bCs/>
+          <w:color w:val="153D63" w:themeColor="text2" w:themeTint="E6"/>
+        </w:rPr>
+        <w:t>impostaRegoleDaSetTest</w:t>
+      </w:r>
+      <w:proofErr w:type="spellEnd"/>
+      <w:r>
+        <w:rPr>
+          <w:b/>
+          <w:bCs/>
+          <w:color w:val="153D63" w:themeColor="text2" w:themeTint="E6"/>
+        </w:rPr>
+        <w:t>(</w:t>
+      </w:r>
+      <w:proofErr w:type="gramEnd"/>
+      <w:r>
+        <w:rPr>
+          <w:b/>
+          <w:bCs/>
+          <w:color w:val="153D63" w:themeColor="text2" w:themeTint="E6"/>
+        </w:rPr>
+        <w:t>)</w:t>
+      </w:r>
+    </w:p>
+    <w:p>
+      <w:r>
+        <w:t>Test dell'impostazione di un set di Regole.</w:t>
+      </w:r>
+    </w:p>
+    <w:p>
+      <w:r>
+        <w:t xml:space="preserve">Condizione iniziale: che esista una variabile </w:t>
+      </w:r>
+      <w:proofErr w:type="spellStart"/>
+      <w:r>
+        <w:t>giocoDellOca</w:t>
+      </w:r>
+      <w:proofErr w:type="spellEnd"/>
+      <w:r>
+        <w:t xml:space="preserve"> e che stia configurando una nuova Partita</w:t>
+      </w:r>
+    </w:p>
+    <w:p>
+      <w:r>
+        <w:t xml:space="preserve">Condizione da testare: perché il metodo funzioni si deve verificare che il numero di regole Attese sia uguale a quello di default se la tabella è vuota (non sono state aggiunte manualmente via </w:t>
+      </w:r>
+      <w:proofErr w:type="spellStart"/>
+      <w:r>
+        <w:t>ui</w:t>
+      </w:r>
+      <w:proofErr w:type="spellEnd"/>
+      <w:r>
+        <w:t>) oppure uguale al numero di record passato dalla tabella se piena.</w:t>
+      </w:r>
+    </w:p>
+    <w:p/>
+    <w:p>
+      <w:pPr>
+        <w:rPr>
+          <w:b/>
+          <w:bCs/>
+          <w:color w:val="153D63" w:themeColor="text2" w:themeTint="E6"/>
+        </w:rPr>
+      </w:pPr>
+      <w:proofErr w:type="spellStart"/>
+      <w:r>
+        <w:rPr>
+          <w:b/>
+          <w:bCs/>
+          <w:color w:val="153D63" w:themeColor="text2" w:themeTint="E6"/>
+        </w:rPr>
+        <w:t>void</w:t>
+      </w:r>
+      <w:proofErr w:type="spellEnd"/>
+      <w:r>
+        <w:rPr>
+          <w:b/>
+          <w:bCs/>
+          <w:color w:val="153D63" w:themeColor="text2" w:themeTint="E6"/>
+        </w:rPr>
+        <w:t xml:space="preserve"> </w:t>
+      </w:r>
+      <w:proofErr w:type="spellStart"/>
+      <w:proofErr w:type="gramStart"/>
+      <w:r>
+        <w:rPr>
+          <w:b/>
+          <w:bCs/>
+          <w:color w:val="153D63" w:themeColor="text2" w:themeTint="E6"/>
+        </w:rPr>
+        <w:t>impostaScenarioTest</w:t>
+      </w:r>
+      <w:proofErr w:type="spellEnd"/>
+      <w:r>
+        <w:rPr>
+          <w:b/>
+          <w:bCs/>
+          <w:color w:val="153D63" w:themeColor="text2" w:themeTint="E6"/>
+        </w:rPr>
+        <w:t>(</w:t>
+      </w:r>
+      <w:proofErr w:type="gramEnd"/>
+      <w:r>
+        <w:rPr>
+          <w:b/>
+          <w:bCs/>
+          <w:color w:val="153D63" w:themeColor="text2" w:themeTint="E6"/>
+        </w:rPr>
+        <w:t>)</w:t>
+      </w:r>
+    </w:p>
+    <w:p>
+      <w:r>
+        <w:t>Test dell'impostazione di uno scenario.</w:t>
+      </w:r>
+    </w:p>
+    <w:p>
+      <w:r>
+        <w:t xml:space="preserve">Condizione iniziale: che esista una variabile </w:t>
+      </w:r>
+      <w:proofErr w:type="spellStart"/>
+      <w:r>
+        <w:t>giocoDellOca</w:t>
+      </w:r>
+      <w:proofErr w:type="spellEnd"/>
+      <w:r>
+        <w:t xml:space="preserve"> e che stia configurando una nuova Partita</w:t>
+      </w:r>
+    </w:p>
+    <w:p>
+      <w:r>
+        <w:t xml:space="preserve">Condizione da testare: perché il metodo funzioni si deve verificare che lo scenario scelto esista tra quelli definiti nella lista di </w:t>
+      </w:r>
+      <w:proofErr w:type="spellStart"/>
+      <w:r>
+        <w:t>giocoDellOca</w:t>
+      </w:r>
+      <w:proofErr w:type="spellEnd"/>
+      <w:r>
+        <w:t xml:space="preserve"> altrimenti viene impostato lo scenario di default</w:t>
+      </w:r>
+    </w:p>
+    <w:p/>
+    <w:p/>
+    <w:p>
+      <w:pPr>
+        <w:rPr>
+          <w:b/>
+          <w:bCs/>
+          <w:color w:val="153D63" w:themeColor="text2" w:themeTint="E6"/>
+        </w:rPr>
+      </w:pPr>
+      <w:proofErr w:type="spellStart"/>
+      <w:r>
+        <w:rPr>
+          <w:b/>
+          <w:bCs/>
+          <w:color w:val="153D63" w:themeColor="text2" w:themeTint="E6"/>
+        </w:rPr>
+        <w:t>void</w:t>
+      </w:r>
+      <w:proofErr w:type="spellEnd"/>
+      <w:r>
+        <w:rPr>
+          <w:b/>
+          <w:bCs/>
+          <w:color w:val="153D63" w:themeColor="text2" w:themeTint="E6"/>
+        </w:rPr>
+        <w:t xml:space="preserve"> </w:t>
+      </w:r>
+      <w:proofErr w:type="spellStart"/>
+      <w:proofErr w:type="gramStart"/>
+      <w:r>
+        <w:rPr>
+          <w:b/>
+          <w:bCs/>
+          <w:color w:val="153D63" w:themeColor="text2" w:themeTint="E6"/>
+        </w:rPr>
+        <w:t>impostaPedinaTest</w:t>
+      </w:r>
+      <w:proofErr w:type="spellEnd"/>
+      <w:r>
+        <w:rPr>
+          <w:b/>
+          <w:bCs/>
+          <w:color w:val="153D63" w:themeColor="text2" w:themeTint="E6"/>
+        </w:rPr>
+        <w:t>(</w:t>
+      </w:r>
+      <w:proofErr w:type="gramEnd"/>
+      <w:r>
+        <w:rPr>
+          <w:b/>
+          <w:bCs/>
+          <w:color w:val="153D63" w:themeColor="text2" w:themeTint="E6"/>
+        </w:rPr>
+        <w:t>)</w:t>
+      </w:r>
+    </w:p>
+    <w:p>
+      <w:r>
+        <w:t>Test dell'impostazione di una pedina abbinata ad un giocatore.</w:t>
+      </w:r>
+    </w:p>
+    <w:p>
+      <w:r>
+        <w:t xml:space="preserve">Condizione iniziale: che esista una variabile </w:t>
+      </w:r>
+      <w:proofErr w:type="spellStart"/>
+      <w:r>
+        <w:t>giocoDellOca</w:t>
+      </w:r>
+      <w:proofErr w:type="spellEnd"/>
+      <w:r>
+        <w:t xml:space="preserve"> e che stia configurando una nuova Partita e che esista un giocatore per poter associare la pedina</w:t>
+      </w:r>
+    </w:p>
+    <w:p>
+      <w:r>
+        <w:t>Condizione da testare: perché il metodo funzioni si deve verificare che la pedina scelta esista e sia stata associata correttamente al giocatore</w:t>
+      </w:r>
+    </w:p>
+    <w:p/>
+    <w:p>
+      <w:pPr>
+        <w:rPr>
+          <w:b/>
+          <w:bCs/>
+          <w:color w:val="153D63" w:themeColor="text2" w:themeTint="E6"/>
+        </w:rPr>
+      </w:pPr>
+      <w:proofErr w:type="spellStart"/>
+      <w:r>
+        <w:rPr>
+          <w:b/>
+          <w:bCs/>
+          <w:color w:val="153D63" w:themeColor="text2" w:themeTint="E6"/>
+        </w:rPr>
+        <w:t>void</w:t>
+      </w:r>
+      <w:proofErr w:type="spellEnd"/>
+      <w:r>
+        <w:rPr>
+          <w:b/>
+          <w:bCs/>
+          <w:color w:val="153D63" w:themeColor="text2" w:themeTint="E6"/>
+        </w:rPr>
+        <w:t xml:space="preserve"> </w:t>
+      </w:r>
+      <w:proofErr w:type="spellStart"/>
+      <w:proofErr w:type="gramStart"/>
+      <w:r>
+        <w:rPr>
+          <w:b/>
+          <w:bCs/>
+          <w:color w:val="153D63" w:themeColor="text2" w:themeTint="E6"/>
+        </w:rPr>
+        <w:t>impostaDadoTest</w:t>
+      </w:r>
+      <w:proofErr w:type="spellEnd"/>
+      <w:r>
+        <w:rPr>
+          <w:b/>
+          <w:bCs/>
+          <w:color w:val="153D63" w:themeColor="text2" w:themeTint="E6"/>
+        </w:rPr>
+        <w:t>(</w:t>
+      </w:r>
+      <w:proofErr w:type="gramEnd"/>
+      <w:r>
+        <w:rPr>
+          <w:b/>
+          <w:bCs/>
+          <w:color w:val="153D63" w:themeColor="text2" w:themeTint="E6"/>
+        </w:rPr>
+        <w:t>)</w:t>
+      </w:r>
+    </w:p>
+    <w:p>
+      <w:r>
+        <w:t>Test dell'impostazione di un dado abbinato ad un giocatore.</w:t>
+      </w:r>
+    </w:p>
+    <w:p>
+      <w:r>
+        <w:t xml:space="preserve">Condizione iniziale: che esista una variabile </w:t>
+      </w:r>
+      <w:proofErr w:type="spellStart"/>
+      <w:r>
+        <w:t>giocoDellOca</w:t>
+      </w:r>
+      <w:proofErr w:type="spellEnd"/>
+      <w:r>
+        <w:t xml:space="preserve"> e che stia configurando una nuova Partita e che esista un giocatore per poter associare il dado.</w:t>
+      </w:r>
+    </w:p>
+    <w:p>
+      <w:r>
+        <w:t>Condizione da testare: perché il metodo funzioni si deve verificare che il dado scelto esista e sia stata associato correttamente al giocatore.</w:t>
+      </w:r>
+    </w:p>
+    <w:p/>
+    <w:p>
+      <w:pPr>
+        <w:rPr>
+          <w:b/>
+          <w:bCs/>
+          <w:color w:val="153D63" w:themeColor="text2" w:themeTint="E6"/>
+        </w:rPr>
+      </w:pPr>
+      <w:proofErr w:type="spellStart"/>
+      <w:r>
+        <w:rPr>
+          <w:b/>
+          <w:bCs/>
+          <w:color w:val="153D63" w:themeColor="text2" w:themeTint="E6"/>
+        </w:rPr>
+        <w:t>void</w:t>
+      </w:r>
+      <w:proofErr w:type="spellEnd"/>
+      <w:r>
+        <w:rPr>
+          <w:b/>
+          <w:bCs/>
+          <w:color w:val="153D63" w:themeColor="text2" w:themeTint="E6"/>
+        </w:rPr>
+        <w:t xml:space="preserve"> </w:t>
+      </w:r>
+      <w:proofErr w:type="spellStart"/>
+      <w:proofErr w:type="gramStart"/>
+      <w:r>
+        <w:rPr>
+          <w:b/>
+          <w:bCs/>
+          <w:color w:val="153D63" w:themeColor="text2" w:themeTint="E6"/>
+        </w:rPr>
+        <w:t>eseguiTurnoTest</w:t>
+      </w:r>
+      <w:proofErr w:type="spellEnd"/>
+      <w:r>
+        <w:rPr>
+          <w:b/>
+          <w:bCs/>
+          <w:color w:val="153D63" w:themeColor="text2" w:themeTint="E6"/>
+        </w:rPr>
+        <w:t>(</w:t>
+      </w:r>
+      <w:proofErr w:type="gramEnd"/>
+      <w:r>
+        <w:rPr>
+          <w:b/>
+          <w:bCs/>
+          <w:color w:val="153D63" w:themeColor="text2" w:themeTint="E6"/>
+        </w:rPr>
+        <w:t>)</w:t>
+      </w:r>
+    </w:p>
+    <w:p>
+      <w:r>
+        <w:t>Test dell'esecuzione di un turno di un giocatore.</w:t>
+      </w:r>
+    </w:p>
+    <w:p>
+      <w:r>
+        <w:t xml:space="preserve">Condizione iniziale: che esista una variabile </w:t>
+      </w:r>
+      <w:proofErr w:type="spellStart"/>
+      <w:r>
+        <w:t>giocoDellOca</w:t>
+      </w:r>
+      <w:proofErr w:type="spellEnd"/>
+      <w:r>
+        <w:t>, che abbia configurato una nuova Partita e l'abbia avviata.</w:t>
+      </w:r>
+    </w:p>
+    <w:p>
+      <w:r>
+        <w:t>Condizione da testare: perché il metodo funzioni si deve verificare che la funzione restituisca una mossa non vuota sotto forma di messaggio (la natura del risultato è casuale, l'importante è che non sia vuota)</w:t>
+      </w:r>
+    </w:p>
+    <w:p/>
+    <w:p/>
+    <w:p>
+      <w:pPr>
+        <w:rPr>
+          <w:b/>
+          <w:bCs/>
+          <w:color w:val="153D63" w:themeColor="text2" w:themeTint="E6"/>
+        </w:rPr>
+      </w:pPr>
+      <w:proofErr w:type="spellStart"/>
+      <w:r>
+        <w:rPr>
+          <w:b/>
+          <w:bCs/>
+          <w:color w:val="153D63" w:themeColor="text2" w:themeTint="E6"/>
+        </w:rPr>
+        <w:t>void</w:t>
+      </w:r>
+      <w:proofErr w:type="spellEnd"/>
+      <w:r>
+        <w:rPr>
+          <w:b/>
+          <w:bCs/>
+          <w:color w:val="153D63" w:themeColor="text2" w:themeTint="E6"/>
+        </w:rPr>
+        <w:t xml:space="preserve"> </w:t>
+      </w:r>
+      <w:proofErr w:type="spellStart"/>
+      <w:proofErr w:type="gramStart"/>
+      <w:r>
+        <w:rPr>
+          <w:b/>
+          <w:bCs/>
+          <w:color w:val="153D63" w:themeColor="text2" w:themeTint="E6"/>
+        </w:rPr>
+        <w:t>aggiungiGiocatoriOspitiTest</w:t>
+      </w:r>
+      <w:proofErr w:type="spellEnd"/>
+      <w:r>
+        <w:rPr>
+          <w:b/>
+          <w:bCs/>
+          <w:color w:val="153D63" w:themeColor="text2" w:themeTint="E6"/>
+        </w:rPr>
+        <w:t>(</w:t>
+      </w:r>
+      <w:proofErr w:type="gramEnd"/>
+      <w:r>
+        <w:rPr>
+          <w:b/>
+          <w:bCs/>
+          <w:color w:val="153D63" w:themeColor="text2" w:themeTint="E6"/>
+        </w:rPr>
+        <w:t>)</w:t>
+      </w:r>
+    </w:p>
+    <w:p>
+      <w:r>
+        <w:t>Test dell'aggiunta giocatori ospiti.</w:t>
+      </w:r>
+    </w:p>
+    <w:p>
+      <w:r>
+        <w:t xml:space="preserve">Condizione iniziale: che esista una variabile </w:t>
+      </w:r>
+      <w:proofErr w:type="spellStart"/>
+      <w:r>
+        <w:t>giocoDellOca</w:t>
+      </w:r>
+      <w:proofErr w:type="spellEnd"/>
+      <w:r>
+        <w:t>, che stia configurando una Partita.</w:t>
+      </w:r>
+    </w:p>
+    <w:p>
+      <w:r>
+        <w:t>Condizione da testare: perché il metodo funzioni si deve verificare che il numero di giocatori aggiunti corrisponda effettivamente al numero di giocatori registrato per la partita corrente.</w:t>
+      </w:r>
+    </w:p>
+    <w:p/>
+    <w:p/>
+    <w:p>
+      <w:pPr>
+        <w:rPr>
+          <w:b/>
+          <w:bCs/>
+          <w:color w:val="153D63" w:themeColor="text2" w:themeTint="E6"/>
+        </w:rPr>
+      </w:pPr>
+      <w:proofErr w:type="spellStart"/>
+      <w:r>
+        <w:rPr>
+          <w:b/>
+          <w:bCs/>
+          <w:color w:val="153D63" w:themeColor="text2" w:themeTint="E6"/>
+        </w:rPr>
+        <w:t>void</w:t>
+      </w:r>
+      <w:proofErr w:type="spellEnd"/>
+      <w:r>
+        <w:rPr>
+          <w:b/>
+          <w:bCs/>
+          <w:color w:val="153D63" w:themeColor="text2" w:themeTint="E6"/>
+        </w:rPr>
+        <w:t xml:space="preserve"> </w:t>
+      </w:r>
+      <w:proofErr w:type="spellStart"/>
+      <w:proofErr w:type="gramStart"/>
+      <w:r>
+        <w:rPr>
+          <w:b/>
+          <w:bCs/>
+          <w:color w:val="153D63" w:themeColor="text2" w:themeTint="E6"/>
+        </w:rPr>
+        <w:t>configuraGiocatoreCorrenteTest</w:t>
+      </w:r>
+      <w:proofErr w:type="spellEnd"/>
+      <w:r>
+        <w:rPr>
+          <w:b/>
+          <w:bCs/>
+          <w:color w:val="153D63" w:themeColor="text2" w:themeTint="E6"/>
+        </w:rPr>
+        <w:t>(</w:t>
+      </w:r>
+      <w:proofErr w:type="gramEnd"/>
+      <w:r>
+        <w:rPr>
+          <w:b/>
+          <w:bCs/>
+          <w:color w:val="153D63" w:themeColor="text2" w:themeTint="E6"/>
+        </w:rPr>
+        <w:t>)</w:t>
+      </w:r>
+    </w:p>
+    <w:p>
+      <w:r>
+        <w:t>Test della configurazione giocatore corrente da fare muovere lungo il tabellone.</w:t>
+      </w:r>
+    </w:p>
+    <w:p>
+      <w:r>
+        <w:t xml:space="preserve">Condizione iniziale: che esista una variabile </w:t>
+      </w:r>
+      <w:proofErr w:type="spellStart"/>
+      <w:r>
+        <w:t>giocoDellOca</w:t>
+      </w:r>
+      <w:proofErr w:type="spellEnd"/>
+      <w:r>
+        <w:t>, che stia configurando o abbia già configurato una nuova Partita.</w:t>
+      </w:r>
+    </w:p>
+    <w:p>
+      <w:r>
+        <w:t xml:space="preserve">Condizione da testare: perché il metodo funzioni si deve verificare </w:t>
+      </w:r>
+      <w:proofErr w:type="gramStart"/>
+      <w:r>
+        <w:t>che</w:t>
+      </w:r>
+      <w:proofErr w:type="gramEnd"/>
+      <w:r>
+        <w:t xml:space="preserve"> se le tabelle preposte alla definizione di pedina e dado sono vuote, vengano associate delle personalizzazioni di default, e il giocatore viene impostato come giocatore corrente</w:t>
+      </w:r>
+    </w:p>
+    <w:p/>
+    <w:p/>
+    <w:p>
+      <w:pPr>
+        <w:rPr>
+          <w:b/>
+          <w:bCs/>
+          <w:color w:val="153D63" w:themeColor="text2" w:themeTint="E6"/>
+        </w:rPr>
+      </w:pPr>
+      <w:proofErr w:type="spellStart"/>
+      <w:r>
+        <w:rPr>
+          <w:b/>
+          <w:bCs/>
+          <w:color w:val="153D63" w:themeColor="text2" w:themeTint="E6"/>
+        </w:rPr>
+        <w:t>void</w:t>
+      </w:r>
+      <w:proofErr w:type="spellEnd"/>
+      <w:r>
+        <w:rPr>
+          <w:b/>
+          <w:bCs/>
+          <w:color w:val="153D63" w:themeColor="text2" w:themeTint="E6"/>
+        </w:rPr>
+        <w:t xml:space="preserve"> </w:t>
+      </w:r>
+      <w:proofErr w:type="spellStart"/>
+      <w:proofErr w:type="gramStart"/>
+      <w:r>
+        <w:rPr>
+          <w:b/>
+          <w:bCs/>
+          <w:color w:val="153D63" w:themeColor="text2" w:themeTint="E6"/>
+        </w:rPr>
+        <w:t>autenticazioneAdminTest</w:t>
+      </w:r>
+      <w:proofErr w:type="spellEnd"/>
+      <w:r>
+        <w:rPr>
+          <w:b/>
+          <w:bCs/>
+          <w:color w:val="153D63" w:themeColor="text2" w:themeTint="E6"/>
+        </w:rPr>
+        <w:t>(</w:t>
+      </w:r>
+      <w:proofErr w:type="gramEnd"/>
+      <w:r>
+        <w:rPr>
+          <w:b/>
+          <w:bCs/>
+          <w:color w:val="153D63" w:themeColor="text2" w:themeTint="E6"/>
+        </w:rPr>
+        <w:t>)</w:t>
+      </w:r>
+    </w:p>
+    <w:p>
+      <w:r>
+        <w:t>Test della autenticazione come admin per poter definire le operazioni</w:t>
+      </w:r>
+    </w:p>
+    <w:p>
+      <w:r>
+        <w:t xml:space="preserve">Condizione iniziale: che esista una variabile </w:t>
+      </w:r>
+      <w:proofErr w:type="spellStart"/>
+      <w:r>
+        <w:t>giocoDellOca</w:t>
+      </w:r>
+      <w:proofErr w:type="spellEnd"/>
+      <w:r>
+        <w:t>, che si voglia accedere con privilegi elevati.</w:t>
+      </w:r>
+    </w:p>
+    <w:p>
+      <w:r>
+        <w:t xml:space="preserve">Condizione da testare: perché il metodo funzioni si deve passare in input la coppia corretta username e password admin </w:t>
+      </w:r>
+      <w:proofErr w:type="spellStart"/>
+      <w:r>
+        <w:t>admin</w:t>
+      </w:r>
+      <w:proofErr w:type="spellEnd"/>
+      <w:r>
+        <w:t xml:space="preserve">, altrimenti viene restituito un </w:t>
+      </w:r>
+      <w:proofErr w:type="spellStart"/>
+      <w:r>
+        <w:t>bool</w:t>
+      </w:r>
+      <w:proofErr w:type="spellEnd"/>
+      <w:r>
+        <w:t xml:space="preserve"> che blocca la funzionalità</w:t>
+      </w:r>
+    </w:p>
+    <w:p/>
+    <w:p>
+      <w:pPr>
+        <w:rPr>
+          <w:b/>
+          <w:bCs/>
+          <w:color w:val="153D63" w:themeColor="text2" w:themeTint="E6"/>
+        </w:rPr>
+      </w:pPr>
+      <w:proofErr w:type="spellStart"/>
+      <w:r>
+        <w:rPr>
+          <w:b/>
+          <w:bCs/>
+          <w:color w:val="153D63" w:themeColor="text2" w:themeTint="E6"/>
+        </w:rPr>
+        <w:t>void</w:t>
+      </w:r>
+      <w:proofErr w:type="spellEnd"/>
+      <w:r>
+        <w:rPr>
+          <w:b/>
+          <w:bCs/>
+          <w:color w:val="153D63" w:themeColor="text2" w:themeTint="E6"/>
+        </w:rPr>
+        <w:t xml:space="preserve"> </w:t>
+      </w:r>
+      <w:proofErr w:type="spellStart"/>
+      <w:proofErr w:type="gramStart"/>
+      <w:r>
+        <w:rPr>
+          <w:b/>
+          <w:bCs/>
+          <w:color w:val="153D63" w:themeColor="text2" w:themeTint="E6"/>
+        </w:rPr>
+        <w:t>replaceAllScenariTest</w:t>
+      </w:r>
+      <w:proofErr w:type="spellEnd"/>
+      <w:r>
+        <w:rPr>
+          <w:b/>
+          <w:bCs/>
+          <w:color w:val="153D63" w:themeColor="text2" w:themeTint="E6"/>
+        </w:rPr>
+        <w:t>(</w:t>
+      </w:r>
+      <w:proofErr w:type="gramEnd"/>
+      <w:r>
+        <w:rPr>
+          <w:b/>
+          <w:bCs/>
+          <w:color w:val="153D63" w:themeColor="text2" w:themeTint="E6"/>
+        </w:rPr>
+        <w:t>)</w:t>
+      </w:r>
+    </w:p>
+    <w:p>
+      <w:r>
+        <w:t>Test rimpiazzo scenari di default con scenari nuovi.</w:t>
+      </w:r>
+    </w:p>
+    <w:p>
+      <w:r>
+        <w:t xml:space="preserve">Condizione iniziale: che esista una variabile </w:t>
+      </w:r>
+      <w:proofErr w:type="spellStart"/>
+      <w:r>
+        <w:t>giocoDellOca</w:t>
+      </w:r>
+      <w:proofErr w:type="spellEnd"/>
+      <w:r>
+        <w:t>, che gli scenari vecchi esistano già per poter fare il confronto.</w:t>
+      </w:r>
+    </w:p>
+    <w:p>
+      <w:r>
+        <w:t xml:space="preserve">Condizione da testare: perché il metodo funzioni si deve verificare che i nuovi elementi siano effettivamente restituiti dalla </w:t>
+      </w:r>
+      <w:proofErr w:type="spellStart"/>
+      <w:r>
+        <w:t>getListaScenari</w:t>
+      </w:r>
+      <w:proofErr w:type="spellEnd"/>
+      <w:r>
+        <w:t xml:space="preserve"> di </w:t>
+      </w:r>
+      <w:proofErr w:type="spellStart"/>
+      <w:r>
+        <w:t>giocoDellOca</w:t>
+      </w:r>
+      <w:proofErr w:type="spellEnd"/>
+      <w:r>
+        <w:t xml:space="preserve"> e siano diversi dai vecchi.</w:t>
+      </w:r>
+    </w:p>
+    <w:p/>
+    <w:p>
+      <w:pPr>
+        <w:rPr>
+          <w:b/>
+          <w:bCs/>
+          <w:color w:val="153D63" w:themeColor="text2" w:themeTint="E6"/>
+        </w:rPr>
+      </w:pPr>
+      <w:proofErr w:type="spellStart"/>
+      <w:r>
+        <w:rPr>
+          <w:b/>
+          <w:bCs/>
+          <w:color w:val="153D63" w:themeColor="text2" w:themeTint="E6"/>
+        </w:rPr>
+        <w:t>void</w:t>
+      </w:r>
+      <w:proofErr w:type="spellEnd"/>
+      <w:r>
+        <w:rPr>
+          <w:b/>
+          <w:bCs/>
+          <w:color w:val="153D63" w:themeColor="text2" w:themeTint="E6"/>
+        </w:rPr>
+        <w:t xml:space="preserve"> </w:t>
+      </w:r>
+      <w:proofErr w:type="spellStart"/>
+      <w:proofErr w:type="gramStart"/>
+      <w:r>
+        <w:rPr>
+          <w:b/>
+          <w:bCs/>
+          <w:color w:val="153D63" w:themeColor="text2" w:themeTint="E6"/>
+        </w:rPr>
+        <w:t>replaceAllRegoleTest</w:t>
+      </w:r>
+      <w:proofErr w:type="spellEnd"/>
+      <w:r>
+        <w:rPr>
+          <w:b/>
+          <w:bCs/>
+          <w:color w:val="153D63" w:themeColor="text2" w:themeTint="E6"/>
+        </w:rPr>
+        <w:t>(</w:t>
+      </w:r>
+      <w:proofErr w:type="gramEnd"/>
+      <w:r>
+        <w:rPr>
+          <w:b/>
+          <w:bCs/>
+          <w:color w:val="153D63" w:themeColor="text2" w:themeTint="E6"/>
+        </w:rPr>
+        <w:t>)</w:t>
+      </w:r>
+    </w:p>
+    <w:p>
+      <w:r>
+        <w:t>Test rimpiazzo set regole di default con regole nuovi.</w:t>
+      </w:r>
+    </w:p>
+    <w:p>
+      <w:r>
+        <w:t xml:space="preserve">Condizione iniziale: che esista una variabile </w:t>
+      </w:r>
+      <w:proofErr w:type="spellStart"/>
+      <w:r>
+        <w:t>giocoDellOca</w:t>
+      </w:r>
+      <w:proofErr w:type="spellEnd"/>
+      <w:r>
+        <w:t>, che i set di regole vecchi esistano già per poter fare il confronto.</w:t>
+      </w:r>
+    </w:p>
+    <w:p>
+      <w:r>
+        <w:t xml:space="preserve">Condizione da testare: perché il metodo funzioni si deve verificare che i nuovi elementi siano effettivamente restituiti dalla </w:t>
+      </w:r>
+      <w:proofErr w:type="spellStart"/>
+      <w:r>
+        <w:t>getMapRegoleSet</w:t>
+      </w:r>
+      <w:proofErr w:type="spellEnd"/>
+      <w:r>
+        <w:t xml:space="preserve"> di </w:t>
+      </w:r>
+      <w:proofErr w:type="spellStart"/>
+      <w:r>
+        <w:t>giocoDellOca</w:t>
+      </w:r>
+      <w:proofErr w:type="spellEnd"/>
+      <w:r>
+        <w:t xml:space="preserve"> e siano diversi dai vecchi.</w:t>
+      </w:r>
+    </w:p>
+    <w:p/>
+    <w:p>
+      <w:pPr>
+        <w:rPr>
+          <w:b/>
+          <w:bCs/>
+          <w:color w:val="153D63" w:themeColor="text2" w:themeTint="E6"/>
+        </w:rPr>
+      </w:pPr>
+      <w:proofErr w:type="spellStart"/>
+      <w:r>
+        <w:rPr>
+          <w:b/>
+          <w:bCs/>
+          <w:color w:val="153D63" w:themeColor="text2" w:themeTint="E6"/>
+        </w:rPr>
+        <w:t>void</w:t>
+      </w:r>
+      <w:proofErr w:type="spellEnd"/>
+      <w:r>
+        <w:rPr>
+          <w:b/>
+          <w:bCs/>
+          <w:color w:val="153D63" w:themeColor="text2" w:themeTint="E6"/>
+        </w:rPr>
+        <w:t xml:space="preserve"> </w:t>
+      </w:r>
+      <w:proofErr w:type="spellStart"/>
+      <w:proofErr w:type="gramStart"/>
+      <w:r>
+        <w:rPr>
+          <w:b/>
+          <w:bCs/>
+          <w:color w:val="153D63" w:themeColor="text2" w:themeTint="E6"/>
+        </w:rPr>
+        <w:t>replaceAllPersonalizzazioniTest</w:t>
+      </w:r>
+      <w:proofErr w:type="spellEnd"/>
+      <w:r>
+        <w:rPr>
+          <w:b/>
+          <w:bCs/>
+          <w:color w:val="153D63" w:themeColor="text2" w:themeTint="E6"/>
+        </w:rPr>
+        <w:t>(</w:t>
+      </w:r>
+      <w:proofErr w:type="gramEnd"/>
+      <w:r>
+        <w:rPr>
+          <w:b/>
+          <w:bCs/>
+          <w:color w:val="153D63" w:themeColor="text2" w:themeTint="E6"/>
+        </w:rPr>
+        <w:t>)</w:t>
+      </w:r>
+    </w:p>
+    <w:p>
+      <w:r>
+        <w:t>Test rimpiazzo personalizzazioni di default con personalizzazioni nuove.</w:t>
+      </w:r>
+    </w:p>
+    <w:p>
+      <w:r>
+        <w:t xml:space="preserve">Condizione iniziale: che esista una variabile </w:t>
+      </w:r>
+      <w:proofErr w:type="spellStart"/>
+      <w:r>
+        <w:t>giocoDellOca</w:t>
+      </w:r>
+      <w:proofErr w:type="spellEnd"/>
+      <w:r>
+        <w:t>, che le personalizzazioni vecchie esistano già per poter fare il confronto.</w:t>
+      </w:r>
+    </w:p>
+    <w:p>
+      <w:pPr>
+        <w:rPr>
+          <w:highlight w:val="white"/>
+        </w:rPr>
+      </w:pPr>
+      <w:r>
+        <w:t xml:space="preserve">Condizione da testare: perché il metodo funzioni si deve verificare che i nuovi elementi siano effettivamente restituiti dalla </w:t>
+      </w:r>
+      <w:proofErr w:type="spellStart"/>
+      <w:r>
+        <w:t>getListaPersonalizzazioni</w:t>
+      </w:r>
+      <w:proofErr w:type="spellEnd"/>
+      <w:r>
+        <w:t xml:space="preserve"> di </w:t>
+      </w:r>
+      <w:proofErr w:type="spellStart"/>
+      <w:r>
+        <w:t>giocoDellOca</w:t>
+      </w:r>
+      <w:proofErr w:type="spellEnd"/>
+      <w:r>
+        <w:t xml:space="preserve"> e siano diversi dai vecchi.</w:t>
+      </w:r>
     </w:p>
     <w:p>
       <w:pPr>
@@ -10890,6 +12467,7 @@
           <w:dataBinding w:prefixMappings="xmlns:ns0='http://purl.org/dc/elements/1.1/' xmlns:ns1='http://schemas.openxmlformats.org/package/2006/metadata/core-properties' " w:xpath="/ns1:coreProperties[1]/ns0:creator[1]" w:storeItemID="{6C3C8BC8-F283-45AE-878A-BAB7291924A1}"/>
           <w:text/>
         </w:sdtPr>
+        <w:sdtEndPr/>
         <w:sdtContent>
           <w:tc>
             <w:tcPr>
@@ -11053,6 +12631,7 @@
         <w:dataBinding w:prefixMappings="xmlns:ns0='http://purl.org/dc/elements/1.1/' xmlns:ns1='http://schemas.openxmlformats.org/package/2006/metadata/core-properties' " w:xpath="/ns1:coreProperties[1]/ns0:title[1]" w:storeItemID="{6C3C8BC8-F283-45AE-878A-BAB7291924A1}"/>
         <w:text/>
       </w:sdtPr>
+      <w:sdtEndPr/>
       <w:sdtContent>
         <w:r>
           <w:rPr>
@@ -12086,6 +13665,92 @@
     </w:lvl>
   </w:abstractNum>
   <w:abstractNum w:abstractNumId="11" w15:restartNumberingAfterBreak="0">
+    <w:nsid w:val="152D0A82"/>
+    <w:multiLevelType w:val="hybridMultilevel"/>
+    <w:tmpl w:val="82A4696C"/>
+    <w:lvl w:ilvl="0" w:tplc="0410000F">
+      <w:start w:val="1"/>
+      <w:numFmt w:val="decimal"/>
+      <w:lvlText w:val="%1."/>
+      <w:lvlJc w:val="left"/>
+      <w:pPr>
+        <w:ind w:left="720" w:hanging="360"/>
+      </w:pPr>
+    </w:lvl>
+    <w:lvl w:ilvl="1" w:tplc="04100019" w:tentative="1">
+      <w:start w:val="1"/>
+      <w:numFmt w:val="lowerLetter"/>
+      <w:lvlText w:val="%2."/>
+      <w:lvlJc w:val="left"/>
+      <w:pPr>
+        <w:ind w:left="1440" w:hanging="360"/>
+      </w:pPr>
+    </w:lvl>
+    <w:lvl w:ilvl="2" w:tplc="0410001B" w:tentative="1">
+      <w:start w:val="1"/>
+      <w:numFmt w:val="lowerRoman"/>
+      <w:lvlText w:val="%3."/>
+      <w:lvlJc w:val="right"/>
+      <w:pPr>
+        <w:ind w:left="2160" w:hanging="180"/>
+      </w:pPr>
+    </w:lvl>
+    <w:lvl w:ilvl="3" w:tplc="0410000F" w:tentative="1">
+      <w:start w:val="1"/>
+      <w:numFmt w:val="decimal"/>
+      <w:lvlText w:val="%4."/>
+      <w:lvlJc w:val="left"/>
+      <w:pPr>
+        <w:ind w:left="2880" w:hanging="360"/>
+      </w:pPr>
+    </w:lvl>
+    <w:lvl w:ilvl="4" w:tplc="04100019" w:tentative="1">
+      <w:start w:val="1"/>
+      <w:numFmt w:val="lowerLetter"/>
+      <w:lvlText w:val="%5."/>
+      <w:lvlJc w:val="left"/>
+      <w:pPr>
+        <w:ind w:left="3600" w:hanging="360"/>
+      </w:pPr>
+    </w:lvl>
+    <w:lvl w:ilvl="5" w:tplc="0410001B" w:tentative="1">
+      <w:start w:val="1"/>
+      <w:numFmt w:val="lowerRoman"/>
+      <w:lvlText w:val="%6."/>
+      <w:lvlJc w:val="right"/>
+      <w:pPr>
+        <w:ind w:left="4320" w:hanging="180"/>
+      </w:pPr>
+    </w:lvl>
+    <w:lvl w:ilvl="6" w:tplc="0410000F" w:tentative="1">
+      <w:start w:val="1"/>
+      <w:numFmt w:val="decimal"/>
+      <w:lvlText w:val="%7."/>
+      <w:lvlJc w:val="left"/>
+      <w:pPr>
+        <w:ind w:left="5040" w:hanging="360"/>
+      </w:pPr>
+    </w:lvl>
+    <w:lvl w:ilvl="7" w:tplc="04100019" w:tentative="1">
+      <w:start w:val="1"/>
+      <w:numFmt w:val="lowerLetter"/>
+      <w:lvlText w:val="%8."/>
+      <w:lvlJc w:val="left"/>
+      <w:pPr>
+        <w:ind w:left="5760" w:hanging="360"/>
+      </w:pPr>
+    </w:lvl>
+    <w:lvl w:ilvl="8" w:tplc="0410001B" w:tentative="1">
+      <w:start w:val="1"/>
+      <w:numFmt w:val="lowerRoman"/>
+      <w:lvlText w:val="%9."/>
+      <w:lvlJc w:val="right"/>
+      <w:pPr>
+        <w:ind w:left="6480" w:hanging="180"/>
+      </w:pPr>
+    </w:lvl>
+  </w:abstractNum>
+  <w:abstractNum w:abstractNumId="12" w15:restartNumberingAfterBreak="0">
     <w:nsid w:val="16B01F32"/>
     <w:multiLevelType w:val="multilevel"/>
     <w:tmpl w:val="F4EE0E02"/>
@@ -12163,7 +13828,7 @@
       </w:pPr>
     </w:lvl>
   </w:abstractNum>
-  <w:abstractNum w:abstractNumId="12" w15:restartNumberingAfterBreak="0">
+  <w:abstractNum w:abstractNumId="13" w15:restartNumberingAfterBreak="0">
     <w:nsid w:val="1E461C16"/>
     <w:multiLevelType w:val="hybridMultilevel"/>
     <w:tmpl w:val="554CC610"/>
@@ -12249,7 +13914,7 @@
       </w:pPr>
     </w:lvl>
   </w:abstractNum>
-  <w:abstractNum w:abstractNumId="13" w15:restartNumberingAfterBreak="0">
+  <w:abstractNum w:abstractNumId="14" w15:restartNumberingAfterBreak="0">
     <w:nsid w:val="23F70304"/>
     <w:multiLevelType w:val="hybridMultilevel"/>
     <w:tmpl w:val="34BC8230"/>
@@ -12361,7 +14026,7 @@
       </w:rPr>
     </w:lvl>
   </w:abstractNum>
-  <w:abstractNum w:abstractNumId="14" w15:restartNumberingAfterBreak="0">
+  <w:abstractNum w:abstractNumId="15" w15:restartNumberingAfterBreak="0">
     <w:nsid w:val="24AF7E14"/>
     <w:multiLevelType w:val="hybridMultilevel"/>
     <w:tmpl w:val="3FEA7C18"/>
@@ -12450,7 +14115,7 @@
       </w:pPr>
     </w:lvl>
   </w:abstractNum>
-  <w:abstractNum w:abstractNumId="15" w15:restartNumberingAfterBreak="0">
+  <w:abstractNum w:abstractNumId="16" w15:restartNumberingAfterBreak="0">
     <w:nsid w:val="25D64541"/>
     <w:multiLevelType w:val="hybridMultilevel"/>
     <w:tmpl w:val="7E5E64B6"/>
@@ -12539,7 +14204,7 @@
       </w:pPr>
     </w:lvl>
   </w:abstractNum>
-  <w:abstractNum w:abstractNumId="16" w15:restartNumberingAfterBreak="0">
+  <w:abstractNum w:abstractNumId="17" w15:restartNumberingAfterBreak="0">
     <w:nsid w:val="26247744"/>
     <w:multiLevelType w:val="hybridMultilevel"/>
     <w:tmpl w:val="27CC1406"/>
@@ -12628,7 +14293,7 @@
       </w:pPr>
     </w:lvl>
   </w:abstractNum>
-  <w:abstractNum w:abstractNumId="17" w15:restartNumberingAfterBreak="0">
+  <w:abstractNum w:abstractNumId="18" w15:restartNumberingAfterBreak="0">
     <w:nsid w:val="2C6B46D0"/>
     <w:multiLevelType w:val="hybridMultilevel"/>
     <w:tmpl w:val="7E5E64B6"/>
@@ -12717,7 +14382,7 @@
       </w:pPr>
     </w:lvl>
   </w:abstractNum>
-  <w:abstractNum w:abstractNumId="18" w15:restartNumberingAfterBreak="0">
+  <w:abstractNum w:abstractNumId="19" w15:restartNumberingAfterBreak="0">
     <w:nsid w:val="2DC46732"/>
     <w:multiLevelType w:val="hybridMultilevel"/>
     <w:tmpl w:val="7E5E64B6"/>
@@ -12806,7 +14471,7 @@
       </w:pPr>
     </w:lvl>
   </w:abstractNum>
-  <w:abstractNum w:abstractNumId="19" w15:restartNumberingAfterBreak="0">
+  <w:abstractNum w:abstractNumId="20" w15:restartNumberingAfterBreak="0">
     <w:nsid w:val="38DA374E"/>
     <w:multiLevelType w:val="hybridMultilevel"/>
     <w:tmpl w:val="67CEBD58"/>
@@ -12895,7 +14560,7 @@
       </w:pPr>
     </w:lvl>
   </w:abstractNum>
-  <w:abstractNum w:abstractNumId="20" w15:restartNumberingAfterBreak="0">
+  <w:abstractNum w:abstractNumId="21" w15:restartNumberingAfterBreak="0">
     <w:nsid w:val="399E15A2"/>
     <w:multiLevelType w:val="hybridMultilevel"/>
     <w:tmpl w:val="5B00A49A"/>
@@ -13008,7 +14673,7 @@
       </w:rPr>
     </w:lvl>
   </w:abstractNum>
-  <w:abstractNum w:abstractNumId="21" w15:restartNumberingAfterBreak="0">
+  <w:abstractNum w:abstractNumId="22" w15:restartNumberingAfterBreak="0">
     <w:nsid w:val="3AED61A6"/>
     <w:multiLevelType w:val="multilevel"/>
     <w:tmpl w:val="28CA4454"/>
@@ -13157,7 +14822,7 @@
       </w:rPr>
     </w:lvl>
   </w:abstractNum>
-  <w:abstractNum w:abstractNumId="22" w15:restartNumberingAfterBreak="0">
+  <w:abstractNum w:abstractNumId="23" w15:restartNumberingAfterBreak="0">
     <w:nsid w:val="3D79147E"/>
     <w:multiLevelType w:val="hybridMultilevel"/>
     <w:tmpl w:val="ECEEE65C"/>
@@ -13269,7 +14934,7 @@
       </w:rPr>
     </w:lvl>
   </w:abstractNum>
-  <w:abstractNum w:abstractNumId="23" w15:restartNumberingAfterBreak="0">
+  <w:abstractNum w:abstractNumId="24" w15:restartNumberingAfterBreak="0">
     <w:nsid w:val="404421C5"/>
     <w:multiLevelType w:val="hybridMultilevel"/>
     <w:tmpl w:val="7FA8C86A"/>
@@ -13382,7 +15047,7 @@
       </w:rPr>
     </w:lvl>
   </w:abstractNum>
-  <w:abstractNum w:abstractNumId="24" w15:restartNumberingAfterBreak="0">
+  <w:abstractNum w:abstractNumId="25" w15:restartNumberingAfterBreak="0">
     <w:nsid w:val="40594783"/>
     <w:multiLevelType w:val="hybridMultilevel"/>
     <w:tmpl w:val="BCBADA0C"/>
@@ -13471,7 +15136,7 @@
       </w:pPr>
     </w:lvl>
   </w:abstractNum>
-  <w:abstractNum w:abstractNumId="25" w15:restartNumberingAfterBreak="0">
+  <w:abstractNum w:abstractNumId="26" w15:restartNumberingAfterBreak="0">
     <w:nsid w:val="40A37759"/>
     <w:multiLevelType w:val="multilevel"/>
     <w:tmpl w:val="28CA4454"/>
@@ -13620,7 +15285,7 @@
       </w:rPr>
     </w:lvl>
   </w:abstractNum>
-  <w:abstractNum w:abstractNumId="26" w15:restartNumberingAfterBreak="0">
+  <w:abstractNum w:abstractNumId="27" w15:restartNumberingAfterBreak="0">
     <w:nsid w:val="44A81745"/>
     <w:multiLevelType w:val="hybridMultilevel"/>
     <w:tmpl w:val="A42E0850"/>
@@ -13709,7 +15374,7 @@
       </w:pPr>
     </w:lvl>
   </w:abstractNum>
-  <w:abstractNum w:abstractNumId="27" w15:restartNumberingAfterBreak="0">
+  <w:abstractNum w:abstractNumId="28" w15:restartNumberingAfterBreak="0">
     <w:nsid w:val="457B3D18"/>
     <w:multiLevelType w:val="hybridMultilevel"/>
     <w:tmpl w:val="3C946BCC"/>
@@ -13798,7 +15463,7 @@
       </w:pPr>
     </w:lvl>
   </w:abstractNum>
-  <w:abstractNum w:abstractNumId="28" w15:restartNumberingAfterBreak="0">
+  <w:abstractNum w:abstractNumId="29" w15:restartNumberingAfterBreak="0">
     <w:nsid w:val="4AD92ACE"/>
     <w:multiLevelType w:val="hybridMultilevel"/>
     <w:tmpl w:val="4514869A"/>
@@ -13910,7 +15575,7 @@
       </w:rPr>
     </w:lvl>
   </w:abstractNum>
-  <w:abstractNum w:abstractNumId="29" w15:restartNumberingAfterBreak="0">
+  <w:abstractNum w:abstractNumId="30" w15:restartNumberingAfterBreak="0">
     <w:nsid w:val="4CEF34C5"/>
     <w:multiLevelType w:val="hybridMultilevel"/>
     <w:tmpl w:val="FDAAF590"/>
@@ -13999,7 +15664,7 @@
       </w:pPr>
     </w:lvl>
   </w:abstractNum>
-  <w:abstractNum w:abstractNumId="30" w15:restartNumberingAfterBreak="0">
+  <w:abstractNum w:abstractNumId="31" w15:restartNumberingAfterBreak="0">
     <w:nsid w:val="4F250AD6"/>
     <w:multiLevelType w:val="hybridMultilevel"/>
     <w:tmpl w:val="BCBADA0C"/>
@@ -14088,7 +15753,7 @@
       </w:pPr>
     </w:lvl>
   </w:abstractNum>
-  <w:abstractNum w:abstractNumId="31" w15:restartNumberingAfterBreak="0">
+  <w:abstractNum w:abstractNumId="32" w15:restartNumberingAfterBreak="0">
     <w:nsid w:val="4FCD378C"/>
     <w:multiLevelType w:val="hybridMultilevel"/>
     <w:tmpl w:val="BCBADA0C"/>
@@ -14177,7 +15842,7 @@
       </w:pPr>
     </w:lvl>
   </w:abstractNum>
-  <w:abstractNum w:abstractNumId="32" w15:restartNumberingAfterBreak="0">
+  <w:abstractNum w:abstractNumId="33" w15:restartNumberingAfterBreak="0">
     <w:nsid w:val="4FE65F5A"/>
     <w:multiLevelType w:val="hybridMultilevel"/>
     <w:tmpl w:val="BCBADA0C"/>
@@ -14266,7 +15931,7 @@
       </w:pPr>
     </w:lvl>
   </w:abstractNum>
-  <w:abstractNum w:abstractNumId="33" w15:restartNumberingAfterBreak="0">
+  <w:abstractNum w:abstractNumId="34" w15:restartNumberingAfterBreak="0">
     <w:nsid w:val="55B5533E"/>
     <w:multiLevelType w:val="hybridMultilevel"/>
     <w:tmpl w:val="7E5E64B6"/>
@@ -14355,7 +16020,7 @@
       </w:pPr>
     </w:lvl>
   </w:abstractNum>
-  <w:abstractNum w:abstractNumId="34" w15:restartNumberingAfterBreak="0">
+  <w:abstractNum w:abstractNumId="35" w15:restartNumberingAfterBreak="0">
     <w:nsid w:val="57482F5D"/>
     <w:multiLevelType w:val="hybridMultilevel"/>
     <w:tmpl w:val="24229218"/>
@@ -14441,7 +16106,7 @@
       </w:pPr>
     </w:lvl>
   </w:abstractNum>
-  <w:abstractNum w:abstractNumId="35" w15:restartNumberingAfterBreak="0">
+  <w:abstractNum w:abstractNumId="36" w15:restartNumberingAfterBreak="0">
     <w:nsid w:val="59E160AC"/>
     <w:multiLevelType w:val="hybridMultilevel"/>
     <w:tmpl w:val="72FCBFE2"/>
@@ -14554,7 +16219,7 @@
       </w:rPr>
     </w:lvl>
   </w:abstractNum>
-  <w:abstractNum w:abstractNumId="36" w15:restartNumberingAfterBreak="0">
+  <w:abstractNum w:abstractNumId="37" w15:restartNumberingAfterBreak="0">
     <w:nsid w:val="5B811B7E"/>
     <w:multiLevelType w:val="hybridMultilevel"/>
     <w:tmpl w:val="24229218"/>
@@ -14640,7 +16305,7 @@
       </w:pPr>
     </w:lvl>
   </w:abstractNum>
-  <w:abstractNum w:abstractNumId="37" w15:restartNumberingAfterBreak="0">
+  <w:abstractNum w:abstractNumId="38" w15:restartNumberingAfterBreak="0">
     <w:nsid w:val="5CC6580D"/>
     <w:multiLevelType w:val="hybridMultilevel"/>
     <w:tmpl w:val="63C6F7A0"/>
@@ -14753,7 +16418,7 @@
       </w:rPr>
     </w:lvl>
   </w:abstractNum>
-  <w:abstractNum w:abstractNumId="38" w15:restartNumberingAfterBreak="0">
+  <w:abstractNum w:abstractNumId="39" w15:restartNumberingAfterBreak="0">
     <w:nsid w:val="6FFE368C"/>
     <w:multiLevelType w:val="hybridMultilevel"/>
     <w:tmpl w:val="3C946BCC"/>
@@ -14842,7 +16507,7 @@
       </w:pPr>
     </w:lvl>
   </w:abstractNum>
-  <w:abstractNum w:abstractNumId="39" w15:restartNumberingAfterBreak="0">
+  <w:abstractNum w:abstractNumId="40" w15:restartNumberingAfterBreak="0">
     <w:nsid w:val="70746A20"/>
     <w:multiLevelType w:val="multilevel"/>
     <w:tmpl w:val="28CA4454"/>
@@ -14991,7 +16656,7 @@
       </w:rPr>
     </w:lvl>
   </w:abstractNum>
-  <w:abstractNum w:abstractNumId="40" w15:restartNumberingAfterBreak="0">
+  <w:abstractNum w:abstractNumId="41" w15:restartNumberingAfterBreak="0">
     <w:nsid w:val="73368866"/>
     <w:multiLevelType w:val="hybridMultilevel"/>
     <w:tmpl w:val="FFFFFFFF"/>
@@ -15042,7 +16707,7 @@
       <w:lvlJc w:val="left"/>
     </w:lvl>
   </w:abstractNum>
-  <w:abstractNum w:abstractNumId="41" w15:restartNumberingAfterBreak="0">
+  <w:abstractNum w:abstractNumId="42" w15:restartNumberingAfterBreak="0">
     <w:nsid w:val="76457BA4"/>
     <w:multiLevelType w:val="hybridMultilevel"/>
     <w:tmpl w:val="554CC610"/>
@@ -15128,7 +16793,7 @@
       </w:pPr>
     </w:lvl>
   </w:abstractNum>
-  <w:abstractNum w:abstractNumId="42" w15:restartNumberingAfterBreak="0">
+  <w:abstractNum w:abstractNumId="43" w15:restartNumberingAfterBreak="0">
     <w:nsid w:val="7DD822C3"/>
     <w:multiLevelType w:val="hybridMultilevel"/>
     <w:tmpl w:val="3C946BCC"/>
@@ -15221,67 +16886,67 @@
     <w:abstractNumId w:val="0"/>
   </w:num>
   <w:num w:numId="2" w16cid:durableId="1453553918">
-    <w:abstractNumId w:val="11"/>
+    <w:abstractNumId w:val="12"/>
   </w:num>
   <w:num w:numId="3" w16cid:durableId="1847984744">
     <w:abstractNumId w:val="6"/>
   </w:num>
   <w:num w:numId="4" w16cid:durableId="1281305233">
-    <w:abstractNumId w:val="39"/>
+    <w:abstractNumId w:val="40"/>
   </w:num>
   <w:num w:numId="5" w16cid:durableId="478426275">
-    <w:abstractNumId w:val="29"/>
+    <w:abstractNumId w:val="30"/>
   </w:num>
   <w:num w:numId="6" w16cid:durableId="1576551924">
-    <w:abstractNumId w:val="42"/>
+    <w:abstractNumId w:val="43"/>
   </w:num>
   <w:num w:numId="7" w16cid:durableId="567691393">
-    <w:abstractNumId w:val="32"/>
+    <w:abstractNumId w:val="33"/>
   </w:num>
   <w:num w:numId="8" w16cid:durableId="594900704">
-    <w:abstractNumId w:val="24"/>
+    <w:abstractNumId w:val="25"/>
   </w:num>
   <w:num w:numId="9" w16cid:durableId="560599277">
     <w:abstractNumId w:val="8"/>
   </w:num>
   <w:num w:numId="10" w16cid:durableId="412166526">
-    <w:abstractNumId w:val="26"/>
+    <w:abstractNumId w:val="27"/>
   </w:num>
   <w:num w:numId="11" w16cid:durableId="764110979">
+    <w:abstractNumId w:val="32"/>
+  </w:num>
+  <w:num w:numId="12" w16cid:durableId="1540972270">
     <w:abstractNumId w:val="31"/>
   </w:num>
-  <w:num w:numId="12" w16cid:durableId="1540972270">
-    <w:abstractNumId w:val="30"/>
-  </w:num>
   <w:num w:numId="13" w16cid:durableId="14770558">
-    <w:abstractNumId w:val="27"/>
+    <w:abstractNumId w:val="28"/>
   </w:num>
   <w:num w:numId="14" w16cid:durableId="1430079531">
     <w:abstractNumId w:val="5"/>
   </w:num>
   <w:num w:numId="15" w16cid:durableId="564529202">
-    <w:abstractNumId w:val="14"/>
+    <w:abstractNumId w:val="15"/>
   </w:num>
   <w:num w:numId="16" w16cid:durableId="697782312">
-    <w:abstractNumId w:val="33"/>
+    <w:abstractNumId w:val="34"/>
   </w:num>
   <w:num w:numId="17" w16cid:durableId="2127001533">
-    <w:abstractNumId w:val="15"/>
+    <w:abstractNumId w:val="16"/>
   </w:num>
   <w:num w:numId="18" w16cid:durableId="605306999">
-    <w:abstractNumId w:val="18"/>
+    <w:abstractNumId w:val="19"/>
   </w:num>
   <w:num w:numId="19" w16cid:durableId="582687429">
     <w:abstractNumId w:val="1"/>
   </w:num>
   <w:num w:numId="20" w16cid:durableId="1412118856">
-    <w:abstractNumId w:val="17"/>
+    <w:abstractNumId w:val="18"/>
   </w:num>
   <w:num w:numId="21" w16cid:durableId="1602184661">
     <w:abstractNumId w:val="10"/>
   </w:num>
   <w:num w:numId="22" w16cid:durableId="1671253131">
-    <w:abstractNumId w:val="38"/>
+    <w:abstractNumId w:val="39"/>
   </w:num>
   <w:num w:numId="23" w16cid:durableId="769471647">
     <w:abstractNumId w:val="2"/>
@@ -15290,40 +16955,40 @@
     <w:abstractNumId w:val="7"/>
   </w:num>
   <w:num w:numId="25" w16cid:durableId="657151589">
-    <w:abstractNumId w:val="16"/>
+    <w:abstractNumId w:val="17"/>
   </w:num>
   <w:num w:numId="26" w16cid:durableId="1885286888">
-    <w:abstractNumId w:val="19"/>
+    <w:abstractNumId w:val="20"/>
   </w:num>
   <w:num w:numId="27" w16cid:durableId="916980803">
+    <w:abstractNumId w:val="24"/>
+  </w:num>
+  <w:num w:numId="28" w16cid:durableId="368334978">
+    <w:abstractNumId w:val="29"/>
+  </w:num>
+  <w:num w:numId="29" w16cid:durableId="948656911">
     <w:abstractNumId w:val="23"/>
   </w:num>
-  <w:num w:numId="28" w16cid:durableId="368334978">
-    <w:abstractNumId w:val="28"/>
-  </w:num>
-  <w:num w:numId="29" w16cid:durableId="948656911">
-    <w:abstractNumId w:val="22"/>
-  </w:num>
   <w:num w:numId="30" w16cid:durableId="1247113509">
-    <w:abstractNumId w:val="13"/>
+    <w:abstractNumId w:val="14"/>
   </w:num>
   <w:num w:numId="31" w16cid:durableId="598947098">
-    <w:abstractNumId w:val="35"/>
+    <w:abstractNumId w:val="36"/>
   </w:num>
   <w:num w:numId="32" w16cid:durableId="285358956">
-    <w:abstractNumId w:val="40"/>
+    <w:abstractNumId w:val="41"/>
   </w:num>
   <w:num w:numId="33" w16cid:durableId="1848980381">
-    <w:abstractNumId w:val="20"/>
+    <w:abstractNumId w:val="21"/>
   </w:num>
   <w:num w:numId="34" w16cid:durableId="1176111948">
     <w:abstractNumId w:val="4"/>
   </w:num>
   <w:num w:numId="35" w16cid:durableId="255401363">
-    <w:abstractNumId w:val="21"/>
+    <w:abstractNumId w:val="22"/>
   </w:num>
   <w:num w:numId="36" w16cid:durableId="35274640">
-    <w:abstractNumId w:val="25"/>
+    <w:abstractNumId w:val="26"/>
   </w:num>
   <w:num w:numId="37" w16cid:durableId="390469088">
     <w:abstractNumId w:val="3"/>
@@ -15332,19 +16997,22 @@
     <w:abstractNumId w:val="9"/>
   </w:num>
   <w:num w:numId="39" w16cid:durableId="773289358">
-    <w:abstractNumId w:val="12"/>
+    <w:abstractNumId w:val="13"/>
   </w:num>
   <w:num w:numId="40" w16cid:durableId="170920218">
-    <w:abstractNumId w:val="41"/>
+    <w:abstractNumId w:val="42"/>
   </w:num>
   <w:num w:numId="41" w16cid:durableId="1876116864">
+    <w:abstractNumId w:val="38"/>
+  </w:num>
+  <w:num w:numId="42" w16cid:durableId="1570506035">
     <w:abstractNumId w:val="37"/>
   </w:num>
-  <w:num w:numId="42" w16cid:durableId="1570506035">
-    <w:abstractNumId w:val="36"/>
+  <w:num w:numId="43" w16cid:durableId="871530239">
+    <w:abstractNumId w:val="35"/>
   </w:num>
-  <w:num w:numId="43" w16cid:durableId="871530239">
-    <w:abstractNumId w:val="34"/>
+  <w:num w:numId="44" w16cid:durableId="1076047681">
+    <w:abstractNumId w:val="11"/>
   </w:num>
 </w:numbering>
 </file>
@@ -17527,6 +19195,7 @@
     <w:rsid w:val="00725A96"/>
     <w:rsid w:val="00733765"/>
     <w:rsid w:val="00743DF4"/>
+    <w:rsid w:val="00772195"/>
     <w:rsid w:val="00781888"/>
     <w:rsid w:val="007F0F73"/>
     <w:rsid w:val="00823465"/>
@@ -17550,6 +19219,7 @@
     <w:rsid w:val="00B86915"/>
     <w:rsid w:val="00BA2BDF"/>
     <w:rsid w:val="00BC399B"/>
+    <w:rsid w:val="00BD4F27"/>
     <w:rsid w:val="00BE08AA"/>
     <w:rsid w:val="00CA6967"/>
     <w:rsid w:val="00D13578"/>

</xml_diff>

<commit_message>
aggiornamento docx it 5 + piccolo fix codice
</commit_message>
<xml_diff>
--- a/Documentazione/Elaborazione/Iterazione 5/Iterazione 5.docx
+++ b/Documentazione/Elaborazione/Iterazione 5/Iterazione 5.docx
@@ -170,7 +170,6 @@
               <w:dataBinding w:prefixMappings="xmlns:ns0='http://purl.org/dc/elements/1.1/' xmlns:ns1='http://schemas.openxmlformats.org/package/2006/metadata/core-properties' " w:xpath="/ns1:coreProperties[1]/ns0:subject[1]" w:storeItemID="{6C3C8BC8-F283-45AE-878A-BAB7291924A1}"/>
               <w:text/>
             </w:sdtPr>
-            <w:sdtEndPr/>
             <w:sdtContent>
               <w:r>
                 <w:rPr>
@@ -292,7 +291,6 @@
                                     <w:dataBinding w:prefixMappings="xmlns:ns0='http://schemas.openxmlformats.org/officeDocument/2006/extended-properties' " w:xpath="/ns0:Properties[1]/ns0:Company[1]" w:storeItemID="{6668398D-A668-4E3E-A5EB-62B293D839F1}"/>
                                     <w:text/>
                                   </w:sdtPr>
-                                  <w:sdtEndPr/>
                                   <w:sdtContent>
                                     <w:r>
                                       <w:rPr>
@@ -323,7 +321,6 @@
                                     <w:dataBinding w:prefixMappings="xmlns:ns0='http://schemas.microsoft.com/office/2006/coverPageProps' " w:xpath="/ns0:CoverPageProperties[1]/ns0:CompanyAddress[1]" w:storeItemID="{55AF091B-3C7A-41E3-B477-F2FDAA23CFDA}"/>
                                     <w:text/>
                                   </w:sdtPr>
-                                  <w:sdtEndPr/>
                                   <w:sdtContent>
                                     <w:r>
                                       <w:rPr>
@@ -396,7 +393,6 @@
                               <w:dataBinding w:prefixMappings="xmlns:ns0='http://schemas.openxmlformats.org/officeDocument/2006/extended-properties' " w:xpath="/ns0:Properties[1]/ns0:Company[1]" w:storeItemID="{6668398D-A668-4E3E-A5EB-62B293D839F1}"/>
                               <w:text/>
                             </w:sdtPr>
-                            <w:sdtEndPr/>
                             <w:sdtContent>
                               <w:r>
                                 <w:rPr>
@@ -427,7 +423,6 @@
                               <w:dataBinding w:prefixMappings="xmlns:ns0='http://schemas.microsoft.com/office/2006/coverPageProps' " w:xpath="/ns0:CoverPageProperties[1]/ns0:CompanyAddress[1]" w:storeItemID="{55AF091B-3C7A-41E3-B477-F2FDAA23CFDA}"/>
                               <w:text/>
                             </w:sdtPr>
-                            <w:sdtEndPr/>
                             <w:sdtContent>
                               <w:r>
                                 <w:rPr>
@@ -533,7 +528,7 @@
             </w:rPr>
             <w:fldChar w:fldCharType="separate"/>
           </w:r>
-          <w:hyperlink w:anchor="_Toc213799326" w:history="1">
+          <w:hyperlink w:anchor="_Toc214079361" w:history="1">
             <w:r>
               <w:rPr>
                 <w:rStyle w:val="Collegamentoipertestuale"/>
@@ -580,7 +575,7 @@
                 <w:noProof/>
                 <w:webHidden/>
               </w:rPr>
-              <w:instrText xml:space="preserve"> PAGEREF _Toc213799326 \h </w:instrText>
+              <w:instrText xml:space="preserve"> PAGEREF _Toc214079361 \h </w:instrText>
             </w:r>
             <w:r>
               <w:rPr>
@@ -626,7 +621,7 @@
               <w14:ligatures w14:val="standardContextual"/>
             </w:rPr>
           </w:pPr>
-          <w:hyperlink w:anchor="_Toc213799327" w:history="1">
+          <w:hyperlink w:anchor="_Toc214079362" w:history="1">
             <w:r>
               <w:rPr>
                 <w:rStyle w:val="Collegamentoipertestuale"/>
@@ -654,7 +649,7 @@
                 <w:noProof/>
                 <w:webHidden/>
               </w:rPr>
-              <w:instrText xml:space="preserve"> PAGEREF _Toc213799327 \h </w:instrText>
+              <w:instrText xml:space="preserve"> PAGEREF _Toc214079362 \h </w:instrText>
             </w:r>
             <w:r>
               <w:rPr>
@@ -674,7 +669,7 @@
                 <w:noProof/>
                 <w:webHidden/>
               </w:rPr>
-              <w:t>1</w:t>
+              <w:t>2</w:t>
             </w:r>
             <w:r>
               <w:rPr>
@@ -700,7 +695,7 @@
               <w14:ligatures w14:val="standardContextual"/>
             </w:rPr>
           </w:pPr>
-          <w:hyperlink w:anchor="_Toc213799328" w:history="1">
+          <w:hyperlink w:anchor="_Toc214079363" w:history="1">
             <w:r>
               <w:rPr>
                 <w:rStyle w:val="Collegamentoipertestuale"/>
@@ -728,7 +723,7 @@
                 <w:noProof/>
                 <w:webHidden/>
               </w:rPr>
-              <w:instrText xml:space="preserve"> PAGEREF _Toc213799328 \h </w:instrText>
+              <w:instrText xml:space="preserve"> PAGEREF _Toc214079363 \h </w:instrText>
             </w:r>
             <w:r>
               <w:rPr>
@@ -748,7 +743,7 @@
                 <w:noProof/>
                 <w:webHidden/>
               </w:rPr>
-              <w:t>1</w:t>
+              <w:t>3</w:t>
             </w:r>
             <w:r>
               <w:rPr>
@@ -774,7 +769,7 @@
               <w14:ligatures w14:val="standardContextual"/>
             </w:rPr>
           </w:pPr>
-          <w:hyperlink w:anchor="_Toc213799329" w:history="1">
+          <w:hyperlink w:anchor="_Toc214079364" w:history="1">
             <w:r>
               <w:rPr>
                 <w:rStyle w:val="Collegamentoipertestuale"/>
@@ -802,7 +797,7 @@
                 <w:noProof/>
                 <w:webHidden/>
               </w:rPr>
-              <w:instrText xml:space="preserve"> PAGEREF _Toc213799329 \h </w:instrText>
+              <w:instrText xml:space="preserve"> PAGEREF _Toc214079364 \h </w:instrText>
             </w:r>
             <w:r>
               <w:rPr>
@@ -822,7 +817,7 @@
                 <w:noProof/>
                 <w:webHidden/>
               </w:rPr>
-              <w:t>1</w:t>
+              <w:t>4</w:t>
             </w:r>
             <w:r>
               <w:rPr>
@@ -848,7 +843,7 @@
               <w14:ligatures w14:val="standardContextual"/>
             </w:rPr>
           </w:pPr>
-          <w:hyperlink w:anchor="_Toc213799330" w:history="1">
+          <w:hyperlink w:anchor="_Toc214079365" w:history="1">
             <w:r>
               <w:rPr>
                 <w:rStyle w:val="Collegamentoipertestuale"/>
@@ -876,7 +871,7 @@
                 <w:noProof/>
                 <w:webHidden/>
               </w:rPr>
-              <w:instrText xml:space="preserve"> PAGEREF _Toc213799330 \h </w:instrText>
+              <w:instrText xml:space="preserve"> PAGEREF _Toc214079365 \h </w:instrText>
             </w:r>
             <w:r>
               <w:rPr>
@@ -896,7 +891,7 @@
                 <w:noProof/>
                 <w:webHidden/>
               </w:rPr>
-              <w:t>1</w:t>
+              <w:t>6</w:t>
             </w:r>
             <w:r>
               <w:rPr>
@@ -922,7 +917,7 @@
               <w14:ligatures w14:val="standardContextual"/>
             </w:rPr>
           </w:pPr>
-          <w:hyperlink w:anchor="_Toc213799331" w:history="1">
+          <w:hyperlink w:anchor="_Toc214079366" w:history="1">
             <w:r>
               <w:rPr>
                 <w:rStyle w:val="Collegamentoipertestuale"/>
@@ -951,7 +946,7 @@
                 <w:noProof/>
                 <w:webHidden/>
               </w:rPr>
-              <w:instrText xml:space="preserve"> PAGEREF _Toc213799331 \h </w:instrText>
+              <w:instrText xml:space="preserve"> PAGEREF _Toc214079366 \h </w:instrText>
             </w:r>
             <w:r>
               <w:rPr>
@@ -971,7 +966,7 @@
                 <w:noProof/>
                 <w:webHidden/>
               </w:rPr>
-              <w:t>1</w:t>
+              <w:t>6</w:t>
             </w:r>
             <w:r>
               <w:rPr>
@@ -997,7 +992,7 @@
               <w14:ligatures w14:val="standardContextual"/>
             </w:rPr>
           </w:pPr>
-          <w:hyperlink w:anchor="_Toc213799332" w:history="1">
+          <w:hyperlink w:anchor="_Toc214079367" w:history="1">
             <w:r>
               <w:rPr>
                 <w:rStyle w:val="Collegamentoipertestuale"/>
@@ -1026,7 +1021,7 @@
                 <w:noProof/>
                 <w:webHidden/>
               </w:rPr>
-              <w:instrText xml:space="preserve"> PAGEREF _Toc213799332 \h </w:instrText>
+              <w:instrText xml:space="preserve"> PAGEREF _Toc214079367 \h </w:instrText>
             </w:r>
             <w:r>
               <w:rPr>
@@ -1046,7 +1041,7 @@
                 <w:noProof/>
                 <w:webHidden/>
               </w:rPr>
-              <w:t>1</w:t>
+              <w:t>8</w:t>
             </w:r>
             <w:r>
               <w:rPr>
@@ -1072,7 +1067,7 @@
               <w14:ligatures w14:val="standardContextual"/>
             </w:rPr>
           </w:pPr>
-          <w:hyperlink w:anchor="_Toc213799333" w:history="1">
+          <w:hyperlink w:anchor="_Toc214079368" w:history="1">
             <w:r>
               <w:rPr>
                 <w:rStyle w:val="Collegamentoipertestuale"/>
@@ -1100,7 +1095,7 @@
                 <w:noProof/>
                 <w:webHidden/>
               </w:rPr>
-              <w:instrText xml:space="preserve"> PAGEREF _Toc213799333 \h </w:instrText>
+              <w:instrText xml:space="preserve"> PAGEREF _Toc214079368 \h </w:instrText>
             </w:r>
             <w:r>
               <w:rPr>
@@ -1120,7 +1115,7 @@
                 <w:noProof/>
                 <w:webHidden/>
               </w:rPr>
-              <w:t>1</w:t>
+              <w:t>14</w:t>
             </w:r>
             <w:r>
               <w:rPr>
@@ -1146,7 +1141,7 @@
               <w14:ligatures w14:val="standardContextual"/>
             </w:rPr>
           </w:pPr>
-          <w:hyperlink w:anchor="_Toc213799334" w:history="1">
+          <w:hyperlink w:anchor="_Toc214079369" w:history="1">
             <w:r>
               <w:rPr>
                 <w:rStyle w:val="Collegamentoipertestuale"/>
@@ -1174,7 +1169,7 @@
                 <w:noProof/>
                 <w:webHidden/>
               </w:rPr>
-              <w:instrText xml:space="preserve"> PAGEREF _Toc213799334 \h </w:instrText>
+              <w:instrText xml:space="preserve"> PAGEREF _Toc214079369 \h </w:instrText>
             </w:r>
             <w:r>
               <w:rPr>
@@ -1194,7 +1189,7 @@
                 <w:noProof/>
                 <w:webHidden/>
               </w:rPr>
-              <w:t>1</w:t>
+              <w:t>15</w:t>
             </w:r>
             <w:r>
               <w:rPr>
@@ -1220,7 +1215,7 @@
               <w14:ligatures w14:val="standardContextual"/>
             </w:rPr>
           </w:pPr>
-          <w:hyperlink w:anchor="_Toc213799335" w:history="1">
+          <w:hyperlink w:anchor="_Toc214079370" w:history="1">
             <w:r>
               <w:rPr>
                 <w:rStyle w:val="Collegamentoipertestuale"/>
@@ -1249,7 +1244,7 @@
                 <w:noProof/>
                 <w:webHidden/>
               </w:rPr>
-              <w:instrText xml:space="preserve"> PAGEREF _Toc213799335 \h </w:instrText>
+              <w:instrText xml:space="preserve"> PAGEREF _Toc214079370 \h </w:instrText>
             </w:r>
             <w:r>
               <w:rPr>
@@ -1269,7 +1264,7 @@
                 <w:noProof/>
                 <w:webHidden/>
               </w:rPr>
-              <w:t>1</w:t>
+              <w:t>15</w:t>
             </w:r>
             <w:r>
               <w:rPr>
@@ -1295,7 +1290,7 @@
               <w14:ligatures w14:val="standardContextual"/>
             </w:rPr>
           </w:pPr>
-          <w:hyperlink w:anchor="_Toc213799336" w:history="1">
+          <w:hyperlink w:anchor="_Toc214079371" w:history="1">
             <w:r>
               <w:rPr>
                 <w:rStyle w:val="Collegamentoipertestuale"/>
@@ -1324,7 +1319,7 @@
                 <w:noProof/>
                 <w:webHidden/>
               </w:rPr>
-              <w:instrText xml:space="preserve"> PAGEREF _Toc213799336 \h </w:instrText>
+              <w:instrText xml:space="preserve"> PAGEREF _Toc214079371 \h </w:instrText>
             </w:r>
             <w:r>
               <w:rPr>
@@ -1344,7 +1339,7 @@
                 <w:noProof/>
                 <w:webHidden/>
               </w:rPr>
-              <w:t>1</w:t>
+              <w:t>18</w:t>
             </w:r>
             <w:r>
               <w:rPr>
@@ -1370,7 +1365,7 @@
               <w14:ligatures w14:val="standardContextual"/>
             </w:rPr>
           </w:pPr>
-          <w:hyperlink w:anchor="_Toc213799337" w:history="1">
+          <w:hyperlink w:anchor="_Toc214079372" w:history="1">
             <w:r>
               <w:rPr>
                 <w:rStyle w:val="Collegamentoipertestuale"/>
@@ -1399,7 +1394,7 @@
                 <w:noProof/>
                 <w:webHidden/>
               </w:rPr>
-              <w:instrText xml:space="preserve"> PAGEREF _Toc213799337 \h </w:instrText>
+              <w:instrText xml:space="preserve"> PAGEREF _Toc214079372 \h </w:instrText>
             </w:r>
             <w:r>
               <w:rPr>
@@ -1419,7 +1414,7 @@
                 <w:noProof/>
                 <w:webHidden/>
               </w:rPr>
-              <w:t>1</w:t>
+              <w:t>18</w:t>
             </w:r>
             <w:r>
               <w:rPr>
@@ -1445,7 +1440,7 @@
               <w14:ligatures w14:val="standardContextual"/>
             </w:rPr>
           </w:pPr>
-          <w:hyperlink w:anchor="_Toc213799338" w:history="1">
+          <w:hyperlink w:anchor="_Toc214079373" w:history="1">
             <w:r>
               <w:rPr>
                 <w:rStyle w:val="Collegamentoipertestuale"/>
@@ -1473,7 +1468,7 @@
                 <w:noProof/>
                 <w:webHidden/>
               </w:rPr>
-              <w:instrText xml:space="preserve"> PAGEREF _Toc213799338 \h </w:instrText>
+              <w:instrText xml:space="preserve"> PAGEREF _Toc214079373 \h </w:instrText>
             </w:r>
             <w:r>
               <w:rPr>
@@ -1493,7 +1488,7 @@
                 <w:noProof/>
                 <w:webHidden/>
               </w:rPr>
-              <w:t>1</w:t>
+              <w:t>19</w:t>
             </w:r>
             <w:r>
               <w:rPr>
@@ -1519,7 +1514,7 @@
               <w14:ligatures w14:val="standardContextual"/>
             </w:rPr>
           </w:pPr>
-          <w:hyperlink w:anchor="_Toc213799339" w:history="1">
+          <w:hyperlink w:anchor="_Toc214079374" w:history="1">
             <w:r>
               <w:rPr>
                 <w:rStyle w:val="Collegamentoipertestuale"/>
@@ -1547,7 +1542,7 @@
                 <w:noProof/>
                 <w:webHidden/>
               </w:rPr>
-              <w:instrText xml:space="preserve"> PAGEREF _Toc213799339 \h </w:instrText>
+              <w:instrText xml:space="preserve"> PAGEREF _Toc214079374 \h </w:instrText>
             </w:r>
             <w:r>
               <w:rPr>
@@ -1567,7 +1562,7 @@
                 <w:noProof/>
                 <w:webHidden/>
               </w:rPr>
-              <w:t>1</w:t>
+              <w:t>20</w:t>
             </w:r>
             <w:r>
               <w:rPr>
@@ -1615,7 +1610,7 @@
           <w:rFonts w:ascii="Calibri" w:hAnsi="Calibri" w:cs="Calibri"/>
         </w:rPr>
       </w:pPr>
-      <w:bookmarkStart w:id="0" w:name="_Toc213799326"/>
+      <w:bookmarkStart w:id="0" w:name="_Toc214079361"/>
       <w:r>
         <w:rPr>
           <w:rFonts w:ascii="Calibri" w:hAnsi="Calibri" w:cs="Calibri"/>
@@ -1961,6 +1956,10 @@
     </w:p>
     <w:p>
       <w:pPr>
+        <w:numPr>
+          <w:ilvl w:val="0"/>
+          <w:numId w:val="2"/>
+        </w:numPr>
         <w:pBdr>
           <w:top w:val="nil"/>
           <w:left w:val="nil"/>
@@ -1974,9 +1973,61 @@
           <w:color w:val="000000"/>
         </w:rPr>
       </w:pPr>
-    </w:p>
-    <w:p>
-      <w:pPr>
+      <w:r>
+        <w:rPr>
+          <w:rFonts w:ascii="Calibri" w:eastAsia="Calibri" w:hAnsi="Calibri" w:cs="Calibri"/>
+          <w:iCs/>
+          <w:color w:val="000000"/>
+        </w:rPr>
+        <w:t>Refactoring della logica</w:t>
+      </w:r>
+      <w:r>
+        <w:rPr>
+          <w:rFonts w:ascii="Calibri" w:eastAsia="Calibri" w:hAnsi="Calibri" w:cs="Calibri"/>
+          <w:iCs/>
+          <w:color w:val="000000"/>
+        </w:rPr>
+        <w:t xml:space="preserve"> di gestione degli effetti delle caselle speciali tramite l’implementazione dei pattern </w:t>
+      </w:r>
+      <w:r>
+        <w:rPr>
+          <w:rFonts w:ascii="Calibri" w:eastAsia="Calibri" w:hAnsi="Calibri" w:cs="Calibri"/>
+          <w:i/>
+          <w:color w:val="000000"/>
+        </w:rPr>
+        <w:t>Singleton</w:t>
+      </w:r>
+      <w:r>
+        <w:rPr>
+          <w:rFonts w:ascii="Calibri" w:eastAsia="Calibri" w:hAnsi="Calibri" w:cs="Calibri"/>
+          <w:iCs/>
+          <w:color w:val="000000"/>
+        </w:rPr>
+        <w:t xml:space="preserve"> e </w:t>
+      </w:r>
+      <w:r>
+        <w:rPr>
+          <w:rFonts w:ascii="Calibri" w:eastAsia="Calibri" w:hAnsi="Calibri" w:cs="Calibri"/>
+          <w:i/>
+          <w:color w:val="000000"/>
+        </w:rPr>
+        <w:t>Strategy</w:t>
+      </w:r>
+      <w:r>
+        <w:rPr>
+          <w:rFonts w:ascii="Calibri" w:eastAsia="Calibri" w:hAnsi="Calibri" w:cs="Calibri"/>
+          <w:iCs/>
+          <w:color w:val="000000"/>
+        </w:rPr>
+        <w:t>.</w:t>
+      </w:r>
+    </w:p>
+    <w:p>
+      <w:pPr>
+        <w:numPr>
+          <w:ilvl w:val="0"/>
+          <w:numId w:val="2"/>
+        </w:numPr>
         <w:pBdr>
           <w:top w:val="nil"/>
           <w:left w:val="nil"/>
@@ -1990,6 +2041,30 @@
           <w:color w:val="000000"/>
         </w:rPr>
       </w:pPr>
+      <w:r>
+        <w:rPr>
+          <w:rFonts w:ascii="Calibri" w:eastAsia="Calibri" w:hAnsi="Calibri" w:cs="Calibri"/>
+          <w:iCs/>
+          <w:color w:val="000000"/>
+        </w:rPr>
+        <w:t>Affinamento di alcuni</w:t>
+      </w:r>
+      <w:r>
+        <w:rPr>
+          <w:rFonts w:ascii="Calibri" w:eastAsia="Calibri" w:hAnsi="Calibri" w:cs="Calibri"/>
+          <w:iCs/>
+          <w:color w:val="000000"/>
+        </w:rPr>
+        <w:t xml:space="preserve"> dei</w:t>
+      </w:r>
+      <w:r>
+        <w:rPr>
+          <w:rFonts w:ascii="Calibri" w:eastAsia="Calibri" w:hAnsi="Calibri" w:cs="Calibri"/>
+          <w:iCs/>
+          <w:color w:val="000000"/>
+        </w:rPr>
+        <w:t xml:space="preserve"> diagrammi UML introdotti nelle precedenti iterazioni.</w:t>
+      </w:r>
     </w:p>
     <w:p>
       <w:pPr>
@@ -2105,49 +2180,18 @@
     </w:p>
     <w:p>
       <w:pPr>
-        <w:pBdr>
-          <w:top w:val="nil"/>
-          <w:left w:val="nil"/>
-          <w:bottom w:val="nil"/>
-          <w:right w:val="nil"/>
-          <w:between w:val="nil"/>
-        </w:pBdr>
-        <w:spacing w:after="61" w:line="240" w:lineRule="auto"/>
-        <w:rPr>
-          <w:rFonts w:ascii="Calibri" w:eastAsia="Calibri" w:hAnsi="Calibri" w:cs="Calibri"/>
-          <w:color w:val="000000"/>
-        </w:rPr>
-      </w:pPr>
-    </w:p>
-    <w:p>
-      <w:pPr>
-        <w:pBdr>
-          <w:top w:val="nil"/>
-          <w:left w:val="nil"/>
-          <w:bottom w:val="nil"/>
-          <w:right w:val="nil"/>
-          <w:between w:val="nil"/>
-        </w:pBdr>
-        <w:spacing w:after="61" w:line="240" w:lineRule="auto"/>
-        <w:rPr>
-          <w:rFonts w:ascii="Calibri" w:eastAsia="Calibri" w:hAnsi="Calibri" w:cs="Calibri"/>
-          <w:color w:val="000000"/>
-        </w:rPr>
-      </w:pPr>
-    </w:p>
-    <w:p>
-      <w:pPr>
         <w:pStyle w:val="Titolo1"/>
         <w:jc w:val="center"/>
         <w:rPr>
           <w:rFonts w:ascii="Calibri" w:hAnsi="Calibri" w:cs="Calibri"/>
         </w:rPr>
       </w:pPr>
-      <w:bookmarkStart w:id="1" w:name="_Toc213799327"/>
-      <w:r>
-        <w:rPr>
-          <w:rFonts w:ascii="Calibri" w:hAnsi="Calibri" w:cs="Calibri"/>
-        </w:rPr>
+      <w:bookmarkStart w:id="1" w:name="_Toc214079362"/>
+      <w:r>
+        <w:rPr>
+          <w:rFonts w:ascii="Calibri" w:hAnsi="Calibri" w:cs="Calibri"/>
+        </w:rPr>
+        <w:lastRenderedPageBreak/>
         <w:t>2.0 Caso d’uso UC</w:t>
       </w:r>
       <w:r>
@@ -3287,6 +3331,7 @@
               <w:rPr>
                 <w:rFonts w:ascii="Calibri" w:hAnsi="Calibri" w:cs="Calibri"/>
               </w:rPr>
+              <w:lastRenderedPageBreak/>
               <w:t>7</w:t>
             </w:r>
             <w:r>
@@ -3334,6 +3379,7 @@
                 <w:szCs w:val="24"/>
                 <w:shd w:val="clear" w:color="auto" w:fill="FFFFFF"/>
               </w:rPr>
+              <w:lastRenderedPageBreak/>
               <w:t>Requisiti speciali</w:t>
             </w:r>
           </w:p>
@@ -3521,7 +3567,7 @@
           <w:rFonts w:ascii="Calibri" w:hAnsi="Calibri" w:cs="Calibri"/>
         </w:rPr>
       </w:pPr>
-      <w:bookmarkStart w:id="2" w:name="_Toc213799328"/>
+      <w:bookmarkStart w:id="2" w:name="_Toc214079363"/>
       <w:r>
         <w:rPr>
           <w:rFonts w:ascii="Calibri" w:hAnsi="Calibri" w:cs="Calibri"/>
@@ -4385,6 +4431,7 @@
                 <w:rFonts w:ascii="Calibri" w:eastAsia="Calibri" w:hAnsi="Calibri" w:cs="Calibri"/>
                 <w:highlight w:val="white"/>
               </w:rPr>
+              <w:lastRenderedPageBreak/>
               <w:t>Il sistema apre la pagina di gestione degli scenari.</w:t>
             </w:r>
           </w:p>
@@ -4483,6 +4530,7 @@
                 <w:szCs w:val="24"/>
                 <w:shd w:val="clear" w:color="auto" w:fill="FFFFFF"/>
               </w:rPr>
+              <w:lastRenderedPageBreak/>
               <w:t>Estensioni</w:t>
             </w:r>
           </w:p>
@@ -4857,7 +4905,7 @@
           <w:rFonts w:ascii="Calibri" w:hAnsi="Calibri" w:cs="Calibri"/>
         </w:rPr>
       </w:pPr>
-      <w:bookmarkStart w:id="3" w:name="_Toc213799329"/>
+      <w:bookmarkStart w:id="3" w:name="_Toc214079364"/>
       <w:r>
         <w:rPr>
           <w:rFonts w:ascii="Calibri" w:hAnsi="Calibri" w:cs="Calibri"/>
@@ -5355,6 +5403,7 @@
                 <w:szCs w:val="24"/>
                 <w:shd w:val="clear" w:color="auto" w:fill="FFFFFF"/>
               </w:rPr>
+              <w:lastRenderedPageBreak/>
               <w:t>Attore primario</w:t>
             </w:r>
           </w:p>
@@ -6380,7 +6429,6 @@
         </w:tc>
       </w:tr>
     </w:tbl>
-    <w:p/>
     <w:p>
       <w:pPr>
         <w:pStyle w:val="Titolo1"/>
@@ -6389,11 +6437,12 @@
           <w:rFonts w:ascii="Calibri" w:hAnsi="Calibri" w:cs="Calibri"/>
         </w:rPr>
       </w:pPr>
-      <w:bookmarkStart w:id="4" w:name="_Toc213799330"/>
-      <w:r>
-        <w:rPr>
-          <w:rFonts w:ascii="Calibri" w:hAnsi="Calibri" w:cs="Calibri"/>
-        </w:rPr>
+      <w:bookmarkStart w:id="4" w:name="_Toc214079365"/>
+      <w:r>
+        <w:rPr>
+          <w:rFonts w:ascii="Calibri" w:hAnsi="Calibri" w:cs="Calibri"/>
+        </w:rPr>
+        <w:lastRenderedPageBreak/>
         <w:t>3.0 Analisi Orientata agli Oggetti</w:t>
       </w:r>
       <w:bookmarkEnd w:id="4"/>
@@ -6544,7 +6593,7 @@
         </w:rPr>
       </w:pPr>
       <w:bookmarkStart w:id="5" w:name="_Toc171097033"/>
-      <w:bookmarkStart w:id="6" w:name="_Toc213799331"/>
+      <w:bookmarkStart w:id="6" w:name="_Toc214079366"/>
       <w:r>
         <w:rPr>
           <w:rFonts w:ascii="Calibri" w:hAnsi="Calibri" w:cs="Calibri"/>
@@ -6936,24 +6985,6 @@
         </w:rPr>
         <w:t>, viene definito nell’Iterazione 1</w:t>
       </w:r>
-      <w:r>
-        <w:rPr>
-          <w:rFonts w:ascii="Calibri" w:hAnsi="Calibri" w:cs="Calibri"/>
-          <w:highlight w:val="white"/>
-        </w:rPr>
-        <w:t xml:space="preserve">. Le diverse tipologie che una regola può assumere sono stabilite da </w:t>
-      </w:r>
-      <w:proofErr w:type="spellStart"/>
-      <w:r>
-        <w:rPr>
-          <w:rFonts w:ascii="Calibri" w:hAnsi="Calibri" w:cs="Calibri"/>
-          <w:b/>
-          <w:bCs/>
-          <w:highlight w:val="white"/>
-        </w:rPr>
-        <w:t>TipologiaRegola</w:t>
-      </w:r>
-      <w:proofErr w:type="spellEnd"/>
       <w:r>
         <w:rPr>
           <w:rFonts w:ascii="Calibri" w:hAnsi="Calibri" w:cs="Calibri"/>
@@ -7236,6 +7267,7 @@
           <w:rFonts w:ascii="Calibri" w:hAnsi="Calibri" w:cs="Calibri"/>
           <w:highlight w:val="white"/>
         </w:rPr>
+        <w:lastRenderedPageBreak/>
         <w:t>•</w:t>
       </w:r>
       <w:r>
@@ -7324,7 +7356,6 @@
         </w:rPr>
         <w:t xml:space="preserve">rappresentano le varie posizioni che il Giocatore tramite la Pedina può assumere. La Casella può essere di tre tipi: </w:t>
       </w:r>
-      <w:proofErr w:type="spellStart"/>
       <w:r>
         <w:rPr>
           <w:rFonts w:ascii="Calibri" w:hAnsi="Calibri" w:cs="Calibri"/>
@@ -7332,17 +7363,15 @@
           <w:bCs/>
           <w:highlight w:val="white"/>
         </w:rPr>
-        <w:t>CasellaNormale</w:t>
-      </w:r>
-      <w:proofErr w:type="spellEnd"/>
-      <w:r>
-        <w:rPr>
-          <w:rFonts w:ascii="Calibri" w:hAnsi="Calibri" w:cs="Calibri"/>
-          <w:highlight w:val="white"/>
-        </w:rPr>
-        <w:t xml:space="preserve">, </w:t>
-      </w:r>
-      <w:proofErr w:type="spellStart"/>
+        <w:t>Casella</w:t>
+      </w:r>
+      <w:r>
+        <w:rPr>
+          <w:rFonts w:ascii="Calibri" w:hAnsi="Calibri" w:cs="Calibri"/>
+          <w:highlight w:val="white"/>
+        </w:rPr>
+        <w:t xml:space="preserve"> </w:t>
+      </w:r>
       <w:r>
         <w:rPr>
           <w:rFonts w:ascii="Calibri" w:hAnsi="Calibri" w:cs="Calibri"/>
@@ -7350,9 +7379,8 @@
           <w:bCs/>
           <w:highlight w:val="white"/>
         </w:rPr>
-        <w:t>CasellaSpeciale</w:t>
-      </w:r>
-      <w:proofErr w:type="spellEnd"/>
+        <w:t>Normale</w:t>
+      </w:r>
       <w:r>
         <w:rPr>
           <w:rFonts w:ascii="Calibri" w:hAnsi="Calibri" w:cs="Calibri"/>
@@ -7360,7 +7388,6 @@
         </w:rPr>
         <w:t xml:space="preserve">, </w:t>
       </w:r>
-      <w:proofErr w:type="spellStart"/>
       <w:r>
         <w:rPr>
           <w:rFonts w:ascii="Calibri" w:hAnsi="Calibri" w:cs="Calibri"/>
@@ -7368,32 +7395,15 @@
           <w:bCs/>
           <w:highlight w:val="white"/>
         </w:rPr>
-        <w:t>CasellaFine</w:t>
-      </w:r>
-      <w:proofErr w:type="spellEnd"/>
-      <w:r>
-        <w:rPr>
-          <w:rFonts w:ascii="Calibri" w:hAnsi="Calibri" w:cs="Calibri"/>
-          <w:highlight w:val="white"/>
-        </w:rPr>
-        <w:t xml:space="preserve">. Se il Giocatore </w:t>
-      </w:r>
-      <w:r>
-        <w:rPr>
-          <w:rFonts w:ascii="Calibri" w:hAnsi="Calibri" w:cs="Calibri"/>
-          <w:highlight w:val="white"/>
-        </w:rPr>
-        <w:t>finisce</w:t>
-      </w:r>
-      <w:r>
-        <w:rPr>
-          <w:rFonts w:ascii="Calibri" w:hAnsi="Calibri" w:cs="Calibri"/>
-          <w:highlight w:val="white"/>
-        </w:rPr>
-        <w:t xml:space="preserve"> su una </w:t>
-      </w:r>
-      <w:proofErr w:type="spellStart"/>
-      <w:proofErr w:type="gramStart"/>
+        <w:t>Casella</w:t>
+      </w:r>
+      <w:r>
+        <w:rPr>
+          <w:rFonts w:ascii="Calibri" w:hAnsi="Calibri" w:cs="Calibri"/>
+          <w:highlight w:val="white"/>
+        </w:rPr>
+        <w:t xml:space="preserve"> </w:t>
+      </w:r>
       <w:r>
         <w:rPr>
           <w:rFonts w:ascii="Calibri" w:hAnsi="Calibri" w:cs="Calibri"/>
@@ -7401,39 +7411,22 @@
           <w:bCs/>
           <w:highlight w:val="white"/>
         </w:rPr>
-        <w:t>CasellaSpeciale</w:t>
-      </w:r>
-      <w:proofErr w:type="spellEnd"/>
-      <w:proofErr w:type="gramEnd"/>
-      <w:r>
-        <w:rPr>
-          <w:rFonts w:ascii="Calibri" w:hAnsi="Calibri" w:cs="Calibri"/>
-          <w:highlight w:val="white"/>
-        </w:rPr>
-        <w:t xml:space="preserve"> viene attivato un modificatore che provoca sulla Pedina un avanzamento</w:t>
-      </w:r>
-      <w:r>
-        <w:rPr>
-          <w:rFonts w:ascii="Calibri" w:hAnsi="Calibri" w:cs="Calibri"/>
-          <w:highlight w:val="white"/>
-        </w:rPr>
-        <w:t xml:space="preserve">, </w:t>
-      </w:r>
-      <w:r>
-        <w:rPr>
-          <w:rFonts w:ascii="Calibri" w:hAnsi="Calibri" w:cs="Calibri"/>
-          <w:highlight w:val="white"/>
-        </w:rPr>
-        <w:t>un indietreggiamento o un blocco (intervento sullo stato)</w:t>
-      </w:r>
-      <w:r>
-        <w:rPr>
-          <w:rFonts w:ascii="Calibri" w:hAnsi="Calibri" w:cs="Calibri"/>
-          <w:highlight w:val="white"/>
-        </w:rPr>
-        <w:t xml:space="preserve">, secondo specifiche regole definite in base alla </w:t>
-      </w:r>
-      <w:proofErr w:type="spellStart"/>
+        <w:t>Speciale</w:t>
+      </w:r>
+      <w:r>
+        <w:rPr>
+          <w:rFonts w:ascii="Calibri" w:hAnsi="Calibri" w:cs="Calibri"/>
+          <w:highlight w:val="white"/>
+        </w:rPr>
+        <w:t xml:space="preserve"> e</w:t>
+      </w:r>
+      <w:r>
+        <w:rPr>
+          <w:rFonts w:ascii="Calibri" w:hAnsi="Calibri" w:cs="Calibri"/>
+          <w:highlight w:val="white"/>
+        </w:rPr>
+        <w:t xml:space="preserve"> </w:t>
+      </w:r>
       <w:r>
         <w:rPr>
           <w:rFonts w:ascii="Calibri" w:hAnsi="Calibri" w:cs="Calibri"/>
@@ -7441,24 +7434,81 @@
           <w:bCs/>
           <w:highlight w:val="white"/>
         </w:rPr>
-        <w:t>TipologiaCasellaSpeciale</w:t>
-      </w:r>
-      <w:proofErr w:type="spellEnd"/>
-      <w:r>
-        <w:rPr>
-          <w:rFonts w:ascii="Calibri" w:hAnsi="Calibri" w:cs="Calibri"/>
-          <w:highlight w:val="white"/>
-        </w:rPr>
-        <w:t>.</w:t>
-      </w:r>
-    </w:p>
-    <w:p>
-      <w:pPr>
-        <w:rPr>
-          <w:rFonts w:ascii="Calibri" w:hAnsi="Calibri" w:cs="Calibri"/>
-          <w:highlight w:val="white"/>
-        </w:rPr>
-      </w:pPr>
+        <w:t>Casella</w:t>
+      </w:r>
+      <w:r>
+        <w:rPr>
+          <w:rFonts w:ascii="Calibri" w:hAnsi="Calibri" w:cs="Calibri"/>
+          <w:b/>
+          <w:bCs/>
+          <w:highlight w:val="white"/>
+        </w:rPr>
+        <w:t xml:space="preserve"> </w:t>
+      </w:r>
+      <w:r>
+        <w:rPr>
+          <w:rFonts w:ascii="Calibri" w:hAnsi="Calibri" w:cs="Calibri"/>
+          <w:b/>
+          <w:bCs/>
+          <w:highlight w:val="white"/>
+        </w:rPr>
+        <w:t>Fin</w:t>
+      </w:r>
+      <w:r>
+        <w:rPr>
+          <w:rFonts w:ascii="Calibri" w:hAnsi="Calibri" w:cs="Calibri"/>
+          <w:b/>
+          <w:bCs/>
+          <w:highlight w:val="white"/>
+        </w:rPr>
+        <w:t>e</w:t>
+      </w:r>
+      <w:r>
+        <w:rPr>
+          <w:rFonts w:ascii="Calibri" w:hAnsi="Calibri" w:cs="Calibri"/>
+          <w:highlight w:val="white"/>
+        </w:rPr>
+        <w:t xml:space="preserve">. </w:t>
+      </w:r>
+      <w:r>
+        <w:rPr>
+          <w:rFonts w:ascii="Calibri" w:hAnsi="Calibri" w:cs="Calibri"/>
+          <w:highlight w:val="white"/>
+        </w:rPr>
+        <w:t xml:space="preserve">A sua volta, sono presenti diversi </w:t>
+      </w:r>
+      <w:r>
+        <w:rPr>
+          <w:rFonts w:ascii="Calibri" w:hAnsi="Calibri" w:cs="Calibri"/>
+          <w:b/>
+          <w:bCs/>
+          <w:highlight w:val="white"/>
+        </w:rPr>
+        <w:t>tipi</w:t>
+      </w:r>
+      <w:r>
+        <w:rPr>
+          <w:rFonts w:ascii="Calibri" w:hAnsi="Calibri" w:cs="Calibri"/>
+          <w:highlight w:val="white"/>
+        </w:rPr>
+        <w:t xml:space="preserve"> di </w:t>
+      </w:r>
+      <w:r>
+        <w:rPr>
+          <w:rFonts w:ascii="Calibri" w:hAnsi="Calibri" w:cs="Calibri"/>
+          <w:b/>
+          <w:bCs/>
+          <w:highlight w:val="white"/>
+        </w:rPr>
+        <w:t>Casella Speciale</w:t>
+      </w:r>
+      <w:r>
+        <w:rPr>
+          <w:rFonts w:ascii="Calibri" w:hAnsi="Calibri" w:cs="Calibri"/>
+          <w:highlight w:val="white"/>
+        </w:rPr>
+        <w:t>: Oca, Ponte, Locanda, Prigione, Labirinto e Scheletro.</w:t>
+      </w:r>
     </w:p>
     <w:p>
       <w:pPr>
@@ -7496,10 +7546,10 @@
           <w:noProof/>
         </w:rPr>
         <w:drawing>
-          <wp:inline distT="0" distB="0" distL="0" distR="0" wp14:anchorId="27232228" wp14:editId="256EF577">
+          <wp:inline distT="0" distB="0" distL="0" distR="0" wp14:anchorId="639DEDE6" wp14:editId="5692878B">
             <wp:extent cx="6120130" cy="5064760"/>
             <wp:effectExtent l="0" t="0" r="0" b="2540"/>
-            <wp:docPr id="313862309" name="Immagine 2" descr="Immagine che contiene testo, diagramma, schermata, Piano"/>
+            <wp:docPr id="884528962" name="Immagine 2" descr="Immagine che contiene testo, diagramma, schermata, Piano&#10;&#10;Il contenuto generato dall'IA potrebbe non essere corretto."/>
             <wp:cNvGraphicFramePr>
               <a:graphicFrameLocks xmlns:a="http://schemas.openxmlformats.org/drawingml/2006/main" noChangeAspect="1"/>
             </wp:cNvGraphicFramePr>
@@ -7507,7 +7557,7 @@
               <a:graphicData uri="http://schemas.openxmlformats.org/drawingml/2006/picture">
                 <pic:pic xmlns:pic="http://schemas.openxmlformats.org/drawingml/2006/picture">
                   <pic:nvPicPr>
-                    <pic:cNvPr id="313862309" name="Immagine 2" descr="Immagine che contiene testo, diagramma, schermata, Piano"/>
+                    <pic:cNvPr id="884528962" name="Immagine 2" descr="Immagine che contiene testo, diagramma, schermata, Piano&#10;&#10;Il contenuto generato dall'IA potrebbe non essere corretto."/>
                     <pic:cNvPicPr/>
                   </pic:nvPicPr>
                   <pic:blipFill>
@@ -7555,12 +7605,43 @@
           <w:highlight w:val="white"/>
         </w:rPr>
       </w:pPr>
-      <w:bookmarkStart w:id="7" w:name="_Toc213799332"/>
-      <w:r>
-        <w:rPr>
-          <w:rFonts w:ascii="Calibri" w:hAnsi="Calibri" w:cs="Calibri"/>
-          <w:highlight w:val="white"/>
-        </w:rPr>
+    </w:p>
+    <w:p>
+      <w:pPr>
+        <w:rPr>
+          <w:highlight w:val="white"/>
+        </w:rPr>
+      </w:pPr>
+    </w:p>
+    <w:p>
+      <w:pPr>
+        <w:rPr>
+          <w:highlight w:val="white"/>
+        </w:rPr>
+      </w:pPr>
+    </w:p>
+    <w:p>
+      <w:pPr>
+        <w:rPr>
+          <w:highlight w:val="white"/>
+        </w:rPr>
+      </w:pPr>
+    </w:p>
+    <w:p>
+      <w:pPr>
+        <w:pStyle w:val="Titolo2"/>
+        <w:rPr>
+          <w:rFonts w:ascii="Calibri" w:hAnsi="Calibri" w:cs="Calibri"/>
+          <w:highlight w:val="white"/>
+        </w:rPr>
+      </w:pPr>
+      <w:bookmarkStart w:id="7" w:name="_Toc214079367"/>
+      <w:r>
+        <w:rPr>
+          <w:rFonts w:ascii="Calibri" w:hAnsi="Calibri" w:cs="Calibri"/>
+          <w:highlight w:val="white"/>
+        </w:rPr>
+        <w:lastRenderedPageBreak/>
         <w:t>3.</w:t>
       </w:r>
       <w:r>
@@ -7816,102 +7897,6 @@
           <w:highlight w:val="white"/>
         </w:rPr>
       </w:pPr>
-    </w:p>
-    <w:p>
-      <w:pPr>
-        <w:rPr>
-          <w:rFonts w:ascii="Calibri" w:hAnsi="Calibri" w:cs="Calibri"/>
-          <w:highlight w:val="white"/>
-        </w:rPr>
-      </w:pPr>
-    </w:p>
-    <w:p>
-      <w:pPr>
-        <w:rPr>
-          <w:rFonts w:ascii="Calibri" w:hAnsi="Calibri" w:cs="Calibri"/>
-          <w:highlight w:val="white"/>
-        </w:rPr>
-      </w:pPr>
-    </w:p>
-    <w:p>
-      <w:pPr>
-        <w:rPr>
-          <w:rFonts w:ascii="Calibri" w:hAnsi="Calibri" w:cs="Calibri"/>
-          <w:highlight w:val="white"/>
-        </w:rPr>
-      </w:pPr>
-    </w:p>
-    <w:p>
-      <w:pPr>
-        <w:rPr>
-          <w:rFonts w:ascii="Calibri" w:hAnsi="Calibri" w:cs="Calibri"/>
-          <w:highlight w:val="white"/>
-        </w:rPr>
-      </w:pPr>
-    </w:p>
-    <w:p>
-      <w:pPr>
-        <w:rPr>
-          <w:rFonts w:ascii="Calibri" w:hAnsi="Calibri" w:cs="Calibri"/>
-          <w:highlight w:val="white"/>
-        </w:rPr>
-      </w:pPr>
-    </w:p>
-    <w:p>
-      <w:pPr>
-        <w:rPr>
-          <w:rFonts w:ascii="Calibri" w:hAnsi="Calibri" w:cs="Calibri"/>
-          <w:highlight w:val="white"/>
-        </w:rPr>
-      </w:pPr>
-    </w:p>
-    <w:p>
-      <w:pPr>
-        <w:rPr>
-          <w:rFonts w:ascii="Calibri" w:hAnsi="Calibri" w:cs="Calibri"/>
-          <w:highlight w:val="white"/>
-        </w:rPr>
-      </w:pPr>
-    </w:p>
-    <w:p>
-      <w:pPr>
-        <w:rPr>
-          <w:rFonts w:ascii="Calibri" w:hAnsi="Calibri" w:cs="Calibri"/>
-          <w:highlight w:val="white"/>
-        </w:rPr>
-      </w:pPr>
-    </w:p>
-    <w:p>
-      <w:pPr>
-        <w:rPr>
-          <w:rFonts w:ascii="Calibri" w:hAnsi="Calibri" w:cs="Calibri"/>
-          <w:highlight w:val="white"/>
-        </w:rPr>
-      </w:pPr>
-    </w:p>
-    <w:p>
-      <w:pPr>
-        <w:rPr>
-          <w:rFonts w:ascii="Calibri" w:hAnsi="Calibri" w:cs="Calibri"/>
-          <w:highlight w:val="white"/>
-        </w:rPr>
-      </w:pPr>
-    </w:p>
-    <w:p>
-      <w:pPr>
-        <w:rPr>
-          <w:rFonts w:ascii="Calibri" w:hAnsi="Calibri" w:cs="Calibri"/>
-          <w:highlight w:val="white"/>
-        </w:rPr>
-      </w:pPr>
-    </w:p>
-    <w:p>
-      <w:pPr>
-        <w:rPr>
-          <w:rFonts w:ascii="Calibri" w:hAnsi="Calibri" w:cs="Calibri"/>
-          <w:highlight w:val="white"/>
-        </w:rPr>
-      </w:pPr>
       <w:r>
         <w:rPr>
           <w:rFonts w:ascii="Calibri" w:hAnsi="Calibri" w:cs="Calibri"/>
@@ -8038,6 +8023,7 @@
           <w:rFonts w:ascii="Calibri" w:hAnsi="Calibri" w:cs="Calibri"/>
           <w:highlight w:val="white"/>
         </w:rPr>
+        <w:lastRenderedPageBreak/>
         <w:t>Il diagramma dell’</w:t>
       </w:r>
       <w:r>
@@ -8157,17 +8143,354 @@
     </w:p>
     <w:p>
       <w:pPr>
+        <w:rPr>
+          <w:rFonts w:ascii="Calibri" w:hAnsi="Calibri" w:cs="Calibri"/>
+          <w:noProof/>
+        </w:rPr>
+      </w:pPr>
+    </w:p>
+    <w:p>
+      <w:pPr>
+        <w:rPr>
+          <w:rFonts w:ascii="Calibri" w:hAnsi="Calibri" w:cs="Calibri"/>
+          <w:noProof/>
+        </w:rPr>
+      </w:pPr>
+    </w:p>
+    <w:p>
+      <w:pPr>
+        <w:rPr>
+          <w:rFonts w:ascii="Calibri" w:hAnsi="Calibri" w:cs="Calibri"/>
+          <w:noProof/>
+        </w:rPr>
+      </w:pPr>
+    </w:p>
+    <w:p>
+      <w:pPr>
+        <w:rPr>
+          <w:rFonts w:ascii="Calibri" w:hAnsi="Calibri" w:cs="Calibri"/>
+          <w:noProof/>
+        </w:rPr>
+      </w:pPr>
+    </w:p>
+    <w:p>
+      <w:pPr>
+        <w:rPr>
+          <w:rFonts w:ascii="Calibri" w:hAnsi="Calibri" w:cs="Calibri"/>
+          <w:noProof/>
+        </w:rPr>
+      </w:pPr>
+    </w:p>
+    <w:p>
+      <w:pPr>
+        <w:rPr>
+          <w:rFonts w:ascii="Calibri" w:hAnsi="Calibri" w:cs="Calibri"/>
+          <w:noProof/>
+        </w:rPr>
+      </w:pPr>
+    </w:p>
+    <w:p>
+      <w:pPr>
+        <w:rPr>
+          <w:rFonts w:ascii="Calibri" w:hAnsi="Calibri" w:cs="Calibri"/>
+          <w:noProof/>
+        </w:rPr>
+      </w:pPr>
+    </w:p>
+    <w:p>
+      <w:pPr>
+        <w:rPr>
+          <w:rFonts w:ascii="Calibri" w:hAnsi="Calibri" w:cs="Calibri"/>
+          <w:noProof/>
+        </w:rPr>
+      </w:pPr>
+    </w:p>
+    <w:p>
+      <w:pPr>
+        <w:rPr>
+          <w:rFonts w:ascii="Calibri" w:hAnsi="Calibri" w:cs="Calibri"/>
+          <w:noProof/>
+        </w:rPr>
+      </w:pPr>
+    </w:p>
+    <w:p>
+      <w:pPr>
+        <w:rPr>
+          <w:rFonts w:ascii="Calibri" w:hAnsi="Calibri" w:cs="Calibri"/>
+          <w:noProof/>
+        </w:rPr>
+      </w:pPr>
+    </w:p>
+    <w:p>
+      <w:pPr>
+        <w:rPr>
+          <w:rFonts w:ascii="Calibri" w:hAnsi="Calibri" w:cs="Calibri"/>
+          <w:noProof/>
+        </w:rPr>
+      </w:pPr>
+    </w:p>
+    <w:p>
+      <w:pPr>
+        <w:rPr>
+          <w:rFonts w:ascii="Calibri" w:hAnsi="Calibri" w:cs="Calibri"/>
+          <w:noProof/>
+        </w:rPr>
+      </w:pPr>
+    </w:p>
+    <w:p>
+      <w:pPr>
+        <w:rPr>
+          <w:rFonts w:ascii="Calibri" w:hAnsi="Calibri" w:cs="Calibri"/>
+          <w:noProof/>
+        </w:rPr>
+      </w:pPr>
+    </w:p>
+    <w:p>
+      <w:pPr>
+        <w:rPr>
+          <w:rFonts w:ascii="Calibri" w:hAnsi="Calibri" w:cs="Calibri"/>
+          <w:noProof/>
+        </w:rPr>
+      </w:pPr>
+      <w:r>
+        <w:rPr>
+          <w:rFonts w:ascii="Calibri" w:hAnsi="Calibri" w:cs="Calibri"/>
+          <w:noProof/>
+        </w:rPr>
+        <w:t>Di seguito viene mostrato l’affinamento di alcuni SSD introdotti nelle precedenti iterazioni:</w:t>
+      </w:r>
+    </w:p>
+    <w:p>
+      <w:pPr>
+        <w:rPr>
+          <w:rFonts w:ascii="Calibri" w:hAnsi="Calibri" w:cs="Calibri"/>
+          <w:noProof/>
+        </w:rPr>
+      </w:pPr>
+      <w:r>
+        <w:rPr>
+          <w:rFonts w:ascii="Calibri" w:hAnsi="Calibri" w:cs="Calibri"/>
+          <w:noProof/>
+        </w:rPr>
+        <w:lastRenderedPageBreak/>
+        <w:drawing>
+          <wp:inline distT="0" distB="0" distL="0" distR="0" wp14:anchorId="735FFA4F" wp14:editId="0ECBBFFC">
+            <wp:extent cx="3600450" cy="8607699"/>
+            <wp:effectExtent l="0" t="0" r="0" b="3175"/>
+            <wp:docPr id="1200759679" name="Immagine 3" descr="Immagine che contiene testo, ricevuta, schermata, documento&#10;&#10;Il contenuto generato dall'IA potrebbe non essere corretto."/>
+            <wp:cNvGraphicFramePr>
+              <a:graphicFrameLocks xmlns:a="http://schemas.openxmlformats.org/drawingml/2006/main" noChangeAspect="1"/>
+            </wp:cNvGraphicFramePr>
+            <a:graphic xmlns:a="http://schemas.openxmlformats.org/drawingml/2006/main">
+              <a:graphicData uri="http://schemas.openxmlformats.org/drawingml/2006/picture">
+                <pic:pic xmlns:pic="http://schemas.openxmlformats.org/drawingml/2006/picture">
+                  <pic:nvPicPr>
+                    <pic:cNvPr id="1200759679" name="Immagine 3" descr="Immagine che contiene testo, ricevuta, schermata, documento&#10;&#10;Il contenuto generato dall'IA potrebbe non essere corretto."/>
+                    <pic:cNvPicPr/>
+                  </pic:nvPicPr>
+                  <pic:blipFill>
+                    <a:blip r:embed="rId14" cstate="print">
+                      <a:extLst>
+                        <a:ext uri="{28A0092B-C50C-407E-A947-70E740481C1C}">
+                          <a14:useLocalDpi xmlns:a14="http://schemas.microsoft.com/office/drawing/2010/main" val="0"/>
+                        </a:ext>
+                      </a:extLst>
+                    </a:blip>
+                    <a:stretch>
+                      <a:fillRect/>
+                    </a:stretch>
+                  </pic:blipFill>
+                  <pic:spPr>
+                    <a:xfrm>
+                      <a:off x="0" y="0"/>
+                      <a:ext cx="3603670" cy="8615397"/>
+                    </a:xfrm>
+                    <a:prstGeom prst="rect">
+                      <a:avLst/>
+                    </a:prstGeom>
+                  </pic:spPr>
+                </pic:pic>
+              </a:graphicData>
+            </a:graphic>
+          </wp:inline>
+        </w:drawing>
+      </w:r>
+      <w:r>
+        <w:rPr>
+          <w:rFonts w:ascii="Calibri" w:hAnsi="Calibri" w:cs="Calibri"/>
+          <w:noProof/>
+        </w:rPr>
+        <w:lastRenderedPageBreak/>
+        <w:drawing>
+          <wp:inline distT="0" distB="0" distL="0" distR="0" wp14:anchorId="12DDC9F8" wp14:editId="5B373BE6">
+            <wp:extent cx="6120130" cy="4880610"/>
+            <wp:effectExtent l="0" t="0" r="0" b="0"/>
+            <wp:docPr id="908223290" name="Immagine 4" descr="Immagine che contiene testo, schermata, diagramma, linea&#10;&#10;Il contenuto generato dall'IA potrebbe non essere corretto."/>
+            <wp:cNvGraphicFramePr>
+              <a:graphicFrameLocks xmlns:a="http://schemas.openxmlformats.org/drawingml/2006/main" noChangeAspect="1"/>
+            </wp:cNvGraphicFramePr>
+            <a:graphic xmlns:a="http://schemas.openxmlformats.org/drawingml/2006/main">
+              <a:graphicData uri="http://schemas.openxmlformats.org/drawingml/2006/picture">
+                <pic:pic xmlns:pic="http://schemas.openxmlformats.org/drawingml/2006/picture">
+                  <pic:nvPicPr>
+                    <pic:cNvPr id="908223290" name="Immagine 4" descr="Immagine che contiene testo, schermata, diagramma, linea&#10;&#10;Il contenuto generato dall'IA potrebbe non essere corretto."/>
+                    <pic:cNvPicPr/>
+                  </pic:nvPicPr>
+                  <pic:blipFill>
+                    <a:blip r:embed="rId15">
+                      <a:extLst>
+                        <a:ext uri="{28A0092B-C50C-407E-A947-70E740481C1C}">
+                          <a14:useLocalDpi xmlns:a14="http://schemas.microsoft.com/office/drawing/2010/main" val="0"/>
+                        </a:ext>
+                      </a:extLst>
+                    </a:blip>
+                    <a:stretch>
+                      <a:fillRect/>
+                    </a:stretch>
+                  </pic:blipFill>
+                  <pic:spPr>
+                    <a:xfrm>
+                      <a:off x="0" y="0"/>
+                      <a:ext cx="6120130" cy="4880610"/>
+                    </a:xfrm>
+                    <a:prstGeom prst="rect">
+                      <a:avLst/>
+                    </a:prstGeom>
+                  </pic:spPr>
+                </pic:pic>
+              </a:graphicData>
+            </a:graphic>
+          </wp:inline>
+        </w:drawing>
+      </w:r>
+      <w:r>
+        <w:rPr>
+          <w:rFonts w:ascii="Calibri" w:hAnsi="Calibri" w:cs="Calibri"/>
+          <w:noProof/>
+        </w:rPr>
+        <w:lastRenderedPageBreak/>
+        <w:drawing>
+          <wp:inline distT="0" distB="0" distL="0" distR="0" wp14:anchorId="5935D76A" wp14:editId="51358F6A">
+            <wp:extent cx="3735076" cy="8582025"/>
+            <wp:effectExtent l="0" t="0" r="0" b="0"/>
+            <wp:docPr id="1226513983" name="Immagine 5" descr="Immagine che contiene testo, diagramma, Parallelo, linea&#10;&#10;Il contenuto generato dall'IA potrebbe non essere corretto."/>
+            <wp:cNvGraphicFramePr>
+              <a:graphicFrameLocks xmlns:a="http://schemas.openxmlformats.org/drawingml/2006/main" noChangeAspect="1"/>
+            </wp:cNvGraphicFramePr>
+            <a:graphic xmlns:a="http://schemas.openxmlformats.org/drawingml/2006/main">
+              <a:graphicData uri="http://schemas.openxmlformats.org/drawingml/2006/picture">
+                <pic:pic xmlns:pic="http://schemas.openxmlformats.org/drawingml/2006/picture">
+                  <pic:nvPicPr>
+                    <pic:cNvPr id="1226513983" name="Immagine 5" descr="Immagine che contiene testo, diagramma, Parallelo, linea&#10;&#10;Il contenuto generato dall'IA potrebbe non essere corretto."/>
+                    <pic:cNvPicPr/>
+                  </pic:nvPicPr>
+                  <pic:blipFill>
+                    <a:blip r:embed="rId16" cstate="print">
+                      <a:extLst>
+                        <a:ext uri="{28A0092B-C50C-407E-A947-70E740481C1C}">
+                          <a14:useLocalDpi xmlns:a14="http://schemas.microsoft.com/office/drawing/2010/main" val="0"/>
+                        </a:ext>
+                      </a:extLst>
+                    </a:blip>
+                    <a:stretch>
+                      <a:fillRect/>
+                    </a:stretch>
+                  </pic:blipFill>
+                  <pic:spPr>
+                    <a:xfrm>
+                      <a:off x="0" y="0"/>
+                      <a:ext cx="3736956" cy="8586345"/>
+                    </a:xfrm>
+                    <a:prstGeom prst="rect">
+                      <a:avLst/>
+                    </a:prstGeom>
+                  </pic:spPr>
+                </pic:pic>
+              </a:graphicData>
+            </a:graphic>
+          </wp:inline>
+        </w:drawing>
+      </w:r>
+      <w:r>
+        <w:rPr>
+          <w:rFonts w:ascii="Calibri" w:hAnsi="Calibri" w:cs="Calibri"/>
+          <w:noProof/>
+        </w:rPr>
+        <w:lastRenderedPageBreak/>
+        <w:drawing>
+          <wp:inline distT="0" distB="0" distL="0" distR="0" wp14:anchorId="3A01453F" wp14:editId="0464DB3E">
+            <wp:extent cx="6120130" cy="7259320"/>
+            <wp:effectExtent l="0" t="0" r="0" b="0"/>
+            <wp:docPr id="1893673573" name="Immagine 6" descr="Immagine che contiene testo, Parallelo, numero, diagramma&#10;&#10;Il contenuto generato dall'IA potrebbe non essere corretto."/>
+            <wp:cNvGraphicFramePr>
+              <a:graphicFrameLocks xmlns:a="http://schemas.openxmlformats.org/drawingml/2006/main" noChangeAspect="1"/>
+            </wp:cNvGraphicFramePr>
+            <a:graphic xmlns:a="http://schemas.openxmlformats.org/drawingml/2006/main">
+              <a:graphicData uri="http://schemas.openxmlformats.org/drawingml/2006/picture">
+                <pic:pic xmlns:pic="http://schemas.openxmlformats.org/drawingml/2006/picture">
+                  <pic:nvPicPr>
+                    <pic:cNvPr id="1893673573" name="Immagine 6" descr="Immagine che contiene testo, Parallelo, numero, diagramma&#10;&#10;Il contenuto generato dall'IA potrebbe non essere corretto."/>
+                    <pic:cNvPicPr/>
+                  </pic:nvPicPr>
+                  <pic:blipFill>
+                    <a:blip r:embed="rId17">
+                      <a:extLst>
+                        <a:ext uri="{28A0092B-C50C-407E-A947-70E740481C1C}">
+                          <a14:useLocalDpi xmlns:a14="http://schemas.microsoft.com/office/drawing/2010/main" val="0"/>
+                        </a:ext>
+                      </a:extLst>
+                    </a:blip>
+                    <a:stretch>
+                      <a:fillRect/>
+                    </a:stretch>
+                  </pic:blipFill>
+                  <pic:spPr>
+                    <a:xfrm>
+                      <a:off x="0" y="0"/>
+                      <a:ext cx="6120130" cy="7259320"/>
+                    </a:xfrm>
+                    <a:prstGeom prst="rect">
+                      <a:avLst/>
+                    </a:prstGeom>
+                  </pic:spPr>
+                </pic:pic>
+              </a:graphicData>
+            </a:graphic>
+          </wp:inline>
+        </w:drawing>
+      </w:r>
+    </w:p>
+    <w:p>
+      <w:pPr>
+        <w:rPr>
+          <w:rFonts w:ascii="Calibri" w:hAnsi="Calibri" w:cs="Calibri"/>
+          <w:noProof/>
+        </w:rPr>
+      </w:pPr>
+    </w:p>
+    <w:p>
+      <w:pPr>
         <w:pStyle w:val="Titolo2"/>
         <w:rPr>
           <w:rFonts w:ascii="Calibri" w:hAnsi="Calibri" w:cs="Calibri"/>
         </w:rPr>
       </w:pPr>
       <w:bookmarkStart w:id="8" w:name="_Toc171097035"/>
-      <w:bookmarkStart w:id="9" w:name="_Toc213799333"/>
-      <w:r>
-        <w:rPr>
-          <w:rFonts w:ascii="Calibri" w:hAnsi="Calibri" w:cs="Calibri"/>
-        </w:rPr>
+    </w:p>
+    <w:p/>
+    <w:p>
+      <w:pPr>
+        <w:pStyle w:val="Titolo2"/>
+        <w:rPr>
+          <w:rFonts w:ascii="Calibri" w:hAnsi="Calibri" w:cs="Calibri"/>
+        </w:rPr>
+      </w:pPr>
+      <w:bookmarkStart w:id="9" w:name="_Toc214079368"/>
+      <w:r>
+        <w:rPr>
+          <w:rFonts w:ascii="Calibri" w:hAnsi="Calibri" w:cs="Calibri"/>
+        </w:rPr>
+        <w:lastRenderedPageBreak/>
         <w:t>3.3</w:t>
       </w:r>
       <w:r>
@@ -9457,11 +9780,12 @@
           <w:rFonts w:ascii="Calibri" w:hAnsi="Calibri" w:cs="Calibri"/>
         </w:rPr>
       </w:pPr>
-      <w:bookmarkStart w:id="10" w:name="_Toc213799334"/>
-      <w:r>
-        <w:rPr>
-          <w:rFonts w:ascii="Calibri" w:hAnsi="Calibri" w:cs="Calibri"/>
-        </w:rPr>
+      <w:bookmarkStart w:id="10" w:name="_Toc214079369"/>
+      <w:r>
+        <w:rPr>
+          <w:rFonts w:ascii="Calibri" w:hAnsi="Calibri" w:cs="Calibri"/>
+        </w:rPr>
+        <w:lastRenderedPageBreak/>
         <w:t>4</w:t>
       </w:r>
       <w:r>
@@ -9630,7 +9954,7 @@
           <w:highlight w:val="white"/>
         </w:rPr>
       </w:pPr>
-      <w:bookmarkStart w:id="11" w:name="_Toc213799335"/>
+      <w:bookmarkStart w:id="11" w:name="_Toc214079370"/>
       <w:r>
         <w:rPr>
           <w:rFonts w:ascii="Calibri" w:hAnsi="Calibri" w:cs="Calibri"/>
@@ -9707,7 +10031,7 @@
           <w:noProof/>
         </w:rPr>
         <w:drawing>
-          <wp:inline distT="0" distB="0" distL="0" distR="0" wp14:anchorId="055F0B55" wp14:editId="69A2CBBD">
+          <wp:inline distT="0" distB="0" distL="0" distR="0" wp14:anchorId="055F0B55" wp14:editId="749BDCC8">
             <wp:extent cx="6120130" cy="2813685"/>
             <wp:effectExtent l="0" t="0" r="0" b="5715"/>
             <wp:docPr id="205790204" name="Immagine 6" descr="Immagine che contiene testo, schermata, diagramma, linea"/>
@@ -9722,7 +10046,7 @@
                     <pic:cNvPicPr/>
                   </pic:nvPicPr>
                   <pic:blipFill>
-                    <a:blip r:embed="rId14" cstate="print">
+                    <a:blip r:embed="rId18" cstate="print">
                       <a:extLst>
                         <a:ext uri="{28A0092B-C50C-407E-A947-70E740481C1C}">
                           <a14:useLocalDpi xmlns:a14="http://schemas.microsoft.com/office/drawing/2010/main" val="0"/>
@@ -9788,7 +10112,7 @@
                     <pic:cNvPicPr/>
                   </pic:nvPicPr>
                   <pic:blipFill>
-                    <a:blip r:embed="rId15" cstate="print">
+                    <a:blip r:embed="rId19" cstate="print">
                       <a:extLst>
                         <a:ext uri="{28A0092B-C50C-407E-A947-70E740481C1C}">
                           <a14:useLocalDpi xmlns:a14="http://schemas.microsoft.com/office/drawing/2010/main" val="0"/>
@@ -9824,6 +10148,7 @@
         </w:numPr>
       </w:pPr>
       <w:r>
+        <w:lastRenderedPageBreak/>
         <w:t xml:space="preserve">SD </w:t>
       </w:r>
       <w:proofErr w:type="spellStart"/>
@@ -9838,7 +10163,7 @@
           <w:noProof/>
         </w:rPr>
         <w:drawing>
-          <wp:inline distT="0" distB="0" distL="0" distR="0" wp14:anchorId="74F48C47" wp14:editId="121FD108">
+          <wp:inline distT="0" distB="0" distL="0" distR="0" wp14:anchorId="74F48C47" wp14:editId="6832816B">
             <wp:extent cx="6120130" cy="2813685"/>
             <wp:effectExtent l="0" t="0" r="0" b="5715"/>
             <wp:docPr id="147181640" name="Immagine 8" descr="Immagine che contiene testo, schermata, diagramma, linea&#10;&#10;Il contenuto generato dall'IA potrebbe non essere corretto."/>
@@ -9853,7 +10178,7 @@
                     <pic:cNvPicPr/>
                   </pic:nvPicPr>
                   <pic:blipFill>
-                    <a:blip r:embed="rId16" cstate="print">
+                    <a:blip r:embed="rId20" cstate="print">
                       <a:extLst>
                         <a:ext uri="{28A0092B-C50C-407E-A947-70E740481C1C}">
                           <a14:useLocalDpi xmlns:a14="http://schemas.microsoft.com/office/drawing/2010/main" val="0"/>
@@ -9904,7 +10229,7 @@
           <w:noProof/>
         </w:rPr>
         <w:drawing>
-          <wp:inline distT="0" distB="0" distL="0" distR="0" wp14:anchorId="296E85D7" wp14:editId="78B6A689">
+          <wp:inline distT="0" distB="0" distL="0" distR="0" wp14:anchorId="296E85D7" wp14:editId="6034E498">
             <wp:extent cx="6120130" cy="2813685"/>
             <wp:effectExtent l="0" t="0" r="0" b="5715"/>
             <wp:docPr id="1732354731" name="Immagine 9" descr="Immagine che contiene testo, diagramma, linea, schermata&#10;&#10;Il contenuto generato dall'IA potrebbe non essere corretto."/>
@@ -9919,7 +10244,7 @@
                     <pic:cNvPicPr/>
                   </pic:nvPicPr>
                   <pic:blipFill>
-                    <a:blip r:embed="rId17" cstate="print">
+                    <a:blip r:embed="rId21" cstate="print">
                       <a:extLst>
                         <a:ext uri="{28A0092B-C50C-407E-A947-70E740481C1C}">
                           <a14:useLocalDpi xmlns:a14="http://schemas.microsoft.com/office/drawing/2010/main" val="0"/>
@@ -9955,93 +10280,65 @@
     <w:p/>
     <w:p>
       <w:pPr>
-        <w:pStyle w:val="Titolo2"/>
-        <w:rPr>
-          <w:rFonts w:ascii="Calibri" w:hAnsi="Calibri" w:cs="Calibri"/>
-          <w:highlight w:val="white"/>
-        </w:rPr>
-      </w:pPr>
-      <w:bookmarkStart w:id="12" w:name="_Toc213799336"/>
-      <w:r>
-        <w:rPr>
-          <w:rFonts w:ascii="Calibri" w:hAnsi="Calibri" w:cs="Calibri"/>
-          <w:highlight w:val="white"/>
-        </w:rPr>
-        <w:t>4</w:t>
-      </w:r>
-      <w:r>
-        <w:rPr>
-          <w:rFonts w:ascii="Calibri" w:hAnsi="Calibri" w:cs="Calibri"/>
-          <w:highlight w:val="white"/>
-        </w:rPr>
-        <w:t>.</w:t>
-      </w:r>
-      <w:r>
-        <w:rPr>
-          <w:rFonts w:ascii="Calibri" w:hAnsi="Calibri" w:cs="Calibri"/>
-          <w:highlight w:val="white"/>
-        </w:rPr>
-        <w:t>2</w:t>
-      </w:r>
-      <w:r>
-        <w:rPr>
-          <w:rFonts w:ascii="Calibri" w:hAnsi="Calibri" w:cs="Calibri"/>
-          <w:highlight w:val="white"/>
-        </w:rPr>
-        <w:t xml:space="preserve"> </w:t>
-      </w:r>
-      <w:r>
-        <w:rPr>
-          <w:rFonts w:ascii="Calibri" w:hAnsi="Calibri" w:cs="Calibri"/>
-          <w:highlight w:val="white"/>
-        </w:rPr>
-        <w:t>Diagramma</w:t>
-      </w:r>
-      <w:r>
-        <w:rPr>
-          <w:rFonts w:ascii="Calibri" w:hAnsi="Calibri" w:cs="Calibri"/>
-          <w:highlight w:val="white"/>
-        </w:rPr>
-        <w:t xml:space="preserve"> d</w:t>
-      </w:r>
-      <w:r>
-        <w:rPr>
-          <w:rFonts w:ascii="Calibri" w:hAnsi="Calibri" w:cs="Calibri"/>
-          <w:highlight w:val="white"/>
-        </w:rPr>
-        <w:t>elle</w:t>
-      </w:r>
-      <w:r>
-        <w:rPr>
-          <w:rFonts w:ascii="Calibri" w:hAnsi="Calibri" w:cs="Calibri"/>
-          <w:highlight w:val="white"/>
-        </w:rPr>
-        <w:t xml:space="preserve"> </w:t>
-      </w:r>
-      <w:r>
-        <w:rPr>
-          <w:rFonts w:ascii="Calibri" w:hAnsi="Calibri" w:cs="Calibri"/>
-          <w:highlight w:val="white"/>
-        </w:rPr>
-        <w:t>Classi</w:t>
-      </w:r>
-      <w:bookmarkEnd w:id="12"/>
-    </w:p>
-    <w:p>
-      <w:pPr>
-        <w:rPr>
-          <w:highlight w:val="white"/>
-        </w:rPr>
+        <w:pStyle w:val="Paragrafoelenco"/>
+        <w:numPr>
+          <w:ilvl w:val="0"/>
+          <w:numId w:val="30"/>
+        </w:numPr>
+      </w:pPr>
+      <w:r>
+        <w:lastRenderedPageBreak/>
+        <w:t xml:space="preserve">Refactoring del SD </w:t>
+      </w:r>
+      <w:proofErr w:type="spellStart"/>
+      <w:proofErr w:type="gramStart"/>
+      <w:r>
+        <w:t>giocaTurno</w:t>
+      </w:r>
+      <w:proofErr w:type="spellEnd"/>
+      <w:proofErr w:type="gramEnd"/>
+      <w:r>
+        <w:t xml:space="preserve">, introdotto nelle precedenti iterazioni, applicando i pattern </w:t>
+      </w:r>
+      <w:r>
+        <w:rPr>
+          <w:i/>
+          <w:iCs/>
+        </w:rPr>
+        <w:t>Singleton</w:t>
+      </w:r>
+      <w:r>
+        <w:t xml:space="preserve"> e </w:t>
+      </w:r>
+      <w:r>
+        <w:rPr>
+          <w:i/>
+          <w:iCs/>
+        </w:rPr>
+        <w:t>Strategy</w:t>
+      </w:r>
+      <w:r>
+        <w:t>:</w:t>
+      </w:r>
+    </w:p>
+    <w:p>
+      <w:pPr>
+        <w:pStyle w:val="Paragrafoelenco"/>
+      </w:pPr>
+    </w:p>
+    <w:p>
+      <w:pPr>
+        <w:pStyle w:val="Paragrafoelenco"/>
       </w:pPr>
       <w:r>
         <w:rPr>
           <w:noProof/>
         </w:rPr>
         <w:drawing>
-          <wp:inline distT="0" distB="0" distL="0" distR="0" wp14:anchorId="5537557D" wp14:editId="3BE5DBEB">
-            <wp:extent cx="6120130" cy="3694430"/>
-            <wp:effectExtent l="0" t="0" r="0" b="1270"/>
-            <wp:docPr id="200525480" name="Immagine 10" descr="Immagine che contiene testo, diagramma, Piano, Rettangolo&#10;&#10;Il contenuto generato dall'IA potrebbe non essere corretto."/>
+          <wp:inline distT="0" distB="0" distL="0" distR="0" wp14:anchorId="21EE0CC0" wp14:editId="7C8107BE">
+            <wp:extent cx="6120130" cy="2576195"/>
+            <wp:effectExtent l="0" t="0" r="0" b="9525"/>
+            <wp:docPr id="884923417" name="Immagine 7" descr="Immagine che contiene testo, diagramma, Parallelo, linea"/>
             <wp:cNvGraphicFramePr>
               <a:graphicFrameLocks xmlns:a="http://schemas.openxmlformats.org/drawingml/2006/main" noChangeAspect="1"/>
             </wp:cNvGraphicFramePr>
@@ -10049,11 +10346,11 @@
               <a:graphicData uri="http://schemas.openxmlformats.org/drawingml/2006/picture">
                 <pic:pic xmlns:pic="http://schemas.openxmlformats.org/drawingml/2006/picture">
                   <pic:nvPicPr>
-                    <pic:cNvPr id="200525480" name="Immagine 10" descr="Immagine che contiene testo, diagramma, Piano, Rettangolo&#10;&#10;Il contenuto generato dall'IA potrebbe non essere corretto."/>
+                    <pic:cNvPr id="884923417" name="Immagine 7" descr="Immagine che contiene testo, diagramma, Parallelo, linea"/>
                     <pic:cNvPicPr/>
                   </pic:nvPicPr>
                   <pic:blipFill>
-                    <a:blip r:embed="rId18" cstate="print">
+                    <a:blip r:embed="rId22" cstate="print">
                       <a:extLst>
                         <a:ext uri="{28A0092B-C50C-407E-A947-70E740481C1C}">
                           <a14:useLocalDpi xmlns:a14="http://schemas.microsoft.com/office/drawing/2010/main" val="0"/>
@@ -10067,7 +10364,7 @@
                   <pic:spPr>
                     <a:xfrm>
                       <a:off x="0" y="0"/>
-                      <a:ext cx="6120130" cy="3694430"/>
+                      <a:ext cx="6120130" cy="2576195"/>
                     </a:xfrm>
                     <a:prstGeom prst="rect">
                       <a:avLst/>
@@ -10080,13 +10377,24 @@
         </w:drawing>
       </w:r>
     </w:p>
-    <w:p>
-      <w:pPr>
-        <w:rPr>
-          <w:highlight w:val="white"/>
-        </w:rPr>
-      </w:pPr>
-    </w:p>
+    <w:p/>
+    <w:p/>
+    <w:p/>
+    <w:p/>
+    <w:p/>
+    <w:p/>
+    <w:p/>
+    <w:p/>
+    <w:p/>
+    <w:p/>
+    <w:p/>
+    <w:p/>
+    <w:p/>
+    <w:p/>
+    <w:p/>
+    <w:p/>
+    <w:p/>
+    <w:p/>
     <w:p>
       <w:pPr>
         <w:pStyle w:val="Titolo2"/>
@@ -10095,12 +10403,13 @@
           <w:highlight w:val="white"/>
         </w:rPr>
       </w:pPr>
-      <w:bookmarkStart w:id="13" w:name="_Toc213799337"/>
-      <w:r>
-        <w:rPr>
-          <w:rFonts w:ascii="Calibri" w:hAnsi="Calibri" w:cs="Calibri"/>
-          <w:highlight w:val="white"/>
-        </w:rPr>
+      <w:bookmarkStart w:id="12" w:name="_Toc214079371"/>
+      <w:r>
+        <w:rPr>
+          <w:rFonts w:ascii="Calibri" w:hAnsi="Calibri" w:cs="Calibri"/>
+          <w:highlight w:val="white"/>
+        </w:rPr>
+        <w:lastRenderedPageBreak/>
         <w:t>4</w:t>
       </w:r>
       <w:r>
@@ -10115,6 +10424,259 @@
           <w:rFonts w:ascii="Calibri" w:hAnsi="Calibri" w:cs="Calibri"/>
           <w:highlight w:val="white"/>
         </w:rPr>
+        <w:t>2</w:t>
+      </w:r>
+      <w:r>
+        <w:rPr>
+          <w:rFonts w:ascii="Calibri" w:hAnsi="Calibri" w:cs="Calibri"/>
+          <w:highlight w:val="white"/>
+        </w:rPr>
+        <w:t xml:space="preserve"> </w:t>
+      </w:r>
+      <w:r>
+        <w:rPr>
+          <w:rFonts w:ascii="Calibri" w:hAnsi="Calibri" w:cs="Calibri"/>
+          <w:highlight w:val="white"/>
+        </w:rPr>
+        <w:t>Diagramma</w:t>
+      </w:r>
+      <w:r>
+        <w:rPr>
+          <w:rFonts w:ascii="Calibri" w:hAnsi="Calibri" w:cs="Calibri"/>
+          <w:highlight w:val="white"/>
+        </w:rPr>
+        <w:t xml:space="preserve"> d</w:t>
+      </w:r>
+      <w:r>
+        <w:rPr>
+          <w:rFonts w:ascii="Calibri" w:hAnsi="Calibri" w:cs="Calibri"/>
+          <w:highlight w:val="white"/>
+        </w:rPr>
+        <w:t>elle</w:t>
+      </w:r>
+      <w:r>
+        <w:rPr>
+          <w:rFonts w:ascii="Calibri" w:hAnsi="Calibri" w:cs="Calibri"/>
+          <w:highlight w:val="white"/>
+        </w:rPr>
+        <w:t xml:space="preserve"> </w:t>
+      </w:r>
+      <w:r>
+        <w:rPr>
+          <w:rFonts w:ascii="Calibri" w:hAnsi="Calibri" w:cs="Calibri"/>
+          <w:highlight w:val="white"/>
+        </w:rPr>
+        <w:t>Classi</w:t>
+      </w:r>
+      <w:bookmarkEnd w:id="12"/>
+    </w:p>
+    <w:p>
+      <w:pPr>
+        <w:rPr>
+          <w:highlight w:val="white"/>
+        </w:rPr>
+      </w:pPr>
+      <w:r>
+        <w:rPr>
+          <w:highlight w:val="white"/>
+        </w:rPr>
+        <w:t xml:space="preserve">Sono state introdotte, in questa iterazione, l’interfaccia e le classi necessarie per la gestione degli effetti delle caselle speciali, secondo i pattern </w:t>
+      </w:r>
+      <w:r>
+        <w:rPr>
+          <w:i/>
+          <w:iCs/>
+          <w:highlight w:val="white"/>
+        </w:rPr>
+        <w:t>Singleton</w:t>
+      </w:r>
+      <w:r>
+        <w:rPr>
+          <w:highlight w:val="white"/>
+        </w:rPr>
+        <w:t xml:space="preserve"> e </w:t>
+      </w:r>
+      <w:r>
+        <w:rPr>
+          <w:i/>
+          <w:iCs/>
+          <w:highlight w:val="white"/>
+        </w:rPr>
+        <w:t>Strategy</w:t>
+      </w:r>
+      <w:r>
+        <w:rPr>
+          <w:highlight w:val="white"/>
+        </w:rPr>
+        <w:t xml:space="preserve">. La classe </w:t>
+      </w:r>
+      <w:r>
+        <w:rPr>
+          <w:b/>
+          <w:bCs/>
+          <w:highlight w:val="white"/>
+        </w:rPr>
+        <w:t>Partita</w:t>
+      </w:r>
+      <w:r>
+        <w:rPr>
+          <w:b/>
+          <w:bCs/>
+          <w:highlight w:val="white"/>
+        </w:rPr>
+        <w:t xml:space="preserve"> </w:t>
+      </w:r>
+      <w:r>
+        <w:rPr>
+          <w:highlight w:val="white"/>
+        </w:rPr>
+        <w:t xml:space="preserve">recupererà la strategia associata alla casella speciale richiesta, interfacciandosi con un oggetto </w:t>
+      </w:r>
+      <w:r>
+        <w:rPr>
+          <w:i/>
+          <w:iCs/>
+          <w:highlight w:val="white"/>
+        </w:rPr>
+        <w:t>Singleton</w:t>
+      </w:r>
+      <w:r>
+        <w:rPr>
+          <w:highlight w:val="white"/>
+        </w:rPr>
+        <w:t xml:space="preserve">. Tale oggetto, con un punto di accesso globale, consente, appunto, di individuare una delle </w:t>
+      </w:r>
+      <w:r>
+        <w:rPr>
+          <w:i/>
+          <w:iCs/>
+          <w:highlight w:val="white"/>
+        </w:rPr>
+        <w:t>Strategy</w:t>
+      </w:r>
+      <w:r>
+        <w:rPr>
+          <w:i/>
+          <w:iCs/>
+          <w:highlight w:val="white"/>
+        </w:rPr>
+        <w:t xml:space="preserve"> </w:t>
+      </w:r>
+      <w:r>
+        <w:rPr>
+          <w:highlight w:val="white"/>
+        </w:rPr>
+        <w:t>che implementano l’interfaccia comune, in base alla casella speciale che gli viene passata in input.</w:t>
+      </w:r>
+    </w:p>
+    <w:p>
+      <w:pPr>
+        <w:rPr>
+          <w:highlight w:val="white"/>
+        </w:rPr>
+      </w:pPr>
+      <w:r>
+        <w:rPr>
+          <w:highlight w:val="white"/>
+        </w:rPr>
+        <w:t xml:space="preserve"> Di seguito il diagramma delle classi completo della modifica sopracitata:</w:t>
+      </w:r>
+    </w:p>
+    <w:p>
+      <w:pPr>
+        <w:rPr>
+          <w:highlight w:val="white"/>
+        </w:rPr>
+      </w:pPr>
+    </w:p>
+    <w:p>
+      <w:pPr>
+        <w:rPr>
+          <w:highlight w:val="white"/>
+        </w:rPr>
+      </w:pPr>
+      <w:r>
+        <w:rPr>
+          <w:noProof/>
+        </w:rPr>
+        <w:drawing>
+          <wp:inline distT="0" distB="0" distL="0" distR="0" wp14:anchorId="2BE471BE" wp14:editId="259C85C2">
+            <wp:extent cx="6120130" cy="3534410"/>
+            <wp:effectExtent l="0" t="0" r="0" b="8890"/>
+            <wp:docPr id="747544228" name="Immagine 8" descr="Immagine che contiene testo, diagramma, Piano, Rettangolo&#10;&#10;Il contenuto generato dall'IA potrebbe non essere corretto."/>
+            <wp:cNvGraphicFramePr>
+              <a:graphicFrameLocks xmlns:a="http://schemas.openxmlformats.org/drawingml/2006/main" noChangeAspect="1"/>
+            </wp:cNvGraphicFramePr>
+            <a:graphic xmlns:a="http://schemas.openxmlformats.org/drawingml/2006/main">
+              <a:graphicData uri="http://schemas.openxmlformats.org/drawingml/2006/picture">
+                <pic:pic xmlns:pic="http://schemas.openxmlformats.org/drawingml/2006/picture">
+                  <pic:nvPicPr>
+                    <pic:cNvPr id="747544228" name="Immagine 8" descr="Immagine che contiene testo, diagramma, Piano, Rettangolo&#10;&#10;Il contenuto generato dall'IA potrebbe non essere corretto."/>
+                    <pic:cNvPicPr/>
+                  </pic:nvPicPr>
+                  <pic:blipFill>
+                    <a:blip r:embed="rId23" cstate="print">
+                      <a:extLst>
+                        <a:ext uri="{28A0092B-C50C-407E-A947-70E740481C1C}">
+                          <a14:useLocalDpi xmlns:a14="http://schemas.microsoft.com/office/drawing/2010/main" val="0"/>
+                        </a:ext>
+                      </a:extLst>
+                    </a:blip>
+                    <a:stretch>
+                      <a:fillRect/>
+                    </a:stretch>
+                  </pic:blipFill>
+                  <pic:spPr>
+                    <a:xfrm>
+                      <a:off x="0" y="0"/>
+                      <a:ext cx="6120130" cy="3534410"/>
+                    </a:xfrm>
+                    <a:prstGeom prst="rect">
+                      <a:avLst/>
+                    </a:prstGeom>
+                  </pic:spPr>
+                </pic:pic>
+              </a:graphicData>
+            </a:graphic>
+          </wp:inline>
+        </w:drawing>
+      </w:r>
+    </w:p>
+    <w:p>
+      <w:pPr>
+        <w:rPr>
+          <w:highlight w:val="white"/>
+        </w:rPr>
+      </w:pPr>
+    </w:p>
+    <w:p>
+      <w:pPr>
+        <w:pStyle w:val="Titolo2"/>
+        <w:rPr>
+          <w:rFonts w:ascii="Calibri" w:hAnsi="Calibri" w:cs="Calibri"/>
+          <w:highlight w:val="white"/>
+        </w:rPr>
+      </w:pPr>
+      <w:bookmarkStart w:id="13" w:name="_Toc214079372"/>
+      <w:r>
+        <w:rPr>
+          <w:rFonts w:ascii="Calibri" w:hAnsi="Calibri" w:cs="Calibri"/>
+          <w:highlight w:val="white"/>
+        </w:rPr>
+        <w:t>4</w:t>
+      </w:r>
+      <w:r>
+        <w:rPr>
+          <w:rFonts w:ascii="Calibri" w:hAnsi="Calibri" w:cs="Calibri"/>
+          <w:highlight w:val="white"/>
+        </w:rPr>
+        <w:t>.</w:t>
+      </w:r>
+      <w:r>
+        <w:rPr>
+          <w:rFonts w:ascii="Calibri" w:hAnsi="Calibri" w:cs="Calibri"/>
+          <w:highlight w:val="white"/>
+        </w:rPr>
         <w:t>3</w:t>
       </w:r>
       <w:r>
@@ -10145,6 +10707,34 @@
         </w:rPr>
         <w:t>Il Caso d’Uso di Avviamento non presenta modifiche rispetto a quello presentato durante l’Iterazione 1.</w:t>
       </w:r>
+    </w:p>
+    <w:p>
+      <w:pPr>
+        <w:rPr>
+          <w:rFonts w:ascii="Calibri" w:hAnsi="Calibri" w:cs="Calibri"/>
+        </w:rPr>
+      </w:pPr>
+    </w:p>
+    <w:p>
+      <w:pPr>
+        <w:rPr>
+          <w:rFonts w:ascii="Calibri" w:hAnsi="Calibri" w:cs="Calibri"/>
+        </w:rPr>
+      </w:pPr>
+    </w:p>
+    <w:p>
+      <w:pPr>
+        <w:rPr>
+          <w:rFonts w:ascii="Calibri" w:hAnsi="Calibri" w:cs="Calibri"/>
+        </w:rPr>
+      </w:pPr>
+    </w:p>
+    <w:p>
+      <w:pPr>
+        <w:rPr>
+          <w:rFonts w:ascii="Calibri" w:hAnsi="Calibri" w:cs="Calibri"/>
+        </w:rPr>
+      </w:pPr>
     </w:p>
     <w:p>
       <w:pPr>
@@ -10169,11 +10759,12 @@
         </w:rPr>
       </w:pPr>
       <w:bookmarkStart w:id="14" w:name="_Toc172061562"/>
-      <w:bookmarkStart w:id="15" w:name="_Toc213799338"/>
-      <w:r>
-        <w:rPr>
-          <w:rFonts w:ascii="Calibri" w:hAnsi="Calibri" w:cs="Calibri"/>
-        </w:rPr>
+      <w:bookmarkStart w:id="15" w:name="_Toc214079373"/>
+      <w:r>
+        <w:rPr>
+          <w:rFonts w:ascii="Calibri" w:hAnsi="Calibri" w:cs="Calibri"/>
+        </w:rPr>
+        <w:lastRenderedPageBreak/>
         <w:t>5</w:t>
       </w:r>
       <w:r>
@@ -10351,6 +10942,158 @@
     </w:p>
     <w:p>
       <w:pPr>
+        <w:rPr>
+          <w:rFonts w:ascii="Calibri" w:hAnsi="Calibri" w:cs="Calibri"/>
+          <w:highlight w:val="white"/>
+        </w:rPr>
+      </w:pPr>
+    </w:p>
+    <w:p>
+      <w:pPr>
+        <w:rPr>
+          <w:rFonts w:ascii="Calibri" w:hAnsi="Calibri" w:cs="Calibri"/>
+          <w:highlight w:val="white"/>
+        </w:rPr>
+      </w:pPr>
+    </w:p>
+    <w:p>
+      <w:pPr>
+        <w:rPr>
+          <w:rFonts w:ascii="Calibri" w:hAnsi="Calibri" w:cs="Calibri"/>
+          <w:highlight w:val="white"/>
+        </w:rPr>
+      </w:pPr>
+    </w:p>
+    <w:p>
+      <w:pPr>
+        <w:rPr>
+          <w:rFonts w:ascii="Calibri" w:hAnsi="Calibri" w:cs="Calibri"/>
+          <w:highlight w:val="white"/>
+        </w:rPr>
+      </w:pPr>
+    </w:p>
+    <w:p>
+      <w:pPr>
+        <w:rPr>
+          <w:rFonts w:ascii="Calibri" w:hAnsi="Calibri" w:cs="Calibri"/>
+          <w:highlight w:val="white"/>
+        </w:rPr>
+      </w:pPr>
+    </w:p>
+    <w:p>
+      <w:pPr>
+        <w:rPr>
+          <w:rFonts w:ascii="Calibri" w:hAnsi="Calibri" w:cs="Calibri"/>
+          <w:highlight w:val="white"/>
+        </w:rPr>
+      </w:pPr>
+    </w:p>
+    <w:p>
+      <w:pPr>
+        <w:rPr>
+          <w:rFonts w:ascii="Calibri" w:hAnsi="Calibri" w:cs="Calibri"/>
+          <w:highlight w:val="white"/>
+        </w:rPr>
+      </w:pPr>
+    </w:p>
+    <w:p>
+      <w:pPr>
+        <w:rPr>
+          <w:rFonts w:ascii="Calibri" w:hAnsi="Calibri" w:cs="Calibri"/>
+          <w:highlight w:val="white"/>
+        </w:rPr>
+      </w:pPr>
+    </w:p>
+    <w:p>
+      <w:pPr>
+        <w:rPr>
+          <w:rFonts w:ascii="Calibri" w:hAnsi="Calibri" w:cs="Calibri"/>
+          <w:highlight w:val="white"/>
+        </w:rPr>
+      </w:pPr>
+    </w:p>
+    <w:p>
+      <w:pPr>
+        <w:rPr>
+          <w:rFonts w:ascii="Calibri" w:hAnsi="Calibri" w:cs="Calibri"/>
+          <w:highlight w:val="white"/>
+        </w:rPr>
+      </w:pPr>
+    </w:p>
+    <w:p>
+      <w:pPr>
+        <w:rPr>
+          <w:rFonts w:ascii="Calibri" w:hAnsi="Calibri" w:cs="Calibri"/>
+          <w:highlight w:val="white"/>
+        </w:rPr>
+      </w:pPr>
+    </w:p>
+    <w:p>
+      <w:pPr>
+        <w:rPr>
+          <w:rFonts w:ascii="Calibri" w:hAnsi="Calibri" w:cs="Calibri"/>
+          <w:highlight w:val="white"/>
+        </w:rPr>
+      </w:pPr>
+    </w:p>
+    <w:p>
+      <w:pPr>
+        <w:rPr>
+          <w:rFonts w:ascii="Calibri" w:hAnsi="Calibri" w:cs="Calibri"/>
+          <w:highlight w:val="white"/>
+        </w:rPr>
+      </w:pPr>
+    </w:p>
+    <w:p>
+      <w:pPr>
+        <w:rPr>
+          <w:rFonts w:ascii="Calibri" w:hAnsi="Calibri" w:cs="Calibri"/>
+          <w:highlight w:val="white"/>
+        </w:rPr>
+      </w:pPr>
+    </w:p>
+    <w:p>
+      <w:pPr>
+        <w:rPr>
+          <w:rFonts w:ascii="Calibri" w:hAnsi="Calibri" w:cs="Calibri"/>
+          <w:highlight w:val="white"/>
+        </w:rPr>
+      </w:pPr>
+    </w:p>
+    <w:p>
+      <w:pPr>
+        <w:rPr>
+          <w:rFonts w:ascii="Calibri" w:hAnsi="Calibri" w:cs="Calibri"/>
+          <w:highlight w:val="white"/>
+        </w:rPr>
+      </w:pPr>
+    </w:p>
+    <w:p>
+      <w:pPr>
+        <w:rPr>
+          <w:rFonts w:ascii="Calibri" w:hAnsi="Calibri" w:cs="Calibri"/>
+          <w:highlight w:val="white"/>
+        </w:rPr>
+      </w:pPr>
+    </w:p>
+    <w:p>
+      <w:pPr>
+        <w:rPr>
+          <w:rFonts w:ascii="Calibri" w:hAnsi="Calibri" w:cs="Calibri"/>
+          <w:highlight w:val="white"/>
+        </w:rPr>
+      </w:pPr>
+    </w:p>
+    <w:p>
+      <w:pPr>
+        <w:rPr>
+          <w:rFonts w:ascii="Calibri" w:hAnsi="Calibri" w:cs="Calibri"/>
+          <w:highlight w:val="white"/>
+        </w:rPr>
+      </w:pPr>
+    </w:p>
+    <w:p>
+      <w:pPr>
         <w:pStyle w:val="Titolo1"/>
         <w:jc w:val="center"/>
         <w:rPr>
@@ -10358,11 +11101,12 @@
         </w:rPr>
       </w:pPr>
       <w:bookmarkStart w:id="16" w:name="_Toc172061563"/>
-      <w:bookmarkStart w:id="17" w:name="_Toc213799339"/>
-      <w:r>
-        <w:rPr>
-          <w:rFonts w:ascii="Calibri" w:hAnsi="Calibri" w:cs="Calibri"/>
-        </w:rPr>
+      <w:bookmarkStart w:id="17" w:name="_Toc214079374"/>
+      <w:r>
+        <w:rPr>
+          <w:rFonts w:ascii="Calibri" w:hAnsi="Calibri" w:cs="Calibri"/>
+        </w:rPr>
+        <w:lastRenderedPageBreak/>
         <w:t>6.</w:t>
       </w:r>
       <w:r>
@@ -10382,25 +11126,7 @@
     </w:p>
     <w:p>
       <w:r>
-        <w:t>I test sono stati eseguiti sull</w:t>
-      </w:r>
-      <w:r>
-        <w:t>a</w:t>
-      </w:r>
-      <w:r>
-        <w:t xml:space="preserve"> seguent</w:t>
-      </w:r>
-      <w:r>
-        <w:t>e</w:t>
-      </w:r>
-      <w:r>
-        <w:t xml:space="preserve"> class</w:t>
-      </w:r>
-      <w:r>
-        <w:t>e</w:t>
-      </w:r>
-      <w:r>
-        <w:t>:</w:t>
+        <w:t>I test sono stati eseguiti sulla seguente classe:</w:t>
       </w:r>
     </w:p>
     <w:p>
@@ -10412,10 +11138,7 @@
       </w:r>
       <w:proofErr w:type="spellStart"/>
       <w:r>
-        <w:t>GiocoDellOca</w:t>
-      </w:r>
-      <w:r>
-        <w:t>Test</w:t>
+        <w:t>GiocoDellOcaTest</w:t>
       </w:r>
       <w:proofErr w:type="spellEnd"/>
     </w:p>
@@ -11267,7 +11990,13 @@
     </w:p>
     <w:p>
       <w:r>
-        <w:t xml:space="preserve">Condizione iniziale: che esista la variabile </w:t>
+        <w:t xml:space="preserve">Condizione iniziale: che esista </w:t>
+      </w:r>
+      <w:r>
+        <w:t>una</w:t>
+      </w:r>
+      <w:r>
+        <w:t xml:space="preserve"> variabile </w:t>
       </w:r>
       <w:proofErr w:type="spellStart"/>
       <w:r>
@@ -11280,7 +12009,25 @@
     </w:p>
     <w:p>
       <w:r>
-        <w:t>Condizione da testare: che esistano i giocatori, personalizzazioni, scenario e regole impostate.</w:t>
+        <w:t xml:space="preserve">Condizione da testare: che esistano i giocatori, </w:t>
+      </w:r>
+      <w:r>
+        <w:t xml:space="preserve">le </w:t>
+      </w:r>
+      <w:r>
+        <w:t xml:space="preserve">personalizzazioni, </w:t>
+      </w:r>
+      <w:r>
+        <w:t xml:space="preserve">lo </w:t>
+      </w:r>
+      <w:r>
+        <w:t>scenario e</w:t>
+      </w:r>
+      <w:r>
+        <w:t xml:space="preserve"> le</w:t>
+      </w:r>
+      <w:r>
+        <w:t xml:space="preserve"> regole impostate.</w:t>
       </w:r>
     </w:p>
     <w:p/>
@@ -11341,7 +12088,19 @@
     </w:p>
     <w:p>
       <w:r>
-        <w:t>Test dell'impostazione di una Regola Singola.</w:t>
+        <w:t xml:space="preserve">Test dell'impostazione di una </w:t>
+      </w:r>
+      <w:r>
+        <w:t>r</w:t>
+      </w:r>
+      <w:r>
+        <w:t xml:space="preserve">egola </w:t>
+      </w:r>
+      <w:r>
+        <w:t>s</w:t>
+      </w:r>
+      <w:r>
+        <w:t>ingola.</w:t>
       </w:r>
     </w:p>
     <w:p>
@@ -11354,22 +12113,39 @@
       </w:r>
       <w:proofErr w:type="spellEnd"/>
       <w:r>
-        <w:t xml:space="preserve"> e che stia configurando una nuova Partita</w:t>
-      </w:r>
-    </w:p>
-    <w:p>
-      <w:r>
-        <w:t xml:space="preserve">Condizione da testare: perché il metodo funzioni si deve verificare che il numero di regole Attese sia uguale a quello di default se la tabella è vuota (non sono state aggiunte manualmente via </w:t>
-      </w:r>
-      <w:proofErr w:type="spellStart"/>
-      <w:r>
-        <w:t>ui</w:t>
-      </w:r>
-      <w:proofErr w:type="spellEnd"/>
+        <w:t xml:space="preserve"> e che</w:t>
+      </w:r>
+      <w:r>
+        <w:t xml:space="preserve"> si</w:t>
+      </w:r>
+      <w:r>
+        <w:t xml:space="preserve"> stia configurando una nuova Partita</w:t>
+      </w:r>
+      <w:r>
+        <w:t>.</w:t>
+      </w:r>
+    </w:p>
+    <w:p>
+      <w:r>
+        <w:t xml:space="preserve">Condizione da testare: perché il metodo funzioni si deve verificare che il numero di regole </w:t>
+      </w:r>
+      <w:r>
+        <w:t>a</w:t>
+      </w:r>
+      <w:r>
+        <w:t xml:space="preserve">ttese sia uguale a quello di default se la tabella è vuota (non sono state aggiunte manualmente via </w:t>
+      </w:r>
+      <w:r>
+        <w:t>GUI</w:t>
+      </w:r>
       <w:r>
         <w:t>) oppure uguale al numero di record passato dalla tabella se piena.</w:t>
       </w:r>
     </w:p>
+    <w:p/>
+    <w:p/>
+    <w:p/>
+    <w:p/>
     <w:p/>
     <w:p>
       <w:pPr>
@@ -11386,6 +12162,7 @@
           <w:bCs/>
           <w:color w:val="153D63" w:themeColor="text2" w:themeTint="E6"/>
         </w:rPr>
+        <w:lastRenderedPageBreak/>
         <w:t>void</w:t>
       </w:r>
       <w:proofErr w:type="spellEnd"/>
@@ -11428,7 +12205,13 @@
     </w:p>
     <w:p>
       <w:r>
-        <w:t>Test dell'impostazione di un set di Regole.</w:t>
+        <w:t xml:space="preserve">Test dell'impostazione di un set di </w:t>
+      </w:r>
+      <w:r>
+        <w:t>r</w:t>
+      </w:r>
+      <w:r>
+        <w:t>egole.</w:t>
       </w:r>
     </w:p>
     <w:p>
@@ -11441,18 +12224,31 @@
       </w:r>
       <w:proofErr w:type="spellEnd"/>
       <w:r>
-        <w:t xml:space="preserve"> e che stia configurando una nuova Partita</w:t>
-      </w:r>
-    </w:p>
-    <w:p>
-      <w:r>
-        <w:t xml:space="preserve">Condizione da testare: perché il metodo funzioni si deve verificare che il numero di regole Attese sia uguale a quello di default se la tabella è vuota (non sono state aggiunte manualmente via </w:t>
-      </w:r>
-      <w:proofErr w:type="spellStart"/>
-      <w:r>
-        <w:t>ui</w:t>
-      </w:r>
-      <w:proofErr w:type="spellEnd"/>
+        <w:t xml:space="preserve"> e che </w:t>
+      </w:r>
+      <w:r>
+        <w:t xml:space="preserve">si </w:t>
+      </w:r>
+      <w:r>
+        <w:t>stia configurando una nuova Partita</w:t>
+      </w:r>
+      <w:r>
+        <w:t>.</w:t>
+      </w:r>
+    </w:p>
+    <w:p>
+      <w:r>
+        <w:t xml:space="preserve">Condizione da testare: perché il metodo funzioni si deve verificare che il numero di regole </w:t>
+      </w:r>
+      <w:r>
+        <w:t>a</w:t>
+      </w:r>
+      <w:r>
+        <w:t xml:space="preserve">ttese sia uguale a quello di default se la tabella è vuota (non sono state aggiunte manualmente via </w:t>
+      </w:r>
+      <w:r>
+        <w:t>UI</w:t>
+      </w:r>
       <w:r>
         <w:t>) oppure uguale al numero di record passato dalla tabella se piena.</w:t>
       </w:r>
@@ -11528,7 +12324,30 @@
       </w:r>
       <w:proofErr w:type="spellEnd"/>
       <w:r>
-        <w:t xml:space="preserve"> e che stia configurando una nuova Partita</w:t>
+        <w:t xml:space="preserve"> e </w:t>
+      </w:r>
+      <w:proofErr w:type="gramStart"/>
+      <w:r>
+        <w:t xml:space="preserve">che </w:t>
+      </w:r>
+      <w:r>
+        <w:t xml:space="preserve"> si</w:t>
+      </w:r>
+      <w:proofErr w:type="gramEnd"/>
+      <w:r>
+        <w:t xml:space="preserve"> </w:t>
+      </w:r>
+      <w:r>
+        <w:t xml:space="preserve">stia configurando una nuova </w:t>
+      </w:r>
+      <w:r>
+        <w:t>p</w:t>
+      </w:r>
+      <w:r>
+        <w:t>artita</w:t>
+      </w:r>
+      <w:r>
+        <w:t>.</w:t>
       </w:r>
     </w:p>
     <w:p>
@@ -11543,8 +12362,10 @@
       <w:r>
         <w:t xml:space="preserve"> altrimenti viene impostato lo scenario di default</w:t>
       </w:r>
-    </w:p>
-    <w:p/>
+      <w:r>
+        <w:t>.</w:t>
+      </w:r>
+    </w:p>
     <w:p/>
     <w:p>
       <w:pPr>
@@ -11616,12 +12437,27 @@
       </w:r>
       <w:proofErr w:type="spellEnd"/>
       <w:r>
-        <w:t xml:space="preserve"> e che stia configurando una nuova Partita e che esista un giocatore per poter associare la pedina</w:t>
+        <w:t>,</w:t>
+      </w:r>
+      <w:r>
+        <w:t xml:space="preserve"> che</w:t>
+      </w:r>
+      <w:r>
+        <w:t xml:space="preserve"> si</w:t>
+      </w:r>
+      <w:r>
+        <w:t xml:space="preserve"> stia configurando una nuova Partita e che esista un giocatore per poter associare la pedina</w:t>
+      </w:r>
+      <w:r>
+        <w:t>.</w:t>
       </w:r>
     </w:p>
     <w:p>
       <w:r>
         <w:t>Condizione da testare: perché il metodo funzioni si deve verificare che la pedina scelta esista e sia stata associata correttamente al giocatore</w:t>
+      </w:r>
+      <w:r>
+        <w:t>.</w:t>
       </w:r>
     </w:p>
     <w:p/>
@@ -11695,7 +12531,16 @@
       </w:r>
       <w:proofErr w:type="spellEnd"/>
       <w:r>
-        <w:t xml:space="preserve"> e che stia configurando una nuova Partita e che esista un giocatore per poter associare il dado.</w:t>
+        <w:t>,</w:t>
+      </w:r>
+      <w:r>
+        <w:t xml:space="preserve"> che </w:t>
+      </w:r>
+      <w:r>
+        <w:t xml:space="preserve">si </w:t>
+      </w:r>
+      <w:r>
+        <w:t>stia configurando una nuova Partita e che esista un giocatore per poter associare il dado.</w:t>
       </w:r>
     </w:p>
     <w:p>
@@ -11703,6 +12548,12 @@
         <w:t>Condizione da testare: perché il metodo funzioni si deve verificare che il dado scelto esista e sia stata associato correttamente al giocatore.</w:t>
       </w:r>
     </w:p>
+    <w:p/>
+    <w:p/>
+    <w:p/>
+    <w:p/>
+    <w:p/>
+    <w:p/>
     <w:p/>
     <w:p>
       <w:pPr>
@@ -11774,15 +12625,41 @@
       </w:r>
       <w:proofErr w:type="spellEnd"/>
       <w:r>
-        <w:t>, che abbia configurato una nuova Partita e l'abbia avviata.</w:t>
-      </w:r>
-    </w:p>
-    <w:p>
-      <w:r>
-        <w:t>Condizione da testare: perché il metodo funzioni si deve verificare che la funzione restituisca una mossa non vuota sotto forma di messaggio (la natura del risultato è casuale, l'importante è che non sia vuota)</w:t>
-      </w:r>
-    </w:p>
-    <w:p/>
+        <w:t xml:space="preserve">, che </w:t>
+      </w:r>
+      <w:r>
+        <w:t>sia stata</w:t>
+      </w:r>
+      <w:r>
+        <w:t xml:space="preserve"> configurat</w:t>
+      </w:r>
+      <w:r>
+        <w:t>a e avviata</w:t>
+      </w:r>
+      <w:r>
+        <w:t xml:space="preserve"> una </w:t>
+      </w:r>
+      <w:r>
+        <w:t>partita con delle impostazioni di default</w:t>
+      </w:r>
+      <w:r>
+        <w:t xml:space="preserve">, </w:t>
+      </w:r>
+      <w:r>
+        <w:t>e che esista una pedina</w:t>
+      </w:r>
+      <w:r>
+        <w:t>.</w:t>
+      </w:r>
+    </w:p>
+    <w:p>
+      <w:r>
+        <w:t xml:space="preserve">Condizione da testare: perché il metodo funzioni si deve verificare </w:t>
+      </w:r>
+      <w:r>
+        <w:t>che per ogni possibile tipologia di casella sulla quale la pedina può atterrare, la posizione e lo stato di quest’ultima siano corrette.</w:t>
+      </w:r>
+    </w:p>
     <w:p/>
     <w:p>
       <w:pPr>
@@ -11854,7 +12731,22 @@
       </w:r>
       <w:proofErr w:type="spellEnd"/>
       <w:r>
-        <w:t>, che stia configurando una Partita.</w:t>
+        <w:t xml:space="preserve"> e</w:t>
+      </w:r>
+      <w:r>
+        <w:t xml:space="preserve"> che</w:t>
+      </w:r>
+      <w:r>
+        <w:t xml:space="preserve"> si</w:t>
+      </w:r>
+      <w:r>
+        <w:t xml:space="preserve"> stia configurando una </w:t>
+      </w:r>
+      <w:r>
+        <w:t>p</w:t>
+      </w:r>
+      <w:r>
+        <w:t>artita.</w:t>
       </w:r>
     </w:p>
     <w:p>
@@ -11862,7 +12754,6 @@
         <w:t>Condizione da testare: perché il metodo funzioni si deve verificare che il numero di giocatori aggiunti corrisponda effettivamente al numero di giocatori registrato per la partita corrente.</w:t>
       </w:r>
     </w:p>
-    <w:p/>
     <w:p/>
     <w:p>
       <w:pPr>
@@ -11934,23 +12825,50 @@
       </w:r>
       <w:proofErr w:type="spellEnd"/>
       <w:r>
-        <w:t>, che stia configurando o abbia già configurato una nuova Partita.</w:t>
+        <w:t xml:space="preserve"> e che </w:t>
+      </w:r>
+      <w:r>
+        <w:t>stia configurando</w:t>
+      </w:r>
+      <w:r>
+        <w:t xml:space="preserve">/sia già stata configurata </w:t>
+      </w:r>
+      <w:r>
+        <w:t xml:space="preserve">una nuova </w:t>
+      </w:r>
+      <w:r>
+        <w:t>p</w:t>
+      </w:r>
+      <w:r>
+        <w:t>artita.</w:t>
       </w:r>
     </w:p>
     <w:p>
       <w:r>
         <w:t xml:space="preserve">Condizione da testare: perché il metodo funzioni si deve verificare </w:t>
       </w:r>
-      <w:proofErr w:type="gramStart"/>
-      <w:r>
-        <w:t>che</w:t>
-      </w:r>
-      <w:proofErr w:type="gramEnd"/>
-      <w:r>
-        <w:t xml:space="preserve"> se le tabelle preposte alla definizione di pedina e dado sono vuote, vengano associate delle personalizzazioni di default, e il giocatore viene impostato come giocatore corrente</w:t>
-      </w:r>
-    </w:p>
-    <w:p/>
+      <w:r>
+        <w:t>che,</w:t>
+      </w:r>
+      <w:r>
+        <w:t xml:space="preserve"> </w:t>
+      </w:r>
+      <w:r>
+        <w:t>qualora</w:t>
+      </w:r>
+      <w:r>
+        <w:t xml:space="preserve"> le tabelle preposte alla definizione di pedina e dado </w:t>
+      </w:r>
+      <w:r>
+        <w:t>siano</w:t>
+      </w:r>
+      <w:r>
+        <w:t xml:space="preserve"> vuote, vengano associate delle personalizzazioni di default, e il giocatore viene impostato come giocatore corrente</w:t>
+      </w:r>
+      <w:r>
+        <w:t>.</w:t>
+      </w:r>
+    </w:p>
     <w:p/>
     <w:p>
       <w:pPr>
@@ -12022,30 +12940,64 @@
       </w:r>
       <w:proofErr w:type="spellEnd"/>
       <w:r>
-        <w:t>, che si voglia accedere con privilegi elevati.</w:t>
-      </w:r>
-    </w:p>
-    <w:p>
-      <w:r>
-        <w:t xml:space="preserve">Condizione da testare: perché il metodo funzioni si deve passare in input la coppia corretta username e password admin </w:t>
-      </w:r>
-      <w:proofErr w:type="spellStart"/>
+        <w:t xml:space="preserve"> </w:t>
+      </w:r>
+      <w:r>
+        <w:t>e</w:t>
+      </w:r>
+      <w:r>
+        <w:t xml:space="preserve"> che si voglia accedere </w:t>
+      </w:r>
+      <w:r>
+        <w:t>al pannello amministratore</w:t>
+      </w:r>
+      <w:r>
+        <w:t>.</w:t>
+      </w:r>
+    </w:p>
+    <w:p>
+      <w:r>
+        <w:t xml:space="preserve">Condizione da testare: perché il metodo funzioni si deve passare in input la coppia corretta username e password </w:t>
+      </w:r>
+      <w:r>
+        <w:t>"</w:t>
+      </w:r>
       <w:r>
         <w:t>admin</w:t>
       </w:r>
-      <w:proofErr w:type="spellEnd"/>
-      <w:r>
-        <w:t xml:space="preserve">, altrimenti viene restituito un </w:t>
-      </w:r>
-      <w:proofErr w:type="spellStart"/>
-      <w:r>
-        <w:t>bool</w:t>
-      </w:r>
-      <w:proofErr w:type="spellEnd"/>
+      <w:r>
+        <w:t>”</w:t>
+      </w:r>
+      <w:r>
+        <w:t xml:space="preserve"> </w:t>
+      </w:r>
+      <w:r>
+        <w:t>“</w:t>
+      </w:r>
+      <w:r>
+        <w:t>admin</w:t>
+      </w:r>
+      <w:r>
+        <w:t>”</w:t>
+      </w:r>
+      <w:r>
+        <w:t>, altrimenti viene restituito un bool</w:t>
+      </w:r>
+      <w:r>
+        <w:t>eano</w:t>
+      </w:r>
       <w:r>
         <w:t xml:space="preserve"> che blocca la funzionalità</w:t>
       </w:r>
-    </w:p>
+      <w:r>
+        <w:t>.</w:t>
+      </w:r>
+    </w:p>
+    <w:p/>
+    <w:p/>
+    <w:p/>
+    <w:p/>
+    <w:p/>
     <w:p/>
     <w:p>
       <w:pPr>
@@ -12062,6 +13014,7 @@
           <w:bCs/>
           <w:color w:val="153D63" w:themeColor="text2" w:themeTint="E6"/>
         </w:rPr>
+        <w:lastRenderedPageBreak/>
         <w:t>void</w:t>
       </w:r>
       <w:proofErr w:type="spellEnd"/>
@@ -12117,7 +13070,10 @@
       </w:r>
       <w:proofErr w:type="spellEnd"/>
       <w:r>
-        <w:t>, che gli scenari vecchi esistano già per poter fare il confronto.</w:t>
+        <w:t xml:space="preserve"> e</w:t>
+      </w:r>
+      <w:r>
+        <w:t xml:space="preserve"> che gli scenari vecchi esistano già per poter fare il confronto.</w:t>
       </w:r>
     </w:p>
     <w:p>
@@ -12212,7 +13168,10 @@
       </w:r>
       <w:proofErr w:type="spellEnd"/>
       <w:r>
-        <w:t>, che i set di regole vecchi esistano già per poter fare il confronto.</w:t>
+        <w:t xml:space="preserve"> e</w:t>
+      </w:r>
+      <w:r>
+        <w:t xml:space="preserve"> che i set di regole vecchi esistano già per poter fare il confronto.</w:t>
       </w:r>
     </w:p>
     <w:p>
@@ -12307,7 +13266,10 @@
       </w:r>
       <w:proofErr w:type="spellEnd"/>
       <w:r>
-        <w:t>, che le personalizzazioni vecchie esistano già per poter fare il confronto.</w:t>
+        <w:t xml:space="preserve"> e</w:t>
+      </w:r>
+      <w:r>
+        <w:t xml:space="preserve"> che le personalizzazioni vecchie esistano già per poter fare il confronto.</w:t>
       </w:r>
     </w:p>
     <w:p>
@@ -12345,8 +13307,8 @@
       </w:pPr>
     </w:p>
     <w:sectPr>
-      <w:headerReference w:type="default" r:id="rId19"/>
-      <w:footerReference w:type="default" r:id="rId20"/>
+      <w:headerReference w:type="default" r:id="rId24"/>
+      <w:footerReference w:type="default" r:id="rId25"/>
       <w:pgSz w:w="11906" w:h="16838"/>
       <w:pgMar w:top="1417" w:right="1134" w:bottom="1134" w:left="1134" w:header="708" w:footer="640" w:gutter="0"/>
       <w:pgNumType w:start="0"/>
@@ -12467,7 +13429,6 @@
           <w:dataBinding w:prefixMappings="xmlns:ns0='http://purl.org/dc/elements/1.1/' xmlns:ns1='http://schemas.openxmlformats.org/package/2006/metadata/core-properties' " w:xpath="/ns1:coreProperties[1]/ns0:creator[1]" w:storeItemID="{6C3C8BC8-F283-45AE-878A-BAB7291924A1}"/>
           <w:text/>
         </w:sdtPr>
-        <w:sdtEndPr/>
         <w:sdtContent>
           <w:tc>
             <w:tcPr>
@@ -12631,7 +13592,6 @@
         <w:dataBinding w:prefixMappings="xmlns:ns0='http://purl.org/dc/elements/1.1/' xmlns:ns1='http://schemas.openxmlformats.org/package/2006/metadata/core-properties' " w:xpath="/ns1:coreProperties[1]/ns0:title[1]" w:storeItemID="{6C3C8BC8-F283-45AE-878A-BAB7291924A1}"/>
         <w:text/>
       </w:sdtPr>
-      <w:sdtEndPr/>
       <w:sdtContent>
         <w:r>
           <w:rPr>
@@ -19190,6 +20150,7 @@
     <w:rsid w:val="006058B6"/>
     <w:rsid w:val="00615AA4"/>
     <w:rsid w:val="00630939"/>
+    <w:rsid w:val="00674555"/>
     <w:rsid w:val="00696856"/>
     <w:rsid w:val="006C5C9A"/>
     <w:rsid w:val="00725A96"/>
@@ -19231,6 +20192,7 @@
     <w:rsid w:val="00F301D3"/>
     <w:rsid w:val="00F435A7"/>
     <w:rsid w:val="00F52648"/>
+    <w:rsid w:val="00F579A5"/>
     <w:rsid w:val="00F66245"/>
     <w:rsid w:val="00FA03DE"/>
     <w:rsid w:val="00FB724A"/>
@@ -20016,28 +20978,28 @@
 </file>
 
 <file path=customXml/item1.xml><?xml version="1.0" encoding="utf-8"?>
-<b:Sources xmlns:b="http://schemas.openxmlformats.org/officeDocument/2006/bibliography" xmlns="http://schemas.openxmlformats.org/officeDocument/2006/bibliography" SelectedStyle="\APASixthEditionOfficeOnline.xsl" StyleName="APA" Version="6"/>
-</file>
-
-<file path=customXml/item2.xml><?xml version="1.0" encoding="utf-8"?>
 <go:gDocsCustomXmlDataStorage xmlns:go="http://customooxmlschemas.google.com/" xmlns:r="http://schemas.openxmlformats.org/officeDocument/2006/relationships" uri="GoogleDocsCustomDataVersion2">
   <go:docsCustomData xmlns:go="http://customooxmlschemas.google.com/" roundtripDataSignature="AMtx7mg1mGL6qORe6yYgtaAnOyb4Kh8WtQ==">CgMxLjAyCGguZ2pkZ3hzOAByITE0M0V0amI5QkxqZWpESnVvRjlQQmhGMzFZMFlUX3kxOQ==</go:docsCustomData>
 </go:gDocsCustomXmlDataStorage>
 </file>
 
-<file path=customXml/itemProps1.xml><?xml version="1.0" encoding="utf-8"?>
-<ds:datastoreItem xmlns:ds="http://schemas.openxmlformats.org/officeDocument/2006/customXml" ds:itemID="{37B528A4-5A93-4436-BAB4-9956BF7FC17A}">
-  <ds:schemaRefs>
-    <ds:schemaRef ds:uri="http://schemas.openxmlformats.org/officeDocument/2006/bibliography"/>
-  </ds:schemaRefs>
-</ds:datastoreItem>
+<file path=customXml/item2.xml><?xml version="1.0" encoding="utf-8"?>
+<b:Sources xmlns:b="http://schemas.openxmlformats.org/officeDocument/2006/bibliography" xmlns="http://schemas.openxmlformats.org/officeDocument/2006/bibliography" SelectedStyle="\APASixthEditionOfficeOnline.xsl" StyleName="APA" Version="6"/>
 </file>
 
-<file path=customXml/itemProps2.xml><?xml version="1.0" encoding="utf-8"?>
+<file path=customXml/itemProps1.xml><?xml version="1.0" encoding="utf-8"?>
 <ds:datastoreItem xmlns:ds="http://schemas.openxmlformats.org/officeDocument/2006/customXml" ds:itemID="{11111111-1234-1234-1234-123412341234}">
   <ds:schemaRefs>
     <ds:schemaRef ds:uri="http://customooxmlschemas.google.com/"/>
     <ds:schemaRef ds:uri="http://schemas.openxmlformats.org/officeDocument/2006/relationships"/>
   </ds:schemaRefs>
 </ds:datastoreItem>
+</file>
+
+<file path=customXml/itemProps2.xml><?xml version="1.0" encoding="utf-8"?>
+<ds:datastoreItem xmlns:ds="http://schemas.openxmlformats.org/officeDocument/2006/customXml" ds:itemID="{37B528A4-5A93-4436-BAB4-9956BF7FC17A}">
+  <ds:schemaRefs>
+    <ds:schemaRef ds:uri="http://schemas.openxmlformats.org/officeDocument/2006/bibliography"/>
+  </ds:schemaRefs>
+</ds:datastoreItem>
 </file>
</xml_diff>

<commit_message>
aggiunta pdf + aggiunta jar
</commit_message>
<xml_diff>
--- a/Documentazione/Elaborazione/Iterazione 5/Iterazione 5.docx
+++ b/Documentazione/Elaborazione/Iterazione 5/Iterazione 5.docx
@@ -528,7 +528,7 @@
             </w:rPr>
             <w:fldChar w:fldCharType="separate"/>
           </w:r>
-          <w:hyperlink w:anchor="_Toc214079361" w:history="1">
+          <w:hyperlink w:anchor="_Toc214080158" w:history="1">
             <w:r>
               <w:rPr>
                 <w:rStyle w:val="Collegamentoipertestuale"/>
@@ -575,7 +575,7 @@
                 <w:noProof/>
                 <w:webHidden/>
               </w:rPr>
-              <w:instrText xml:space="preserve"> PAGEREF _Toc214079361 \h </w:instrText>
+              <w:instrText xml:space="preserve"> PAGEREF _Toc214080158 \h </w:instrText>
             </w:r>
             <w:r>
               <w:rPr>
@@ -621,7 +621,7 @@
               <w14:ligatures w14:val="standardContextual"/>
             </w:rPr>
           </w:pPr>
-          <w:hyperlink w:anchor="_Toc214079362" w:history="1">
+          <w:hyperlink w:anchor="_Toc214080159" w:history="1">
             <w:r>
               <w:rPr>
                 <w:rStyle w:val="Collegamentoipertestuale"/>
@@ -649,7 +649,7 @@
                 <w:noProof/>
                 <w:webHidden/>
               </w:rPr>
-              <w:instrText xml:space="preserve"> PAGEREF _Toc214079362 \h </w:instrText>
+              <w:instrText xml:space="preserve"> PAGEREF _Toc214080159 \h </w:instrText>
             </w:r>
             <w:r>
               <w:rPr>
@@ -695,7 +695,7 @@
               <w14:ligatures w14:val="standardContextual"/>
             </w:rPr>
           </w:pPr>
-          <w:hyperlink w:anchor="_Toc214079363" w:history="1">
+          <w:hyperlink w:anchor="_Toc214080160" w:history="1">
             <w:r>
               <w:rPr>
                 <w:rStyle w:val="Collegamentoipertestuale"/>
@@ -723,7 +723,7 @@
                 <w:noProof/>
                 <w:webHidden/>
               </w:rPr>
-              <w:instrText xml:space="preserve"> PAGEREF _Toc214079363 \h </w:instrText>
+              <w:instrText xml:space="preserve"> PAGEREF _Toc214080160 \h </w:instrText>
             </w:r>
             <w:r>
               <w:rPr>
@@ -769,7 +769,7 @@
               <w14:ligatures w14:val="standardContextual"/>
             </w:rPr>
           </w:pPr>
-          <w:hyperlink w:anchor="_Toc214079364" w:history="1">
+          <w:hyperlink w:anchor="_Toc214080161" w:history="1">
             <w:r>
               <w:rPr>
                 <w:rStyle w:val="Collegamentoipertestuale"/>
@@ -797,7 +797,7 @@
                 <w:noProof/>
                 <w:webHidden/>
               </w:rPr>
-              <w:instrText xml:space="preserve"> PAGEREF _Toc214079364 \h </w:instrText>
+              <w:instrText xml:space="preserve"> PAGEREF _Toc214080161 \h </w:instrText>
             </w:r>
             <w:r>
               <w:rPr>
@@ -843,7 +843,7 @@
               <w14:ligatures w14:val="standardContextual"/>
             </w:rPr>
           </w:pPr>
-          <w:hyperlink w:anchor="_Toc214079365" w:history="1">
+          <w:hyperlink w:anchor="_Toc214080162" w:history="1">
             <w:r>
               <w:rPr>
                 <w:rStyle w:val="Collegamentoipertestuale"/>
@@ -871,7 +871,7 @@
                 <w:noProof/>
                 <w:webHidden/>
               </w:rPr>
-              <w:instrText xml:space="preserve"> PAGEREF _Toc214079365 \h </w:instrText>
+              <w:instrText xml:space="preserve"> PAGEREF _Toc214080162 \h </w:instrText>
             </w:r>
             <w:r>
               <w:rPr>
@@ -917,7 +917,7 @@
               <w14:ligatures w14:val="standardContextual"/>
             </w:rPr>
           </w:pPr>
-          <w:hyperlink w:anchor="_Toc214079366" w:history="1">
+          <w:hyperlink w:anchor="_Toc214080163" w:history="1">
             <w:r>
               <w:rPr>
                 <w:rStyle w:val="Collegamentoipertestuale"/>
@@ -946,7 +946,7 @@
                 <w:noProof/>
                 <w:webHidden/>
               </w:rPr>
-              <w:instrText xml:space="preserve"> PAGEREF _Toc214079366 \h </w:instrText>
+              <w:instrText xml:space="preserve"> PAGEREF _Toc214080163 \h </w:instrText>
             </w:r>
             <w:r>
               <w:rPr>
@@ -992,7 +992,7 @@
               <w14:ligatures w14:val="standardContextual"/>
             </w:rPr>
           </w:pPr>
-          <w:hyperlink w:anchor="_Toc214079367" w:history="1">
+          <w:hyperlink w:anchor="_Toc214080164" w:history="1">
             <w:r>
               <w:rPr>
                 <w:rStyle w:val="Collegamentoipertestuale"/>
@@ -1021,7 +1021,7 @@
                 <w:noProof/>
                 <w:webHidden/>
               </w:rPr>
-              <w:instrText xml:space="preserve"> PAGEREF _Toc214079367 \h </w:instrText>
+              <w:instrText xml:space="preserve"> PAGEREF _Toc214080164 \h </w:instrText>
             </w:r>
             <w:r>
               <w:rPr>
@@ -1067,7 +1067,7 @@
               <w14:ligatures w14:val="standardContextual"/>
             </w:rPr>
           </w:pPr>
-          <w:hyperlink w:anchor="_Toc214079368" w:history="1">
+          <w:hyperlink w:anchor="_Toc214080165" w:history="1">
             <w:r>
               <w:rPr>
                 <w:rStyle w:val="Collegamentoipertestuale"/>
@@ -1095,7 +1095,7 @@
                 <w:noProof/>
                 <w:webHidden/>
               </w:rPr>
-              <w:instrText xml:space="preserve"> PAGEREF _Toc214079368 \h </w:instrText>
+              <w:instrText xml:space="preserve"> PAGEREF _Toc214080165 \h </w:instrText>
             </w:r>
             <w:r>
               <w:rPr>
@@ -1141,7 +1141,7 @@
               <w14:ligatures w14:val="standardContextual"/>
             </w:rPr>
           </w:pPr>
-          <w:hyperlink w:anchor="_Toc214079369" w:history="1">
+          <w:hyperlink w:anchor="_Toc214080166" w:history="1">
             <w:r>
               <w:rPr>
                 <w:rStyle w:val="Collegamentoipertestuale"/>
@@ -1169,7 +1169,7 @@
                 <w:noProof/>
                 <w:webHidden/>
               </w:rPr>
-              <w:instrText xml:space="preserve"> PAGEREF _Toc214079369 \h </w:instrText>
+              <w:instrText xml:space="preserve"> PAGEREF _Toc214080166 \h </w:instrText>
             </w:r>
             <w:r>
               <w:rPr>
@@ -1215,7 +1215,7 @@
               <w14:ligatures w14:val="standardContextual"/>
             </w:rPr>
           </w:pPr>
-          <w:hyperlink w:anchor="_Toc214079370" w:history="1">
+          <w:hyperlink w:anchor="_Toc214080167" w:history="1">
             <w:r>
               <w:rPr>
                 <w:rStyle w:val="Collegamentoipertestuale"/>
@@ -1244,7 +1244,7 @@
                 <w:noProof/>
                 <w:webHidden/>
               </w:rPr>
-              <w:instrText xml:space="preserve"> PAGEREF _Toc214079370 \h </w:instrText>
+              <w:instrText xml:space="preserve"> PAGEREF _Toc214080167 \h </w:instrText>
             </w:r>
             <w:r>
               <w:rPr>
@@ -1290,7 +1290,7 @@
               <w14:ligatures w14:val="standardContextual"/>
             </w:rPr>
           </w:pPr>
-          <w:hyperlink w:anchor="_Toc214079371" w:history="1">
+          <w:hyperlink w:anchor="_Toc214080168" w:history="1">
             <w:r>
               <w:rPr>
                 <w:rStyle w:val="Collegamentoipertestuale"/>
@@ -1319,7 +1319,7 @@
                 <w:noProof/>
                 <w:webHidden/>
               </w:rPr>
-              <w:instrText xml:space="preserve"> PAGEREF _Toc214079371 \h </w:instrText>
+              <w:instrText xml:space="preserve"> PAGEREF _Toc214080168 \h </w:instrText>
             </w:r>
             <w:r>
               <w:rPr>
@@ -1365,7 +1365,7 @@
               <w14:ligatures w14:val="standardContextual"/>
             </w:rPr>
           </w:pPr>
-          <w:hyperlink w:anchor="_Toc214079372" w:history="1">
+          <w:hyperlink w:anchor="_Toc214080169" w:history="1">
             <w:r>
               <w:rPr>
                 <w:rStyle w:val="Collegamentoipertestuale"/>
@@ -1394,7 +1394,7 @@
                 <w:noProof/>
                 <w:webHidden/>
               </w:rPr>
-              <w:instrText xml:space="preserve"> PAGEREF _Toc214079372 \h </w:instrText>
+              <w:instrText xml:space="preserve"> PAGEREF _Toc214080169 \h </w:instrText>
             </w:r>
             <w:r>
               <w:rPr>
@@ -1440,7 +1440,7 @@
               <w14:ligatures w14:val="standardContextual"/>
             </w:rPr>
           </w:pPr>
-          <w:hyperlink w:anchor="_Toc214079373" w:history="1">
+          <w:hyperlink w:anchor="_Toc214080170" w:history="1">
             <w:r>
               <w:rPr>
                 <w:rStyle w:val="Collegamentoipertestuale"/>
@@ -1468,7 +1468,7 @@
                 <w:noProof/>
                 <w:webHidden/>
               </w:rPr>
-              <w:instrText xml:space="preserve"> PAGEREF _Toc214079373 \h </w:instrText>
+              <w:instrText xml:space="preserve"> PAGEREF _Toc214080170 \h </w:instrText>
             </w:r>
             <w:r>
               <w:rPr>
@@ -1514,7 +1514,7 @@
               <w14:ligatures w14:val="standardContextual"/>
             </w:rPr>
           </w:pPr>
-          <w:hyperlink w:anchor="_Toc214079374" w:history="1">
+          <w:hyperlink w:anchor="_Toc214080171" w:history="1">
             <w:r>
               <w:rPr>
                 <w:rStyle w:val="Collegamentoipertestuale"/>
@@ -1542,7 +1542,7 @@
                 <w:noProof/>
                 <w:webHidden/>
               </w:rPr>
-              <w:instrText xml:space="preserve"> PAGEREF _Toc214079374 \h </w:instrText>
+              <w:instrText xml:space="preserve"> PAGEREF _Toc214080171 \h </w:instrText>
             </w:r>
             <w:r>
               <w:rPr>
@@ -1610,7 +1610,7 @@
           <w:rFonts w:ascii="Calibri" w:hAnsi="Calibri" w:cs="Calibri"/>
         </w:rPr>
       </w:pPr>
-      <w:bookmarkStart w:id="0" w:name="_Toc214079361"/>
+      <w:bookmarkStart w:id="0" w:name="_Toc214080158"/>
       <w:r>
         <w:rPr>
           <w:rFonts w:ascii="Calibri" w:hAnsi="Calibri" w:cs="Calibri"/>
@@ -2186,7 +2186,7 @@
           <w:rFonts w:ascii="Calibri" w:hAnsi="Calibri" w:cs="Calibri"/>
         </w:rPr>
       </w:pPr>
-      <w:bookmarkStart w:id="1" w:name="_Toc214079362"/>
+      <w:bookmarkStart w:id="1" w:name="_Toc214080159"/>
       <w:r>
         <w:rPr>
           <w:rFonts w:ascii="Calibri" w:hAnsi="Calibri" w:cs="Calibri"/>
@@ -3567,7 +3567,7 @@
           <w:rFonts w:ascii="Calibri" w:hAnsi="Calibri" w:cs="Calibri"/>
         </w:rPr>
       </w:pPr>
-      <w:bookmarkStart w:id="2" w:name="_Toc214079363"/>
+      <w:bookmarkStart w:id="2" w:name="_Toc214080160"/>
       <w:r>
         <w:rPr>
           <w:rFonts w:ascii="Calibri" w:hAnsi="Calibri" w:cs="Calibri"/>
@@ -4905,7 +4905,7 @@
           <w:rFonts w:ascii="Calibri" w:hAnsi="Calibri" w:cs="Calibri"/>
         </w:rPr>
       </w:pPr>
-      <w:bookmarkStart w:id="3" w:name="_Toc214079364"/>
+      <w:bookmarkStart w:id="3" w:name="_Toc214080161"/>
       <w:r>
         <w:rPr>
           <w:rFonts w:ascii="Calibri" w:hAnsi="Calibri" w:cs="Calibri"/>
@@ -6437,7 +6437,7 @@
           <w:rFonts w:ascii="Calibri" w:hAnsi="Calibri" w:cs="Calibri"/>
         </w:rPr>
       </w:pPr>
-      <w:bookmarkStart w:id="4" w:name="_Toc214079365"/>
+      <w:bookmarkStart w:id="4" w:name="_Toc214080162"/>
       <w:r>
         <w:rPr>
           <w:rFonts w:ascii="Calibri" w:hAnsi="Calibri" w:cs="Calibri"/>
@@ -6593,7 +6593,7 @@
         </w:rPr>
       </w:pPr>
       <w:bookmarkStart w:id="5" w:name="_Toc171097033"/>
-      <w:bookmarkStart w:id="6" w:name="_Toc214079366"/>
+      <w:bookmarkStart w:id="6" w:name="_Toc214080163"/>
       <w:r>
         <w:rPr>
           <w:rFonts w:ascii="Calibri" w:hAnsi="Calibri" w:cs="Calibri"/>
@@ -7546,7 +7546,7 @@
           <w:noProof/>
         </w:rPr>
         <w:drawing>
-          <wp:inline distT="0" distB="0" distL="0" distR="0" wp14:anchorId="639DEDE6" wp14:editId="5692878B">
+          <wp:inline distT="0" distB="0" distL="0" distR="0" wp14:anchorId="639DEDE6" wp14:editId="510143B7">
             <wp:extent cx="6120130" cy="5064760"/>
             <wp:effectExtent l="0" t="0" r="0" b="2540"/>
             <wp:docPr id="884528962" name="Immagine 2" descr="Immagine che contiene testo, diagramma, schermata, Piano&#10;&#10;Il contenuto generato dall'IA potrebbe non essere corretto."/>
@@ -7635,7 +7635,7 @@
           <w:highlight w:val="white"/>
         </w:rPr>
       </w:pPr>
-      <w:bookmarkStart w:id="7" w:name="_Toc214079367"/>
+      <w:bookmarkStart w:id="7" w:name="_Toc214080164"/>
       <w:r>
         <w:rPr>
           <w:rFonts w:ascii="Calibri" w:hAnsi="Calibri" w:cs="Calibri"/>
@@ -8485,7 +8485,7 @@
           <w:rFonts w:ascii="Calibri" w:hAnsi="Calibri" w:cs="Calibri"/>
         </w:rPr>
       </w:pPr>
-      <w:bookmarkStart w:id="9" w:name="_Toc214079368"/>
+      <w:bookmarkStart w:id="9" w:name="_Toc214080165"/>
       <w:r>
         <w:rPr>
           <w:rFonts w:ascii="Calibri" w:hAnsi="Calibri" w:cs="Calibri"/>
@@ -9780,7 +9780,7 @@
           <w:rFonts w:ascii="Calibri" w:hAnsi="Calibri" w:cs="Calibri"/>
         </w:rPr>
       </w:pPr>
-      <w:bookmarkStart w:id="10" w:name="_Toc214079369"/>
+      <w:bookmarkStart w:id="10" w:name="_Toc214080166"/>
       <w:r>
         <w:rPr>
           <w:rFonts w:ascii="Calibri" w:hAnsi="Calibri" w:cs="Calibri"/>
@@ -9954,7 +9954,7 @@
           <w:highlight w:val="white"/>
         </w:rPr>
       </w:pPr>
-      <w:bookmarkStart w:id="11" w:name="_Toc214079370"/>
+      <w:bookmarkStart w:id="11" w:name="_Toc214080167"/>
       <w:r>
         <w:rPr>
           <w:rFonts w:ascii="Calibri" w:hAnsi="Calibri" w:cs="Calibri"/>
@@ -10031,7 +10031,7 @@
           <w:noProof/>
         </w:rPr>
         <w:drawing>
-          <wp:inline distT="0" distB="0" distL="0" distR="0" wp14:anchorId="055F0B55" wp14:editId="749BDCC8">
+          <wp:inline distT="0" distB="0" distL="0" distR="0" wp14:anchorId="055F0B55" wp14:editId="29DAFBF9">
             <wp:extent cx="6120130" cy="2813685"/>
             <wp:effectExtent l="0" t="0" r="0" b="5715"/>
             <wp:docPr id="205790204" name="Immagine 6" descr="Immagine che contiene testo, schermata, diagramma, linea"/>
@@ -10163,7 +10163,7 @@
           <w:noProof/>
         </w:rPr>
         <w:drawing>
-          <wp:inline distT="0" distB="0" distL="0" distR="0" wp14:anchorId="74F48C47" wp14:editId="6832816B">
+          <wp:inline distT="0" distB="0" distL="0" distR="0" wp14:anchorId="74F48C47" wp14:editId="6B229C81">
             <wp:extent cx="6120130" cy="2813685"/>
             <wp:effectExtent l="0" t="0" r="0" b="5715"/>
             <wp:docPr id="147181640" name="Immagine 8" descr="Immagine che contiene testo, schermata, diagramma, linea&#10;&#10;Il contenuto generato dall'IA potrebbe non essere corretto."/>
@@ -10229,7 +10229,7 @@
           <w:noProof/>
         </w:rPr>
         <w:drawing>
-          <wp:inline distT="0" distB="0" distL="0" distR="0" wp14:anchorId="296E85D7" wp14:editId="6034E498">
+          <wp:inline distT="0" distB="0" distL="0" distR="0" wp14:anchorId="296E85D7" wp14:editId="18E382EE">
             <wp:extent cx="6120130" cy="2813685"/>
             <wp:effectExtent l="0" t="0" r="0" b="5715"/>
             <wp:docPr id="1732354731" name="Immagine 9" descr="Immagine che contiene testo, diagramma, linea, schermata&#10;&#10;Il contenuto generato dall'IA potrebbe non essere corretto."/>
@@ -10286,9 +10286,14 @@
           <w:numId w:val="30"/>
         </w:numPr>
       </w:pPr>
+      <w:proofErr w:type="spellStart"/>
       <w:r>
         <w:lastRenderedPageBreak/>
-        <w:t xml:space="preserve">Refactoring del SD </w:t>
+        <w:t>Refactoring</w:t>
+      </w:r>
+      <w:proofErr w:type="spellEnd"/>
+      <w:r>
+        <w:t xml:space="preserve"> del SD </w:t>
       </w:r>
       <w:proofErr w:type="spellStart"/>
       <w:proofErr w:type="gramStart"/>
@@ -10403,7 +10408,7 @@
           <w:highlight w:val="white"/>
         </w:rPr>
       </w:pPr>
-      <w:bookmarkStart w:id="12" w:name="_Toc214079371"/>
+      <w:bookmarkStart w:id="12" w:name="_Toc214080168"/>
       <w:r>
         <w:rPr>
           <w:rFonts w:ascii="Calibri" w:hAnsi="Calibri" w:cs="Calibri"/>
@@ -10657,7 +10662,7 @@
           <w:highlight w:val="white"/>
         </w:rPr>
       </w:pPr>
-      <w:bookmarkStart w:id="13" w:name="_Toc214079372"/>
+      <w:bookmarkStart w:id="13" w:name="_Toc214080169"/>
       <w:r>
         <w:rPr>
           <w:rFonts w:ascii="Calibri" w:hAnsi="Calibri" w:cs="Calibri"/>
@@ -10759,7 +10764,7 @@
         </w:rPr>
       </w:pPr>
       <w:bookmarkStart w:id="14" w:name="_Toc172061562"/>
-      <w:bookmarkStart w:id="15" w:name="_Toc214079373"/>
+      <w:bookmarkStart w:id="15" w:name="_Toc214080170"/>
       <w:r>
         <w:rPr>
           <w:rFonts w:ascii="Calibri" w:hAnsi="Calibri" w:cs="Calibri"/>
@@ -10910,11 +10915,76 @@
     </w:p>
     <w:p>
       <w:pPr>
-        <w:rPr>
-          <w:rFonts w:ascii="Calibri" w:hAnsi="Calibri" w:cs="Calibri"/>
-          <w:highlight w:val="white"/>
-        </w:rPr>
-      </w:pPr>
+        <w:pStyle w:val="Paragrafoelenco"/>
+        <w:numPr>
+          <w:ilvl w:val="0"/>
+          <w:numId w:val="33"/>
+        </w:numPr>
+        <w:rPr>
+          <w:rFonts w:ascii="Calibri" w:hAnsi="Calibri" w:cs="Calibri"/>
+          <w:highlight w:val="white"/>
+        </w:rPr>
+      </w:pPr>
+      <w:r>
+        <w:rPr>
+          <w:rFonts w:ascii="Calibri" w:hAnsi="Calibri" w:cs="Calibri"/>
+          <w:highlight w:val="white"/>
+        </w:rPr>
+        <w:t xml:space="preserve">Per semplicità, le credenziali di accesso al pannello degli admin sono: </w:t>
+      </w:r>
+    </w:p>
+    <w:p>
+      <w:pPr>
+        <w:pStyle w:val="Paragrafoelenco"/>
+        <w:rPr>
+          <w:rFonts w:ascii="Calibri" w:hAnsi="Calibri" w:cs="Calibri"/>
+          <w:highlight w:val="white"/>
+        </w:rPr>
+      </w:pPr>
+      <w:r>
+        <w:rPr>
+          <w:rFonts w:ascii="Calibri" w:hAnsi="Calibri" w:cs="Calibri"/>
+          <w:highlight w:val="white"/>
+        </w:rPr>
+        <w:t>username -&gt; “admin”, password -&gt; “admin”.</w:t>
+      </w:r>
+    </w:p>
+    <w:p>
+      <w:pPr>
+        <w:pStyle w:val="Paragrafoelenco"/>
+        <w:rPr>
+          <w:rFonts w:ascii="Calibri" w:hAnsi="Calibri" w:cs="Calibri"/>
+          <w:highlight w:val="white"/>
+        </w:rPr>
+      </w:pPr>
+      <w:r>
+        <w:rPr>
+          <w:rFonts w:ascii="Calibri" w:hAnsi="Calibri" w:cs="Calibri"/>
+          <w:highlight w:val="white"/>
+        </w:rPr>
+        <w:t>Una gestione più articolata d</w:t>
+      </w:r>
+      <w:r>
+        <w:rPr>
+          <w:rFonts w:ascii="Calibri" w:hAnsi="Calibri" w:cs="Calibri"/>
+          <w:highlight w:val="white"/>
+        </w:rPr>
+        <w:t xml:space="preserve">elle credenziali </w:t>
+      </w:r>
+      <w:r>
+        <w:rPr>
+          <w:rFonts w:ascii="Calibri" w:hAnsi="Calibri" w:cs="Calibri"/>
+          <w:highlight w:val="white"/>
+        </w:rPr>
+        <w:t>degli amministratori</w:t>
+      </w:r>
+      <w:r>
+        <w:rPr>
+          <w:rFonts w:ascii="Calibri" w:hAnsi="Calibri" w:cs="Calibri"/>
+          <w:highlight w:val="white"/>
+        </w:rPr>
+        <w:t xml:space="preserve"> potrebbe essere oggetto di eventuali evolutive future del software.</w:t>
+      </w:r>
     </w:p>
     <w:p>
       <w:pPr>
@@ -11101,25 +11171,13 @@
         </w:rPr>
       </w:pPr>
       <w:bookmarkStart w:id="16" w:name="_Toc172061563"/>
-      <w:bookmarkStart w:id="17" w:name="_Toc214079374"/>
+      <w:bookmarkStart w:id="17" w:name="_Toc214080171"/>
       <w:r>
         <w:rPr>
           <w:rFonts w:ascii="Calibri" w:hAnsi="Calibri" w:cs="Calibri"/>
         </w:rPr>
         <w:lastRenderedPageBreak/>
-        <w:t>6.</w:t>
-      </w:r>
-      <w:r>
-        <w:rPr>
-          <w:rFonts w:ascii="Calibri" w:hAnsi="Calibri" w:cs="Calibri"/>
-        </w:rPr>
-        <w:t>0</w:t>
-      </w:r>
-      <w:r>
-        <w:rPr>
-          <w:rFonts w:ascii="Calibri" w:hAnsi="Calibri" w:cs="Calibri"/>
-        </w:rPr>
-        <w:t xml:space="preserve"> Testing</w:t>
+        <w:t>6.0 Testing</w:t>
       </w:r>
       <w:bookmarkEnd w:id="16"/>
       <w:bookmarkEnd w:id="17"/>
@@ -12147,6 +12205,7 @@
     <w:p/>
     <w:p/>
     <w:p/>
+    <w:p/>
     <w:p>
       <w:pPr>
         <w:rPr>
@@ -12162,7 +12221,6 @@
           <w:bCs/>
           <w:color w:val="153D63" w:themeColor="text2" w:themeTint="E6"/>
         </w:rPr>
-        <w:lastRenderedPageBreak/>
         <w:t>void</w:t>
       </w:r>
       <w:proofErr w:type="spellEnd"/>
@@ -12546,6 +12604,444 @@
     <w:p>
       <w:r>
         <w:t>Condizione da testare: perché il metodo funzioni si deve verificare che il dado scelto esista e sia stata associato correttamente al giocatore.</w:t>
+      </w:r>
+    </w:p>
+    <w:p/>
+    <w:p/>
+    <w:p/>
+    <w:p/>
+    <w:p/>
+    <w:p/>
+    <w:p>
+      <w:pPr>
+        <w:rPr>
+          <w:b/>
+          <w:bCs/>
+          <w:color w:val="153D63" w:themeColor="text2" w:themeTint="E6"/>
+        </w:rPr>
+      </w:pPr>
+      <w:proofErr w:type="spellStart"/>
+      <w:r>
+        <w:rPr>
+          <w:b/>
+          <w:bCs/>
+          <w:color w:val="153D63" w:themeColor="text2" w:themeTint="E6"/>
+        </w:rPr>
+        <w:t>void</w:t>
+      </w:r>
+      <w:proofErr w:type="spellEnd"/>
+      <w:r>
+        <w:rPr>
+          <w:b/>
+          <w:bCs/>
+          <w:color w:val="153D63" w:themeColor="text2" w:themeTint="E6"/>
+        </w:rPr>
+        <w:t xml:space="preserve"> </w:t>
+      </w:r>
+      <w:proofErr w:type="spellStart"/>
+      <w:proofErr w:type="gramStart"/>
+      <w:r>
+        <w:rPr>
+          <w:b/>
+          <w:bCs/>
+          <w:color w:val="153D63" w:themeColor="text2" w:themeTint="E6"/>
+        </w:rPr>
+        <w:t>eseguiTurnoTest</w:t>
+      </w:r>
+      <w:proofErr w:type="spellEnd"/>
+      <w:r>
+        <w:rPr>
+          <w:b/>
+          <w:bCs/>
+          <w:color w:val="153D63" w:themeColor="text2" w:themeTint="E6"/>
+        </w:rPr>
+        <w:t>(</w:t>
+      </w:r>
+      <w:proofErr w:type="gramEnd"/>
+      <w:r>
+        <w:rPr>
+          <w:b/>
+          <w:bCs/>
+          <w:color w:val="153D63" w:themeColor="text2" w:themeTint="E6"/>
+        </w:rPr>
+        <w:t>)</w:t>
+      </w:r>
+    </w:p>
+    <w:p>
+      <w:r>
+        <w:t>Test dell'esecuzione di un turno di un giocatore.</w:t>
+      </w:r>
+    </w:p>
+    <w:p>
+      <w:r>
+        <w:t xml:space="preserve">Condizione iniziale: che esista una variabile </w:t>
+      </w:r>
+      <w:proofErr w:type="spellStart"/>
+      <w:r>
+        <w:t>giocoDellOca</w:t>
+      </w:r>
+      <w:proofErr w:type="spellEnd"/>
+      <w:r>
+        <w:t xml:space="preserve">, che </w:t>
+      </w:r>
+      <w:r>
+        <w:t>sia stata</w:t>
+      </w:r>
+      <w:r>
+        <w:t xml:space="preserve"> configurat</w:t>
+      </w:r>
+      <w:r>
+        <w:t>a e avviata</w:t>
+      </w:r>
+      <w:r>
+        <w:t xml:space="preserve"> una </w:t>
+      </w:r>
+      <w:r>
+        <w:t>partita con delle impostazioni di default</w:t>
+      </w:r>
+      <w:r>
+        <w:t xml:space="preserve">, </w:t>
+      </w:r>
+      <w:r>
+        <w:t>e che esista una pedina</w:t>
+      </w:r>
+      <w:r>
+        <w:t>.</w:t>
+      </w:r>
+    </w:p>
+    <w:p>
+      <w:r>
+        <w:t xml:space="preserve">Condizione da testare: perché il metodo funzioni si deve verificare </w:t>
+      </w:r>
+      <w:r>
+        <w:t>che per ogni possibile tipologia di casella sulla quale la pedina può atterrare, la posizione e lo stato di quest’ultima siano corrette.</w:t>
+      </w:r>
+    </w:p>
+    <w:p/>
+    <w:p>
+      <w:pPr>
+        <w:rPr>
+          <w:b/>
+          <w:bCs/>
+          <w:color w:val="153D63" w:themeColor="text2" w:themeTint="E6"/>
+        </w:rPr>
+      </w:pPr>
+      <w:proofErr w:type="spellStart"/>
+      <w:r>
+        <w:rPr>
+          <w:b/>
+          <w:bCs/>
+          <w:color w:val="153D63" w:themeColor="text2" w:themeTint="E6"/>
+        </w:rPr>
+        <w:t>void</w:t>
+      </w:r>
+      <w:proofErr w:type="spellEnd"/>
+      <w:r>
+        <w:rPr>
+          <w:b/>
+          <w:bCs/>
+          <w:color w:val="153D63" w:themeColor="text2" w:themeTint="E6"/>
+        </w:rPr>
+        <w:t xml:space="preserve"> </w:t>
+      </w:r>
+      <w:proofErr w:type="spellStart"/>
+      <w:proofErr w:type="gramStart"/>
+      <w:r>
+        <w:rPr>
+          <w:b/>
+          <w:bCs/>
+          <w:color w:val="153D63" w:themeColor="text2" w:themeTint="E6"/>
+        </w:rPr>
+        <w:t>aggiungiGiocatoriOspitiTest</w:t>
+      </w:r>
+      <w:proofErr w:type="spellEnd"/>
+      <w:r>
+        <w:rPr>
+          <w:b/>
+          <w:bCs/>
+          <w:color w:val="153D63" w:themeColor="text2" w:themeTint="E6"/>
+        </w:rPr>
+        <w:t>(</w:t>
+      </w:r>
+      <w:proofErr w:type="gramEnd"/>
+      <w:r>
+        <w:rPr>
+          <w:b/>
+          <w:bCs/>
+          <w:color w:val="153D63" w:themeColor="text2" w:themeTint="E6"/>
+        </w:rPr>
+        <w:t>)</w:t>
+      </w:r>
+    </w:p>
+    <w:p>
+      <w:r>
+        <w:t>Test dell'aggiunta giocatori ospiti.</w:t>
+      </w:r>
+    </w:p>
+    <w:p>
+      <w:r>
+        <w:t xml:space="preserve">Condizione iniziale: che esista una variabile </w:t>
+      </w:r>
+      <w:proofErr w:type="spellStart"/>
+      <w:r>
+        <w:t>giocoDellOca</w:t>
+      </w:r>
+      <w:proofErr w:type="spellEnd"/>
+      <w:r>
+        <w:t xml:space="preserve"> e</w:t>
+      </w:r>
+      <w:r>
+        <w:t xml:space="preserve"> che</w:t>
+      </w:r>
+      <w:r>
+        <w:t xml:space="preserve"> si</w:t>
+      </w:r>
+      <w:r>
+        <w:t xml:space="preserve"> stia configurando una </w:t>
+      </w:r>
+      <w:r>
+        <w:t>p</w:t>
+      </w:r>
+      <w:r>
+        <w:t>artita.</w:t>
+      </w:r>
+    </w:p>
+    <w:p>
+      <w:r>
+        <w:t>Condizione da testare: perché il metodo funzioni si deve verificare che il numero di giocatori aggiunti corrisponda effettivamente al numero di giocatori registrato per la partita corrente.</w:t>
+      </w:r>
+    </w:p>
+    <w:p/>
+    <w:p>
+      <w:pPr>
+        <w:rPr>
+          <w:b/>
+          <w:bCs/>
+          <w:color w:val="153D63" w:themeColor="text2" w:themeTint="E6"/>
+        </w:rPr>
+      </w:pPr>
+      <w:proofErr w:type="spellStart"/>
+      <w:r>
+        <w:rPr>
+          <w:b/>
+          <w:bCs/>
+          <w:color w:val="153D63" w:themeColor="text2" w:themeTint="E6"/>
+        </w:rPr>
+        <w:t>void</w:t>
+      </w:r>
+      <w:proofErr w:type="spellEnd"/>
+      <w:r>
+        <w:rPr>
+          <w:b/>
+          <w:bCs/>
+          <w:color w:val="153D63" w:themeColor="text2" w:themeTint="E6"/>
+        </w:rPr>
+        <w:t xml:space="preserve"> </w:t>
+      </w:r>
+      <w:proofErr w:type="spellStart"/>
+      <w:proofErr w:type="gramStart"/>
+      <w:r>
+        <w:rPr>
+          <w:b/>
+          <w:bCs/>
+          <w:color w:val="153D63" w:themeColor="text2" w:themeTint="E6"/>
+        </w:rPr>
+        <w:t>configuraGiocatoreCorrenteTest</w:t>
+      </w:r>
+      <w:proofErr w:type="spellEnd"/>
+      <w:r>
+        <w:rPr>
+          <w:b/>
+          <w:bCs/>
+          <w:color w:val="153D63" w:themeColor="text2" w:themeTint="E6"/>
+        </w:rPr>
+        <w:t>(</w:t>
+      </w:r>
+      <w:proofErr w:type="gramEnd"/>
+      <w:r>
+        <w:rPr>
+          <w:b/>
+          <w:bCs/>
+          <w:color w:val="153D63" w:themeColor="text2" w:themeTint="E6"/>
+        </w:rPr>
+        <w:t>)</w:t>
+      </w:r>
+    </w:p>
+    <w:p>
+      <w:r>
+        <w:t>Test della configurazione giocatore corrente da fare muovere lungo il tabellone.</w:t>
+      </w:r>
+    </w:p>
+    <w:p>
+      <w:r>
+        <w:t xml:space="preserve">Condizione iniziale: che esista una variabile </w:t>
+      </w:r>
+      <w:proofErr w:type="spellStart"/>
+      <w:r>
+        <w:t>giocoDellOca</w:t>
+      </w:r>
+      <w:proofErr w:type="spellEnd"/>
+      <w:r>
+        <w:t xml:space="preserve"> e che stia configurando/sia già stata configurata </w:t>
+      </w:r>
+      <w:r>
+        <w:t xml:space="preserve">una nuova </w:t>
+      </w:r>
+      <w:r>
+        <w:t>p</w:t>
+      </w:r>
+      <w:r>
+        <w:t>artita.</w:t>
+      </w:r>
+    </w:p>
+    <w:p>
+      <w:r>
+        <w:t xml:space="preserve">Condizione da testare: perché il metodo funzioni si deve verificare </w:t>
+      </w:r>
+      <w:r>
+        <w:t>che,</w:t>
+      </w:r>
+      <w:r>
+        <w:t xml:space="preserve"> </w:t>
+      </w:r>
+      <w:r>
+        <w:t>qualora</w:t>
+      </w:r>
+      <w:r>
+        <w:t xml:space="preserve"> le tabelle preposte alla definizione di pedina e dado </w:t>
+      </w:r>
+      <w:r>
+        <w:t>siano</w:t>
+      </w:r>
+      <w:r>
+        <w:t xml:space="preserve"> vuote, vengano associate delle personalizzazioni di default, e il giocatore viene impostato come giocatore corrente</w:t>
+      </w:r>
+      <w:r>
+        <w:t>.</w:t>
+      </w:r>
+    </w:p>
+    <w:p/>
+    <w:p>
+      <w:pPr>
+        <w:rPr>
+          <w:b/>
+          <w:bCs/>
+          <w:color w:val="153D63" w:themeColor="text2" w:themeTint="E6"/>
+        </w:rPr>
+      </w:pPr>
+      <w:proofErr w:type="spellStart"/>
+      <w:r>
+        <w:rPr>
+          <w:b/>
+          <w:bCs/>
+          <w:color w:val="153D63" w:themeColor="text2" w:themeTint="E6"/>
+        </w:rPr>
+        <w:t>void</w:t>
+      </w:r>
+      <w:proofErr w:type="spellEnd"/>
+      <w:r>
+        <w:rPr>
+          <w:b/>
+          <w:bCs/>
+          <w:color w:val="153D63" w:themeColor="text2" w:themeTint="E6"/>
+        </w:rPr>
+        <w:t xml:space="preserve"> </w:t>
+      </w:r>
+      <w:proofErr w:type="spellStart"/>
+      <w:proofErr w:type="gramStart"/>
+      <w:r>
+        <w:rPr>
+          <w:b/>
+          <w:bCs/>
+          <w:color w:val="153D63" w:themeColor="text2" w:themeTint="E6"/>
+        </w:rPr>
+        <w:t>autenticazioneAdminTest</w:t>
+      </w:r>
+      <w:proofErr w:type="spellEnd"/>
+      <w:r>
+        <w:rPr>
+          <w:b/>
+          <w:bCs/>
+          <w:color w:val="153D63" w:themeColor="text2" w:themeTint="E6"/>
+        </w:rPr>
+        <w:t>(</w:t>
+      </w:r>
+      <w:proofErr w:type="gramEnd"/>
+      <w:r>
+        <w:rPr>
+          <w:b/>
+          <w:bCs/>
+          <w:color w:val="153D63" w:themeColor="text2" w:themeTint="E6"/>
+        </w:rPr>
+        <w:t>)</w:t>
+      </w:r>
+    </w:p>
+    <w:p>
+      <w:r>
+        <w:t>Test della autenticazione come admin per poter definire le operazioni</w:t>
+      </w:r>
+    </w:p>
+    <w:p>
+      <w:r>
+        <w:t xml:space="preserve">Condizione iniziale: che esista una variabile </w:t>
+      </w:r>
+      <w:proofErr w:type="spellStart"/>
+      <w:r>
+        <w:t>giocoDellOca</w:t>
+      </w:r>
+      <w:proofErr w:type="spellEnd"/>
+      <w:r>
+        <w:t xml:space="preserve"> </w:t>
+      </w:r>
+      <w:r>
+        <w:t>e</w:t>
+      </w:r>
+      <w:r>
+        <w:t xml:space="preserve"> che si voglia accedere </w:t>
+      </w:r>
+      <w:r>
+        <w:t>al pannello amministratore</w:t>
+      </w:r>
+      <w:r>
+        <w:t>.</w:t>
+      </w:r>
+    </w:p>
+    <w:p>
+      <w:r>
+        <w:t xml:space="preserve">Condizione da testare: perché il metodo funzioni si deve passare in input la coppia corretta username e password </w:t>
+      </w:r>
+      <w:r>
+        <w:t>"</w:t>
+      </w:r>
+      <w:r>
+        <w:t>admin</w:t>
+      </w:r>
+      <w:r>
+        <w:t>”</w:t>
+      </w:r>
+      <w:r>
+        <w:t xml:space="preserve"> </w:t>
+      </w:r>
+      <w:r>
+        <w:t>“</w:t>
+      </w:r>
+      <w:r>
+        <w:t>admin</w:t>
+      </w:r>
+      <w:r>
+        <w:t>”</w:t>
+      </w:r>
+      <w:r>
+        <w:t>, altrimenti viene restituito un bool</w:t>
+      </w:r>
+      <w:r>
+        <w:t>eano</w:t>
+      </w:r>
+      <w:r>
+        <w:t xml:space="preserve"> che blocca la funzionalità</w:t>
+      </w:r>
+      <w:r>
+        <w:t>.</w:t>
       </w:r>
     </w:p>
     <w:p/>
@@ -12570,451 +13066,6 @@
           <w:bCs/>
           <w:color w:val="153D63" w:themeColor="text2" w:themeTint="E6"/>
         </w:rPr>
-        <w:t>void</w:t>
-      </w:r>
-      <w:proofErr w:type="spellEnd"/>
-      <w:r>
-        <w:rPr>
-          <w:b/>
-          <w:bCs/>
-          <w:color w:val="153D63" w:themeColor="text2" w:themeTint="E6"/>
-        </w:rPr>
-        <w:t xml:space="preserve"> </w:t>
-      </w:r>
-      <w:proofErr w:type="spellStart"/>
-      <w:proofErr w:type="gramStart"/>
-      <w:r>
-        <w:rPr>
-          <w:b/>
-          <w:bCs/>
-          <w:color w:val="153D63" w:themeColor="text2" w:themeTint="E6"/>
-        </w:rPr>
-        <w:t>eseguiTurnoTest</w:t>
-      </w:r>
-      <w:proofErr w:type="spellEnd"/>
-      <w:r>
-        <w:rPr>
-          <w:b/>
-          <w:bCs/>
-          <w:color w:val="153D63" w:themeColor="text2" w:themeTint="E6"/>
-        </w:rPr>
-        <w:t>(</w:t>
-      </w:r>
-      <w:proofErr w:type="gramEnd"/>
-      <w:r>
-        <w:rPr>
-          <w:b/>
-          <w:bCs/>
-          <w:color w:val="153D63" w:themeColor="text2" w:themeTint="E6"/>
-        </w:rPr>
-        <w:t>)</w:t>
-      </w:r>
-    </w:p>
-    <w:p>
-      <w:r>
-        <w:t>Test dell'esecuzione di un turno di un giocatore.</w:t>
-      </w:r>
-    </w:p>
-    <w:p>
-      <w:r>
-        <w:t xml:space="preserve">Condizione iniziale: che esista una variabile </w:t>
-      </w:r>
-      <w:proofErr w:type="spellStart"/>
-      <w:r>
-        <w:t>giocoDellOca</w:t>
-      </w:r>
-      <w:proofErr w:type="spellEnd"/>
-      <w:r>
-        <w:t xml:space="preserve">, che </w:t>
-      </w:r>
-      <w:r>
-        <w:t>sia stata</w:t>
-      </w:r>
-      <w:r>
-        <w:t xml:space="preserve"> configurat</w:t>
-      </w:r>
-      <w:r>
-        <w:t>a e avviata</w:t>
-      </w:r>
-      <w:r>
-        <w:t xml:space="preserve"> una </w:t>
-      </w:r>
-      <w:r>
-        <w:t>partita con delle impostazioni di default</w:t>
-      </w:r>
-      <w:r>
-        <w:t xml:space="preserve">, </w:t>
-      </w:r>
-      <w:r>
-        <w:t>e che esista una pedina</w:t>
-      </w:r>
-      <w:r>
-        <w:t>.</w:t>
-      </w:r>
-    </w:p>
-    <w:p>
-      <w:r>
-        <w:t xml:space="preserve">Condizione da testare: perché il metodo funzioni si deve verificare </w:t>
-      </w:r>
-      <w:r>
-        <w:t>che per ogni possibile tipologia di casella sulla quale la pedina può atterrare, la posizione e lo stato di quest’ultima siano corrette.</w:t>
-      </w:r>
-    </w:p>
-    <w:p/>
-    <w:p>
-      <w:pPr>
-        <w:rPr>
-          <w:b/>
-          <w:bCs/>
-          <w:color w:val="153D63" w:themeColor="text2" w:themeTint="E6"/>
-        </w:rPr>
-      </w:pPr>
-      <w:proofErr w:type="spellStart"/>
-      <w:r>
-        <w:rPr>
-          <w:b/>
-          <w:bCs/>
-          <w:color w:val="153D63" w:themeColor="text2" w:themeTint="E6"/>
-        </w:rPr>
-        <w:t>void</w:t>
-      </w:r>
-      <w:proofErr w:type="spellEnd"/>
-      <w:r>
-        <w:rPr>
-          <w:b/>
-          <w:bCs/>
-          <w:color w:val="153D63" w:themeColor="text2" w:themeTint="E6"/>
-        </w:rPr>
-        <w:t xml:space="preserve"> </w:t>
-      </w:r>
-      <w:proofErr w:type="spellStart"/>
-      <w:proofErr w:type="gramStart"/>
-      <w:r>
-        <w:rPr>
-          <w:b/>
-          <w:bCs/>
-          <w:color w:val="153D63" w:themeColor="text2" w:themeTint="E6"/>
-        </w:rPr>
-        <w:t>aggiungiGiocatoriOspitiTest</w:t>
-      </w:r>
-      <w:proofErr w:type="spellEnd"/>
-      <w:r>
-        <w:rPr>
-          <w:b/>
-          <w:bCs/>
-          <w:color w:val="153D63" w:themeColor="text2" w:themeTint="E6"/>
-        </w:rPr>
-        <w:t>(</w:t>
-      </w:r>
-      <w:proofErr w:type="gramEnd"/>
-      <w:r>
-        <w:rPr>
-          <w:b/>
-          <w:bCs/>
-          <w:color w:val="153D63" w:themeColor="text2" w:themeTint="E6"/>
-        </w:rPr>
-        <w:t>)</w:t>
-      </w:r>
-    </w:p>
-    <w:p>
-      <w:r>
-        <w:t>Test dell'aggiunta giocatori ospiti.</w:t>
-      </w:r>
-    </w:p>
-    <w:p>
-      <w:r>
-        <w:t xml:space="preserve">Condizione iniziale: che esista una variabile </w:t>
-      </w:r>
-      <w:proofErr w:type="spellStart"/>
-      <w:r>
-        <w:t>giocoDellOca</w:t>
-      </w:r>
-      <w:proofErr w:type="spellEnd"/>
-      <w:r>
-        <w:t xml:space="preserve"> e</w:t>
-      </w:r>
-      <w:r>
-        <w:t xml:space="preserve"> che</w:t>
-      </w:r>
-      <w:r>
-        <w:t xml:space="preserve"> si</w:t>
-      </w:r>
-      <w:r>
-        <w:t xml:space="preserve"> stia configurando una </w:t>
-      </w:r>
-      <w:r>
-        <w:t>p</w:t>
-      </w:r>
-      <w:r>
-        <w:t>artita.</w:t>
-      </w:r>
-    </w:p>
-    <w:p>
-      <w:r>
-        <w:t>Condizione da testare: perché il metodo funzioni si deve verificare che il numero di giocatori aggiunti corrisponda effettivamente al numero di giocatori registrato per la partita corrente.</w:t>
-      </w:r>
-    </w:p>
-    <w:p/>
-    <w:p>
-      <w:pPr>
-        <w:rPr>
-          <w:b/>
-          <w:bCs/>
-          <w:color w:val="153D63" w:themeColor="text2" w:themeTint="E6"/>
-        </w:rPr>
-      </w:pPr>
-      <w:proofErr w:type="spellStart"/>
-      <w:r>
-        <w:rPr>
-          <w:b/>
-          <w:bCs/>
-          <w:color w:val="153D63" w:themeColor="text2" w:themeTint="E6"/>
-        </w:rPr>
-        <w:t>void</w:t>
-      </w:r>
-      <w:proofErr w:type="spellEnd"/>
-      <w:r>
-        <w:rPr>
-          <w:b/>
-          <w:bCs/>
-          <w:color w:val="153D63" w:themeColor="text2" w:themeTint="E6"/>
-        </w:rPr>
-        <w:t xml:space="preserve"> </w:t>
-      </w:r>
-      <w:proofErr w:type="spellStart"/>
-      <w:proofErr w:type="gramStart"/>
-      <w:r>
-        <w:rPr>
-          <w:b/>
-          <w:bCs/>
-          <w:color w:val="153D63" w:themeColor="text2" w:themeTint="E6"/>
-        </w:rPr>
-        <w:t>configuraGiocatoreCorrenteTest</w:t>
-      </w:r>
-      <w:proofErr w:type="spellEnd"/>
-      <w:r>
-        <w:rPr>
-          <w:b/>
-          <w:bCs/>
-          <w:color w:val="153D63" w:themeColor="text2" w:themeTint="E6"/>
-        </w:rPr>
-        <w:t>(</w:t>
-      </w:r>
-      <w:proofErr w:type="gramEnd"/>
-      <w:r>
-        <w:rPr>
-          <w:b/>
-          <w:bCs/>
-          <w:color w:val="153D63" w:themeColor="text2" w:themeTint="E6"/>
-        </w:rPr>
-        <w:t>)</w:t>
-      </w:r>
-    </w:p>
-    <w:p>
-      <w:r>
-        <w:t>Test della configurazione giocatore corrente da fare muovere lungo il tabellone.</w:t>
-      </w:r>
-    </w:p>
-    <w:p>
-      <w:r>
-        <w:t xml:space="preserve">Condizione iniziale: che esista una variabile </w:t>
-      </w:r>
-      <w:proofErr w:type="spellStart"/>
-      <w:r>
-        <w:t>giocoDellOca</w:t>
-      </w:r>
-      <w:proofErr w:type="spellEnd"/>
-      <w:r>
-        <w:t xml:space="preserve"> e che </w:t>
-      </w:r>
-      <w:r>
-        <w:t>stia configurando</w:t>
-      </w:r>
-      <w:r>
-        <w:t xml:space="preserve">/sia già stata configurata </w:t>
-      </w:r>
-      <w:r>
-        <w:t xml:space="preserve">una nuova </w:t>
-      </w:r>
-      <w:r>
-        <w:t>p</w:t>
-      </w:r>
-      <w:r>
-        <w:t>artita.</w:t>
-      </w:r>
-    </w:p>
-    <w:p>
-      <w:r>
-        <w:t xml:space="preserve">Condizione da testare: perché il metodo funzioni si deve verificare </w:t>
-      </w:r>
-      <w:r>
-        <w:t>che,</w:t>
-      </w:r>
-      <w:r>
-        <w:t xml:space="preserve"> </w:t>
-      </w:r>
-      <w:r>
-        <w:t>qualora</w:t>
-      </w:r>
-      <w:r>
-        <w:t xml:space="preserve"> le tabelle preposte alla definizione di pedina e dado </w:t>
-      </w:r>
-      <w:r>
-        <w:t>siano</w:t>
-      </w:r>
-      <w:r>
-        <w:t xml:space="preserve"> vuote, vengano associate delle personalizzazioni di default, e il giocatore viene impostato come giocatore corrente</w:t>
-      </w:r>
-      <w:r>
-        <w:t>.</w:t>
-      </w:r>
-    </w:p>
-    <w:p/>
-    <w:p>
-      <w:pPr>
-        <w:rPr>
-          <w:b/>
-          <w:bCs/>
-          <w:color w:val="153D63" w:themeColor="text2" w:themeTint="E6"/>
-        </w:rPr>
-      </w:pPr>
-      <w:proofErr w:type="spellStart"/>
-      <w:r>
-        <w:rPr>
-          <w:b/>
-          <w:bCs/>
-          <w:color w:val="153D63" w:themeColor="text2" w:themeTint="E6"/>
-        </w:rPr>
-        <w:t>void</w:t>
-      </w:r>
-      <w:proofErr w:type="spellEnd"/>
-      <w:r>
-        <w:rPr>
-          <w:b/>
-          <w:bCs/>
-          <w:color w:val="153D63" w:themeColor="text2" w:themeTint="E6"/>
-        </w:rPr>
-        <w:t xml:space="preserve"> </w:t>
-      </w:r>
-      <w:proofErr w:type="spellStart"/>
-      <w:proofErr w:type="gramStart"/>
-      <w:r>
-        <w:rPr>
-          <w:b/>
-          <w:bCs/>
-          <w:color w:val="153D63" w:themeColor="text2" w:themeTint="E6"/>
-        </w:rPr>
-        <w:t>autenticazioneAdminTest</w:t>
-      </w:r>
-      <w:proofErr w:type="spellEnd"/>
-      <w:r>
-        <w:rPr>
-          <w:b/>
-          <w:bCs/>
-          <w:color w:val="153D63" w:themeColor="text2" w:themeTint="E6"/>
-        </w:rPr>
-        <w:t>(</w:t>
-      </w:r>
-      <w:proofErr w:type="gramEnd"/>
-      <w:r>
-        <w:rPr>
-          <w:b/>
-          <w:bCs/>
-          <w:color w:val="153D63" w:themeColor="text2" w:themeTint="E6"/>
-        </w:rPr>
-        <w:t>)</w:t>
-      </w:r>
-    </w:p>
-    <w:p>
-      <w:r>
-        <w:t>Test della autenticazione come admin per poter definire le operazioni</w:t>
-      </w:r>
-    </w:p>
-    <w:p>
-      <w:r>
-        <w:t xml:space="preserve">Condizione iniziale: che esista una variabile </w:t>
-      </w:r>
-      <w:proofErr w:type="spellStart"/>
-      <w:r>
-        <w:t>giocoDellOca</w:t>
-      </w:r>
-      <w:proofErr w:type="spellEnd"/>
-      <w:r>
-        <w:t xml:space="preserve"> </w:t>
-      </w:r>
-      <w:r>
-        <w:t>e</w:t>
-      </w:r>
-      <w:r>
-        <w:t xml:space="preserve"> che si voglia accedere </w:t>
-      </w:r>
-      <w:r>
-        <w:t>al pannello amministratore</w:t>
-      </w:r>
-      <w:r>
-        <w:t>.</w:t>
-      </w:r>
-    </w:p>
-    <w:p>
-      <w:r>
-        <w:t xml:space="preserve">Condizione da testare: perché il metodo funzioni si deve passare in input la coppia corretta username e password </w:t>
-      </w:r>
-      <w:r>
-        <w:t>"</w:t>
-      </w:r>
-      <w:r>
-        <w:t>admin</w:t>
-      </w:r>
-      <w:r>
-        <w:t>”</w:t>
-      </w:r>
-      <w:r>
-        <w:t xml:space="preserve"> </w:t>
-      </w:r>
-      <w:r>
-        <w:t>“</w:t>
-      </w:r>
-      <w:r>
-        <w:t>admin</w:t>
-      </w:r>
-      <w:r>
-        <w:t>”</w:t>
-      </w:r>
-      <w:r>
-        <w:t>, altrimenti viene restituito un bool</w:t>
-      </w:r>
-      <w:r>
-        <w:t>eano</w:t>
-      </w:r>
-      <w:r>
-        <w:t xml:space="preserve"> che blocca la funzionalità</w:t>
-      </w:r>
-      <w:r>
-        <w:t>.</w:t>
-      </w:r>
-    </w:p>
-    <w:p/>
-    <w:p/>
-    <w:p/>
-    <w:p/>
-    <w:p/>
-    <w:p/>
-    <w:p>
-      <w:pPr>
-        <w:rPr>
-          <w:b/>
-          <w:bCs/>
-          <w:color w:val="153D63" w:themeColor="text2" w:themeTint="E6"/>
-        </w:rPr>
-      </w:pPr>
-      <w:proofErr w:type="spellStart"/>
-      <w:r>
-        <w:rPr>
-          <w:b/>
-          <w:bCs/>
-          <w:color w:val="153D63" w:themeColor="text2" w:themeTint="E6"/>
-        </w:rPr>
-        <w:lastRenderedPageBreak/>
         <w:t>void</w:t>
       </w:r>
       <w:proofErr w:type="spellEnd"/>
@@ -20144,6 +20195,7 @@
     <w:rsid w:val="005170C4"/>
     <w:rsid w:val="00536FBF"/>
     <w:rsid w:val="00543A4F"/>
+    <w:rsid w:val="005A20D4"/>
     <w:rsid w:val="005A223A"/>
     <w:rsid w:val="005E049C"/>
     <w:rsid w:val="005E710A"/>
@@ -20156,6 +20208,7 @@
     <w:rsid w:val="00725A96"/>
     <w:rsid w:val="00733765"/>
     <w:rsid w:val="00743DF4"/>
+    <w:rsid w:val="00755941"/>
     <w:rsid w:val="00772195"/>
     <w:rsid w:val="00781888"/>
     <w:rsid w:val="007F0F73"/>
@@ -20175,6 +20228,7 @@
     <w:rsid w:val="00A22019"/>
     <w:rsid w:val="00A30F8E"/>
     <w:rsid w:val="00A46757"/>
+    <w:rsid w:val="00B0532B"/>
     <w:rsid w:val="00B11FB2"/>
     <w:rsid w:val="00B47B6A"/>
     <w:rsid w:val="00B86915"/>
@@ -20182,6 +20236,7 @@
     <w:rsid w:val="00BC399B"/>
     <w:rsid w:val="00BD4F27"/>
     <w:rsid w:val="00BE08AA"/>
+    <w:rsid w:val="00BF2C34"/>
     <w:rsid w:val="00CA6967"/>
     <w:rsid w:val="00D13578"/>
     <w:rsid w:val="00D373CE"/>

</xml_diff>

<commit_message>
fix test importazione regole
</commit_message>
<xml_diff>
--- a/Documentazione/Elaborazione/Iterazione 5/Iterazione 5.docx
+++ b/Documentazione/Elaborazione/Iterazione 5/Iterazione 5.docx
@@ -6705,7 +6705,6 @@
         </w:rPr>
         <w:t xml:space="preserve">• </w:t>
       </w:r>
-      <w:proofErr w:type="spellStart"/>
       <w:r>
         <w:rPr>
           <w:rFonts w:ascii="Calibri" w:hAnsi="Calibri" w:cs="Calibri"/>
@@ -6720,16 +6719,7 @@
           <w:b/>
           <w:highlight w:val="white"/>
         </w:rPr>
-        <w:t>DellOca</w:t>
-      </w:r>
-      <w:proofErr w:type="spellEnd"/>
-      <w:r>
-        <w:rPr>
-          <w:rFonts w:ascii="Calibri" w:hAnsi="Calibri" w:cs="Calibri"/>
-          <w:b/>
-          <w:highlight w:val="white"/>
-        </w:rPr>
-        <w:t>:</w:t>
+        <w:t>DellOca:</w:t>
       </w:r>
       <w:r>
         <w:rPr>
@@ -7107,23 +7097,7 @@
           <w:rFonts w:ascii="Calibri" w:hAnsi="Calibri" w:cs="Calibri"/>
           <w:highlight w:val="white"/>
         </w:rPr>
-        <w:t xml:space="preserve"> nel caso di partita </w:t>
-      </w:r>
-      <w:proofErr w:type="spellStart"/>
-      <w:r>
-        <w:rPr>
-          <w:rFonts w:ascii="Calibri" w:hAnsi="Calibri" w:cs="Calibri"/>
-          <w:highlight w:val="white"/>
-        </w:rPr>
-        <w:t>singleplayer</w:t>
-      </w:r>
-      <w:proofErr w:type="spellEnd"/>
-      <w:r>
-        <w:rPr>
-          <w:rFonts w:ascii="Calibri" w:hAnsi="Calibri" w:cs="Calibri"/>
-          <w:highlight w:val="white"/>
-        </w:rPr>
-        <w:t>,</w:t>
+        <w:t xml:space="preserve"> nel caso di partita singleplayer,</w:t>
       </w:r>
       <w:r>
         <w:rPr>
@@ -7132,7 +7106,6 @@
         </w:rPr>
         <w:t xml:space="preserve"> e da ciascun giocatore (sia </w:t>
       </w:r>
-      <w:proofErr w:type="spellStart"/>
       <w:r>
         <w:rPr>
           <w:rFonts w:ascii="Calibri" w:hAnsi="Calibri" w:cs="Calibri"/>
@@ -7142,7 +7115,6 @@
         </w:rPr>
         <w:t>host</w:t>
       </w:r>
-      <w:proofErr w:type="spellEnd"/>
       <w:r>
         <w:rPr>
           <w:rFonts w:ascii="Calibri" w:hAnsi="Calibri" w:cs="Calibri"/>
@@ -7211,7 +7183,6 @@
         </w:rPr>
         <w:t xml:space="preserve">, e da ciascun giocatore (sia </w:t>
       </w:r>
-      <w:proofErr w:type="spellStart"/>
       <w:r>
         <w:rPr>
           <w:rFonts w:ascii="Calibri" w:hAnsi="Calibri" w:cs="Calibri"/>
@@ -7221,7 +7192,6 @@
         </w:rPr>
         <w:t>host</w:t>
       </w:r>
-      <w:proofErr w:type="spellEnd"/>
       <w:r>
         <w:rPr>
           <w:rFonts w:ascii="Calibri" w:hAnsi="Calibri" w:cs="Calibri"/>
@@ -7291,23 +7261,7 @@
           <w:rFonts w:ascii="Calibri" w:hAnsi="Calibri" w:cs="Calibri"/>
           <w:highlight w:val="white"/>
         </w:rPr>
-        <w:t xml:space="preserve">si tratta del campo di gioco messo a disposizione dal controller </w:t>
-      </w:r>
-      <w:proofErr w:type="spellStart"/>
-      <w:r>
-        <w:rPr>
-          <w:rFonts w:ascii="Calibri" w:hAnsi="Calibri" w:cs="Calibri"/>
-          <w:highlight w:val="white"/>
-        </w:rPr>
-        <w:t>GiocoDellOca</w:t>
-      </w:r>
-      <w:proofErr w:type="spellEnd"/>
-      <w:r>
-        <w:rPr>
-          <w:rFonts w:ascii="Calibri" w:hAnsi="Calibri" w:cs="Calibri"/>
-          <w:highlight w:val="white"/>
-        </w:rPr>
-        <w:t xml:space="preserve"> tramite Partita. L’interazione con l’oggetto Tabellone non è diretta, ma passa attraverso le Caselle che lo costituiscono</w:t>
+        <w:t>si tratta del campo di gioco messo a disposizione dal controller GiocoDellOca tramite Partita. L’interazione con l’oggetto Tabellone non è diretta, ma passa attraverso le Caselle che lo costituiscono</w:t>
       </w:r>
       <w:r>
         <w:rPr>
@@ -7530,7 +7484,21 @@
           <w:rFonts w:ascii="Calibri" w:hAnsi="Calibri" w:cs="Calibri"/>
           <w:highlight w:val="white"/>
         </w:rPr>
-        <w:t>Tenendo conto di associazione e attributi, si costruisce il seguente Modello di Dominio:</w:t>
+        <w:t>Tenendo conto di associazion</w:t>
+      </w:r>
+      <w:r>
+        <w:rPr>
+          <w:rFonts w:ascii="Calibri" w:hAnsi="Calibri" w:cs="Calibri"/>
+          <w:highlight w:val="white"/>
+        </w:rPr>
+        <w:t>i</w:t>
+      </w:r>
+      <w:r>
+        <w:rPr>
+          <w:rFonts w:ascii="Calibri" w:hAnsi="Calibri" w:cs="Calibri"/>
+          <w:highlight w:val="white"/>
+        </w:rPr>
+        <w:t xml:space="preserve"> e attributi, si costruisce il seguente Modello di Dominio:</w:t>
       </w:r>
     </w:p>
     <w:p>
@@ -7546,7 +7514,7 @@
           <w:noProof/>
         </w:rPr>
         <w:drawing>
-          <wp:inline distT="0" distB="0" distL="0" distR="0" wp14:anchorId="639DEDE6" wp14:editId="510143B7">
+          <wp:inline distT="0" distB="0" distL="0" distR="0" wp14:anchorId="639DEDE6" wp14:editId="3C3FE080">
             <wp:extent cx="6120130" cy="5064760"/>
             <wp:effectExtent l="0" t="0" r="0" b="2540"/>
             <wp:docPr id="884528962" name="Immagine 2" descr="Immagine che contiene testo, diagramma, schermata, Piano&#10;&#10;Il contenuto generato dall'IA potrebbe non essere corretto."/>
@@ -8589,7 +8557,6 @@
                 <w:i/>
               </w:rPr>
             </w:pPr>
-            <w:proofErr w:type="spellStart"/>
             <w:r>
               <w:rPr>
                 <w:rFonts w:ascii="Calibri" w:eastAsia="Aptos" w:hAnsi="Calibri" w:cs="Calibri"/>
@@ -8601,7 +8568,6 @@
               </w:rPr>
               <w:t>autenticazioneAdmin</w:t>
             </w:r>
-            <w:proofErr w:type="spellEnd"/>
           </w:p>
         </w:tc>
       </w:tr>
@@ -8643,14 +8609,12 @@
                 <w:rFonts w:ascii="Calibri" w:eastAsia="Aptos" w:hAnsi="Calibri" w:cs="Calibri"/>
               </w:rPr>
             </w:pPr>
-            <w:proofErr w:type="spellStart"/>
             <w:r>
               <w:rPr>
                 <w:rFonts w:ascii="Calibri" w:eastAsia="Aptos" w:hAnsi="Calibri" w:cs="Calibri"/>
               </w:rPr>
               <w:t>autenticazioneAdmin</w:t>
             </w:r>
-            <w:proofErr w:type="spellEnd"/>
             <w:r>
               <w:rPr>
                 <w:rFonts w:ascii="Calibri" w:eastAsia="Aptos" w:hAnsi="Calibri" w:cs="Calibri"/>
@@ -8891,7 +8855,6 @@
                 <w:i/>
               </w:rPr>
             </w:pPr>
-            <w:proofErr w:type="spellStart"/>
             <w:r>
               <w:rPr>
                 <w:rFonts w:ascii="Calibri" w:eastAsia="Aptos" w:hAnsi="Calibri" w:cs="Calibri"/>
@@ -8903,7 +8866,6 @@
               </w:rPr>
               <w:t>replaceAllSetRegole</w:t>
             </w:r>
-            <w:proofErr w:type="spellEnd"/>
           </w:p>
         </w:tc>
       </w:tr>
@@ -8945,28 +8907,24 @@
                 <w:rFonts w:ascii="Calibri" w:eastAsia="Aptos" w:hAnsi="Calibri" w:cs="Calibri"/>
               </w:rPr>
             </w:pPr>
-            <w:proofErr w:type="spellStart"/>
             <w:r>
               <w:rPr>
                 <w:rFonts w:ascii="Calibri" w:eastAsia="Aptos" w:hAnsi="Calibri" w:cs="Calibri"/>
               </w:rPr>
               <w:t>replaceAllSetRegole</w:t>
             </w:r>
-            <w:proofErr w:type="spellEnd"/>
             <w:r>
               <w:rPr>
                 <w:rFonts w:ascii="Calibri" w:eastAsia="Aptos" w:hAnsi="Calibri" w:cs="Calibri"/>
               </w:rPr>
               <w:t>(</w:t>
             </w:r>
-            <w:proofErr w:type="spellStart"/>
             <w:r>
               <w:rPr>
                 <w:rFonts w:ascii="Calibri" w:eastAsia="Aptos" w:hAnsi="Calibri" w:cs="Calibri"/>
               </w:rPr>
               <w:t>mapRegoleSet</w:t>
             </w:r>
-            <w:proofErr w:type="spellEnd"/>
             <w:r>
               <w:rPr>
                 <w:rFonts w:ascii="Calibri" w:eastAsia="Aptos" w:hAnsi="Calibri" w:cs="Calibri"/>
@@ -9201,7 +9159,6 @@
                 <w:i/>
               </w:rPr>
             </w:pPr>
-            <w:proofErr w:type="spellStart"/>
             <w:r>
               <w:rPr>
                 <w:rFonts w:ascii="Calibri" w:eastAsia="Aptos" w:hAnsi="Calibri" w:cs="Calibri"/>
@@ -9213,7 +9170,6 @@
               </w:rPr>
               <w:t>replaceAllScenari</w:t>
             </w:r>
-            <w:proofErr w:type="spellEnd"/>
           </w:p>
         </w:tc>
       </w:tr>
@@ -9255,33 +9211,11 @@
                 <w:rFonts w:ascii="Calibri" w:eastAsia="Aptos" w:hAnsi="Calibri" w:cs="Calibri"/>
               </w:rPr>
             </w:pPr>
-            <w:proofErr w:type="spellStart"/>
             <w:r>
               <w:rPr>
                 <w:rFonts w:ascii="Calibri" w:eastAsia="Aptos" w:hAnsi="Calibri" w:cs="Calibri"/>
               </w:rPr>
-              <w:t>replaceAllScenari</w:t>
-            </w:r>
-            <w:proofErr w:type="spellEnd"/>
-            <w:r>
-              <w:rPr>
-                <w:rFonts w:ascii="Calibri" w:eastAsia="Aptos" w:hAnsi="Calibri" w:cs="Calibri"/>
-              </w:rPr>
-              <w:t>(</w:t>
-            </w:r>
-            <w:proofErr w:type="spellStart"/>
-            <w:r>
-              <w:rPr>
-                <w:rFonts w:ascii="Calibri" w:eastAsia="Aptos" w:hAnsi="Calibri" w:cs="Calibri"/>
-              </w:rPr>
-              <w:t>listScenari</w:t>
-            </w:r>
-            <w:proofErr w:type="spellEnd"/>
-            <w:r>
-              <w:rPr>
-                <w:rFonts w:ascii="Calibri" w:eastAsia="Aptos" w:hAnsi="Calibri" w:cs="Calibri"/>
-              </w:rPr>
-              <w:t>)</w:t>
+              <w:t>replaceAllScenari(listScenari)</w:t>
             </w:r>
           </w:p>
         </w:tc>
@@ -9511,7 +9445,6 @@
                 <w:i/>
               </w:rPr>
             </w:pPr>
-            <w:proofErr w:type="spellStart"/>
             <w:r>
               <w:rPr>
                 <w:rFonts w:ascii="Calibri" w:eastAsia="Aptos" w:hAnsi="Calibri" w:cs="Calibri"/>
@@ -9523,7 +9456,6 @@
               </w:rPr>
               <w:t>replaceAllPersonalizzazioni</w:t>
             </w:r>
-            <w:proofErr w:type="spellEnd"/>
           </w:p>
         </w:tc>
       </w:tr>
@@ -9565,33 +9497,11 @@
                 <w:rFonts w:ascii="Calibri" w:eastAsia="Aptos" w:hAnsi="Calibri" w:cs="Calibri"/>
               </w:rPr>
             </w:pPr>
-            <w:proofErr w:type="spellStart"/>
             <w:r>
               <w:rPr>
                 <w:rFonts w:ascii="Calibri" w:eastAsia="Aptos" w:hAnsi="Calibri" w:cs="Calibri"/>
               </w:rPr>
-              <w:t>replaceAllPersonalizzazioni</w:t>
-            </w:r>
-            <w:proofErr w:type="spellEnd"/>
-            <w:r>
-              <w:rPr>
-                <w:rFonts w:ascii="Calibri" w:eastAsia="Aptos" w:hAnsi="Calibri" w:cs="Calibri"/>
-              </w:rPr>
-              <w:t>(</w:t>
-            </w:r>
-            <w:proofErr w:type="spellStart"/>
-            <w:r>
-              <w:rPr>
-                <w:rFonts w:ascii="Calibri" w:eastAsia="Aptos" w:hAnsi="Calibri" w:cs="Calibri"/>
-              </w:rPr>
-              <w:t>listPersonalizzazioni</w:t>
-            </w:r>
-            <w:proofErr w:type="spellEnd"/>
-            <w:r>
-              <w:rPr>
-                <w:rFonts w:ascii="Calibri" w:eastAsia="Aptos" w:hAnsi="Calibri" w:cs="Calibri"/>
-              </w:rPr>
-              <w:t>)</w:t>
+              <w:t>replaceAllPersonalizzazioni(listPersonalizzazioni)</w:t>
             </w:r>
           </w:p>
         </w:tc>
@@ -10016,14 +9926,12 @@
         </w:rPr>
         <w:t xml:space="preserve">SD </w:t>
       </w:r>
-      <w:proofErr w:type="spellStart"/>
       <w:r>
         <w:rPr>
           <w:highlight w:val="white"/>
         </w:rPr>
         <w:t>replaceAllSetRegole</w:t>
       </w:r>
-      <w:proofErr w:type="spellEnd"/>
     </w:p>
     <w:p>
       <w:r>
@@ -10031,7 +9939,7 @@
           <w:noProof/>
         </w:rPr>
         <w:drawing>
-          <wp:inline distT="0" distB="0" distL="0" distR="0" wp14:anchorId="055F0B55" wp14:editId="29DAFBF9">
+          <wp:inline distT="0" distB="0" distL="0" distR="0" wp14:anchorId="055F0B55" wp14:editId="09347381">
             <wp:extent cx="6120130" cy="2813685"/>
             <wp:effectExtent l="0" t="0" r="0" b="5715"/>
             <wp:docPr id="205790204" name="Immagine 6" descr="Immagine che contiene testo, schermata, diagramma, linea"/>
@@ -10083,13 +9991,8 @@
         </w:numPr>
       </w:pPr>
       <w:r>
-        <w:t xml:space="preserve">SD </w:t>
-      </w:r>
-      <w:proofErr w:type="spellStart"/>
-      <w:r>
-        <w:t>replaceAllScenari</w:t>
-      </w:r>
-      <w:proofErr w:type="spellEnd"/>
+        <w:t>SD replaceAllScenari</w:t>
+      </w:r>
     </w:p>
     <w:p>
       <w:r>
@@ -10149,13 +10052,8 @@
       </w:pPr>
       <w:r>
         <w:lastRenderedPageBreak/>
-        <w:t xml:space="preserve">SD </w:t>
-      </w:r>
-      <w:proofErr w:type="spellStart"/>
-      <w:r>
-        <w:t>replaceAllPersonalizzazioni</w:t>
-      </w:r>
-      <w:proofErr w:type="spellEnd"/>
+        <w:t>SD replaceAllPersonalizzazioni</w:t>
+      </w:r>
     </w:p>
     <w:p>
       <w:r>
@@ -10163,7 +10061,7 @@
           <w:noProof/>
         </w:rPr>
         <w:drawing>
-          <wp:inline distT="0" distB="0" distL="0" distR="0" wp14:anchorId="74F48C47" wp14:editId="6B229C81">
+          <wp:inline distT="0" distB="0" distL="0" distR="0" wp14:anchorId="74F48C47" wp14:editId="61760F43">
             <wp:extent cx="6120130" cy="2813685"/>
             <wp:effectExtent l="0" t="0" r="0" b="5715"/>
             <wp:docPr id="147181640" name="Immagine 8" descr="Immagine che contiene testo, schermata, diagramma, linea&#10;&#10;Il contenuto generato dall'IA potrebbe non essere corretto."/>
@@ -10215,13 +10113,8 @@
         </w:numPr>
       </w:pPr>
       <w:r>
-        <w:t xml:space="preserve">SD </w:t>
-      </w:r>
-      <w:proofErr w:type="spellStart"/>
-      <w:r>
-        <w:t>autenticazioneAdmin</w:t>
-      </w:r>
-      <w:proofErr w:type="spellEnd"/>
+        <w:t>SD autenticazioneAdmin</w:t>
+      </w:r>
     </w:p>
     <w:p>
       <w:r>
@@ -10229,7 +10122,7 @@
           <w:noProof/>
         </w:rPr>
         <w:drawing>
-          <wp:inline distT="0" distB="0" distL="0" distR="0" wp14:anchorId="296E85D7" wp14:editId="18E382EE">
+          <wp:inline distT="0" distB="0" distL="0" distR="0" wp14:anchorId="296E85D7" wp14:editId="6F59C20B">
             <wp:extent cx="6120130" cy="2813685"/>
             <wp:effectExtent l="0" t="0" r="0" b="5715"/>
             <wp:docPr id="1732354731" name="Immagine 9" descr="Immagine che contiene testo, diagramma, linea, schermata&#10;&#10;Il contenuto generato dall'IA potrebbe non essere corretto."/>
@@ -10286,24 +10179,9 @@
           <w:numId w:val="30"/>
         </w:numPr>
       </w:pPr>
-      <w:proofErr w:type="spellStart"/>
       <w:r>
         <w:lastRenderedPageBreak/>
-        <w:t>Refactoring</w:t>
-      </w:r>
-      <w:proofErr w:type="spellEnd"/>
-      <w:r>
-        <w:t xml:space="preserve"> del SD </w:t>
-      </w:r>
-      <w:proofErr w:type="spellStart"/>
-      <w:proofErr w:type="gramStart"/>
-      <w:r>
-        <w:t>giocaTurno</w:t>
-      </w:r>
-      <w:proofErr w:type="spellEnd"/>
-      <w:proofErr w:type="gramEnd"/>
-      <w:r>
-        <w:t xml:space="preserve">, introdotto nelle precedenti iterazioni, applicando i pattern </w:t>
+        <w:t xml:space="preserve">Refactoring del SD giocaTurno, introdotto nelle precedenti iterazioni, applicando i pattern </w:t>
       </w:r>
       <w:r>
         <w:rPr>
@@ -11193,25 +11071,13 @@
       </w:r>
       <w:r>
         <w:tab/>
-      </w:r>
-      <w:proofErr w:type="spellStart"/>
-      <w:r>
         <w:t>GiocoDellOcaTest</w:t>
       </w:r>
-      <w:proofErr w:type="spellEnd"/>
     </w:p>
     <w:p/>
     <w:p>
       <w:r>
-        <w:t xml:space="preserve">I metodi testati sono i seguenti metodi provenienti dalla classe </w:t>
-      </w:r>
-      <w:proofErr w:type="spellStart"/>
-      <w:r>
-        <w:t>GiocoDellOca</w:t>
-      </w:r>
-      <w:proofErr w:type="spellEnd"/>
-      <w:r>
-        <w:t>:</w:t>
+        <w:t>I metodi testati sono i seguenti metodi provenienti dalla classe GiocoDellOca:</w:t>
       </w:r>
     </w:p>
     <w:p>
@@ -11227,51 +11093,13 @@
           <w:color w:val="153D63" w:themeColor="text2" w:themeTint="E6"/>
         </w:rPr>
       </w:pPr>
-      <w:proofErr w:type="spellStart"/>
       <w:r>
         <w:rPr>
           <w:b/>
           <w:bCs/>
           <w:color w:val="153D63" w:themeColor="text2" w:themeTint="E6"/>
         </w:rPr>
-        <w:t>void</w:t>
-      </w:r>
-      <w:proofErr w:type="spellEnd"/>
-      <w:r>
-        <w:rPr>
-          <w:b/>
-          <w:bCs/>
-          <w:color w:val="153D63" w:themeColor="text2" w:themeTint="E6"/>
-        </w:rPr>
-        <w:t xml:space="preserve"> </w:t>
-      </w:r>
-      <w:proofErr w:type="spellStart"/>
-      <w:proofErr w:type="gramStart"/>
-      <w:r>
-        <w:rPr>
-          <w:b/>
-          <w:bCs/>
-          <w:color w:val="153D63" w:themeColor="text2" w:themeTint="E6"/>
-        </w:rPr>
-        <w:t>impostazioniTest</w:t>
-      </w:r>
-      <w:proofErr w:type="spellEnd"/>
-      <w:r>
-        <w:rPr>
-          <w:b/>
-          <w:bCs/>
-          <w:color w:val="153D63" w:themeColor="text2" w:themeTint="E6"/>
-        </w:rPr>
-        <w:t>(</w:t>
-      </w:r>
-      <w:proofErr w:type="gramEnd"/>
-      <w:r>
-        <w:rPr>
-          <w:b/>
-          <w:bCs/>
-          <w:color w:val="153D63" w:themeColor="text2" w:themeTint="E6"/>
-        </w:rPr>
-        <w:t>)</w:t>
+        <w:t>void impostazioniTest()</w:t>
       </w:r>
     </w:p>
     <w:p>
@@ -11287,51 +11115,13 @@
           <w:color w:val="153D63" w:themeColor="text2" w:themeTint="E6"/>
         </w:rPr>
       </w:pPr>
-      <w:proofErr w:type="spellStart"/>
       <w:r>
         <w:rPr>
           <w:b/>
           <w:bCs/>
           <w:color w:val="153D63" w:themeColor="text2" w:themeTint="E6"/>
         </w:rPr>
-        <w:t>void</w:t>
-      </w:r>
-      <w:proofErr w:type="spellEnd"/>
-      <w:r>
-        <w:rPr>
-          <w:b/>
-          <w:bCs/>
-          <w:color w:val="153D63" w:themeColor="text2" w:themeTint="E6"/>
-        </w:rPr>
-        <w:t xml:space="preserve"> </w:t>
-      </w:r>
-      <w:proofErr w:type="spellStart"/>
-      <w:proofErr w:type="gramStart"/>
-      <w:r>
-        <w:rPr>
-          <w:b/>
-          <w:bCs/>
-          <w:color w:val="153D63" w:themeColor="text2" w:themeTint="E6"/>
-        </w:rPr>
-        <w:t>impostaRegoleSingoleTest</w:t>
-      </w:r>
-      <w:proofErr w:type="spellEnd"/>
-      <w:r>
-        <w:rPr>
-          <w:b/>
-          <w:bCs/>
-          <w:color w:val="153D63" w:themeColor="text2" w:themeTint="E6"/>
-        </w:rPr>
-        <w:t>(</w:t>
-      </w:r>
-      <w:proofErr w:type="gramEnd"/>
-      <w:r>
-        <w:rPr>
-          <w:b/>
-          <w:bCs/>
-          <w:color w:val="153D63" w:themeColor="text2" w:themeTint="E6"/>
-        </w:rPr>
-        <w:t>)</w:t>
+        <w:t>void impostaRegoleSingoleTest()</w:t>
       </w:r>
     </w:p>
     <w:p>
@@ -11347,51 +11137,13 @@
           <w:color w:val="153D63" w:themeColor="text2" w:themeTint="E6"/>
         </w:rPr>
       </w:pPr>
-      <w:proofErr w:type="spellStart"/>
       <w:r>
         <w:rPr>
           <w:b/>
           <w:bCs/>
           <w:color w:val="153D63" w:themeColor="text2" w:themeTint="E6"/>
         </w:rPr>
-        <w:t>void</w:t>
-      </w:r>
-      <w:proofErr w:type="spellEnd"/>
-      <w:r>
-        <w:rPr>
-          <w:b/>
-          <w:bCs/>
-          <w:color w:val="153D63" w:themeColor="text2" w:themeTint="E6"/>
-        </w:rPr>
-        <w:t xml:space="preserve"> </w:t>
-      </w:r>
-      <w:proofErr w:type="spellStart"/>
-      <w:proofErr w:type="gramStart"/>
-      <w:r>
-        <w:rPr>
-          <w:b/>
-          <w:bCs/>
-          <w:color w:val="153D63" w:themeColor="text2" w:themeTint="E6"/>
-        </w:rPr>
-        <w:t>impostaRegoleDaSetTest</w:t>
-      </w:r>
-      <w:proofErr w:type="spellEnd"/>
-      <w:r>
-        <w:rPr>
-          <w:b/>
-          <w:bCs/>
-          <w:color w:val="153D63" w:themeColor="text2" w:themeTint="E6"/>
-        </w:rPr>
-        <w:t>(</w:t>
-      </w:r>
-      <w:proofErr w:type="gramEnd"/>
-      <w:r>
-        <w:rPr>
-          <w:b/>
-          <w:bCs/>
-          <w:color w:val="153D63" w:themeColor="text2" w:themeTint="E6"/>
-        </w:rPr>
-        <w:t>)</w:t>
+        <w:t>void impostaRegoleDaSetTest()</w:t>
       </w:r>
     </w:p>
     <w:p>
@@ -11407,51 +11159,13 @@
           <w:color w:val="153D63" w:themeColor="text2" w:themeTint="E6"/>
         </w:rPr>
       </w:pPr>
-      <w:proofErr w:type="spellStart"/>
       <w:r>
         <w:rPr>
           <w:b/>
           <w:bCs/>
           <w:color w:val="153D63" w:themeColor="text2" w:themeTint="E6"/>
         </w:rPr>
-        <w:t>void</w:t>
-      </w:r>
-      <w:proofErr w:type="spellEnd"/>
-      <w:r>
-        <w:rPr>
-          <w:b/>
-          <w:bCs/>
-          <w:color w:val="153D63" w:themeColor="text2" w:themeTint="E6"/>
-        </w:rPr>
-        <w:t xml:space="preserve"> </w:t>
-      </w:r>
-      <w:proofErr w:type="spellStart"/>
-      <w:proofErr w:type="gramStart"/>
-      <w:r>
-        <w:rPr>
-          <w:b/>
-          <w:bCs/>
-          <w:color w:val="153D63" w:themeColor="text2" w:themeTint="E6"/>
-        </w:rPr>
-        <w:t>impostaScenarioTest</w:t>
-      </w:r>
-      <w:proofErr w:type="spellEnd"/>
-      <w:r>
-        <w:rPr>
-          <w:b/>
-          <w:bCs/>
-          <w:color w:val="153D63" w:themeColor="text2" w:themeTint="E6"/>
-        </w:rPr>
-        <w:t>(</w:t>
-      </w:r>
-      <w:proofErr w:type="gramEnd"/>
-      <w:r>
-        <w:rPr>
-          <w:b/>
-          <w:bCs/>
-          <w:color w:val="153D63" w:themeColor="text2" w:themeTint="E6"/>
-        </w:rPr>
-        <w:t>)</w:t>
+        <w:t>void impostaScenarioTest()</w:t>
       </w:r>
     </w:p>
     <w:p>
@@ -11467,51 +11181,13 @@
           <w:color w:val="153D63" w:themeColor="text2" w:themeTint="E6"/>
         </w:rPr>
       </w:pPr>
-      <w:proofErr w:type="spellStart"/>
       <w:r>
         <w:rPr>
           <w:b/>
           <w:bCs/>
           <w:color w:val="153D63" w:themeColor="text2" w:themeTint="E6"/>
         </w:rPr>
-        <w:t>void</w:t>
-      </w:r>
-      <w:proofErr w:type="spellEnd"/>
-      <w:r>
-        <w:rPr>
-          <w:b/>
-          <w:bCs/>
-          <w:color w:val="153D63" w:themeColor="text2" w:themeTint="E6"/>
-        </w:rPr>
-        <w:t xml:space="preserve"> </w:t>
-      </w:r>
-      <w:proofErr w:type="spellStart"/>
-      <w:proofErr w:type="gramStart"/>
-      <w:r>
-        <w:rPr>
-          <w:b/>
-          <w:bCs/>
-          <w:color w:val="153D63" w:themeColor="text2" w:themeTint="E6"/>
-        </w:rPr>
-        <w:t>impostaPedinaTest</w:t>
-      </w:r>
-      <w:proofErr w:type="spellEnd"/>
-      <w:r>
-        <w:rPr>
-          <w:b/>
-          <w:bCs/>
-          <w:color w:val="153D63" w:themeColor="text2" w:themeTint="E6"/>
-        </w:rPr>
-        <w:t>(</w:t>
-      </w:r>
-      <w:proofErr w:type="gramEnd"/>
-      <w:r>
-        <w:rPr>
-          <w:b/>
-          <w:bCs/>
-          <w:color w:val="153D63" w:themeColor="text2" w:themeTint="E6"/>
-        </w:rPr>
-        <w:t>)</w:t>
+        <w:t>void impostaPedinaTest()</w:t>
       </w:r>
     </w:p>
     <w:p>
@@ -11527,51 +11203,13 @@
           <w:color w:val="153D63" w:themeColor="text2" w:themeTint="E6"/>
         </w:rPr>
       </w:pPr>
-      <w:proofErr w:type="spellStart"/>
       <w:r>
         <w:rPr>
           <w:b/>
           <w:bCs/>
           <w:color w:val="153D63" w:themeColor="text2" w:themeTint="E6"/>
         </w:rPr>
-        <w:t>void</w:t>
-      </w:r>
-      <w:proofErr w:type="spellEnd"/>
-      <w:r>
-        <w:rPr>
-          <w:b/>
-          <w:bCs/>
-          <w:color w:val="153D63" w:themeColor="text2" w:themeTint="E6"/>
-        </w:rPr>
-        <w:t xml:space="preserve"> </w:t>
-      </w:r>
-      <w:proofErr w:type="spellStart"/>
-      <w:proofErr w:type="gramStart"/>
-      <w:r>
-        <w:rPr>
-          <w:b/>
-          <w:bCs/>
-          <w:color w:val="153D63" w:themeColor="text2" w:themeTint="E6"/>
-        </w:rPr>
-        <w:t>impostaDadoTest</w:t>
-      </w:r>
-      <w:proofErr w:type="spellEnd"/>
-      <w:r>
-        <w:rPr>
-          <w:b/>
-          <w:bCs/>
-          <w:color w:val="153D63" w:themeColor="text2" w:themeTint="E6"/>
-        </w:rPr>
-        <w:t>(</w:t>
-      </w:r>
-      <w:proofErr w:type="gramEnd"/>
-      <w:r>
-        <w:rPr>
-          <w:b/>
-          <w:bCs/>
-          <w:color w:val="153D63" w:themeColor="text2" w:themeTint="E6"/>
-        </w:rPr>
-        <w:t>)</w:t>
+        <w:t>void impostaDadoTest()</w:t>
       </w:r>
     </w:p>
     <w:p>
@@ -11587,51 +11225,13 @@
           <w:color w:val="153D63" w:themeColor="text2" w:themeTint="E6"/>
         </w:rPr>
       </w:pPr>
-      <w:proofErr w:type="spellStart"/>
       <w:r>
         <w:rPr>
           <w:b/>
           <w:bCs/>
           <w:color w:val="153D63" w:themeColor="text2" w:themeTint="E6"/>
         </w:rPr>
-        <w:t>void</w:t>
-      </w:r>
-      <w:proofErr w:type="spellEnd"/>
-      <w:r>
-        <w:rPr>
-          <w:b/>
-          <w:bCs/>
-          <w:color w:val="153D63" w:themeColor="text2" w:themeTint="E6"/>
-        </w:rPr>
-        <w:t xml:space="preserve"> </w:t>
-      </w:r>
-      <w:proofErr w:type="spellStart"/>
-      <w:proofErr w:type="gramStart"/>
-      <w:r>
-        <w:rPr>
-          <w:b/>
-          <w:bCs/>
-          <w:color w:val="153D63" w:themeColor="text2" w:themeTint="E6"/>
-        </w:rPr>
-        <w:t>eseguiTurnoTest</w:t>
-      </w:r>
-      <w:proofErr w:type="spellEnd"/>
-      <w:r>
-        <w:rPr>
-          <w:b/>
-          <w:bCs/>
-          <w:color w:val="153D63" w:themeColor="text2" w:themeTint="E6"/>
-        </w:rPr>
-        <w:t>(</w:t>
-      </w:r>
-      <w:proofErr w:type="gramEnd"/>
-      <w:r>
-        <w:rPr>
-          <w:b/>
-          <w:bCs/>
-          <w:color w:val="153D63" w:themeColor="text2" w:themeTint="E6"/>
-        </w:rPr>
-        <w:t>)</w:t>
+        <w:t>void eseguiTurnoTest()</w:t>
       </w:r>
     </w:p>
     <w:p>
@@ -11647,51 +11247,13 @@
           <w:color w:val="153D63" w:themeColor="text2" w:themeTint="E6"/>
         </w:rPr>
       </w:pPr>
-      <w:proofErr w:type="spellStart"/>
       <w:r>
         <w:rPr>
           <w:b/>
           <w:bCs/>
           <w:color w:val="153D63" w:themeColor="text2" w:themeTint="E6"/>
         </w:rPr>
-        <w:t>void</w:t>
-      </w:r>
-      <w:proofErr w:type="spellEnd"/>
-      <w:r>
-        <w:rPr>
-          <w:b/>
-          <w:bCs/>
-          <w:color w:val="153D63" w:themeColor="text2" w:themeTint="E6"/>
-        </w:rPr>
-        <w:t xml:space="preserve"> </w:t>
-      </w:r>
-      <w:proofErr w:type="spellStart"/>
-      <w:proofErr w:type="gramStart"/>
-      <w:r>
-        <w:rPr>
-          <w:b/>
-          <w:bCs/>
-          <w:color w:val="153D63" w:themeColor="text2" w:themeTint="E6"/>
-        </w:rPr>
-        <w:t>aggiungiGiocatoriOspitiTest</w:t>
-      </w:r>
-      <w:proofErr w:type="spellEnd"/>
-      <w:r>
-        <w:rPr>
-          <w:b/>
-          <w:bCs/>
-          <w:color w:val="153D63" w:themeColor="text2" w:themeTint="E6"/>
-        </w:rPr>
-        <w:t>(</w:t>
-      </w:r>
-      <w:proofErr w:type="gramEnd"/>
-      <w:r>
-        <w:rPr>
-          <w:b/>
-          <w:bCs/>
-          <w:color w:val="153D63" w:themeColor="text2" w:themeTint="E6"/>
-        </w:rPr>
-        <w:t>)</w:t>
+        <w:t>void aggiungiGiocatoriOspitiTest()</w:t>
       </w:r>
     </w:p>
     <w:p>
@@ -11707,51 +11269,13 @@
           <w:color w:val="153D63" w:themeColor="text2" w:themeTint="E6"/>
         </w:rPr>
       </w:pPr>
-      <w:proofErr w:type="spellStart"/>
       <w:r>
         <w:rPr>
           <w:b/>
           <w:bCs/>
           <w:color w:val="153D63" w:themeColor="text2" w:themeTint="E6"/>
         </w:rPr>
-        <w:t>void</w:t>
-      </w:r>
-      <w:proofErr w:type="spellEnd"/>
-      <w:r>
-        <w:rPr>
-          <w:b/>
-          <w:bCs/>
-          <w:color w:val="153D63" w:themeColor="text2" w:themeTint="E6"/>
-        </w:rPr>
-        <w:t xml:space="preserve"> </w:t>
-      </w:r>
-      <w:proofErr w:type="spellStart"/>
-      <w:proofErr w:type="gramStart"/>
-      <w:r>
-        <w:rPr>
-          <w:b/>
-          <w:bCs/>
-          <w:color w:val="153D63" w:themeColor="text2" w:themeTint="E6"/>
-        </w:rPr>
-        <w:t>configuraGiocatoreCorrenteTest</w:t>
-      </w:r>
-      <w:proofErr w:type="spellEnd"/>
-      <w:r>
-        <w:rPr>
-          <w:b/>
-          <w:bCs/>
-          <w:color w:val="153D63" w:themeColor="text2" w:themeTint="E6"/>
-        </w:rPr>
-        <w:t>(</w:t>
-      </w:r>
-      <w:proofErr w:type="gramEnd"/>
-      <w:r>
-        <w:rPr>
-          <w:b/>
-          <w:bCs/>
-          <w:color w:val="153D63" w:themeColor="text2" w:themeTint="E6"/>
-        </w:rPr>
-        <w:t>)</w:t>
+        <w:t>void configuraGiocatoreCorrenteTest()</w:t>
       </w:r>
     </w:p>
     <w:p>
@@ -11767,51 +11291,13 @@
           <w:color w:val="153D63" w:themeColor="text2" w:themeTint="E6"/>
         </w:rPr>
       </w:pPr>
-      <w:proofErr w:type="spellStart"/>
       <w:r>
         <w:rPr>
           <w:b/>
           <w:bCs/>
           <w:color w:val="153D63" w:themeColor="text2" w:themeTint="E6"/>
         </w:rPr>
-        <w:t>void</w:t>
-      </w:r>
-      <w:proofErr w:type="spellEnd"/>
-      <w:r>
-        <w:rPr>
-          <w:b/>
-          <w:bCs/>
-          <w:color w:val="153D63" w:themeColor="text2" w:themeTint="E6"/>
-        </w:rPr>
-        <w:t xml:space="preserve"> </w:t>
-      </w:r>
-      <w:proofErr w:type="spellStart"/>
-      <w:proofErr w:type="gramStart"/>
-      <w:r>
-        <w:rPr>
-          <w:b/>
-          <w:bCs/>
-          <w:color w:val="153D63" w:themeColor="text2" w:themeTint="E6"/>
-        </w:rPr>
-        <w:t>autenticazioneAdminTest</w:t>
-      </w:r>
-      <w:proofErr w:type="spellEnd"/>
-      <w:r>
-        <w:rPr>
-          <w:b/>
-          <w:bCs/>
-          <w:color w:val="153D63" w:themeColor="text2" w:themeTint="E6"/>
-        </w:rPr>
-        <w:t>(</w:t>
-      </w:r>
-      <w:proofErr w:type="gramEnd"/>
-      <w:r>
-        <w:rPr>
-          <w:b/>
-          <w:bCs/>
-          <w:color w:val="153D63" w:themeColor="text2" w:themeTint="E6"/>
-        </w:rPr>
-        <w:t>)</w:t>
+        <w:t>void autenticazioneAdminTest()</w:t>
       </w:r>
     </w:p>
     <w:p>
@@ -11835,38 +11321,7 @@
           <w:color w:val="153D63" w:themeColor="text2" w:themeTint="E6"/>
           <w:lang w:val="en-US"/>
         </w:rPr>
-        <w:t xml:space="preserve">void </w:t>
-      </w:r>
-      <w:proofErr w:type="spellStart"/>
-      <w:proofErr w:type="gramStart"/>
-      <w:r>
-        <w:rPr>
-          <w:b/>
-          <w:bCs/>
-          <w:color w:val="153D63" w:themeColor="text2" w:themeTint="E6"/>
-          <w:lang w:val="en-US"/>
-        </w:rPr>
-        <w:t>replaceAllScenariTest</w:t>
-      </w:r>
-      <w:proofErr w:type="spellEnd"/>
-      <w:r>
-        <w:rPr>
-          <w:b/>
-          <w:bCs/>
-          <w:color w:val="153D63" w:themeColor="text2" w:themeTint="E6"/>
-          <w:lang w:val="en-US"/>
-        </w:rPr>
-        <w:t>(</w:t>
-      </w:r>
-      <w:proofErr w:type="gramEnd"/>
-      <w:r>
-        <w:rPr>
-          <w:b/>
-          <w:bCs/>
-          <w:color w:val="153D63" w:themeColor="text2" w:themeTint="E6"/>
-          <w:lang w:val="en-US"/>
-        </w:rPr>
-        <w:t>)</w:t>
+        <w:t>void replaceAllScenariTest()</w:t>
       </w:r>
     </w:p>
     <w:p>
@@ -11890,38 +11345,7 @@
           <w:color w:val="153D63" w:themeColor="text2" w:themeTint="E6"/>
           <w:lang w:val="en-US"/>
         </w:rPr>
-        <w:t xml:space="preserve">void </w:t>
-      </w:r>
-      <w:proofErr w:type="spellStart"/>
-      <w:proofErr w:type="gramStart"/>
-      <w:r>
-        <w:rPr>
-          <w:b/>
-          <w:bCs/>
-          <w:color w:val="153D63" w:themeColor="text2" w:themeTint="E6"/>
-          <w:lang w:val="en-US"/>
-        </w:rPr>
-        <w:t>replaceAllRegoleTest</w:t>
-      </w:r>
-      <w:proofErr w:type="spellEnd"/>
-      <w:r>
-        <w:rPr>
-          <w:b/>
-          <w:bCs/>
-          <w:color w:val="153D63" w:themeColor="text2" w:themeTint="E6"/>
-          <w:lang w:val="en-US"/>
-        </w:rPr>
-        <w:t>(</w:t>
-      </w:r>
-      <w:proofErr w:type="gramEnd"/>
-      <w:r>
-        <w:rPr>
-          <w:b/>
-          <w:bCs/>
-          <w:color w:val="153D63" w:themeColor="text2" w:themeTint="E6"/>
-          <w:lang w:val="en-US"/>
-        </w:rPr>
-        <w:t>)</w:t>
+        <w:t>void replaceAllRegoleTest()</w:t>
       </w:r>
     </w:p>
     <w:p>
@@ -11945,259 +11369,154 @@
           <w:color w:val="153D63" w:themeColor="text2" w:themeTint="E6"/>
           <w:lang w:val="en-US"/>
         </w:rPr>
-        <w:t xml:space="preserve">void </w:t>
-      </w:r>
-      <w:proofErr w:type="spellStart"/>
-      <w:proofErr w:type="gramStart"/>
-      <w:r>
+        <w:t>void replaceAllPersonalizzazioniTest()</w:t>
+      </w:r>
+    </w:p>
+    <w:p>
+      <w:pPr>
+        <w:rPr>
+          <w:lang w:val="en-US"/>
+        </w:rPr>
+      </w:pPr>
+    </w:p>
+    <w:p>
+      <w:pPr>
         <w:rPr>
           <w:b/>
           <w:bCs/>
           <w:color w:val="153D63" w:themeColor="text2" w:themeTint="E6"/>
-          <w:lang w:val="en-US"/>
-        </w:rPr>
-        <w:t>replaceAllPersonalizzazioniTest</w:t>
-      </w:r>
-      <w:proofErr w:type="spellEnd"/>
+        </w:rPr>
+      </w:pPr>
       <w:r>
         <w:rPr>
           <w:b/>
           <w:bCs/>
           <w:color w:val="153D63" w:themeColor="text2" w:themeTint="E6"/>
-          <w:lang w:val="en-US"/>
-        </w:rPr>
-        <w:t>(</w:t>
-      </w:r>
-      <w:proofErr w:type="gramEnd"/>
-      <w:r>
+        </w:rPr>
+        <w:t>void impostazioniTest()</w:t>
+      </w:r>
+    </w:p>
+    <w:p>
+      <w:r>
+        <w:t xml:space="preserve">Test del salvataggio delle impostazioni per avviare il gioco. </w:t>
+      </w:r>
+    </w:p>
+    <w:p>
+      <w:r>
+        <w:t xml:space="preserve">Condizione iniziale: che esista </w:t>
+      </w:r>
+      <w:r>
+        <w:t>una</w:t>
+      </w:r>
+      <w:r>
+        <w:t xml:space="preserve"> variabile giocoDellOca.</w:t>
+      </w:r>
+    </w:p>
+    <w:p>
+      <w:r>
+        <w:t xml:space="preserve">Condizione da testare: che esistano i giocatori, </w:t>
+      </w:r>
+      <w:r>
+        <w:t xml:space="preserve">le </w:t>
+      </w:r>
+      <w:r>
+        <w:t xml:space="preserve">personalizzazioni, </w:t>
+      </w:r>
+      <w:r>
+        <w:t xml:space="preserve">lo </w:t>
+      </w:r>
+      <w:r>
+        <w:t>scenario e</w:t>
+      </w:r>
+      <w:r>
+        <w:t xml:space="preserve"> le</w:t>
+      </w:r>
+      <w:r>
+        <w:t xml:space="preserve"> regole impostate.</w:t>
+      </w:r>
+    </w:p>
+    <w:p/>
+    <w:p>
+      <w:pPr>
         <w:rPr>
           <w:b/>
           <w:bCs/>
           <w:color w:val="153D63" w:themeColor="text2" w:themeTint="E6"/>
-          <w:lang w:val="en-US"/>
-        </w:rPr>
-        <w:t>)</w:t>
-      </w:r>
-    </w:p>
-    <w:p>
-      <w:pPr>
-        <w:rPr>
-          <w:lang w:val="en-US"/>
-        </w:rPr>
-      </w:pPr>
-    </w:p>
-    <w:p>
-      <w:pPr>
+        </w:rPr>
+      </w:pPr>
+      <w:r>
         <w:rPr>
           <w:b/>
           <w:bCs/>
           <w:color w:val="153D63" w:themeColor="text2" w:themeTint="E6"/>
         </w:rPr>
-      </w:pPr>
-      <w:proofErr w:type="spellStart"/>
-      <w:r>
-        <w:rPr>
-          <w:b/>
-          <w:bCs/>
-          <w:color w:val="153D63" w:themeColor="text2" w:themeTint="E6"/>
-        </w:rPr>
-        <w:t>void</w:t>
-      </w:r>
-      <w:proofErr w:type="spellEnd"/>
-      <w:r>
-        <w:rPr>
-          <w:b/>
-          <w:bCs/>
-          <w:color w:val="153D63" w:themeColor="text2" w:themeTint="E6"/>
-        </w:rPr>
-        <w:t xml:space="preserve"> </w:t>
-      </w:r>
-      <w:proofErr w:type="spellStart"/>
-      <w:proofErr w:type="gramStart"/>
-      <w:r>
-        <w:rPr>
-          <w:b/>
-          <w:bCs/>
-          <w:color w:val="153D63" w:themeColor="text2" w:themeTint="E6"/>
-        </w:rPr>
-        <w:t>impostazioniTest</w:t>
-      </w:r>
-      <w:proofErr w:type="spellEnd"/>
-      <w:r>
-        <w:rPr>
-          <w:b/>
-          <w:bCs/>
-          <w:color w:val="153D63" w:themeColor="text2" w:themeTint="E6"/>
-        </w:rPr>
-        <w:t>(</w:t>
-      </w:r>
-      <w:proofErr w:type="gramEnd"/>
-      <w:r>
-        <w:rPr>
-          <w:b/>
-          <w:bCs/>
-          <w:color w:val="153D63" w:themeColor="text2" w:themeTint="E6"/>
-        </w:rPr>
-        <w:t>)</w:t>
-      </w:r>
-    </w:p>
-    <w:p>
-      <w:r>
-        <w:t xml:space="preserve">Test del salvataggio delle impostazioni per avviare il gioco. </w:t>
-      </w:r>
-    </w:p>
-    <w:p>
-      <w:r>
-        <w:t xml:space="preserve">Condizione iniziale: che esista </w:t>
-      </w:r>
-      <w:r>
-        <w:t>una</w:t>
-      </w:r>
-      <w:r>
-        <w:t xml:space="preserve"> variabile </w:t>
-      </w:r>
-      <w:proofErr w:type="spellStart"/>
-      <w:r>
-        <w:t>giocoDellOca</w:t>
-      </w:r>
-      <w:proofErr w:type="spellEnd"/>
+        <w:t>void impostaRegoleSingoleTest()</w:t>
+      </w:r>
+    </w:p>
+    <w:p>
+      <w:r>
+        <w:t xml:space="preserve">Test dell'impostazione di una </w:t>
+      </w:r>
+      <w:r>
+        <w:t>r</w:t>
+      </w:r>
+      <w:r>
+        <w:t xml:space="preserve">egola </w:t>
+      </w:r>
+      <w:r>
+        <w:t>s</w:t>
+      </w:r>
+      <w:r>
+        <w:t>ingola.</w:t>
+      </w:r>
+    </w:p>
+    <w:p>
+      <w:r>
+        <w:t>Condizione iniziale: che esista una variabile giocoDellOca e che</w:t>
+      </w:r>
+      <w:r>
+        <w:t xml:space="preserve"> si</w:t>
+      </w:r>
+      <w:r>
+        <w:t xml:space="preserve"> stia configurando una nuova </w:t>
+      </w:r>
+      <w:r>
+        <w:t>p</w:t>
+      </w:r>
+      <w:r>
+        <w:t>artita</w:t>
+      </w:r>
       <w:r>
         <w:t>.</w:t>
       </w:r>
     </w:p>
     <w:p>
       <w:r>
-        <w:t xml:space="preserve">Condizione da testare: che esistano i giocatori, </w:t>
-      </w:r>
-      <w:r>
-        <w:t xml:space="preserve">le </w:t>
-      </w:r>
-      <w:r>
-        <w:t xml:space="preserve">personalizzazioni, </w:t>
-      </w:r>
-      <w:r>
-        <w:t xml:space="preserve">lo </w:t>
-      </w:r>
-      <w:r>
-        <w:t>scenario e</w:t>
-      </w:r>
-      <w:r>
-        <w:t xml:space="preserve"> le</w:t>
-      </w:r>
-      <w:r>
-        <w:t xml:space="preserve"> regole impostate.</w:t>
-      </w:r>
-    </w:p>
-    <w:p/>
-    <w:p>
-      <w:pPr>
-        <w:rPr>
-          <w:b/>
-          <w:bCs/>
-          <w:color w:val="153D63" w:themeColor="text2" w:themeTint="E6"/>
-        </w:rPr>
-      </w:pPr>
-      <w:proofErr w:type="spellStart"/>
-      <w:r>
-        <w:rPr>
-          <w:b/>
-          <w:bCs/>
-          <w:color w:val="153D63" w:themeColor="text2" w:themeTint="E6"/>
-        </w:rPr>
-        <w:t>void</w:t>
-      </w:r>
-      <w:proofErr w:type="spellEnd"/>
-      <w:r>
-        <w:rPr>
-          <w:b/>
-          <w:bCs/>
-          <w:color w:val="153D63" w:themeColor="text2" w:themeTint="E6"/>
-        </w:rPr>
-        <w:t xml:space="preserve"> </w:t>
-      </w:r>
-      <w:proofErr w:type="spellStart"/>
-      <w:proofErr w:type="gramStart"/>
-      <w:r>
-        <w:rPr>
-          <w:b/>
-          <w:bCs/>
-          <w:color w:val="153D63" w:themeColor="text2" w:themeTint="E6"/>
-        </w:rPr>
-        <w:t>impostaRegoleSingoleTest</w:t>
-      </w:r>
-      <w:proofErr w:type="spellEnd"/>
-      <w:r>
-        <w:rPr>
-          <w:b/>
-          <w:bCs/>
-          <w:color w:val="153D63" w:themeColor="text2" w:themeTint="E6"/>
-        </w:rPr>
-        <w:t>(</w:t>
-      </w:r>
-      <w:proofErr w:type="gramEnd"/>
-      <w:r>
-        <w:rPr>
-          <w:b/>
-          <w:bCs/>
-          <w:color w:val="153D63" w:themeColor="text2" w:themeTint="E6"/>
-        </w:rPr>
-        <w:t>)</w:t>
-      </w:r>
-    </w:p>
-    <w:p>
-      <w:r>
-        <w:t xml:space="preserve">Test dell'impostazione di una </w:t>
-      </w:r>
-      <w:r>
-        <w:t>r</w:t>
-      </w:r>
-      <w:r>
-        <w:t xml:space="preserve">egola </w:t>
-      </w:r>
-      <w:r>
-        <w:t>s</w:t>
-      </w:r>
-      <w:r>
-        <w:t>ingola.</w:t>
-      </w:r>
-    </w:p>
-    <w:p>
-      <w:r>
-        <w:t xml:space="preserve">Condizione iniziale: che esista una variabile </w:t>
-      </w:r>
-      <w:proofErr w:type="spellStart"/>
-      <w:r>
-        <w:t>giocoDellOca</w:t>
-      </w:r>
-      <w:proofErr w:type="spellEnd"/>
-      <w:r>
-        <w:t xml:space="preserve"> e che</w:t>
-      </w:r>
-      <w:r>
-        <w:t xml:space="preserve"> si</w:t>
-      </w:r>
-      <w:r>
-        <w:t xml:space="preserve"> stia configurando una nuova Partita</w:t>
+        <w:t xml:space="preserve">Condizione da testare: perché il metodo funzioni si deve verificare che il numero di regole </w:t>
+      </w:r>
+      <w:r>
+        <w:t>che vengono salvate nelle impostazioni</w:t>
+      </w:r>
+      <w:r>
+        <w:t xml:space="preserve"> sia </w:t>
+      </w:r>
+      <w:r>
+        <w:t>0</w:t>
+      </w:r>
+      <w:r>
+        <w:t xml:space="preserve"> se la tabella è vuota (non sono state aggiunte manualmente via </w:t>
+      </w:r>
+      <w:r>
+        <w:t>GUI</w:t>
+      </w:r>
+      <w:r>
+        <w:t xml:space="preserve">) oppure uguale al numero di record passato dalla tabella se </w:t>
+      </w:r>
+      <w:r>
+        <w:t>quest’ultima è stata valorizzata</w:t>
       </w:r>
       <w:r>
         <w:t>.</w:t>
-      </w:r>
-    </w:p>
-    <w:p>
-      <w:r>
-        <w:t xml:space="preserve">Condizione da testare: perché il metodo funzioni si deve verificare che il numero di regole </w:t>
-      </w:r>
-      <w:r>
-        <w:t>a</w:t>
-      </w:r>
-      <w:r>
-        <w:t xml:space="preserve">ttese sia uguale a quello di default se la tabella è vuota (non sono state aggiunte manualmente via </w:t>
-      </w:r>
-      <w:r>
-        <w:t>GUI</w:t>
-      </w:r>
-      <w:r>
-        <w:t>) oppure uguale al numero di record passato dalla tabella se piena.</w:t>
       </w:r>
     </w:p>
     <w:p/>
@@ -12214,81 +11533,143 @@
           <w:color w:val="153D63" w:themeColor="text2" w:themeTint="E6"/>
         </w:rPr>
       </w:pPr>
-      <w:proofErr w:type="spellStart"/>
       <w:r>
         <w:rPr>
           <w:b/>
           <w:bCs/>
           <w:color w:val="153D63" w:themeColor="text2" w:themeTint="E6"/>
         </w:rPr>
-        <w:t>void</w:t>
-      </w:r>
-      <w:proofErr w:type="spellEnd"/>
-      <w:r>
+        <w:t>void impostaRegoleDaSetTest()</w:t>
+      </w:r>
+    </w:p>
+    <w:p>
+      <w:r>
+        <w:t xml:space="preserve">Test dell'impostazione di un set di </w:t>
+      </w:r>
+      <w:r>
+        <w:t>r</w:t>
+      </w:r>
+      <w:r>
+        <w:t>egole.</w:t>
+      </w:r>
+    </w:p>
+    <w:p>
+      <w:r>
+        <w:t xml:space="preserve">Condizione iniziale: che esista una variabile giocoDellOca e che </w:t>
+      </w:r>
+      <w:r>
+        <w:t xml:space="preserve">si </w:t>
+      </w:r>
+      <w:r>
+        <w:t xml:space="preserve">stia configurando una nuova </w:t>
+      </w:r>
+      <w:r>
+        <w:t>p</w:t>
+      </w:r>
+      <w:r>
+        <w:t>artita</w:t>
+      </w:r>
+      <w:r>
+        <w:t>.</w:t>
+      </w:r>
+    </w:p>
+    <w:p>
+      <w:r>
+        <w:t xml:space="preserve">Condizione da testare: </w:t>
+      </w:r>
+      <w:r>
+        <w:t>perché il metodo funzioni si deve verificare che il numero di regole che vengono salvate nelle impostazioni sia 0 se la tabella è vuota (non sono state aggiunte manualmente via GUI) oppure uguale al numero di record passato dalla tabella se quest’ultima è stata valorizzata.</w:t>
+      </w:r>
+    </w:p>
+    <w:p/>
+    <w:p>
+      <w:pPr>
         <w:rPr>
           <w:b/>
           <w:bCs/>
           <w:color w:val="153D63" w:themeColor="text2" w:themeTint="E6"/>
         </w:rPr>
-        <w:t xml:space="preserve"> </w:t>
-      </w:r>
-      <w:proofErr w:type="spellStart"/>
-      <w:proofErr w:type="gramStart"/>
+      </w:pPr>
       <w:r>
         <w:rPr>
           <w:b/>
           <w:bCs/>
           <w:color w:val="153D63" w:themeColor="text2" w:themeTint="E6"/>
         </w:rPr>
-        <w:t>impostaRegoleDaSetTest</w:t>
-      </w:r>
-      <w:proofErr w:type="spellEnd"/>
-      <w:r>
+        <w:t>void impostaScenarioTest()</w:t>
+      </w:r>
+    </w:p>
+    <w:p>
+      <w:r>
+        <w:t>Test dell'impostazione di uno scenario.</w:t>
+      </w:r>
+    </w:p>
+    <w:p>
+      <w:r>
+        <w:t xml:space="preserve">Condizione iniziale: che esista una variabile giocoDellOca e che </w:t>
+      </w:r>
+      <w:r>
+        <w:t xml:space="preserve"> si </w:t>
+      </w:r>
+      <w:r>
+        <w:t xml:space="preserve">stia configurando una nuova </w:t>
+      </w:r>
+      <w:r>
+        <w:t>p</w:t>
+      </w:r>
+      <w:r>
+        <w:t>artita</w:t>
+      </w:r>
+      <w:r>
+        <w:t>.</w:t>
+      </w:r>
+    </w:p>
+    <w:p>
+      <w:r>
+        <w:t>Condizione da testare: perché il metodo funzioni si deve verificare che lo scenario scelto esista tra quelli definiti nella lista di giocoDellOca altrimenti viene impostato lo scenario di default</w:t>
+      </w:r>
+      <w:r>
+        <w:t>.</w:t>
+      </w:r>
+    </w:p>
+    <w:p/>
+    <w:p>
+      <w:pPr>
         <w:rPr>
           <w:b/>
           <w:bCs/>
           <w:color w:val="153D63" w:themeColor="text2" w:themeTint="E6"/>
         </w:rPr>
-        <w:t>(</w:t>
-      </w:r>
-      <w:proofErr w:type="gramEnd"/>
+      </w:pPr>
       <w:r>
         <w:rPr>
           <w:b/>
           <w:bCs/>
           <w:color w:val="153D63" w:themeColor="text2" w:themeTint="E6"/>
         </w:rPr>
-        <w:t>)</w:t>
-      </w:r>
-    </w:p>
-    <w:p>
-      <w:r>
-        <w:t xml:space="preserve">Test dell'impostazione di un set di </w:t>
-      </w:r>
-      <w:r>
-        <w:t>r</w:t>
-      </w:r>
-      <w:r>
-        <w:t>egole.</w:t>
-      </w:r>
-    </w:p>
-    <w:p>
-      <w:r>
-        <w:t xml:space="preserve">Condizione iniziale: che esista una variabile </w:t>
-      </w:r>
-      <w:proofErr w:type="spellStart"/>
-      <w:r>
-        <w:t>giocoDellOca</w:t>
-      </w:r>
-      <w:proofErr w:type="spellEnd"/>
-      <w:r>
-        <w:t xml:space="preserve"> e che </w:t>
-      </w:r>
-      <w:r>
-        <w:t xml:space="preserve">si </w:t>
-      </w:r>
-      <w:r>
-        <w:t>stia configurando una nuova Partita</w:t>
+        <w:t>void impostaPedinaTest()</w:t>
+      </w:r>
+    </w:p>
+    <w:p>
+      <w:r>
+        <w:t>Test dell'impostazione di una pedina abbinata ad un giocatore.</w:t>
+      </w:r>
+    </w:p>
+    <w:p>
+      <w:r>
+        <w:t>Condizione iniziale: che esista una variabile giocoDellOca</w:t>
+      </w:r>
+      <w:r>
+        <w:t>,</w:t>
+      </w:r>
+      <w:r>
+        <w:t xml:space="preserve"> che</w:t>
+      </w:r>
+      <w:r>
+        <w:t xml:space="preserve"> si</w:t>
+      </w:r>
+      <w:r>
+        <w:t xml:space="preserve"> stia configurando una nuova Partita e che esista un giocatore per poter associare la pedina</w:t>
       </w:r>
       <w:r>
         <w:t>.</w:t>
@@ -12296,19 +11677,10 @@
     </w:p>
     <w:p>
       <w:r>
-        <w:t xml:space="preserve">Condizione da testare: perché il metodo funzioni si deve verificare che il numero di regole </w:t>
-      </w:r>
-      <w:r>
-        <w:t>a</w:t>
-      </w:r>
-      <w:r>
-        <w:t xml:space="preserve">ttese sia uguale a quello di default se la tabella è vuota (non sono state aggiunte manualmente via </w:t>
-      </w:r>
-      <w:r>
-        <w:t>UI</w:t>
-      </w:r>
-      <w:r>
-        <w:t>) oppure uguale al numero di record passato dalla tabella se piena.</w:t>
+        <w:t>Condizione da testare: perché il metodo funzioni si deve verificare che la pedina scelta esista e sia stata associata correttamente al giocatore</w:t>
+      </w:r>
+      <w:r>
+        <w:t>.</w:t>
       </w:r>
     </w:p>
     <w:p/>
@@ -12320,258 +11692,13 @@
           <w:color w:val="153D63" w:themeColor="text2" w:themeTint="E6"/>
         </w:rPr>
       </w:pPr>
-      <w:proofErr w:type="spellStart"/>
       <w:r>
         <w:rPr>
           <w:b/>
           <w:bCs/>
           <w:color w:val="153D63" w:themeColor="text2" w:themeTint="E6"/>
         </w:rPr>
-        <w:t>void</w:t>
-      </w:r>
-      <w:proofErr w:type="spellEnd"/>
-      <w:r>
-        <w:rPr>
-          <w:b/>
-          <w:bCs/>
-          <w:color w:val="153D63" w:themeColor="text2" w:themeTint="E6"/>
-        </w:rPr>
-        <w:t xml:space="preserve"> </w:t>
-      </w:r>
-      <w:proofErr w:type="spellStart"/>
-      <w:proofErr w:type="gramStart"/>
-      <w:r>
-        <w:rPr>
-          <w:b/>
-          <w:bCs/>
-          <w:color w:val="153D63" w:themeColor="text2" w:themeTint="E6"/>
-        </w:rPr>
-        <w:t>impostaScenarioTest</w:t>
-      </w:r>
-      <w:proofErr w:type="spellEnd"/>
-      <w:r>
-        <w:rPr>
-          <w:b/>
-          <w:bCs/>
-          <w:color w:val="153D63" w:themeColor="text2" w:themeTint="E6"/>
-        </w:rPr>
-        <w:t>(</w:t>
-      </w:r>
-      <w:proofErr w:type="gramEnd"/>
-      <w:r>
-        <w:rPr>
-          <w:b/>
-          <w:bCs/>
-          <w:color w:val="153D63" w:themeColor="text2" w:themeTint="E6"/>
-        </w:rPr>
-        <w:t>)</w:t>
-      </w:r>
-    </w:p>
-    <w:p>
-      <w:r>
-        <w:t>Test dell'impostazione di uno scenario.</w:t>
-      </w:r>
-    </w:p>
-    <w:p>
-      <w:r>
-        <w:t xml:space="preserve">Condizione iniziale: che esista una variabile </w:t>
-      </w:r>
-      <w:proofErr w:type="spellStart"/>
-      <w:r>
-        <w:t>giocoDellOca</w:t>
-      </w:r>
-      <w:proofErr w:type="spellEnd"/>
-      <w:r>
-        <w:t xml:space="preserve"> e </w:t>
-      </w:r>
-      <w:proofErr w:type="gramStart"/>
-      <w:r>
-        <w:t xml:space="preserve">che </w:t>
-      </w:r>
-      <w:r>
-        <w:t xml:space="preserve"> si</w:t>
-      </w:r>
-      <w:proofErr w:type="gramEnd"/>
-      <w:r>
-        <w:t xml:space="preserve"> </w:t>
-      </w:r>
-      <w:r>
-        <w:t xml:space="preserve">stia configurando una nuova </w:t>
-      </w:r>
-      <w:r>
-        <w:t>p</w:t>
-      </w:r>
-      <w:r>
-        <w:t>artita</w:t>
-      </w:r>
-      <w:r>
-        <w:t>.</w:t>
-      </w:r>
-    </w:p>
-    <w:p>
-      <w:r>
-        <w:t xml:space="preserve">Condizione da testare: perché il metodo funzioni si deve verificare che lo scenario scelto esista tra quelli definiti nella lista di </w:t>
-      </w:r>
-      <w:proofErr w:type="spellStart"/>
-      <w:r>
-        <w:t>giocoDellOca</w:t>
-      </w:r>
-      <w:proofErr w:type="spellEnd"/>
-      <w:r>
-        <w:t xml:space="preserve"> altrimenti viene impostato lo scenario di default</w:t>
-      </w:r>
-      <w:r>
-        <w:t>.</w:t>
-      </w:r>
-    </w:p>
-    <w:p/>
-    <w:p>
-      <w:pPr>
-        <w:rPr>
-          <w:b/>
-          <w:bCs/>
-          <w:color w:val="153D63" w:themeColor="text2" w:themeTint="E6"/>
-        </w:rPr>
-      </w:pPr>
-      <w:proofErr w:type="spellStart"/>
-      <w:r>
-        <w:rPr>
-          <w:b/>
-          <w:bCs/>
-          <w:color w:val="153D63" w:themeColor="text2" w:themeTint="E6"/>
-        </w:rPr>
-        <w:t>void</w:t>
-      </w:r>
-      <w:proofErr w:type="spellEnd"/>
-      <w:r>
-        <w:rPr>
-          <w:b/>
-          <w:bCs/>
-          <w:color w:val="153D63" w:themeColor="text2" w:themeTint="E6"/>
-        </w:rPr>
-        <w:t xml:space="preserve"> </w:t>
-      </w:r>
-      <w:proofErr w:type="spellStart"/>
-      <w:proofErr w:type="gramStart"/>
-      <w:r>
-        <w:rPr>
-          <w:b/>
-          <w:bCs/>
-          <w:color w:val="153D63" w:themeColor="text2" w:themeTint="E6"/>
-        </w:rPr>
-        <w:t>impostaPedinaTest</w:t>
-      </w:r>
-      <w:proofErr w:type="spellEnd"/>
-      <w:r>
-        <w:rPr>
-          <w:b/>
-          <w:bCs/>
-          <w:color w:val="153D63" w:themeColor="text2" w:themeTint="E6"/>
-        </w:rPr>
-        <w:t>(</w:t>
-      </w:r>
-      <w:proofErr w:type="gramEnd"/>
-      <w:r>
-        <w:rPr>
-          <w:b/>
-          <w:bCs/>
-          <w:color w:val="153D63" w:themeColor="text2" w:themeTint="E6"/>
-        </w:rPr>
-        <w:t>)</w:t>
-      </w:r>
-    </w:p>
-    <w:p>
-      <w:r>
-        <w:t>Test dell'impostazione di una pedina abbinata ad un giocatore.</w:t>
-      </w:r>
-    </w:p>
-    <w:p>
-      <w:r>
-        <w:t xml:space="preserve">Condizione iniziale: che esista una variabile </w:t>
-      </w:r>
-      <w:proofErr w:type="spellStart"/>
-      <w:r>
-        <w:t>giocoDellOca</w:t>
-      </w:r>
-      <w:proofErr w:type="spellEnd"/>
-      <w:r>
-        <w:t>,</w:t>
-      </w:r>
-      <w:r>
-        <w:t xml:space="preserve"> che</w:t>
-      </w:r>
-      <w:r>
-        <w:t xml:space="preserve"> si</w:t>
-      </w:r>
-      <w:r>
-        <w:t xml:space="preserve"> stia configurando una nuova Partita e che esista un giocatore per poter associare la pedina</w:t>
-      </w:r>
-      <w:r>
-        <w:t>.</w:t>
-      </w:r>
-    </w:p>
-    <w:p>
-      <w:r>
-        <w:t>Condizione da testare: perché il metodo funzioni si deve verificare che la pedina scelta esista e sia stata associata correttamente al giocatore</w:t>
-      </w:r>
-      <w:r>
-        <w:t>.</w:t>
-      </w:r>
-    </w:p>
-    <w:p/>
-    <w:p>
-      <w:pPr>
-        <w:rPr>
-          <w:b/>
-          <w:bCs/>
-          <w:color w:val="153D63" w:themeColor="text2" w:themeTint="E6"/>
-        </w:rPr>
-      </w:pPr>
-      <w:proofErr w:type="spellStart"/>
-      <w:r>
-        <w:rPr>
-          <w:b/>
-          <w:bCs/>
-          <w:color w:val="153D63" w:themeColor="text2" w:themeTint="E6"/>
-        </w:rPr>
-        <w:t>void</w:t>
-      </w:r>
-      <w:proofErr w:type="spellEnd"/>
-      <w:r>
-        <w:rPr>
-          <w:b/>
-          <w:bCs/>
-          <w:color w:val="153D63" w:themeColor="text2" w:themeTint="E6"/>
-        </w:rPr>
-        <w:t xml:space="preserve"> </w:t>
-      </w:r>
-      <w:proofErr w:type="spellStart"/>
-      <w:proofErr w:type="gramStart"/>
-      <w:r>
-        <w:rPr>
-          <w:b/>
-          <w:bCs/>
-          <w:color w:val="153D63" w:themeColor="text2" w:themeTint="E6"/>
-        </w:rPr>
-        <w:t>impostaDadoTest</w:t>
-      </w:r>
-      <w:proofErr w:type="spellEnd"/>
-      <w:r>
-        <w:rPr>
-          <w:b/>
-          <w:bCs/>
-          <w:color w:val="153D63" w:themeColor="text2" w:themeTint="E6"/>
-        </w:rPr>
-        <w:t>(</w:t>
-      </w:r>
-      <w:proofErr w:type="gramEnd"/>
-      <w:r>
-        <w:rPr>
-          <w:b/>
-          <w:bCs/>
-          <w:color w:val="153D63" w:themeColor="text2" w:themeTint="E6"/>
-        </w:rPr>
-        <w:t>)</w:t>
+        <w:t>void impostaDadoTest()</w:t>
       </w:r>
     </w:p>
     <w:p>
@@ -12581,13 +11708,8 @@
     </w:p>
     <w:p>
       <w:r>
-        <w:t xml:space="preserve">Condizione iniziale: che esista una variabile </w:t>
-      </w:r>
-      <w:proofErr w:type="spellStart"/>
-      <w:r>
-        <w:t>giocoDellOca</w:t>
-      </w:r>
-      <w:proofErr w:type="spellEnd"/>
+        <w:t>Condizione iniziale: che esista una variabile giocoDellOca</w:t>
+      </w:r>
       <w:r>
         <w:t>,</w:t>
       </w:r>
@@ -12620,101 +11742,172 @@
           <w:color w:val="153D63" w:themeColor="text2" w:themeTint="E6"/>
         </w:rPr>
       </w:pPr>
-      <w:proofErr w:type="spellStart"/>
       <w:r>
         <w:rPr>
           <w:b/>
           <w:bCs/>
           <w:color w:val="153D63" w:themeColor="text2" w:themeTint="E6"/>
         </w:rPr>
-        <w:t>void</w:t>
-      </w:r>
-      <w:proofErr w:type="spellEnd"/>
-      <w:r>
+        <w:t>void eseguiTurnoTest()</w:t>
+      </w:r>
+    </w:p>
+    <w:p>
+      <w:r>
+        <w:t>Test dell'esecuzione di un turno di un giocatore.</w:t>
+      </w:r>
+    </w:p>
+    <w:p>
+      <w:r>
+        <w:t xml:space="preserve">Condizione iniziale: che esista una variabile giocoDellOca, che </w:t>
+      </w:r>
+      <w:r>
+        <w:t>sia stata</w:t>
+      </w:r>
+      <w:r>
+        <w:t xml:space="preserve"> configurat</w:t>
+      </w:r>
+      <w:r>
+        <w:t>a e avviata</w:t>
+      </w:r>
+      <w:r>
+        <w:t xml:space="preserve"> una </w:t>
+      </w:r>
+      <w:r>
+        <w:t>partita con delle impostazioni di default</w:t>
+      </w:r>
+      <w:r>
+        <w:t xml:space="preserve">, </w:t>
+      </w:r>
+      <w:r>
+        <w:t>e che esista una pedina</w:t>
+      </w:r>
+      <w:r>
+        <w:t>.</w:t>
+      </w:r>
+    </w:p>
+    <w:p>
+      <w:r>
+        <w:t xml:space="preserve">Condizione da testare: perché il metodo funzioni si deve verificare </w:t>
+      </w:r>
+      <w:r>
+        <w:t>che per ogni possibile tipologia di casella sulla quale la pedina può atterrare, la posizione e lo stato di quest’ultima siano corrette.</w:t>
+      </w:r>
+    </w:p>
+    <w:p/>
+    <w:p>
+      <w:pPr>
         <w:rPr>
           <w:b/>
           <w:bCs/>
           <w:color w:val="153D63" w:themeColor="text2" w:themeTint="E6"/>
         </w:rPr>
-        <w:t xml:space="preserve"> </w:t>
-      </w:r>
-      <w:proofErr w:type="spellStart"/>
-      <w:proofErr w:type="gramStart"/>
+      </w:pPr>
       <w:r>
         <w:rPr>
           <w:b/>
           <w:bCs/>
           <w:color w:val="153D63" w:themeColor="text2" w:themeTint="E6"/>
         </w:rPr>
-        <w:t>eseguiTurnoTest</w:t>
-      </w:r>
-      <w:proofErr w:type="spellEnd"/>
-      <w:r>
+        <w:t>void aggiungiGiocatoriOspitiTest()</w:t>
+      </w:r>
+    </w:p>
+    <w:p>
+      <w:r>
+        <w:t>Test dell'aggiunta giocatori ospiti.</w:t>
+      </w:r>
+    </w:p>
+    <w:p>
+      <w:r>
+        <w:t>Condizione iniziale: che esista una variabile giocoDellOca</w:t>
+      </w:r>
+      <w:r>
+        <w:t xml:space="preserve"> e</w:t>
+      </w:r>
+      <w:r>
+        <w:t xml:space="preserve"> che</w:t>
+      </w:r>
+      <w:r>
+        <w:t xml:space="preserve"> si</w:t>
+      </w:r>
+      <w:r>
+        <w:t xml:space="preserve"> stia configurando una </w:t>
+      </w:r>
+      <w:r>
+        <w:t>p</w:t>
+      </w:r>
+      <w:r>
+        <w:t>artita.</w:t>
+      </w:r>
+    </w:p>
+    <w:p>
+      <w:r>
+        <w:t>Condizione da testare: perché il metodo funzioni si deve verificare che il numero di giocatori aggiunti corrisponda effettivamente al numero di giocatori registrato per la partita corrente.</w:t>
+      </w:r>
+    </w:p>
+    <w:p/>
+    <w:p>
+      <w:pPr>
         <w:rPr>
           <w:b/>
           <w:bCs/>
           <w:color w:val="153D63" w:themeColor="text2" w:themeTint="E6"/>
         </w:rPr>
-        <w:t>(</w:t>
-      </w:r>
-      <w:proofErr w:type="gramEnd"/>
+      </w:pPr>
       <w:r>
         <w:rPr>
           <w:b/>
           <w:bCs/>
           <w:color w:val="153D63" w:themeColor="text2" w:themeTint="E6"/>
         </w:rPr>
-        <w:t>)</w:t>
-      </w:r>
-    </w:p>
-    <w:p>
-      <w:r>
-        <w:t>Test dell'esecuzione di un turno di un giocatore.</w:t>
-      </w:r>
-    </w:p>
-    <w:p>
-      <w:r>
-        <w:t xml:space="preserve">Condizione iniziale: che esista una variabile </w:t>
-      </w:r>
-      <w:proofErr w:type="spellStart"/>
-      <w:r>
-        <w:t>giocoDellOca</w:t>
-      </w:r>
-      <w:proofErr w:type="spellEnd"/>
-      <w:r>
-        <w:t xml:space="preserve">, che </w:t>
-      </w:r>
-      <w:r>
-        <w:t>sia stata</w:t>
-      </w:r>
-      <w:r>
-        <w:t xml:space="preserve"> configurat</w:t>
-      </w:r>
-      <w:r>
-        <w:t>a e avviata</w:t>
-      </w:r>
-      <w:r>
-        <w:t xml:space="preserve"> una </w:t>
-      </w:r>
-      <w:r>
-        <w:t>partita con delle impostazioni di default</w:t>
-      </w:r>
-      <w:r>
-        <w:t xml:space="preserve">, </w:t>
-      </w:r>
-      <w:r>
-        <w:t>e che esista una pedina</w:t>
+        <w:t>void configuraGiocatoreCorrenteTest()</w:t>
+      </w:r>
+    </w:p>
+    <w:p>
+      <w:r>
+        <w:t>Test della configurazione giocatore corrente da fare muovere lungo il tabellone.</w:t>
+      </w:r>
+    </w:p>
+    <w:p>
+      <w:r>
+        <w:t>Condizione iniziale: che esista una variabile giocoDellOca</w:t>
+      </w:r>
+      <w:r>
+        <w:t xml:space="preserve"> e che stia configurando/sia già stata configurata </w:t>
+      </w:r>
+      <w:r>
+        <w:t xml:space="preserve">una nuova </w:t>
+      </w:r>
+      <w:r>
+        <w:t>p</w:t>
+      </w:r>
+      <w:r>
+        <w:t>artita.</w:t>
+      </w:r>
+    </w:p>
+    <w:p>
+      <w:r>
+        <w:t xml:space="preserve">Condizione da testare: perché il metodo funzioni si deve verificare </w:t>
+      </w:r>
+      <w:r>
+        <w:t>che,</w:t>
+      </w:r>
+      <w:r>
+        <w:t xml:space="preserve"> </w:t>
+      </w:r>
+      <w:r>
+        <w:t>qualora</w:t>
+      </w:r>
+      <w:r>
+        <w:t xml:space="preserve"> le tabelle preposte alla definizione di pedina e dado </w:t>
+      </w:r>
+      <w:r>
+        <w:t>siano</w:t>
+      </w:r>
+      <w:r>
+        <w:t xml:space="preserve"> vuote, vengano associate delle personalizzazioni di default, e il giocatore viene impostato come giocatore corrente</w:t>
       </w:r>
       <w:r>
         <w:t>.</w:t>
-      </w:r>
-    </w:p>
-    <w:p>
-      <w:r>
-        <w:t xml:space="preserve">Condizione da testare: perché il metodo funzioni si deve verificare </w:t>
-      </w:r>
-      <w:r>
-        <w:t>che per ogni possibile tipologia di casella sulla quale la pedina può atterrare, la posizione e lo stato di quest’ultima siano corrette.</w:t>
       </w:r>
     </w:p>
     <w:p/>
@@ -12726,254 +11919,13 @@
           <w:color w:val="153D63" w:themeColor="text2" w:themeTint="E6"/>
         </w:rPr>
       </w:pPr>
-      <w:proofErr w:type="spellStart"/>
       <w:r>
         <w:rPr>
           <w:b/>
           <w:bCs/>
           <w:color w:val="153D63" w:themeColor="text2" w:themeTint="E6"/>
         </w:rPr>
-        <w:t>void</w:t>
-      </w:r>
-      <w:proofErr w:type="spellEnd"/>
-      <w:r>
-        <w:rPr>
-          <w:b/>
-          <w:bCs/>
-          <w:color w:val="153D63" w:themeColor="text2" w:themeTint="E6"/>
-        </w:rPr>
-        <w:t xml:space="preserve"> </w:t>
-      </w:r>
-      <w:proofErr w:type="spellStart"/>
-      <w:proofErr w:type="gramStart"/>
-      <w:r>
-        <w:rPr>
-          <w:b/>
-          <w:bCs/>
-          <w:color w:val="153D63" w:themeColor="text2" w:themeTint="E6"/>
-        </w:rPr>
-        <w:t>aggiungiGiocatoriOspitiTest</w:t>
-      </w:r>
-      <w:proofErr w:type="spellEnd"/>
-      <w:r>
-        <w:rPr>
-          <w:b/>
-          <w:bCs/>
-          <w:color w:val="153D63" w:themeColor="text2" w:themeTint="E6"/>
-        </w:rPr>
-        <w:t>(</w:t>
-      </w:r>
-      <w:proofErr w:type="gramEnd"/>
-      <w:r>
-        <w:rPr>
-          <w:b/>
-          <w:bCs/>
-          <w:color w:val="153D63" w:themeColor="text2" w:themeTint="E6"/>
-        </w:rPr>
-        <w:t>)</w:t>
-      </w:r>
-    </w:p>
-    <w:p>
-      <w:r>
-        <w:t>Test dell'aggiunta giocatori ospiti.</w:t>
-      </w:r>
-    </w:p>
-    <w:p>
-      <w:r>
-        <w:t xml:space="preserve">Condizione iniziale: che esista una variabile </w:t>
-      </w:r>
-      <w:proofErr w:type="spellStart"/>
-      <w:r>
-        <w:t>giocoDellOca</w:t>
-      </w:r>
-      <w:proofErr w:type="spellEnd"/>
-      <w:r>
-        <w:t xml:space="preserve"> e</w:t>
-      </w:r>
-      <w:r>
-        <w:t xml:space="preserve"> che</w:t>
-      </w:r>
-      <w:r>
-        <w:t xml:space="preserve"> si</w:t>
-      </w:r>
-      <w:r>
-        <w:t xml:space="preserve"> stia configurando una </w:t>
-      </w:r>
-      <w:r>
-        <w:t>p</w:t>
-      </w:r>
-      <w:r>
-        <w:t>artita.</w:t>
-      </w:r>
-    </w:p>
-    <w:p>
-      <w:r>
-        <w:t>Condizione da testare: perché il metodo funzioni si deve verificare che il numero di giocatori aggiunti corrisponda effettivamente al numero di giocatori registrato per la partita corrente.</w:t>
-      </w:r>
-    </w:p>
-    <w:p/>
-    <w:p>
-      <w:pPr>
-        <w:rPr>
-          <w:b/>
-          <w:bCs/>
-          <w:color w:val="153D63" w:themeColor="text2" w:themeTint="E6"/>
-        </w:rPr>
-      </w:pPr>
-      <w:proofErr w:type="spellStart"/>
-      <w:r>
-        <w:rPr>
-          <w:b/>
-          <w:bCs/>
-          <w:color w:val="153D63" w:themeColor="text2" w:themeTint="E6"/>
-        </w:rPr>
-        <w:t>void</w:t>
-      </w:r>
-      <w:proofErr w:type="spellEnd"/>
-      <w:r>
-        <w:rPr>
-          <w:b/>
-          <w:bCs/>
-          <w:color w:val="153D63" w:themeColor="text2" w:themeTint="E6"/>
-        </w:rPr>
-        <w:t xml:space="preserve"> </w:t>
-      </w:r>
-      <w:proofErr w:type="spellStart"/>
-      <w:proofErr w:type="gramStart"/>
-      <w:r>
-        <w:rPr>
-          <w:b/>
-          <w:bCs/>
-          <w:color w:val="153D63" w:themeColor="text2" w:themeTint="E6"/>
-        </w:rPr>
-        <w:t>configuraGiocatoreCorrenteTest</w:t>
-      </w:r>
-      <w:proofErr w:type="spellEnd"/>
-      <w:r>
-        <w:rPr>
-          <w:b/>
-          <w:bCs/>
-          <w:color w:val="153D63" w:themeColor="text2" w:themeTint="E6"/>
-        </w:rPr>
-        <w:t>(</w:t>
-      </w:r>
-      <w:proofErr w:type="gramEnd"/>
-      <w:r>
-        <w:rPr>
-          <w:b/>
-          <w:bCs/>
-          <w:color w:val="153D63" w:themeColor="text2" w:themeTint="E6"/>
-        </w:rPr>
-        <w:t>)</w:t>
-      </w:r>
-    </w:p>
-    <w:p>
-      <w:r>
-        <w:t>Test della configurazione giocatore corrente da fare muovere lungo il tabellone.</w:t>
-      </w:r>
-    </w:p>
-    <w:p>
-      <w:r>
-        <w:t xml:space="preserve">Condizione iniziale: che esista una variabile </w:t>
-      </w:r>
-      <w:proofErr w:type="spellStart"/>
-      <w:r>
-        <w:t>giocoDellOca</w:t>
-      </w:r>
-      <w:proofErr w:type="spellEnd"/>
-      <w:r>
-        <w:t xml:space="preserve"> e che stia configurando/sia già stata configurata </w:t>
-      </w:r>
-      <w:r>
-        <w:t xml:space="preserve">una nuova </w:t>
-      </w:r>
-      <w:r>
-        <w:t>p</w:t>
-      </w:r>
-      <w:r>
-        <w:t>artita.</w:t>
-      </w:r>
-    </w:p>
-    <w:p>
-      <w:r>
-        <w:t xml:space="preserve">Condizione da testare: perché il metodo funzioni si deve verificare </w:t>
-      </w:r>
-      <w:r>
-        <w:t>che,</w:t>
-      </w:r>
-      <w:r>
-        <w:t xml:space="preserve"> </w:t>
-      </w:r>
-      <w:r>
-        <w:t>qualora</w:t>
-      </w:r>
-      <w:r>
-        <w:t xml:space="preserve"> le tabelle preposte alla definizione di pedina e dado </w:t>
-      </w:r>
-      <w:r>
-        <w:t>siano</w:t>
-      </w:r>
-      <w:r>
-        <w:t xml:space="preserve"> vuote, vengano associate delle personalizzazioni di default, e il giocatore viene impostato come giocatore corrente</w:t>
-      </w:r>
-      <w:r>
-        <w:t>.</w:t>
-      </w:r>
-    </w:p>
-    <w:p/>
-    <w:p>
-      <w:pPr>
-        <w:rPr>
-          <w:b/>
-          <w:bCs/>
-          <w:color w:val="153D63" w:themeColor="text2" w:themeTint="E6"/>
-        </w:rPr>
-      </w:pPr>
-      <w:proofErr w:type="spellStart"/>
-      <w:r>
-        <w:rPr>
-          <w:b/>
-          <w:bCs/>
-          <w:color w:val="153D63" w:themeColor="text2" w:themeTint="E6"/>
-        </w:rPr>
-        <w:t>void</w:t>
-      </w:r>
-      <w:proofErr w:type="spellEnd"/>
-      <w:r>
-        <w:rPr>
-          <w:b/>
-          <w:bCs/>
-          <w:color w:val="153D63" w:themeColor="text2" w:themeTint="E6"/>
-        </w:rPr>
-        <w:t xml:space="preserve"> </w:t>
-      </w:r>
-      <w:proofErr w:type="spellStart"/>
-      <w:proofErr w:type="gramStart"/>
-      <w:r>
-        <w:rPr>
-          <w:b/>
-          <w:bCs/>
-          <w:color w:val="153D63" w:themeColor="text2" w:themeTint="E6"/>
-        </w:rPr>
-        <w:t>autenticazioneAdminTest</w:t>
-      </w:r>
-      <w:proofErr w:type="spellEnd"/>
-      <w:r>
-        <w:rPr>
-          <w:b/>
-          <w:bCs/>
-          <w:color w:val="153D63" w:themeColor="text2" w:themeTint="E6"/>
-        </w:rPr>
-        <w:t>(</w:t>
-      </w:r>
-      <w:proofErr w:type="gramEnd"/>
-      <w:r>
-        <w:rPr>
-          <w:b/>
-          <w:bCs/>
-          <w:color w:val="153D63" w:themeColor="text2" w:themeTint="E6"/>
-        </w:rPr>
-        <w:t>)</w:t>
+        <w:t>void autenticazioneAdminTest()</w:t>
       </w:r>
     </w:p>
     <w:p>
@@ -12983,13 +11935,8 @@
     </w:p>
     <w:p>
       <w:r>
-        <w:t xml:space="preserve">Condizione iniziale: che esista una variabile </w:t>
-      </w:r>
-      <w:proofErr w:type="spellStart"/>
-      <w:r>
-        <w:t>giocoDellOca</w:t>
-      </w:r>
-      <w:proofErr w:type="spellEnd"/>
+        <w:t>Condizione iniziale: che esista una variabile giocoDellOca</w:t>
+      </w:r>
       <w:r>
         <w:t xml:space="preserve"> </w:t>
       </w:r>
@@ -13059,267 +12006,106 @@
           <w:color w:val="153D63" w:themeColor="text2" w:themeTint="E6"/>
         </w:rPr>
       </w:pPr>
-      <w:proofErr w:type="spellStart"/>
       <w:r>
         <w:rPr>
           <w:b/>
           <w:bCs/>
           <w:color w:val="153D63" w:themeColor="text2" w:themeTint="E6"/>
         </w:rPr>
-        <w:t>void</w:t>
-      </w:r>
-      <w:proofErr w:type="spellEnd"/>
-      <w:r>
+        <w:t>void replaceAllScenariTest()</w:t>
+      </w:r>
+    </w:p>
+    <w:p>
+      <w:r>
+        <w:t>Test rimpiazzo scenari di default con scenari nuovi.</w:t>
+      </w:r>
+    </w:p>
+    <w:p>
+      <w:r>
+        <w:t>Condizione iniziale: che esista una variabile giocoDellOca</w:t>
+      </w:r>
+      <w:r>
+        <w:t xml:space="preserve"> e</w:t>
+      </w:r>
+      <w:r>
+        <w:t xml:space="preserve"> che gli scenari vecchi esistano già per poter fare il confronto.</w:t>
+      </w:r>
+    </w:p>
+    <w:p>
+      <w:r>
+        <w:t>Condizione da testare: perché il metodo funzioni si deve verificare che i nuovi elementi siano effettivamente restituiti dalla getListaScenari di giocoDellOca e siano diversi dai vecchi.</w:t>
+      </w:r>
+    </w:p>
+    <w:p/>
+    <w:p>
+      <w:pPr>
         <w:rPr>
           <w:b/>
           <w:bCs/>
           <w:color w:val="153D63" w:themeColor="text2" w:themeTint="E6"/>
         </w:rPr>
-        <w:t xml:space="preserve"> </w:t>
-      </w:r>
-      <w:proofErr w:type="spellStart"/>
-      <w:proofErr w:type="gramStart"/>
+      </w:pPr>
       <w:r>
         <w:rPr>
           <w:b/>
           <w:bCs/>
           <w:color w:val="153D63" w:themeColor="text2" w:themeTint="E6"/>
         </w:rPr>
-        <w:t>replaceAllScenariTest</w:t>
-      </w:r>
-      <w:proofErr w:type="spellEnd"/>
-      <w:r>
+        <w:t>void replaceAllRegoleTest()</w:t>
+      </w:r>
+    </w:p>
+    <w:p>
+      <w:r>
+        <w:t>Test rimpiazzo set regole di default con regole nuovi.</w:t>
+      </w:r>
+    </w:p>
+    <w:p>
+      <w:r>
+        <w:t>Condizione iniziale: che esista una variabile giocoDellOca</w:t>
+      </w:r>
+      <w:r>
+        <w:t xml:space="preserve"> e</w:t>
+      </w:r>
+      <w:r>
+        <w:t xml:space="preserve"> che i set di regole vecchi esistano già per poter fare il confronto.</w:t>
+      </w:r>
+    </w:p>
+    <w:p>
+      <w:r>
+        <w:t>Condizione da testare: perché il metodo funzioni si deve verificare che i nuovi elementi siano effettivamente restituiti dalla getMapRegoleSet di giocoDellOca e siano diversi dai vecchi.</w:t>
+      </w:r>
+    </w:p>
+    <w:p/>
+    <w:p>
+      <w:pPr>
         <w:rPr>
           <w:b/>
           <w:bCs/>
           <w:color w:val="153D63" w:themeColor="text2" w:themeTint="E6"/>
         </w:rPr>
-        <w:t>(</w:t>
-      </w:r>
-      <w:proofErr w:type="gramEnd"/>
+      </w:pPr>
       <w:r>
         <w:rPr>
           <w:b/>
           <w:bCs/>
           <w:color w:val="153D63" w:themeColor="text2" w:themeTint="E6"/>
         </w:rPr>
-        <w:t>)</w:t>
-      </w:r>
-    </w:p>
-    <w:p>
-      <w:r>
-        <w:t>Test rimpiazzo scenari di default con scenari nuovi.</w:t>
-      </w:r>
-    </w:p>
-    <w:p>
-      <w:r>
-        <w:t xml:space="preserve">Condizione iniziale: che esista una variabile </w:t>
-      </w:r>
-      <w:proofErr w:type="spellStart"/>
-      <w:r>
-        <w:t>giocoDellOca</w:t>
-      </w:r>
-      <w:proofErr w:type="spellEnd"/>
+        <w:t>void replaceAllPersonalizzazioniTest()</w:t>
+      </w:r>
+    </w:p>
+    <w:p>
+      <w:r>
+        <w:t>Test rimpiazzo personalizzazioni di default con personalizzazioni nuove.</w:t>
+      </w:r>
+    </w:p>
+    <w:p>
+      <w:r>
+        <w:t>Condizione iniziale: che esista una variabile giocoDellOca</w:t>
+      </w:r>
       <w:r>
         <w:t xml:space="preserve"> e</w:t>
       </w:r>
       <w:r>
-        <w:t xml:space="preserve"> che gli scenari vecchi esistano già per poter fare il confronto.</w:t>
-      </w:r>
-    </w:p>
-    <w:p>
-      <w:r>
-        <w:t xml:space="preserve">Condizione da testare: perché il metodo funzioni si deve verificare che i nuovi elementi siano effettivamente restituiti dalla </w:t>
-      </w:r>
-      <w:proofErr w:type="spellStart"/>
-      <w:r>
-        <w:t>getListaScenari</w:t>
-      </w:r>
-      <w:proofErr w:type="spellEnd"/>
-      <w:r>
-        <w:t xml:space="preserve"> di </w:t>
-      </w:r>
-      <w:proofErr w:type="spellStart"/>
-      <w:r>
-        <w:t>giocoDellOca</w:t>
-      </w:r>
-      <w:proofErr w:type="spellEnd"/>
-      <w:r>
-        <w:t xml:space="preserve"> e siano diversi dai vecchi.</w:t>
-      </w:r>
-    </w:p>
-    <w:p/>
-    <w:p>
-      <w:pPr>
-        <w:rPr>
-          <w:b/>
-          <w:bCs/>
-          <w:color w:val="153D63" w:themeColor="text2" w:themeTint="E6"/>
-        </w:rPr>
-      </w:pPr>
-      <w:proofErr w:type="spellStart"/>
-      <w:r>
-        <w:rPr>
-          <w:b/>
-          <w:bCs/>
-          <w:color w:val="153D63" w:themeColor="text2" w:themeTint="E6"/>
-        </w:rPr>
-        <w:t>void</w:t>
-      </w:r>
-      <w:proofErr w:type="spellEnd"/>
-      <w:r>
-        <w:rPr>
-          <w:b/>
-          <w:bCs/>
-          <w:color w:val="153D63" w:themeColor="text2" w:themeTint="E6"/>
-        </w:rPr>
-        <w:t xml:space="preserve"> </w:t>
-      </w:r>
-      <w:proofErr w:type="spellStart"/>
-      <w:proofErr w:type="gramStart"/>
-      <w:r>
-        <w:rPr>
-          <w:b/>
-          <w:bCs/>
-          <w:color w:val="153D63" w:themeColor="text2" w:themeTint="E6"/>
-        </w:rPr>
-        <w:t>replaceAllRegoleTest</w:t>
-      </w:r>
-      <w:proofErr w:type="spellEnd"/>
-      <w:r>
-        <w:rPr>
-          <w:b/>
-          <w:bCs/>
-          <w:color w:val="153D63" w:themeColor="text2" w:themeTint="E6"/>
-        </w:rPr>
-        <w:t>(</w:t>
-      </w:r>
-      <w:proofErr w:type="gramEnd"/>
-      <w:r>
-        <w:rPr>
-          <w:b/>
-          <w:bCs/>
-          <w:color w:val="153D63" w:themeColor="text2" w:themeTint="E6"/>
-        </w:rPr>
-        <w:t>)</w:t>
-      </w:r>
-    </w:p>
-    <w:p>
-      <w:r>
-        <w:t>Test rimpiazzo set regole di default con regole nuovi.</w:t>
-      </w:r>
-    </w:p>
-    <w:p>
-      <w:r>
-        <w:t xml:space="preserve">Condizione iniziale: che esista una variabile </w:t>
-      </w:r>
-      <w:proofErr w:type="spellStart"/>
-      <w:r>
-        <w:t>giocoDellOca</w:t>
-      </w:r>
-      <w:proofErr w:type="spellEnd"/>
-      <w:r>
-        <w:t xml:space="preserve"> e</w:t>
-      </w:r>
-      <w:r>
-        <w:t xml:space="preserve"> che i set di regole vecchi esistano già per poter fare il confronto.</w:t>
-      </w:r>
-    </w:p>
-    <w:p>
-      <w:r>
-        <w:t xml:space="preserve">Condizione da testare: perché il metodo funzioni si deve verificare che i nuovi elementi siano effettivamente restituiti dalla </w:t>
-      </w:r>
-      <w:proofErr w:type="spellStart"/>
-      <w:r>
-        <w:t>getMapRegoleSet</w:t>
-      </w:r>
-      <w:proofErr w:type="spellEnd"/>
-      <w:r>
-        <w:t xml:space="preserve"> di </w:t>
-      </w:r>
-      <w:proofErr w:type="spellStart"/>
-      <w:r>
-        <w:t>giocoDellOca</w:t>
-      </w:r>
-      <w:proofErr w:type="spellEnd"/>
-      <w:r>
-        <w:t xml:space="preserve"> e siano diversi dai vecchi.</w:t>
-      </w:r>
-    </w:p>
-    <w:p/>
-    <w:p>
-      <w:pPr>
-        <w:rPr>
-          <w:b/>
-          <w:bCs/>
-          <w:color w:val="153D63" w:themeColor="text2" w:themeTint="E6"/>
-        </w:rPr>
-      </w:pPr>
-      <w:proofErr w:type="spellStart"/>
-      <w:r>
-        <w:rPr>
-          <w:b/>
-          <w:bCs/>
-          <w:color w:val="153D63" w:themeColor="text2" w:themeTint="E6"/>
-        </w:rPr>
-        <w:t>void</w:t>
-      </w:r>
-      <w:proofErr w:type="spellEnd"/>
-      <w:r>
-        <w:rPr>
-          <w:b/>
-          <w:bCs/>
-          <w:color w:val="153D63" w:themeColor="text2" w:themeTint="E6"/>
-        </w:rPr>
-        <w:t xml:space="preserve"> </w:t>
-      </w:r>
-      <w:proofErr w:type="spellStart"/>
-      <w:proofErr w:type="gramStart"/>
-      <w:r>
-        <w:rPr>
-          <w:b/>
-          <w:bCs/>
-          <w:color w:val="153D63" w:themeColor="text2" w:themeTint="E6"/>
-        </w:rPr>
-        <w:t>replaceAllPersonalizzazioniTest</w:t>
-      </w:r>
-      <w:proofErr w:type="spellEnd"/>
-      <w:r>
-        <w:rPr>
-          <w:b/>
-          <w:bCs/>
-          <w:color w:val="153D63" w:themeColor="text2" w:themeTint="E6"/>
-        </w:rPr>
-        <w:t>(</w:t>
-      </w:r>
-      <w:proofErr w:type="gramEnd"/>
-      <w:r>
-        <w:rPr>
-          <w:b/>
-          <w:bCs/>
-          <w:color w:val="153D63" w:themeColor="text2" w:themeTint="E6"/>
-        </w:rPr>
-        <w:t>)</w:t>
-      </w:r>
-    </w:p>
-    <w:p>
-      <w:r>
-        <w:t>Test rimpiazzo personalizzazioni di default con personalizzazioni nuove.</w:t>
-      </w:r>
-    </w:p>
-    <w:p>
-      <w:r>
-        <w:t xml:space="preserve">Condizione iniziale: che esista una variabile </w:t>
-      </w:r>
-      <w:proofErr w:type="spellStart"/>
-      <w:r>
-        <w:t>giocoDellOca</w:t>
-      </w:r>
-      <w:proofErr w:type="spellEnd"/>
-      <w:r>
-        <w:t xml:space="preserve"> e</w:t>
-      </w:r>
-      <w:r>
         <w:t xml:space="preserve"> che le personalizzazioni vecchie esistano già per poter fare il confronto.</w:t>
       </w:r>
     </w:p>
@@ -13330,23 +12116,7 @@
         </w:rPr>
       </w:pPr>
       <w:r>
-        <w:t xml:space="preserve">Condizione da testare: perché il metodo funzioni si deve verificare che i nuovi elementi siano effettivamente restituiti dalla </w:t>
-      </w:r>
-      <w:proofErr w:type="spellStart"/>
-      <w:r>
-        <w:t>getListaPersonalizzazioni</w:t>
-      </w:r>
-      <w:proofErr w:type="spellEnd"/>
-      <w:r>
-        <w:t xml:space="preserve"> di </w:t>
-      </w:r>
-      <w:proofErr w:type="spellStart"/>
-      <w:r>
-        <w:t>giocoDellOca</w:t>
-      </w:r>
-      <w:proofErr w:type="spellEnd"/>
-      <w:r>
-        <w:t xml:space="preserve"> e siano diversi dai vecchi.</w:t>
+        <w:t>Condizione da testare: perché il metodo funzioni si deve verificare che i nuovi elementi siano effettivamente restituiti dalla getListaPersonalizzazioni di giocoDellOca e siano diversi dai vecchi.</w:t>
       </w:r>
     </w:p>
     <w:p>
@@ -20224,7 +18994,9 @@
     <w:rsid w:val="008F61CB"/>
     <w:rsid w:val="009123BB"/>
     <w:rsid w:val="00971202"/>
+    <w:rsid w:val="009D0149"/>
     <w:rsid w:val="009F39B5"/>
+    <w:rsid w:val="00A17ABD"/>
     <w:rsid w:val="00A22019"/>
     <w:rsid w:val="00A30F8E"/>
     <w:rsid w:val="00A46757"/>

</xml_diff>